<commit_message>
Prolog: Satz zum Gang auf das Wirtshaus zu; Lesetexte neu erzeugt
Co-Authored-By: Claude Fable 5.1 <noreply@anthropic.com>
Claude-Session: https://claude.ai/code/session_01ADUPP2jvP6dgTYk1DsQkUN
</commit_message>
<xml_diff>
--- a/helferblatt/Nachtfels_Lesetext_DM.docx
+++ b/helferblatt/Nachtfels_Lesetext_DM.docx
@@ -1413,6 +1413,77 @@
           <w:szCs w:val="22"/>
         </w:rPr>
         <w:t xml:space="preserve">.</w:t>
+      </w:r>
+    </w:p>
+    <w:p>
+      <w:pPr>
+        <w:spacing w:after="110" w:line="320"/>
+      </w:pPr>
+      <w:r>
+        <w:rPr>
+          <w:rFonts w:ascii="Georgia" w:cs="Georgia" w:eastAsia="Georgia" w:hAnsi="Georgia"/>
+          <w:sz w:val="22"/>
+          <w:szCs w:val="22"/>
+        </w:rPr>
+        <w:t xml:space="preserve">You walk towards the old tavern</w:t>
+      </w:r>
+      <w:r>
+        <w:rPr>
+          <w:rFonts w:ascii="Georgia" w:cs="Georgia" w:eastAsia="Georgia" w:hAnsi="Georgia"/>
+          <w:sz w:val="22"/>
+          <w:szCs w:val="22"/>
+        </w:rPr>
+        <w:t xml:space="preserve"> slowly. Under your boots</w:t>
+      </w:r>
+      <w:r>
+        <w:rPr>
+          <w:rFonts w:ascii="Georgia" w:cs="Georgia" w:eastAsia="Georgia" w:hAnsi="Georgia"/>
+          <w:color w:val="7A5A1A"/>
+          <w:sz w:val="18"/>
+          <w:szCs w:val="18"/>
+        </w:rPr>
+        <w:t xml:space="preserve"> [Stiefel]</w:t>
+      </w:r>
+      <w:r>
+        <w:rPr>
+          <w:rFonts w:ascii="Georgia" w:cs="Georgia" w:eastAsia="Georgia" w:hAnsi="Georgia"/>
+          <w:sz w:val="22"/>
+          <w:szCs w:val="22"/>
+        </w:rPr>
+        <w:t xml:space="preserve"> the mud</w:t>
+      </w:r>
+      <w:r>
+        <w:rPr>
+          <w:rFonts w:ascii="Georgia" w:cs="Georgia" w:eastAsia="Georgia" w:hAnsi="Georgia"/>
+          <w:sz w:val="22"/>
+          <w:szCs w:val="22"/>
+        </w:rPr>
+        <w:t xml:space="preserve"> is half frozen</w:t>
+      </w:r>
+      <w:r>
+        <w:rPr>
+          <w:rFonts w:ascii="Georgia" w:cs="Georgia" w:eastAsia="Georgia" w:hAnsi="Georgia"/>
+          <w:color w:val="7A5A1A"/>
+          <w:sz w:val="18"/>
+          <w:szCs w:val="18"/>
+        </w:rPr>
+        <w:t xml:space="preserve"> [gefroren]</w:t>
+      </w:r>
+      <w:r>
+        <w:rPr>
+          <w:rFonts w:ascii="Georgia" w:cs="Georgia" w:eastAsia="Georgia" w:hAnsi="Georgia"/>
+          <w:sz w:val="22"/>
+          <w:szCs w:val="22"/>
+        </w:rPr>
+        <w:t xml:space="preserve">, and the light in the windows</w:t>
+      </w:r>
+      <w:r>
+        <w:rPr>
+          <w:rFonts w:ascii="Georgia" w:cs="Georgia" w:eastAsia="Georgia" w:hAnsi="Georgia"/>
+          <w:sz w:val="22"/>
+          <w:szCs w:val="22"/>
+        </w:rPr>
+        <w:t xml:space="preserve"> is the only warm thing for miles.</w:t>
       </w:r>
     </w:p>
     <w:p>

</xml_diff>

<commit_message>
DM: Vorlesen und wörtliche Rede in einer Karte, Aufgaben als direkte Rede, Hintergrund oben, Antwortmöglichkeiten abhakbar
Co-Authored-By: Claude Fable 5.1 <noreply@anthropic.com>
Claude-Session: https://claude.ai/code/session_01ADUPP2jvP6dgTYk1DsQkUN
</commit_message>
<xml_diff>
--- a/helferblatt/Nachtfels_Lesetext_DM.docx
+++ b/helferblatt/Nachtfels_Lesetext_DM.docx
@@ -185,7 +185,7 @@
           <w:sz w:val="18"/>
           <w:szCs w:val="18"/>
         </w:rPr>
-        <w:t xml:space="preserve">Gelb umrandet heisst: wörtlich vorlesen oder sagen. Grün heisst: das sollen die Schüler jetzt tun. Grau heisst: nur für dich. Ganz unten steht immer, wann es weitergeht.
+        <w:t xml:space="preserve">Gelb heisst: wörtlich vorlesen — Erzähltext und die Sätze der Figuren stehen in einer Karte. Grün heisst: das sagst du den Schülern, ebenfalls wörtlich — es ist ihre Aufgabe. Grau heisst: nur für dich, und steht als Hintergrund oben. Ganz unten steht immer, wann es weitergeht.
  Unter dem Titel jeder Seite steht die Lage: wo die Gruppe ist, was sie gewählt hat, was sie weiss. Auf der Seite steht immer nur, was zu diesem Weg gehört — das andere siehst du gar nicht erst. Und eine Entscheidung lässt sich erst anklicken, wenn die davor getroffen ist.</w:t>
       </w:r>
     </w:p>
@@ -591,6 +591,36 @@
     </w:p>
     <w:p>
       <w:pPr>
+        <w:pBdr>
+          <w:left w:val="single" w:color="BFBFBF" w:sz="18" w:space="8"/>
+        </w:pBdr>
+        <w:shd w:fill="F2F2F2" w:color="auto" w:val="clear"/>
+        <w:spacing w:after="140"/>
+        <w:ind w:left="120"/>
+      </w:pPr>
+      <w:r>
+        <w:rPr>
+          <w:rFonts w:ascii="Georgia" w:cs="Georgia" w:eastAsia="Georgia" w:hAnsi="Georgia"/>
+          <w:b/>
+          <w:bCs/>
+          <w:color w:val="555555"/>
+          <w:sz w:val="16"/>
+          <w:szCs w:val="16"/>
+        </w:rPr>
+        <w:t xml:space="preserve">NUR DM:  </w:t>
+      </w:r>
+      <w:r>
+        <w:rPr>
+          <w:rFonts w:ascii="Georgia" w:cs="Georgia" w:eastAsia="Georgia" w:hAnsi="Georgia"/>
+          <w:color w:val="333333"/>
+          <w:sz w:val="18"/>
+          <w:szCs w:val="18"/>
+        </w:rPr>
+        <w:t xml:space="preserve">Der Fahrer heisst Marek. Grimmig, wortkarg, will das Geld und wieder weg. Er ist kein Rätsel — er ist der Mann, der die erste Frage stellt.</w:t>
+      </w:r>
+    </w:p>
+    <w:p>
+      <w:pPr>
         <w:spacing w:after="40" w:before="100"/>
       </w:pPr>
       <w:r>
@@ -794,36 +824,6 @@
           <w:szCs w:val="22"/>
         </w:rPr>
         <w:t xml:space="preserve">. The driver does not look.</w:t>
-      </w:r>
-    </w:p>
-    <w:p>
-      <w:pPr>
-        <w:pBdr>
-          <w:left w:val="single" w:color="BFBFBF" w:sz="18" w:space="8"/>
-        </w:pBdr>
-        <w:shd w:fill="F2F2F2" w:color="auto" w:val="clear"/>
-        <w:spacing w:after="140"/>
-        <w:ind w:left="120"/>
-      </w:pPr>
-      <w:r>
-        <w:rPr>
-          <w:rFonts w:ascii="Georgia" w:cs="Georgia" w:eastAsia="Georgia" w:hAnsi="Georgia"/>
-          <w:b/>
-          <w:bCs/>
-          <w:color w:val="555555"/>
-          <w:sz w:val="16"/>
-          <w:szCs w:val="16"/>
-        </w:rPr>
-        <w:t xml:space="preserve">NUR DM:  </w:t>
-      </w:r>
-      <w:r>
-        <w:rPr>
-          <w:rFonts w:ascii="Georgia" w:cs="Georgia" w:eastAsia="Georgia" w:hAnsi="Georgia"/>
-          <w:color w:val="333333"/>
-          <w:sz w:val="18"/>
-          <w:szCs w:val="18"/>
-        </w:rPr>
-        <w:t xml:space="preserve">Der Fahrer heisst Marek. Grimmig, wortkarg, will das Geld und wieder weg. Er ist kein Rätsel — er ist der Mann, der die erste Frage stellt.</w:t>
       </w:r>
     </w:p>
     <w:p>
@@ -879,7 +879,7 @@
           <w:left w:val="single" w:color="74B094" w:sz="18" w:space="8"/>
         </w:pBdr>
         <w:shd w:fill="EAF4EC" w:color="auto" w:val="clear"/>
-        <w:spacing w:after="140"/>
+        <w:spacing w:after="40"/>
         <w:ind w:left="120"/>
       </w:pPr>
       <w:r>
@@ -891,7 +891,7 @@
           <w:sz w:val="16"/>
           <w:szCs w:val="16"/>
         </w:rPr>
-        <w:t xml:space="preserve">AUFGABE:  </w:t>
+        <w:t xml:space="preserve">DM SAGT DEN SCHÜLERN:  </w:t>
       </w:r>
       <w:r>
         <w:rPr>
@@ -899,7 +899,26 @@
           <w:sz w:val="19"/>
           <w:szCs w:val="19"/>
         </w:rPr>
-        <w:t xml:space="preserve">Jede Figur antwortet Marek: Name, was sie kann, warum sie mitgekommen ist. Mindestens zwei bis drei Sätze pro Person — wer nur „I am a mage“ sagt, bekommt von dir: „Give me two more sentences.“  →  Helfer-Blatt · Teil 1</w:t>
+        <w:t xml:space="preserve">“Marek is waiting for an answer. Each of you: tell him your name, what you are good at, and why you came up here. At least two or three sentences.”</w:t>
+      </w:r>
+    </w:p>
+    <w:p>
+      <w:pPr>
+        <w:pBdr>
+          <w:left w:val="single" w:color="74B094" w:sz="18" w:space="8"/>
+        </w:pBdr>
+        <w:shd w:fill="EAF4EC" w:color="auto" w:val="clear"/>
+        <w:spacing w:after="140"/>
+        <w:ind w:left="120"/>
+      </w:pPr>
+      <w:r>
+        <w:rPr>
+          <w:rFonts w:ascii="Georgia" w:cs="Georgia" w:eastAsia="Georgia" w:hAnsi="Georgia"/>
+          <w:color w:val="555555"/>
+          <w:sz w:val="17"/>
+          <w:szCs w:val="17"/>
+        </w:rPr>
+        <w:t xml:space="preserve">Wer nur „I am a mage“ sagt, bekommt: „Give me two more sentences.“  →  Helfer-Blatt · Teil 1</w:t>
       </w:r>
     </w:p>
     <w:p>
@@ -920,7 +939,7 @@
           <w:sz w:val="16"/>
           <w:szCs w:val="16"/>
         </w:rPr>
-        <w:t xml:space="preserve">WENN SIE MAREK ETWAS FRAGEN (NUR DM)  </w:t>
+        <w:t xml:space="preserve">ANTWORTMÖGLICHKEITEN (NUR DM)  </w:t>
       </w:r>
     </w:p>
     <w:p>
@@ -1533,6 +1552,280 @@
     </w:p>
     <w:p>
       <w:pPr>
+        <w:pBdr>
+          <w:left w:val="single" w:color="BFBFBF" w:sz="18" w:space="8"/>
+        </w:pBdr>
+        <w:shd w:fill="F2F2F2" w:color="auto" w:val="clear"/>
+        <w:spacing w:after="140"/>
+        <w:ind w:left="120"/>
+      </w:pPr>
+      <w:r>
+        <w:rPr>
+          <w:rFonts w:ascii="Georgia" w:cs="Georgia" w:eastAsia="Georgia" w:hAnsi="Georgia"/>
+          <w:b/>
+          <w:bCs/>
+          <w:color w:val="555555"/>
+          <w:sz w:val="16"/>
+          <w:szCs w:val="16"/>
+        </w:rPr>
+        <w:t xml:space="preserve">NUR DM:  </w:t>
+      </w:r>
+      <w:r>
+        <w:rPr>
+          <w:rFonts w:ascii="Georgia" w:cs="Georgia" w:eastAsia="Georgia" w:hAnsi="Georgia"/>
+          <w:color w:val="333333"/>
+          <w:sz w:val="18"/>
+          <w:szCs w:val="18"/>
+        </w:rPr>
+        <w:t xml:space="preserve">Nur diese drei antworten. Die anderen acht sind Kulisse: Spricht jemand sie an, sagst du „They look into their drinks and say nothing“ — damit ist es erledigt, und du musst dir niemanden ausdenken. An den drei Beschreibungen oben erkennen die Schüler, wen sie ansprechen können.</w:t>
+      </w:r>
+    </w:p>
+    <w:p>
+      <w:pPr>
+        <w:pBdr>
+          <w:left w:val="single" w:color="BFBFBF" w:sz="18" w:space="8"/>
+        </w:pBdr>
+        <w:shd w:fill="F2F2F2" w:color="auto" w:val="clear"/>
+        <w:spacing w:after="40"/>
+        <w:ind w:left="120"/>
+      </w:pPr>
+      <w:r>
+        <w:rPr>
+          <w:rFonts w:ascii="Georgia" w:cs="Georgia" w:eastAsia="Georgia" w:hAnsi="Georgia"/>
+          <w:b/>
+          <w:bCs/>
+          <w:color w:val="555555"/>
+          <w:sz w:val="16"/>
+          <w:szCs w:val="16"/>
+        </w:rPr>
+        <w:t xml:space="preserve">WEN MAN ANSPRECHEN KANN (NUR DM)  </w:t>
+      </w:r>
+    </w:p>
+    <w:p>
+      <w:pPr>
+        <w:pBdr>
+          <w:left w:val="single" w:color="BFBFBF" w:sz="18" w:space="8"/>
+        </w:pBdr>
+        <w:shd w:fill="F2F2F2" w:color="auto" w:val="clear"/>
+        <w:spacing w:after="40"/>
+        <w:ind w:left="120"/>
+      </w:pPr>
+      <w:r>
+        <w:rPr>
+          <w:rFonts w:ascii="Georgia" w:cs="Georgia" w:eastAsia="Georgia" w:hAnsi="Georgia"/>
+          <w:b/>
+          <w:bCs/>
+          <w:sz w:val="18"/>
+          <w:szCs w:val="18"/>
+        </w:rPr>
+        <w:t xml:space="preserve">Greta — Wirtin, drei Finger. </w:t>
+      </w:r>
+      <w:r>
+        <w:rPr>
+          <w:rFonts w:ascii="Georgia" w:cs="Georgia" w:eastAsia="Georgia" w:hAnsi="Georgia"/>
+          <w:color w:val="333333"/>
+          <w:sz w:val="18"/>
+          <w:szCs w:val="18"/>
+        </w:rPr>
+        <w:t xml:space="preserve">Kurze Sätze. Sie lügt nie — sie wechselt das Thema. Freundlich, nicht feindlich.</w:t>
+      </w:r>
+    </w:p>
+    <w:p>
+      <w:pPr>
+        <w:pBdr>
+          <w:left w:val="single" w:color="BFBFBF" w:sz="18" w:space="8"/>
+        </w:pBdr>
+        <w:shd w:fill="F2F2F2" w:color="auto" w:val="clear"/>
+        <w:spacing w:after="40"/>
+        <w:ind w:left="120"/>
+      </w:pPr>
+      <w:r>
+        <w:rPr>
+          <w:rFonts w:ascii="Georgia" w:cs="Georgia" w:eastAsia="Georgia" w:hAnsi="Georgia"/>
+          <w:i/>
+          <w:iCs/>
+          <w:sz w:val="18"/>
+          <w:szCs w:val="18"/>
+        </w:rPr>
+        <w:t xml:space="preserve">„Mirela is gone. That is all there is.“  ·  „We don’t go up there. That is the arrangement.“  ·  „You want to help? Go home. That would help.“</w:t>
+      </w:r>
+    </w:p>
+    <w:p>
+      <w:pPr>
+        <w:pBdr>
+          <w:left w:val="single" w:color="BFBFBF" w:sz="18" w:space="8"/>
+        </w:pBdr>
+        <w:shd w:fill="F2F2F2" w:color="auto" w:val="clear"/>
+        <w:spacing w:after="40"/>
+        <w:ind w:left="120"/>
+      </w:pPr>
+      <w:r>
+        <w:rPr>
+          <w:rFonts w:ascii="Georgia" w:cs="Georgia" w:eastAsia="Georgia" w:hAnsi="Georgia"/>
+          <w:color w:val="555555"/>
+          <w:sz w:val="17"/>
+          <w:szCs w:val="17"/>
+        </w:rPr>
+        <w:t xml:space="preserve">Notfalls: Fragt sie niemand, stellt sie ungefragt drei Becher hin: „You’re going up there anyway, aren’t you.“</w:t>
+      </w:r>
+    </w:p>
+    <w:p>
+      <w:pPr>
+        <w:pBdr>
+          <w:left w:val="single" w:color="BFBFBF" w:sz="18" w:space="8"/>
+        </w:pBdr>
+        <w:shd w:fill="F2F2F2" w:color="auto" w:val="clear"/>
+        <w:spacing w:after="40"/>
+        <w:ind w:left="120"/>
+      </w:pPr>
+      <w:r>
+        <w:rPr>
+          <w:rFonts w:ascii="Georgia" w:cs="Georgia" w:eastAsia="Georgia" w:hAnsi="Georgia"/>
+          <w:b/>
+          <w:bCs/>
+          <w:sz w:val="18"/>
+          <w:szCs w:val="18"/>
+        </w:rPr>
+        <w:t xml:space="preserve">Old Pieter — Totengräber, betrunken. </w:t>
+      </w:r>
+      <w:r>
+        <w:rPr>
+          <w:rFonts w:ascii="Georgia" w:cs="Georgia" w:eastAsia="Georgia" w:hAnsi="Georgia"/>
+          <w:color w:val="333333"/>
+          <w:sz w:val="18"/>
+          <w:szCs w:val="18"/>
+        </w:rPr>
+        <w:t xml:space="preserve">Zu laut, lacht an den falschen Stellen. Er sagt die Wahrheit, darum glaubt ihm niemand.</w:t>
+      </w:r>
+    </w:p>
+    <w:p>
+      <w:pPr>
+        <w:pBdr>
+          <w:left w:val="single" w:color="BFBFBF" w:sz="18" w:space="8"/>
+        </w:pBdr>
+        <w:shd w:fill="F2F2F2" w:color="auto" w:val="clear"/>
+        <w:spacing w:after="40"/>
+        <w:ind w:left="120"/>
+      </w:pPr>
+      <w:r>
+        <w:rPr>
+          <w:rFonts w:ascii="Georgia" w:cs="Georgia" w:eastAsia="Georgia" w:hAnsi="Georgia"/>
+          <w:i/>
+          <w:iCs/>
+          <w:sz w:val="18"/>
+          <w:szCs w:val="18"/>
+        </w:rPr>
+        <w:t xml:space="preserve">„Twenty years! Ask her what happened twenty years ago!“  ·  „Ask her about Anneke! Go on — ask her about Anneke!“  ·  „I dug no grave for that girl. Because there was nothing to bury.“</w:t>
+      </w:r>
+    </w:p>
+    <w:p>
+      <w:pPr>
+        <w:pBdr>
+          <w:left w:val="single" w:color="BFBFBF" w:sz="18" w:space="8"/>
+        </w:pBdr>
+        <w:shd w:fill="F2F2F2" w:color="auto" w:val="clear"/>
+        <w:spacing w:after="40"/>
+        <w:ind w:left="120"/>
+      </w:pPr>
+      <w:r>
+        <w:rPr>
+          <w:rFonts w:ascii="Georgia" w:cs="Georgia" w:eastAsia="Georgia" w:hAnsi="Georgia"/>
+          <w:color w:val="555555"/>
+          <w:sz w:val="17"/>
+          <w:szCs w:val="17"/>
+        </w:rPr>
+        <w:t xml:space="preserve">Notfalls: Spricht ihn niemand an, ruft er den Anneke-Satz nach fünf Minuten quer durch den Raum. Der Name muss fallen.</w:t>
+      </w:r>
+    </w:p>
+    <w:p>
+      <w:pPr>
+        <w:pBdr>
+          <w:left w:val="single" w:color="BFBFBF" w:sz="18" w:space="8"/>
+        </w:pBdr>
+        <w:shd w:fill="F2F2F2" w:color="auto" w:val="clear"/>
+        <w:spacing w:after="40"/>
+        <w:ind w:left="120"/>
+      </w:pPr>
+      <w:r>
+        <w:rPr>
+          <w:rFonts w:ascii="Georgia" w:cs="Georgia" w:eastAsia="Georgia" w:hAnsi="Georgia"/>
+          <w:b/>
+          <w:bCs/>
+          <w:sz w:val="18"/>
+          <w:szCs w:val="18"/>
+        </w:rPr>
+        <w:t xml:space="preserve">Tobias — Junge an der Tür, 12. </w:t>
+      </w:r>
+      <w:r>
+        <w:rPr>
+          <w:rFonts w:ascii="Georgia" w:cs="Georgia" w:eastAsia="Georgia" w:hAnsi="Georgia"/>
+          <w:color w:val="333333"/>
+          <w:sz w:val="18"/>
+          <w:szCs w:val="18"/>
+        </w:rPr>
+        <w:t xml:space="preserve">Schnell, hoffnungsvoll, zu ehrlich. Er wartet seit drei Nächten auf jemanden wie euch.</w:t>
+      </w:r>
+    </w:p>
+    <w:p>
+      <w:pPr>
+        <w:pBdr>
+          <w:left w:val="single" w:color="BFBFBF" w:sz="18" w:space="8"/>
+        </w:pBdr>
+        <w:shd w:fill="F2F2F2" w:color="auto" w:val="clear"/>
+        <w:spacing w:after="40"/>
+        <w:ind w:left="120"/>
+      </w:pPr>
+      <w:r>
+        <w:rPr>
+          <w:rFonts w:ascii="Georgia" w:cs="Georgia" w:eastAsia="Georgia" w:hAnsi="Georgia"/>
+          <w:i/>
+          <w:iCs/>
+          <w:sz w:val="18"/>
+          <w:szCs w:val="18"/>
+        </w:rPr>
+        <w:t xml:space="preserve">„She wasn’t taken. She packed a bag.“  ·  „She said it was her turn. She said it like it was a shopping list.“  ·  „She said: tell them it’s for Lene. Lene is my sister. She’s nine.“</w:t>
+      </w:r>
+    </w:p>
+    <w:p>
+      <w:pPr>
+        <w:pBdr>
+          <w:left w:val="single" w:color="BFBFBF" w:sz="18" w:space="8"/>
+        </w:pBdr>
+        <w:shd w:fill="F2F2F2" w:color="auto" w:val="clear"/>
+        <w:spacing w:after="40"/>
+        <w:ind w:left="120"/>
+      </w:pPr>
+      <w:r>
+        <w:rPr>
+          <w:rFonts w:ascii="Georgia" w:cs="Georgia" w:eastAsia="Georgia" w:hAnsi="Georgia"/>
+          <w:color w:val="555555"/>
+          <w:sz w:val="17"/>
+          <w:szCs w:val="17"/>
+        </w:rPr>
+        <w:t xml:space="preserve">Notfalls: Redet niemand mit ihm, läuft er ihnen an der Tür nach und sagt den Satz mit dem Koffer.</w:t>
+      </w:r>
+    </w:p>
+    <w:p>
+      <w:pPr>
+        <w:pBdr>
+          <w:left w:val="single" w:color="BFBFBF" w:sz="18" w:space="8"/>
+        </w:pBdr>
+        <w:shd w:fill="F2F2F2" w:color="auto" w:val="clear"/>
+        <w:spacing w:after="140"/>
+        <w:ind w:left="120"/>
+      </w:pPr>
+      <w:r>
+        <w:rPr>
+          <w:rFonts w:ascii="Georgia" w:cs="Georgia" w:eastAsia="Georgia" w:hAnsi="Georgia"/>
+          <w:color w:val="555555"/>
+          <w:sz w:val="17"/>
+          <w:szCs w:val="17"/>
+        </w:rPr>
+        <w:t xml:space="preserve">Tobias ist Mirelas Lehrling. Er will mit ins Schloss. Er darf nicht mit — aber lass ihn fragen. Er bleibt im Dorf und wartet.</w:t>
+      </w:r>
+    </w:p>
+    <w:p>
+      <w:pPr>
         <w:spacing w:after="40" w:before="100"/>
       </w:pPr>
       <w:r>
@@ -1775,280 +2068,6 @@
           <w:szCs w:val="22"/>
         </w:rPr>
         <w:t xml:space="preserve">The other eight look into their drinks.</w:t>
-      </w:r>
-    </w:p>
-    <w:p>
-      <w:pPr>
-        <w:pBdr>
-          <w:left w:val="single" w:color="BFBFBF" w:sz="18" w:space="8"/>
-        </w:pBdr>
-        <w:shd w:fill="F2F2F2" w:color="auto" w:val="clear"/>
-        <w:spacing w:after="140"/>
-        <w:ind w:left="120"/>
-      </w:pPr>
-      <w:r>
-        <w:rPr>
-          <w:rFonts w:ascii="Georgia" w:cs="Georgia" w:eastAsia="Georgia" w:hAnsi="Georgia"/>
-          <w:b/>
-          <w:bCs/>
-          <w:color w:val="555555"/>
-          <w:sz w:val="16"/>
-          <w:szCs w:val="16"/>
-        </w:rPr>
-        <w:t xml:space="preserve">NUR DM:  </w:t>
-      </w:r>
-      <w:r>
-        <w:rPr>
-          <w:rFonts w:ascii="Georgia" w:cs="Georgia" w:eastAsia="Georgia" w:hAnsi="Georgia"/>
-          <w:color w:val="333333"/>
-          <w:sz w:val="18"/>
-          <w:szCs w:val="18"/>
-        </w:rPr>
-        <w:t xml:space="preserve">Nur diese drei antworten. Die anderen acht sind Kulisse: Spricht jemand sie an, sagst du „They look into their drinks and say nothing“ — damit ist es erledigt, und du musst dir niemanden ausdenken. An den drei Beschreibungen oben erkennen die Schüler, wen sie ansprechen können.</w:t>
-      </w:r>
-    </w:p>
-    <w:p>
-      <w:pPr>
-        <w:pBdr>
-          <w:left w:val="single" w:color="BFBFBF" w:sz="18" w:space="8"/>
-        </w:pBdr>
-        <w:shd w:fill="F2F2F2" w:color="auto" w:val="clear"/>
-        <w:spacing w:after="40"/>
-        <w:ind w:left="120"/>
-      </w:pPr>
-      <w:r>
-        <w:rPr>
-          <w:rFonts w:ascii="Georgia" w:cs="Georgia" w:eastAsia="Georgia" w:hAnsi="Georgia"/>
-          <w:b/>
-          <w:bCs/>
-          <w:color w:val="555555"/>
-          <w:sz w:val="16"/>
-          <w:szCs w:val="16"/>
-        </w:rPr>
-        <w:t xml:space="preserve">WEN MAN ANSPRECHEN KANN (NUR DM)  </w:t>
-      </w:r>
-    </w:p>
-    <w:p>
-      <w:pPr>
-        <w:pBdr>
-          <w:left w:val="single" w:color="BFBFBF" w:sz="18" w:space="8"/>
-        </w:pBdr>
-        <w:shd w:fill="F2F2F2" w:color="auto" w:val="clear"/>
-        <w:spacing w:after="40"/>
-        <w:ind w:left="120"/>
-      </w:pPr>
-      <w:r>
-        <w:rPr>
-          <w:rFonts w:ascii="Georgia" w:cs="Georgia" w:eastAsia="Georgia" w:hAnsi="Georgia"/>
-          <w:b/>
-          <w:bCs/>
-          <w:sz w:val="18"/>
-          <w:szCs w:val="18"/>
-        </w:rPr>
-        <w:t xml:space="preserve">Greta — Wirtin, drei Finger. </w:t>
-      </w:r>
-      <w:r>
-        <w:rPr>
-          <w:rFonts w:ascii="Georgia" w:cs="Georgia" w:eastAsia="Georgia" w:hAnsi="Georgia"/>
-          <w:color w:val="333333"/>
-          <w:sz w:val="18"/>
-          <w:szCs w:val="18"/>
-        </w:rPr>
-        <w:t xml:space="preserve">Kurze Sätze. Sie lügt nie — sie wechselt das Thema. Freundlich, nicht feindlich.</w:t>
-      </w:r>
-    </w:p>
-    <w:p>
-      <w:pPr>
-        <w:pBdr>
-          <w:left w:val="single" w:color="BFBFBF" w:sz="18" w:space="8"/>
-        </w:pBdr>
-        <w:shd w:fill="F2F2F2" w:color="auto" w:val="clear"/>
-        <w:spacing w:after="40"/>
-        <w:ind w:left="120"/>
-      </w:pPr>
-      <w:r>
-        <w:rPr>
-          <w:rFonts w:ascii="Georgia" w:cs="Georgia" w:eastAsia="Georgia" w:hAnsi="Georgia"/>
-          <w:i/>
-          <w:iCs/>
-          <w:sz w:val="18"/>
-          <w:szCs w:val="18"/>
-        </w:rPr>
-        <w:t xml:space="preserve">„Mirela is gone. That is all there is.“  ·  „We don’t go up there. That is the arrangement.“  ·  „You want to help? Go home. That would help.“</w:t>
-      </w:r>
-    </w:p>
-    <w:p>
-      <w:pPr>
-        <w:pBdr>
-          <w:left w:val="single" w:color="BFBFBF" w:sz="18" w:space="8"/>
-        </w:pBdr>
-        <w:shd w:fill="F2F2F2" w:color="auto" w:val="clear"/>
-        <w:spacing w:after="40"/>
-        <w:ind w:left="120"/>
-      </w:pPr>
-      <w:r>
-        <w:rPr>
-          <w:rFonts w:ascii="Georgia" w:cs="Georgia" w:eastAsia="Georgia" w:hAnsi="Georgia"/>
-          <w:color w:val="555555"/>
-          <w:sz w:val="17"/>
-          <w:szCs w:val="17"/>
-        </w:rPr>
-        <w:t xml:space="preserve">Notfalls: Fragt sie niemand, stellt sie ungefragt drei Becher hin: „You’re going up there anyway, aren’t you.“</w:t>
-      </w:r>
-    </w:p>
-    <w:p>
-      <w:pPr>
-        <w:pBdr>
-          <w:left w:val="single" w:color="BFBFBF" w:sz="18" w:space="8"/>
-        </w:pBdr>
-        <w:shd w:fill="F2F2F2" w:color="auto" w:val="clear"/>
-        <w:spacing w:after="40"/>
-        <w:ind w:left="120"/>
-      </w:pPr>
-      <w:r>
-        <w:rPr>
-          <w:rFonts w:ascii="Georgia" w:cs="Georgia" w:eastAsia="Georgia" w:hAnsi="Georgia"/>
-          <w:b/>
-          <w:bCs/>
-          <w:sz w:val="18"/>
-          <w:szCs w:val="18"/>
-        </w:rPr>
-        <w:t xml:space="preserve">Old Pieter — Totengräber, betrunken. </w:t>
-      </w:r>
-      <w:r>
-        <w:rPr>
-          <w:rFonts w:ascii="Georgia" w:cs="Georgia" w:eastAsia="Georgia" w:hAnsi="Georgia"/>
-          <w:color w:val="333333"/>
-          <w:sz w:val="18"/>
-          <w:szCs w:val="18"/>
-        </w:rPr>
-        <w:t xml:space="preserve">Zu laut, lacht an den falschen Stellen. Er sagt die Wahrheit, darum glaubt ihm niemand.</w:t>
-      </w:r>
-    </w:p>
-    <w:p>
-      <w:pPr>
-        <w:pBdr>
-          <w:left w:val="single" w:color="BFBFBF" w:sz="18" w:space="8"/>
-        </w:pBdr>
-        <w:shd w:fill="F2F2F2" w:color="auto" w:val="clear"/>
-        <w:spacing w:after="40"/>
-        <w:ind w:left="120"/>
-      </w:pPr>
-      <w:r>
-        <w:rPr>
-          <w:rFonts w:ascii="Georgia" w:cs="Georgia" w:eastAsia="Georgia" w:hAnsi="Georgia"/>
-          <w:i/>
-          <w:iCs/>
-          <w:sz w:val="18"/>
-          <w:szCs w:val="18"/>
-        </w:rPr>
-        <w:t xml:space="preserve">„Twenty years! Ask her what happened twenty years ago!“  ·  „Ask her about Anneke! Go on — ask her about Anneke!“  ·  „I dug no grave for that girl. Because there was nothing to bury.“</w:t>
-      </w:r>
-    </w:p>
-    <w:p>
-      <w:pPr>
-        <w:pBdr>
-          <w:left w:val="single" w:color="BFBFBF" w:sz="18" w:space="8"/>
-        </w:pBdr>
-        <w:shd w:fill="F2F2F2" w:color="auto" w:val="clear"/>
-        <w:spacing w:after="40"/>
-        <w:ind w:left="120"/>
-      </w:pPr>
-      <w:r>
-        <w:rPr>
-          <w:rFonts w:ascii="Georgia" w:cs="Georgia" w:eastAsia="Georgia" w:hAnsi="Georgia"/>
-          <w:color w:val="555555"/>
-          <w:sz w:val="17"/>
-          <w:szCs w:val="17"/>
-        </w:rPr>
-        <w:t xml:space="preserve">Notfalls: Spricht ihn niemand an, ruft er den Anneke-Satz nach fünf Minuten quer durch den Raum. Der Name muss fallen.</w:t>
-      </w:r>
-    </w:p>
-    <w:p>
-      <w:pPr>
-        <w:pBdr>
-          <w:left w:val="single" w:color="BFBFBF" w:sz="18" w:space="8"/>
-        </w:pBdr>
-        <w:shd w:fill="F2F2F2" w:color="auto" w:val="clear"/>
-        <w:spacing w:after="40"/>
-        <w:ind w:left="120"/>
-      </w:pPr>
-      <w:r>
-        <w:rPr>
-          <w:rFonts w:ascii="Georgia" w:cs="Georgia" w:eastAsia="Georgia" w:hAnsi="Georgia"/>
-          <w:b/>
-          <w:bCs/>
-          <w:sz w:val="18"/>
-          <w:szCs w:val="18"/>
-        </w:rPr>
-        <w:t xml:space="preserve">Tobias — Junge an der Tür, 12. </w:t>
-      </w:r>
-      <w:r>
-        <w:rPr>
-          <w:rFonts w:ascii="Georgia" w:cs="Georgia" w:eastAsia="Georgia" w:hAnsi="Georgia"/>
-          <w:color w:val="333333"/>
-          <w:sz w:val="18"/>
-          <w:szCs w:val="18"/>
-        </w:rPr>
-        <w:t xml:space="preserve">Schnell, hoffnungsvoll, zu ehrlich. Er wartet seit drei Nächten auf jemanden wie euch.</w:t>
-      </w:r>
-    </w:p>
-    <w:p>
-      <w:pPr>
-        <w:pBdr>
-          <w:left w:val="single" w:color="BFBFBF" w:sz="18" w:space="8"/>
-        </w:pBdr>
-        <w:shd w:fill="F2F2F2" w:color="auto" w:val="clear"/>
-        <w:spacing w:after="40"/>
-        <w:ind w:left="120"/>
-      </w:pPr>
-      <w:r>
-        <w:rPr>
-          <w:rFonts w:ascii="Georgia" w:cs="Georgia" w:eastAsia="Georgia" w:hAnsi="Georgia"/>
-          <w:i/>
-          <w:iCs/>
-          <w:sz w:val="18"/>
-          <w:szCs w:val="18"/>
-        </w:rPr>
-        <w:t xml:space="preserve">„She wasn’t taken. She packed a bag.“  ·  „She said it was her turn. She said it like it was a shopping list.“  ·  „She said: tell them it’s for Lene. Lene is my sister. She’s nine.“</w:t>
-      </w:r>
-    </w:p>
-    <w:p>
-      <w:pPr>
-        <w:pBdr>
-          <w:left w:val="single" w:color="BFBFBF" w:sz="18" w:space="8"/>
-        </w:pBdr>
-        <w:shd w:fill="F2F2F2" w:color="auto" w:val="clear"/>
-        <w:spacing w:after="40"/>
-        <w:ind w:left="120"/>
-      </w:pPr>
-      <w:r>
-        <w:rPr>
-          <w:rFonts w:ascii="Georgia" w:cs="Georgia" w:eastAsia="Georgia" w:hAnsi="Georgia"/>
-          <w:color w:val="555555"/>
-          <w:sz w:val="17"/>
-          <w:szCs w:val="17"/>
-        </w:rPr>
-        <w:t xml:space="preserve">Notfalls: Redet niemand mit ihm, läuft er ihnen an der Tür nach und sagt den Satz mit dem Koffer.</w:t>
-      </w:r>
-    </w:p>
-    <w:p>
-      <w:pPr>
-        <w:pBdr>
-          <w:left w:val="single" w:color="BFBFBF" w:sz="18" w:space="8"/>
-        </w:pBdr>
-        <w:shd w:fill="F2F2F2" w:color="auto" w:val="clear"/>
-        <w:spacing w:after="140"/>
-        <w:ind w:left="120"/>
-      </w:pPr>
-      <w:r>
-        <w:rPr>
-          <w:rFonts w:ascii="Georgia" w:cs="Georgia" w:eastAsia="Georgia" w:hAnsi="Georgia"/>
-          <w:color w:val="555555"/>
-          <w:sz w:val="17"/>
-          <w:szCs w:val="17"/>
-        </w:rPr>
-        <w:t xml:space="preserve">Tobias ist Mirelas Lehrling. Er will mit ins Schloss. Er darf nicht mit — aber lass ihn fragen. Er bleibt im Dorf und wartet.</w:t>
       </w:r>
     </w:p>
     <w:p>
@@ -2104,7 +2123,7 @@
           <w:left w:val="single" w:color="74B094" w:sz="18" w:space="8"/>
         </w:pBdr>
         <w:shd w:fill="EAF4EC" w:color="auto" w:val="clear"/>
-        <w:spacing w:after="140"/>
+        <w:spacing w:after="40"/>
         <w:ind w:left="120"/>
       </w:pPr>
       <w:r>
@@ -2116,7 +2135,7 @@
           <w:sz w:val="16"/>
           <w:szCs w:val="16"/>
         </w:rPr>
-        <w:t xml:space="preserve">AUFGABE:  </w:t>
+        <w:t xml:space="preserve">DM SAGT DEN SCHÜLERN:  </w:t>
       </w:r>
       <w:r>
         <w:rPr>
@@ -2124,7 +2143,26 @@
           <w:sz w:val="19"/>
           <w:szCs w:val="19"/>
         </w:rPr>
-        <w:t xml:space="preserve">Jede Figur stellt mindestens eine Frage auf Englisch an eine der drei Personen — und hakt einmal nach. Von selbst wird hier nichts erzählt.  →  Helfer-Blatt · Teil 2</w:t>
+        <w:t xml:space="preserve">“Three people in this room will talk to you. Each of you asks at least one question — and one follow-up question. Nobody in here tells you anything by themselves.”</w:t>
+      </w:r>
+    </w:p>
+    <w:p>
+      <w:pPr>
+        <w:pBdr>
+          <w:left w:val="single" w:color="74B094" w:sz="18" w:space="8"/>
+        </w:pBdr>
+        <w:shd w:fill="EAF4EC" w:color="auto" w:val="clear"/>
+        <w:spacing w:after="140"/>
+        <w:ind w:left="120"/>
+      </w:pPr>
+      <w:r>
+        <w:rPr>
+          <w:rFonts w:ascii="Georgia" w:cs="Georgia" w:eastAsia="Georgia" w:hAnsi="Georgia"/>
+          <w:color w:val="555555"/>
+          <w:sz w:val="17"/>
+          <w:szCs w:val="17"/>
+        </w:rPr>
+        <w:t xml:space="preserve">Antwortmöglichkeiten unten abhaken, sobald eine Frage gestellt ist — jede nur einmal, egal von wem.  →  Helfer-Blatt · Teil 2</w:t>
       </w:r>
     </w:p>
     <w:p>
@@ -2145,7 +2183,7 @@
           <w:sz w:val="16"/>
           <w:szCs w:val="16"/>
         </w:rPr>
-        <w:t xml:space="preserve">WENN SIE FRAGEN — ANTWORTE SO (NUR DM)  </w:t>
+        <w:t xml:space="preserve">ANTWORTMÖGLICHKEITEN (NUR DM)  </w:t>
       </w:r>
     </w:p>
     <w:p>
@@ -2404,6 +2442,36 @@
     </w:p>
     <w:p>
       <w:pPr>
+        <w:pBdr>
+          <w:left w:val="single" w:color="BFBFBF" w:sz="18" w:space="8"/>
+        </w:pBdr>
+        <w:shd w:fill="F2F2F2" w:color="auto" w:val="clear"/>
+        <w:spacing w:after="140"/>
+        <w:ind w:left="120"/>
+      </w:pPr>
+      <w:r>
+        <w:rPr>
+          <w:rFonts w:ascii="Georgia" w:cs="Georgia" w:eastAsia="Georgia" w:hAnsi="Georgia"/>
+          <w:b/>
+          <w:bCs/>
+          <w:color w:val="555555"/>
+          <w:sz w:val="16"/>
+          <w:szCs w:val="16"/>
+        </w:rPr>
+        <w:t xml:space="preserve">NUR DM:  </w:t>
+      </w:r>
+      <w:r>
+        <w:rPr>
+          <w:rFonts w:ascii="Georgia" w:cs="Georgia" w:eastAsia="Georgia" w:hAnsi="Georgia"/>
+          <w:color w:val="333333"/>
+          <w:sz w:val="18"/>
+          <w:szCs w:val="18"/>
+        </w:rPr>
+        <w:t xml:space="preserve">Zeig die Karte, sobald jemand nach dem Weg fragt oder sich umsieht. Notfalls legt Greta sie von selbst hin, wenn die Gruppe aufbrechen will: „You’ll need this.“ Ohne die Karte geht es nicht weiter.</w:t>
+      </w:r>
+    </w:p>
+    <w:p>
+      <w:pPr>
         <w:spacing w:after="40" w:before="100"/>
       </w:pPr>
       <w:r>
@@ -2510,36 +2578,6 @@
           <w:szCs w:val="22"/>
         </w:rPr>
         <w:t xml:space="preserve">. And a third line with two words written next to it: “coach, midnight”.</w:t>
-      </w:r>
-    </w:p>
-    <w:p>
-      <w:pPr>
-        <w:pBdr>
-          <w:left w:val="single" w:color="BFBFBF" w:sz="18" w:space="8"/>
-        </w:pBdr>
-        <w:shd w:fill="F2F2F2" w:color="auto" w:val="clear"/>
-        <w:spacing w:after="140"/>
-        <w:ind w:left="120"/>
-      </w:pPr>
-      <w:r>
-        <w:rPr>
-          <w:rFonts w:ascii="Georgia" w:cs="Georgia" w:eastAsia="Georgia" w:hAnsi="Georgia"/>
-          <w:b/>
-          <w:bCs/>
-          <w:color w:val="555555"/>
-          <w:sz w:val="16"/>
-          <w:szCs w:val="16"/>
-        </w:rPr>
-        <w:t xml:space="preserve">NUR DM:  </w:t>
-      </w:r>
-      <w:r>
-        <w:rPr>
-          <w:rFonts w:ascii="Georgia" w:cs="Georgia" w:eastAsia="Georgia" w:hAnsi="Georgia"/>
-          <w:color w:val="333333"/>
-          <w:sz w:val="18"/>
-          <w:szCs w:val="18"/>
-        </w:rPr>
-        <w:t xml:space="preserve">Zeig die Karte, sobald jemand nach dem Weg fragt oder sich umsieht. Notfalls legt Greta sie von selbst hin, wenn die Gruppe aufbrechen will: „You’ll need this.“ Ohne die Karte geht es nicht weiter.</w:t>
       </w:r>
     </w:p>
     <w:p>
@@ -2745,7 +2783,7 @@
           <w:left w:val="single" w:color="74B094" w:sz="18" w:space="8"/>
         </w:pBdr>
         <w:shd w:fill="EAF4EC" w:color="auto" w:val="clear"/>
-        <w:spacing w:after="140"/>
+        <w:spacing w:after="40"/>
         <w:ind w:left="120"/>
       </w:pPr>
       <w:r>
@@ -2757,7 +2795,7 @@
           <w:sz w:val="16"/>
           <w:szCs w:val="16"/>
         </w:rPr>
-        <w:t xml:space="preserve">AUFGABE:  </w:t>
+        <w:t xml:space="preserve">DM SAGT DEN SCHÜLERN:  </w:t>
       </w:r>
       <w:r>
         <w:rPr>
@@ -2765,7 +2803,26 @@
           <w:sz w:val="19"/>
           <w:szCs w:val="19"/>
         </w:rPr>
-        <w:t xml:space="preserve">Jede Figur sagt einen vollständigen Satz dazu, welchen Weg sie will und warum — bevor abgestimmt wird.  →  Helfer-Blatt · Teil 3</w:t>
+        <w:t xml:space="preserve">“Before we vote: each of you says one full sentence. Which way do you want to take — and why?”</w:t>
+      </w:r>
+    </w:p>
+    <w:p>
+      <w:pPr>
+        <w:pBdr>
+          <w:left w:val="single" w:color="74B094" w:sz="18" w:space="8"/>
+        </w:pBdr>
+        <w:shd w:fill="EAF4EC" w:color="auto" w:val="clear"/>
+        <w:spacing w:after="140"/>
+        <w:ind w:left="120"/>
+      </w:pPr>
+      <w:r>
+        <w:rPr>
+          <w:rFonts w:ascii="Georgia" w:cs="Georgia" w:eastAsia="Georgia" w:hAnsi="Georgia"/>
+          <w:color w:val="555555"/>
+          <w:sz w:val="17"/>
+          <w:szCs w:val="17"/>
+        </w:rPr>
+        <w:t xml:space="preserve">Reihum. Bei Streit: „One minute, then we vote.“  →  Helfer-Blatt · Teil 3</w:t>
       </w:r>
     </w:p>
     <w:p>
@@ -2969,6 +3026,36 @@
     </w:p>
     <w:p>
       <w:pPr>
+        <w:pBdr>
+          <w:left w:val="single" w:color="BFBFBF" w:sz="18" w:space="8"/>
+        </w:pBdr>
+        <w:shd w:fill="F2F2F2" w:color="auto" w:val="clear"/>
+        <w:spacing w:after="140"/>
+        <w:ind w:left="120"/>
+      </w:pPr>
+      <w:r>
+        <w:rPr>
+          <w:rFonts w:ascii="Georgia" w:cs="Georgia" w:eastAsia="Georgia" w:hAnsi="Georgia"/>
+          <w:b/>
+          <w:bCs/>
+          <w:color w:val="555555"/>
+          <w:sz w:val="16"/>
+          <w:szCs w:val="16"/>
+        </w:rPr>
+        <w:t xml:space="preserve">NUR DM:  </w:t>
+      </w:r>
+      <w:r>
+        <w:rPr>
+          <w:rFonts w:ascii="Georgia" w:cs="Georgia" w:eastAsia="Georgia" w:hAnsi="Georgia"/>
+          <w:color w:val="333333"/>
+          <w:sz w:val="18"/>
+          <w:szCs w:val="18"/>
+        </w:rPr>
+        <w:t xml:space="preserve">Der erste Kampf des Abends. Geh ihn langsam durch: Jeder sagt zuerst auf Englisch, was er tut, dann drückt er seinen Knopf, dann liest er seinen gelben Satz vor. Fällt ein Wolf, läuft der andere weg — der Kampf muss nicht zu Ende gehen.</w:t>
+      </w:r>
+    </w:p>
+    <w:p>
+      <w:pPr>
         <w:spacing w:after="40" w:before="100"/>
       </w:pPr>
       <w:r>
@@ -3143,36 +3230,6 @@
           <w:szCs w:val="22"/>
         </w:rPr>
         <w:t xml:space="preserve">, watching you come. They are not barking. They are waiting for you to get closer.</w:t>
-      </w:r>
-    </w:p>
-    <w:p>
-      <w:pPr>
-        <w:pBdr>
-          <w:left w:val="single" w:color="BFBFBF" w:sz="18" w:space="8"/>
-        </w:pBdr>
-        <w:shd w:fill="F2F2F2" w:color="auto" w:val="clear"/>
-        <w:spacing w:after="140"/>
-        <w:ind w:left="120"/>
-      </w:pPr>
-      <w:r>
-        <w:rPr>
-          <w:rFonts w:ascii="Georgia" w:cs="Georgia" w:eastAsia="Georgia" w:hAnsi="Georgia"/>
-          <w:b/>
-          <w:bCs/>
-          <w:color w:val="555555"/>
-          <w:sz w:val="16"/>
-          <w:szCs w:val="16"/>
-        </w:rPr>
-        <w:t xml:space="preserve">NUR DM:  </w:t>
-      </w:r>
-      <w:r>
-        <w:rPr>
-          <w:rFonts w:ascii="Georgia" w:cs="Georgia" w:eastAsia="Georgia" w:hAnsi="Georgia"/>
-          <w:color w:val="333333"/>
-          <w:sz w:val="18"/>
-          <w:szCs w:val="18"/>
-        </w:rPr>
-        <w:t xml:space="preserve">Der erste Kampf des Abends. Geh ihn langsam durch: Jeder sagt zuerst auf Englisch, was er tut, dann drückt er seinen Knopf, dann liest er seinen gelben Satz vor. Fällt ein Wolf, läuft der andere weg — der Kampf muss nicht zu Ende gehen.</w:t>
       </w:r>
     </w:p>
     <w:p>
@@ -3333,7 +3390,7 @@
           <w:left w:val="single" w:color="74B094" w:sz="18" w:space="8"/>
         </w:pBdr>
         <w:shd w:fill="EAF4EC" w:color="auto" w:val="clear"/>
-        <w:spacing w:after="140"/>
+        <w:spacing w:after="40"/>
         <w:ind w:left="120"/>
       </w:pPr>
       <w:r>
@@ -3345,7 +3402,7 @@
           <w:sz w:val="16"/>
           <w:szCs w:val="16"/>
         </w:rPr>
-        <w:t xml:space="preserve">AUFGABE:  </w:t>
+        <w:t xml:space="preserve">DM SAGT DEN SCHÜLERN:  </w:t>
       </w:r>
       <w:r>
         <w:rPr>
@@ -3353,7 +3410,56 @@
           <w:sz w:val="19"/>
           <w:szCs w:val="19"/>
         </w:rPr>
-        <w:t xml:space="preserve">Jede Figur würfelt dreimal mit dem Knopf „Just roll a d20“. Unter 10: der Fuss bleibt hängen, −1 HP — trag es rechts ein. Lass sie dabei reden: „I’m stuck!“ — „Give me your hand!“  →  Helfer-Blatt · Teil 4</w:t>
+        <w:t xml:space="preserve">“Each of you rolls three times — press ‘Just roll a d20’. Under ten, your foot gets stuck and you lose one hit point. Talk to each other while you cross!”</w:t>
+      </w:r>
+    </w:p>
+    <w:p>
+      <w:pPr>
+        <w:pBdr>
+          <w:left w:val="single" w:color="74B094" w:sz="18" w:space="8"/>
+        </w:pBdr>
+        <w:shd w:fill="EAF4EC" w:color="auto" w:val="clear"/>
+        <w:spacing w:after="140"/>
+        <w:ind w:left="120"/>
+      </w:pPr>
+      <w:r>
+        <w:rPr>
+          <w:rFonts w:ascii="Georgia" w:cs="Georgia" w:eastAsia="Georgia" w:hAnsi="Georgia"/>
+          <w:color w:val="555555"/>
+          <w:sz w:val="17"/>
+          <w:szCs w:val="17"/>
+        </w:rPr>
+        <w:t xml:space="preserve">Schaden rechts eintragen.  →  Helfer-Blatt · Teil 4</w:t>
+      </w:r>
+    </w:p>
+    <w:p>
+      <w:pPr>
+        <w:pBdr>
+          <w:left w:val="single" w:color="BFBFBF" w:sz="18" w:space="8"/>
+        </w:pBdr>
+        <w:shd w:fill="F2F2F2" w:color="auto" w:val="clear"/>
+        <w:spacing w:after="140"/>
+        <w:ind w:left="120"/>
+      </w:pPr>
+      <w:r>
+        <w:rPr>
+          <w:rFonts w:ascii="Georgia" w:cs="Georgia" w:eastAsia="Georgia" w:hAnsi="Georgia"/>
+          <w:b/>
+          <w:bCs/>
+          <w:color w:val="555555"/>
+          <w:sz w:val="16"/>
+          <w:szCs w:val="16"/>
+        </w:rPr>
+        <w:t xml:space="preserve">NUR DM:  </w:t>
+      </w:r>
+      <w:r>
+        <w:rPr>
+          <w:rFonts w:ascii="Georgia" w:cs="Georgia" w:eastAsia="Georgia" w:hAnsi="Georgia"/>
+          <w:color w:val="333333"/>
+          <w:sz w:val="18"/>
+          <w:szCs w:val="18"/>
+        </w:rPr>
+        <w:t xml:space="preserve">Anschleichen: jede Figur würfelt einmal. Sind alle bei 10 oder höher, kommen sie an den Wachen vorbei. Ist auch nur einer darunter: Eine Wache dreht sich um — Knopf unten, Kampf, und die Gefahr steigt um 1.</w:t>
       </w:r>
     </w:p>
     <w:p>
@@ -3479,16 +3585,277 @@
           <w:sz w:val="16"/>
           <w:szCs w:val="16"/>
         </w:rPr>
-        <w:t xml:space="preserve">NUR DM:  </w:t>
-      </w:r>
-      <w:r>
-        <w:rPr>
-          <w:rFonts w:ascii="Georgia" w:cs="Georgia" w:eastAsia="Georgia" w:hAnsi="Georgia"/>
-          <w:color w:val="333333"/>
-          <w:sz w:val="18"/>
-          <w:szCs w:val="18"/>
-        </w:rPr>
-        <w:t xml:space="preserve">Anschleichen: jede Figur würfelt einmal. Sind alle bei 10 oder höher, kommen sie an den Wachen vorbei. Ist auch nur einer darunter: Eine Wache dreht sich um — Knopf unten, Kampf, und die Gefahr steigt um 1.</w:t>
+        <w:t xml:space="preserve">KNOPF (NUR DM):  </w:t>
+      </w:r>
+      <w:r>
+        <w:rPr>
+          <w:rFonts w:ascii="Georgia" w:cs="Georgia" w:eastAsia="Georgia" w:hAnsi="Georgia"/>
+          <w:color w:val="333333"/>
+          <w:sz w:val="18"/>
+          <w:szCs w:val="18"/>
+        </w:rPr>
+        <w:t xml:space="preserve">Das Anschleichen ist misslungen — eine Wache hat sie gesehen.  →  Kampf mit der Wache, Gefahr +1</w:t>
+      </w:r>
+    </w:p>
+    <w:p>
+      <w:pPr>
+        <w:spacing w:after="40" w:before="100"/>
+      </w:pPr>
+      <w:r>
+        <w:rPr>
+          <w:rFonts w:ascii="Georgia" w:cs="Georgia" w:eastAsia="Georgia" w:hAnsi="Georgia"/>
+          <w:b/>
+          <w:bCs/>
+          <w:color w:val="555555"/>
+          <w:sz w:val="19"/>
+          <w:szCs w:val="19"/>
+        </w:rPr>
+        <w:t xml:space="preserve">Im Hof</w:t>
+      </w:r>
+    </w:p>
+    <w:p>
+      <w:pPr>
+        <w:spacing w:after="110" w:line="320"/>
+      </w:pPr>
+      <w:r>
+        <w:rPr>
+          <w:rFonts w:ascii="Georgia" w:cs="Georgia" w:eastAsia="Georgia" w:hAnsi="Georgia"/>
+          <w:sz w:val="22"/>
+          <w:szCs w:val="22"/>
+        </w:rPr>
+        <w:t xml:space="preserve">Past the guards, through the gate</w:t>
+      </w:r>
+      <w:r>
+        <w:rPr>
+          <w:rFonts w:ascii="Georgia" w:cs="Georgia" w:eastAsia="Georgia" w:hAnsi="Georgia"/>
+          <w:sz w:val="22"/>
+          <w:szCs w:val="22"/>
+        </w:rPr>
+        <w:t xml:space="preserve"> that nobody ever closed — and you are standing in a square courtyard</w:t>
+      </w:r>
+      <w:r>
+        <w:rPr>
+          <w:rFonts w:ascii="Georgia" w:cs="Georgia" w:eastAsia="Georgia" w:hAnsi="Georgia"/>
+          <w:color w:val="7A5A1A"/>
+          <w:sz w:val="18"/>
+          <w:szCs w:val="18"/>
+        </w:rPr>
+        <w:t xml:space="preserve"> [Innenhof]</w:t>
+      </w:r>
+      <w:r>
+        <w:rPr>
+          <w:rFonts w:ascii="Georgia" w:cs="Georgia" w:eastAsia="Georgia" w:hAnsi="Georgia"/>
+          <w:sz w:val="22"/>
+          <w:szCs w:val="22"/>
+        </w:rPr>
+        <w:t xml:space="preserve"> of black stone</w:t>
+      </w:r>
+      <w:r>
+        <w:rPr>
+          <w:rFonts w:ascii="Georgia" w:cs="Georgia" w:eastAsia="Georgia" w:hAnsi="Georgia"/>
+          <w:color w:val="7A5A1A"/>
+          <w:sz w:val="18"/>
+          <w:szCs w:val="18"/>
+        </w:rPr>
+        <w:t xml:space="preserve"> [schwarzer Stein]</w:t>
+      </w:r>
+      <w:r>
+        <w:rPr>
+          <w:rFonts w:ascii="Georgia" w:cs="Georgia" w:eastAsia="Georgia" w:hAnsi="Georgia"/>
+          <w:sz w:val="22"/>
+          <w:szCs w:val="22"/>
+        </w:rPr>
+        <w:t xml:space="preserve">.</w:t>
+      </w:r>
+    </w:p>
+    <w:p>
+      <w:pPr>
+        <w:spacing w:after="60" w:before="120"/>
+      </w:pPr>
+      <w:r>
+        <w:rPr>
+          <w:rFonts w:ascii="Georgia" w:cs="Georgia" w:eastAsia="Georgia" w:hAnsi="Georgia"/>
+          <w:b/>
+          <w:bCs/>
+          <w:color w:val="7A5A1A"/>
+          <w:sz w:val="17"/>
+          <w:szCs w:val="17"/>
+        </w:rPr>
+        <w:t xml:space="preserve">▸ Nur bei: Weg B · Stollen</w:t>
+      </w:r>
+    </w:p>
+    <w:p>
+      <w:pPr>
+        <w:spacing w:after="40" w:before="100"/>
+      </w:pPr>
+      <w:r>
+        <w:rPr>
+          <w:rFonts w:ascii="Georgia" w:cs="Georgia" w:eastAsia="Georgia" w:hAnsi="Georgia"/>
+          <w:b/>
+          <w:bCs/>
+          <w:color w:val="555555"/>
+          <w:sz w:val="19"/>
+          <w:szCs w:val="19"/>
+        </w:rPr>
+        <w:t xml:space="preserve">Der Stollen</w:t>
+      </w:r>
+    </w:p>
+    <w:p>
+      <w:pPr>
+        <w:spacing w:after="110" w:line="320"/>
+      </w:pPr>
+      <w:r>
+        <w:rPr>
+          <w:rFonts w:ascii="Georgia" w:cs="Georgia" w:eastAsia="Georgia" w:hAnsi="Georgia"/>
+          <w:sz w:val="22"/>
+          <w:szCs w:val="22"/>
+        </w:rPr>
+        <w:t xml:space="preserve">The mine entrance</w:t>
+      </w:r>
+      <w:r>
+        <w:rPr>
+          <w:rFonts w:ascii="Georgia" w:cs="Georgia" w:eastAsia="Georgia" w:hAnsi="Georgia"/>
+          <w:color w:val="7A5A1A"/>
+          <w:sz w:val="18"/>
+          <w:szCs w:val="18"/>
+        </w:rPr>
+        <w:t xml:space="preserve"> [Stolleneingang]</w:t>
+      </w:r>
+      <w:r>
+        <w:rPr>
+          <w:rFonts w:ascii="Georgia" w:cs="Georgia" w:eastAsia="Georgia" w:hAnsi="Georgia"/>
+          <w:sz w:val="22"/>
+          <w:szCs w:val="22"/>
+        </w:rPr>
+        <w:t xml:space="preserve"> is a hole behind a dead tree</w:t>
+      </w:r>
+      <w:r>
+        <w:rPr>
+          <w:rFonts w:ascii="Georgia" w:cs="Georgia" w:eastAsia="Georgia" w:hAnsi="Georgia"/>
+          <w:color w:val="7A5A1A"/>
+          <w:sz w:val="18"/>
+          <w:szCs w:val="18"/>
+        </w:rPr>
+        <w:t xml:space="preserve"> [toter Baum]</w:t>
+      </w:r>
+      <w:r>
+        <w:rPr>
+          <w:rFonts w:ascii="Georgia" w:cs="Georgia" w:eastAsia="Georgia" w:hAnsi="Georgia"/>
+          <w:sz w:val="22"/>
+          <w:szCs w:val="22"/>
+        </w:rPr>
+        <w:t xml:space="preserve"> above the village, and it is smaller than all of you.</w:t>
+      </w:r>
+    </w:p>
+    <w:p>
+      <w:pPr>
+        <w:spacing w:after="110" w:line="320"/>
+      </w:pPr>
+      <w:r>
+        <w:rPr>
+          <w:rFonts w:ascii="Georgia" w:cs="Georgia" w:eastAsia="Georgia" w:hAnsi="Georgia"/>
+          <w:sz w:val="22"/>
+          <w:szCs w:val="22"/>
+        </w:rPr>
+        <w:t xml:space="preserve">Four hours in the dark. After two, the air turns sweet and heavy</w:t>
+      </w:r>
+      <w:r>
+        <w:rPr>
+          <w:rFonts w:ascii="Georgia" w:cs="Georgia" w:eastAsia="Georgia" w:hAnsi="Georgia"/>
+          <w:color w:val="7A5A1A"/>
+          <w:sz w:val="18"/>
+          <w:szCs w:val="18"/>
+        </w:rPr>
+        <w:t xml:space="preserve"> [süss und schwer]</w:t>
+      </w:r>
+      <w:r>
+        <w:rPr>
+          <w:rFonts w:ascii="Georgia" w:cs="Georgia" w:eastAsia="Georgia" w:hAnsi="Georgia"/>
+          <w:sz w:val="22"/>
+          <w:szCs w:val="22"/>
+        </w:rPr>
+        <w:t xml:space="preserve"> and everybody’s head starts to hurt</w:t>
+      </w:r>
+      <w:r>
+        <w:rPr>
+          <w:rFonts w:ascii="Georgia" w:cs="Georgia" w:eastAsia="Georgia" w:hAnsi="Georgia"/>
+          <w:color w:val="7A5A1A"/>
+          <w:sz w:val="18"/>
+          <w:szCs w:val="18"/>
+        </w:rPr>
+        <w:t xml:space="preserve"> [verletzt]</w:t>
+      </w:r>
+      <w:r>
+        <w:rPr>
+          <w:rFonts w:ascii="Georgia" w:cs="Georgia" w:eastAsia="Georgia" w:hAnsi="Georgia"/>
+          <w:sz w:val="22"/>
+          <w:szCs w:val="22"/>
+        </w:rPr>
+        <w:t xml:space="preserve"> — you each lose two hit points.</w:t>
+      </w:r>
+    </w:p>
+    <w:p>
+      <w:pPr>
+        <w:spacing w:after="110" w:line="320"/>
+      </w:pPr>
+      <w:r>
+        <w:rPr>
+          <w:rFonts w:ascii="Georgia" w:cs="Georgia" w:eastAsia="Georgia" w:hAnsi="Georgia"/>
+          <w:sz w:val="22"/>
+          <w:szCs w:val="22"/>
+        </w:rPr>
+        <w:t xml:space="preserve">After three, you find what is left of the Kessler family: tools</w:t>
+      </w:r>
+      <w:r>
+        <w:rPr>
+          <w:rFonts w:ascii="Georgia" w:cs="Georgia" w:eastAsia="Georgia" w:hAnsi="Georgia"/>
+          <w:color w:val="7A5A1A"/>
+          <w:sz w:val="18"/>
+          <w:szCs w:val="18"/>
+        </w:rPr>
+        <w:t xml:space="preserve"> [Werkzeuge]</w:t>
+      </w:r>
+      <w:r>
+        <w:rPr>
+          <w:rFonts w:ascii="Georgia" w:cs="Georgia" w:eastAsia="Georgia" w:hAnsi="Georgia"/>
+          <w:sz w:val="22"/>
+          <w:szCs w:val="22"/>
+        </w:rPr>
+        <w:t xml:space="preserve">, a child’s shoe</w:t>
+      </w:r>
+      <w:r>
+        <w:rPr>
+          <w:rFonts w:ascii="Georgia" w:cs="Georgia" w:eastAsia="Georgia" w:hAnsi="Georgia"/>
+          <w:color w:val="7A5A1A"/>
+          <w:sz w:val="18"/>
+          <w:szCs w:val="18"/>
+        </w:rPr>
+        <w:t xml:space="preserve"> [Kinderschuh]</w:t>
+      </w:r>
+      <w:r>
+        <w:rPr>
+          <w:rFonts w:ascii="Georgia" w:cs="Georgia" w:eastAsia="Georgia" w:hAnsi="Georgia"/>
+          <w:sz w:val="22"/>
+          <w:szCs w:val="22"/>
+        </w:rPr>
+        <w:t xml:space="preserve">, and a lamp that somebody put down neatly</w:t>
+      </w:r>
+      <w:r>
+        <w:rPr>
+          <w:rFonts w:ascii="Georgia" w:cs="Georgia" w:eastAsia="Georgia" w:hAnsi="Georgia"/>
+          <w:color w:val="7A5A1A"/>
+          <w:sz w:val="18"/>
+          <w:szCs w:val="18"/>
+        </w:rPr>
+        <w:t xml:space="preserve"> [ordentlich]</w:t>
+      </w:r>
+      <w:r>
+        <w:rPr>
+          <w:rFonts w:ascii="Georgia" w:cs="Georgia" w:eastAsia="Georgia" w:hAnsi="Georgia"/>
+          <w:sz w:val="22"/>
+          <w:szCs w:val="22"/>
+        </w:rPr>
+        <w:t xml:space="preserve"> before they stopped needing it.</w:t>
       </w:r>
     </w:p>
     <w:p>
@@ -3518,268 +3885,7 @@
           <w:sz w:val="18"/>
           <w:szCs w:val="18"/>
         </w:rPr>
-        <w:t xml:space="preserve">Das Anschleichen ist misslungen — eine Wache hat sie gesehen.  →  Kampf mit der Wache, Gefahr +1</w:t>
-      </w:r>
-    </w:p>
-    <w:p>
-      <w:pPr>
-        <w:spacing w:after="40" w:before="100"/>
-      </w:pPr>
-      <w:r>
-        <w:rPr>
-          <w:rFonts w:ascii="Georgia" w:cs="Georgia" w:eastAsia="Georgia" w:hAnsi="Georgia"/>
-          <w:b/>
-          <w:bCs/>
-          <w:color w:val="555555"/>
-          <w:sz w:val="19"/>
-          <w:szCs w:val="19"/>
-        </w:rPr>
-        <w:t xml:space="preserve">Im Hof</w:t>
-      </w:r>
-    </w:p>
-    <w:p>
-      <w:pPr>
-        <w:spacing w:after="110" w:line="320"/>
-      </w:pPr>
-      <w:r>
-        <w:rPr>
-          <w:rFonts w:ascii="Georgia" w:cs="Georgia" w:eastAsia="Georgia" w:hAnsi="Georgia"/>
-          <w:sz w:val="22"/>
-          <w:szCs w:val="22"/>
-        </w:rPr>
-        <w:t xml:space="preserve">Past the guards, through the gate</w:t>
-      </w:r>
-      <w:r>
-        <w:rPr>
-          <w:rFonts w:ascii="Georgia" w:cs="Georgia" w:eastAsia="Georgia" w:hAnsi="Georgia"/>
-          <w:sz w:val="22"/>
-          <w:szCs w:val="22"/>
-        </w:rPr>
-        <w:t xml:space="preserve"> that nobody ever closed — and you are standing in a square courtyard</w:t>
-      </w:r>
-      <w:r>
-        <w:rPr>
-          <w:rFonts w:ascii="Georgia" w:cs="Georgia" w:eastAsia="Georgia" w:hAnsi="Georgia"/>
-          <w:color w:val="7A5A1A"/>
-          <w:sz w:val="18"/>
-          <w:szCs w:val="18"/>
-        </w:rPr>
-        <w:t xml:space="preserve"> [Innenhof]</w:t>
-      </w:r>
-      <w:r>
-        <w:rPr>
-          <w:rFonts w:ascii="Georgia" w:cs="Georgia" w:eastAsia="Georgia" w:hAnsi="Georgia"/>
-          <w:sz w:val="22"/>
-          <w:szCs w:val="22"/>
-        </w:rPr>
-        <w:t xml:space="preserve"> of black stone</w:t>
-      </w:r>
-      <w:r>
-        <w:rPr>
-          <w:rFonts w:ascii="Georgia" w:cs="Georgia" w:eastAsia="Georgia" w:hAnsi="Georgia"/>
-          <w:color w:val="7A5A1A"/>
-          <w:sz w:val="18"/>
-          <w:szCs w:val="18"/>
-        </w:rPr>
-        <w:t xml:space="preserve"> [schwarzer Stein]</w:t>
-      </w:r>
-      <w:r>
-        <w:rPr>
-          <w:rFonts w:ascii="Georgia" w:cs="Georgia" w:eastAsia="Georgia" w:hAnsi="Georgia"/>
-          <w:sz w:val="22"/>
-          <w:szCs w:val="22"/>
-        </w:rPr>
-        <w:t xml:space="preserve">.</w:t>
-      </w:r>
-    </w:p>
-    <w:p>
-      <w:pPr>
-        <w:spacing w:after="60" w:before="120"/>
-      </w:pPr>
-      <w:r>
-        <w:rPr>
-          <w:rFonts w:ascii="Georgia" w:cs="Georgia" w:eastAsia="Georgia" w:hAnsi="Georgia"/>
-          <w:b/>
-          <w:bCs/>
-          <w:color w:val="7A5A1A"/>
-          <w:sz w:val="17"/>
-          <w:szCs w:val="17"/>
-        </w:rPr>
-        <w:t xml:space="preserve">▸ Nur bei: Weg B · Stollen</w:t>
-      </w:r>
-    </w:p>
-    <w:p>
-      <w:pPr>
-        <w:spacing w:after="40" w:before="100"/>
-      </w:pPr>
-      <w:r>
-        <w:rPr>
-          <w:rFonts w:ascii="Georgia" w:cs="Georgia" w:eastAsia="Georgia" w:hAnsi="Georgia"/>
-          <w:b/>
-          <w:bCs/>
-          <w:color w:val="555555"/>
-          <w:sz w:val="19"/>
-          <w:szCs w:val="19"/>
-        </w:rPr>
-        <w:t xml:space="preserve">Der Stollen</w:t>
-      </w:r>
-    </w:p>
-    <w:p>
-      <w:pPr>
-        <w:spacing w:after="110" w:line="320"/>
-      </w:pPr>
-      <w:r>
-        <w:rPr>
-          <w:rFonts w:ascii="Georgia" w:cs="Georgia" w:eastAsia="Georgia" w:hAnsi="Georgia"/>
-          <w:sz w:val="22"/>
-          <w:szCs w:val="22"/>
-        </w:rPr>
-        <w:t xml:space="preserve">The mine entrance</w:t>
-      </w:r>
-      <w:r>
-        <w:rPr>
-          <w:rFonts w:ascii="Georgia" w:cs="Georgia" w:eastAsia="Georgia" w:hAnsi="Georgia"/>
-          <w:color w:val="7A5A1A"/>
-          <w:sz w:val="18"/>
-          <w:szCs w:val="18"/>
-        </w:rPr>
-        <w:t xml:space="preserve"> [Stolleneingang]</w:t>
-      </w:r>
-      <w:r>
-        <w:rPr>
-          <w:rFonts w:ascii="Georgia" w:cs="Georgia" w:eastAsia="Georgia" w:hAnsi="Georgia"/>
-          <w:sz w:val="22"/>
-          <w:szCs w:val="22"/>
-        </w:rPr>
-        <w:t xml:space="preserve"> is a hole behind a dead tree</w:t>
-      </w:r>
-      <w:r>
-        <w:rPr>
-          <w:rFonts w:ascii="Georgia" w:cs="Georgia" w:eastAsia="Georgia" w:hAnsi="Georgia"/>
-          <w:color w:val="7A5A1A"/>
-          <w:sz w:val="18"/>
-          <w:szCs w:val="18"/>
-        </w:rPr>
-        <w:t xml:space="preserve"> [toter Baum]</w:t>
-      </w:r>
-      <w:r>
-        <w:rPr>
-          <w:rFonts w:ascii="Georgia" w:cs="Georgia" w:eastAsia="Georgia" w:hAnsi="Georgia"/>
-          <w:sz w:val="22"/>
-          <w:szCs w:val="22"/>
-        </w:rPr>
-        <w:t xml:space="preserve"> above the village, and it is smaller than all of you.</w:t>
-      </w:r>
-    </w:p>
-    <w:p>
-      <w:pPr>
-        <w:spacing w:after="110" w:line="320"/>
-      </w:pPr>
-      <w:r>
-        <w:rPr>
-          <w:rFonts w:ascii="Georgia" w:cs="Georgia" w:eastAsia="Georgia" w:hAnsi="Georgia"/>
-          <w:sz w:val="22"/>
-          <w:szCs w:val="22"/>
-        </w:rPr>
-        <w:t xml:space="preserve">Four hours in the dark. After two, the air turns sweet and heavy</w:t>
-      </w:r>
-      <w:r>
-        <w:rPr>
-          <w:rFonts w:ascii="Georgia" w:cs="Georgia" w:eastAsia="Georgia" w:hAnsi="Georgia"/>
-          <w:color w:val="7A5A1A"/>
-          <w:sz w:val="18"/>
-          <w:szCs w:val="18"/>
-        </w:rPr>
-        <w:t xml:space="preserve"> [süss und schwer]</w:t>
-      </w:r>
-      <w:r>
-        <w:rPr>
-          <w:rFonts w:ascii="Georgia" w:cs="Georgia" w:eastAsia="Georgia" w:hAnsi="Georgia"/>
-          <w:sz w:val="22"/>
-          <w:szCs w:val="22"/>
-        </w:rPr>
-        <w:t xml:space="preserve"> and everybody’s head starts to hurt</w:t>
-      </w:r>
-      <w:r>
-        <w:rPr>
-          <w:rFonts w:ascii="Georgia" w:cs="Georgia" w:eastAsia="Georgia" w:hAnsi="Georgia"/>
-          <w:color w:val="7A5A1A"/>
-          <w:sz w:val="18"/>
-          <w:szCs w:val="18"/>
-        </w:rPr>
-        <w:t xml:space="preserve"> [verletzt]</w:t>
-      </w:r>
-      <w:r>
-        <w:rPr>
-          <w:rFonts w:ascii="Georgia" w:cs="Georgia" w:eastAsia="Georgia" w:hAnsi="Georgia"/>
-          <w:sz w:val="22"/>
-          <w:szCs w:val="22"/>
-        </w:rPr>
-        <w:t xml:space="preserve"> — you each lose two hit points.</w:t>
-      </w:r>
-    </w:p>
-    <w:p>
-      <w:pPr>
-        <w:spacing w:after="110" w:line="320"/>
-      </w:pPr>
-      <w:r>
-        <w:rPr>
-          <w:rFonts w:ascii="Georgia" w:cs="Georgia" w:eastAsia="Georgia" w:hAnsi="Georgia"/>
-          <w:sz w:val="22"/>
-          <w:szCs w:val="22"/>
-        </w:rPr>
-        <w:t xml:space="preserve">After three, you find what is left of the Kessler family: tools</w:t>
-      </w:r>
-      <w:r>
-        <w:rPr>
-          <w:rFonts w:ascii="Georgia" w:cs="Georgia" w:eastAsia="Georgia" w:hAnsi="Georgia"/>
-          <w:color w:val="7A5A1A"/>
-          <w:sz w:val="18"/>
-          <w:szCs w:val="18"/>
-        </w:rPr>
-        <w:t xml:space="preserve"> [Werkzeuge]</w:t>
-      </w:r>
-      <w:r>
-        <w:rPr>
-          <w:rFonts w:ascii="Georgia" w:cs="Georgia" w:eastAsia="Georgia" w:hAnsi="Georgia"/>
-          <w:sz w:val="22"/>
-          <w:szCs w:val="22"/>
-        </w:rPr>
-        <w:t xml:space="preserve">, a child’s shoe</w:t>
-      </w:r>
-      <w:r>
-        <w:rPr>
-          <w:rFonts w:ascii="Georgia" w:cs="Georgia" w:eastAsia="Georgia" w:hAnsi="Georgia"/>
-          <w:color w:val="7A5A1A"/>
-          <w:sz w:val="18"/>
-          <w:szCs w:val="18"/>
-        </w:rPr>
-        <w:t xml:space="preserve"> [Kinderschuh]</w:t>
-      </w:r>
-      <w:r>
-        <w:rPr>
-          <w:rFonts w:ascii="Georgia" w:cs="Georgia" w:eastAsia="Georgia" w:hAnsi="Georgia"/>
-          <w:sz w:val="22"/>
-          <w:szCs w:val="22"/>
-        </w:rPr>
-        <w:t xml:space="preserve">, and a lamp that somebody put down neatly</w:t>
-      </w:r>
-      <w:r>
-        <w:rPr>
-          <w:rFonts w:ascii="Georgia" w:cs="Georgia" w:eastAsia="Georgia" w:hAnsi="Georgia"/>
-          <w:color w:val="7A5A1A"/>
-          <w:sz w:val="18"/>
-          <w:szCs w:val="18"/>
-        </w:rPr>
-        <w:t xml:space="preserve"> [ordentlich]</w:t>
-      </w:r>
-      <w:r>
-        <w:rPr>
-          <w:rFonts w:ascii="Georgia" w:cs="Georgia" w:eastAsia="Georgia" w:hAnsi="Georgia"/>
-          <w:sz w:val="22"/>
-          <w:szCs w:val="22"/>
-        </w:rPr>
-        <w:t xml:space="preserve"> before they stopped needing it.</w:t>
+        <w:t xml:space="preserve">Die schlechte Luft anwenden — dann stimmen die Werte rechts.  →  −2 HP für alle</w:t>
       </w:r>
     </w:p>
     <w:p>
@@ -3800,16 +3906,16 @@
           <w:sz w:val="16"/>
           <w:szCs w:val="16"/>
         </w:rPr>
-        <w:t xml:space="preserve">KNOPF (NUR DM):  </w:t>
-      </w:r>
-      <w:r>
-        <w:rPr>
-          <w:rFonts w:ascii="Georgia" w:cs="Georgia" w:eastAsia="Georgia" w:hAnsi="Georgia"/>
-          <w:color w:val="333333"/>
-          <w:sz w:val="18"/>
-          <w:szCs w:val="18"/>
-        </w:rPr>
-        <w:t xml:space="preserve">Die schlechte Luft anwenden — dann stimmen die Werte rechts.  →  −2 HP für alle</w:t>
+        <w:t xml:space="preserve">NUR DM:  </w:t>
+      </w:r>
+      <w:r>
+        <w:rPr>
+          <w:rFonts w:ascii="Georgia" w:cs="Georgia" w:eastAsia="Georgia" w:hAnsi="Georgia"/>
+          <w:color w:val="333333"/>
+          <w:sz w:val="18"/>
+          <w:szCs w:val="18"/>
+        </w:rPr>
+        <w:t xml:space="preserve">Die Regel: Trägt jede Figur einen ganzen englischen Satz bei und droht niemand, glaubt er ihnen — „Guests. Of course. Follow me.“ — und bringt sie hinauf. Stottert die Gruppe, droht jemand, oder greift jemand an: Knopf unten, Kampf, und die Gefahr steigt um 1.</w:t>
       </w:r>
     </w:p>
     <w:p>
@@ -4025,7 +4131,7 @@
           <w:left w:val="single" w:color="74B094" w:sz="18" w:space="8"/>
         </w:pBdr>
         <w:shd w:fill="EAF4EC" w:color="auto" w:val="clear"/>
-        <w:spacing w:after="140"/>
+        <w:spacing w:after="40"/>
         <w:ind w:left="120"/>
       </w:pPr>
       <w:r>
@@ -4037,7 +4143,7 @@
           <w:sz w:val="16"/>
           <w:szCs w:val="16"/>
         </w:rPr>
-        <w:t xml:space="preserve">AUFGABE:  </w:t>
+        <w:t xml:space="preserve">DM SAGT DEN SCHÜLERN:  </w:t>
       </w:r>
       <w:r>
         <w:rPr>
@@ -4045,7 +4151,51 @@
           <w:sz w:val="19"/>
           <w:szCs w:val="19"/>
         </w:rPr>
-        <w:t xml:space="preserve">Die Gruppe muss die Wache überzeugen, dass sie Gäste sind — jede Figur einen Satz. Ruhig, freundlich, mit einem Grund. Hier wird nicht gewürfelt, hier wird geredet.  →  Helfer-Blatt · Teil 4</w:t>
+        <w:t xml:space="preserve">“The guard</w:t>
+      </w:r>
+      <w:r>
+        <w:rPr>
+          <w:rFonts w:ascii="Georgia" w:cs="Georgia" w:eastAsia="Georgia" w:hAnsi="Georgia"/>
+          <w:sz w:val="19"/>
+          <w:szCs w:val="19"/>
+        </w:rPr>
+        <w:t xml:space="preserve"> is waiting. Convince him that you are guests</w:t>
+      </w:r>
+      <w:r>
+        <w:rPr>
+          <w:rFonts w:ascii="Georgia" w:cs="Georgia" w:eastAsia="Georgia" w:hAnsi="Georgia"/>
+          <w:color w:val="7A5A1A"/>
+          <w:sz w:val="15"/>
+          <w:szCs w:val="15"/>
+        </w:rPr>
+        <w:t xml:space="preserve"> [Gäste]</w:t>
+      </w:r>
+      <w:r>
+        <w:rPr>
+          <w:rFonts w:ascii="Georgia" w:cs="Georgia" w:eastAsia="Georgia" w:hAnsi="Georgia"/>
+          <w:sz w:val="19"/>
+          <w:szCs w:val="19"/>
+        </w:rPr>
+        <w:t xml:space="preserve"> — each of you one sentence. Calm, friendly, and give him a reason. No dice here. You talk.”</w:t>
+      </w:r>
+    </w:p>
+    <w:p>
+      <w:pPr>
+        <w:pBdr>
+          <w:left w:val="single" w:color="74B094" w:sz="18" w:space="8"/>
+        </w:pBdr>
+        <w:shd w:fill="EAF4EC" w:color="auto" w:val="clear"/>
+        <w:spacing w:after="140"/>
+        <w:ind w:left="120"/>
+      </w:pPr>
+      <w:r>
+        <w:rPr>
+          <w:rFonts w:ascii="Georgia" w:cs="Georgia" w:eastAsia="Georgia" w:hAnsi="Georgia"/>
+          <w:color w:val="555555"/>
+          <w:sz w:val="17"/>
+          <w:szCs w:val="17"/>
+        </w:rPr>
+        <w:t xml:space="preserve">Jeder ein ganzer Satz, keine Drohung → er glaubt ihnen. Sonst der Knopf unten.  →  Helfer-Blatt · Teil 4</w:t>
       </w:r>
     </w:p>
     <w:p>
@@ -4066,16 +4216,93 @@
           <w:sz w:val="16"/>
           <w:szCs w:val="16"/>
         </w:rPr>
-        <w:t xml:space="preserve">NUR DM:  </w:t>
-      </w:r>
-      <w:r>
-        <w:rPr>
-          <w:rFonts w:ascii="Georgia" w:cs="Georgia" w:eastAsia="Georgia" w:hAnsi="Georgia"/>
-          <w:color w:val="333333"/>
-          <w:sz w:val="18"/>
-          <w:szCs w:val="18"/>
-        </w:rPr>
-        <w:t xml:space="preserve">Die Regel: Trägt jede Figur einen ganzen englischen Satz bei und droht niemand, glaubt er ihnen — „Guests. Of course. Follow me.“ — und bringt sie hinauf. Stottert die Gruppe, droht jemand, oder greift jemand an: Knopf unten, Kampf, und die Gefahr steigt um 1.</w:t>
+        <w:t xml:space="preserve">KNOPF (NUR DM):  </w:t>
+      </w:r>
+      <w:r>
+        <w:rPr>
+          <w:rFonts w:ascii="Georgia" w:cs="Georgia" w:eastAsia="Georgia" w:hAnsi="Georgia"/>
+          <w:color w:val="333333"/>
+          <w:sz w:val="18"/>
+          <w:szCs w:val="18"/>
+        </w:rPr>
+        <w:t xml:space="preserve">Die Wache glaubt ihnen nicht.  →  Kampf mit der Wache, Gefahr +1</w:t>
+      </w:r>
+    </w:p>
+    <w:p>
+      <w:pPr>
+        <w:spacing w:after="40" w:before="100"/>
+      </w:pPr>
+      <w:r>
+        <w:rPr>
+          <w:rFonts w:ascii="Georgia" w:cs="Georgia" w:eastAsia="Georgia" w:hAnsi="Georgia"/>
+          <w:b/>
+          <w:bCs/>
+          <w:color w:val="555555"/>
+          <w:sz w:val="19"/>
+          <w:szCs w:val="19"/>
+        </w:rPr>
+        <w:t xml:space="preserve">Hinauf in den Hof</w:t>
+      </w:r>
+    </w:p>
+    <w:p>
+      <w:pPr>
+        <w:spacing w:after="110" w:line="320"/>
+      </w:pPr>
+      <w:r>
+        <w:rPr>
+          <w:rFonts w:ascii="Georgia" w:cs="Georgia" w:eastAsia="Georgia" w:hAnsi="Georgia"/>
+          <w:sz w:val="22"/>
+          <w:szCs w:val="22"/>
+        </w:rPr>
+        <w:t xml:space="preserve">Up the cellar</w:t>
+      </w:r>
+      <w:r>
+        <w:rPr>
+          <w:rFonts w:ascii="Georgia" w:cs="Georgia" w:eastAsia="Georgia" w:hAnsi="Georgia"/>
+          <w:sz w:val="22"/>
+          <w:szCs w:val="22"/>
+        </w:rPr>
+        <w:t xml:space="preserve"> stair</w:t>
+      </w:r>
+      <w:r>
+        <w:rPr>
+          <w:rFonts w:ascii="Georgia" w:cs="Georgia" w:eastAsia="Georgia" w:hAnsi="Georgia"/>
+          <w:sz w:val="22"/>
+          <w:szCs w:val="22"/>
+        </w:rPr>
+        <w:t xml:space="preserve">, through a low door — and you are standing in a square courtyard</w:t>
+      </w:r>
+      <w:r>
+        <w:rPr>
+          <w:rFonts w:ascii="Georgia" w:cs="Georgia" w:eastAsia="Georgia" w:hAnsi="Georgia"/>
+          <w:sz w:val="22"/>
+          <w:szCs w:val="22"/>
+        </w:rPr>
+        <w:t xml:space="preserve"> of black stone</w:t>
+      </w:r>
+      <w:r>
+        <w:rPr>
+          <w:rFonts w:ascii="Georgia" w:cs="Georgia" w:eastAsia="Georgia" w:hAnsi="Georgia"/>
+          <w:sz w:val="22"/>
+          <w:szCs w:val="22"/>
+        </w:rPr>
+        <w:t xml:space="preserve">, with the night sky above you for the first time in five hours.</w:t>
+      </w:r>
+    </w:p>
+    <w:p>
+      <w:pPr>
+        <w:spacing w:after="60" w:before="120"/>
+      </w:pPr>
+      <w:r>
+        <w:rPr>
+          <w:rFonts w:ascii="Georgia" w:cs="Georgia" w:eastAsia="Georgia" w:hAnsi="Georgia"/>
+          <w:b/>
+          <w:bCs/>
+          <w:color w:val="7A5A1A"/>
+          <w:sz w:val="17"/>
+          <w:szCs w:val="17"/>
+        </w:rPr>
+        <w:t xml:space="preserve">▸ Nur bei: Weg C · Kutsche</w:t>
       </w:r>
     </w:p>
     <w:p>
@@ -4096,16 +4323,17 @@
           <w:sz w:val="16"/>
           <w:szCs w:val="16"/>
         </w:rPr>
-        <w:t xml:space="preserve">KNOPF (NUR DM):  </w:t>
-      </w:r>
-      <w:r>
-        <w:rPr>
-          <w:rFonts w:ascii="Georgia" w:cs="Georgia" w:eastAsia="Georgia" w:hAnsi="Georgia"/>
-          <w:color w:val="333333"/>
-          <w:sz w:val="18"/>
-          <w:szCs w:val="18"/>
-        </w:rPr>
-        <w:t xml:space="preserve">Die Wache glaubt ihnen nicht.  →  Kampf mit der Wache, Gefahr +1</w:t>
+        <w:t xml:space="preserve">NUR DM:  </w:t>
+      </w:r>
+      <w:r>
+        <w:rPr>
+          <w:rFonts w:ascii="Georgia" w:cs="Georgia" w:eastAsia="Georgia" w:hAnsi="Georgia"/>
+          <w:color w:val="333333"/>
+          <w:sz w:val="18"/>
+          <w:szCs w:val="18"/>
+        </w:rPr>
+        <w:t xml:space="preserve">Spiel ihn freundlich und stell den Spielern seine Fragen: „And what are your names?“ — „And what do you want up there?“ — „You’re not from the village, are you?“
+ Drei Dinge dürfen sie von selbst merken: Er sagt nie Mirelas Namen. Seine Hände sind kalt. Und im Kutschenfenster spiegelt sich alles ausser ihm. Merkt es niemand, ist das kein Problem — die Gefahr ist schon eingetragen.</w:t>
       </w:r>
     </w:p>
     <w:p>
@@ -4121,7 +4349,7 @@
           <w:sz w:val="19"/>
           <w:szCs w:val="19"/>
         </w:rPr>
-        <w:t xml:space="preserve">Hinauf in den Hof</w:t>
+        <w:t xml:space="preserve">Die Kutsche</w:t>
       </w:r>
     </w:p>
     <w:p>
@@ -4134,55 +4362,20 @@
           <w:sz w:val="22"/>
           <w:szCs w:val="22"/>
         </w:rPr>
-        <w:t xml:space="preserve">Up the cellar</w:t>
-      </w:r>
-      <w:r>
-        <w:rPr>
-          <w:rFonts w:ascii="Georgia" w:cs="Georgia" w:eastAsia="Georgia" w:hAnsi="Georgia"/>
-          <w:sz w:val="22"/>
-          <w:szCs w:val="22"/>
-        </w:rPr>
-        <w:t xml:space="preserve"> stair</w:t>
-      </w:r>
-      <w:r>
-        <w:rPr>
-          <w:rFonts w:ascii="Georgia" w:cs="Georgia" w:eastAsia="Georgia" w:hAnsi="Georgia"/>
-          <w:sz w:val="22"/>
-          <w:szCs w:val="22"/>
-        </w:rPr>
-        <w:t xml:space="preserve">, through a low door — and you are standing in a square courtyard</w:t>
-      </w:r>
-      <w:r>
-        <w:rPr>
-          <w:rFonts w:ascii="Georgia" w:cs="Georgia" w:eastAsia="Georgia" w:hAnsi="Georgia"/>
-          <w:sz w:val="22"/>
-          <w:szCs w:val="22"/>
-        </w:rPr>
-        <w:t xml:space="preserve"> of black stone</w:t>
-      </w:r>
-      <w:r>
-        <w:rPr>
-          <w:rFonts w:ascii="Georgia" w:cs="Georgia" w:eastAsia="Georgia" w:hAnsi="Georgia"/>
-          <w:sz w:val="22"/>
-          <w:szCs w:val="22"/>
-        </w:rPr>
-        <w:t xml:space="preserve">, with the night sky above you for the first time in five hours.</w:t>
-      </w:r>
-    </w:p>
-    <w:p>
-      <w:pPr>
-        <w:spacing w:after="60" w:before="120"/>
-      </w:pPr>
-      <w:r>
-        <w:rPr>
-          <w:rFonts w:ascii="Georgia" w:cs="Georgia" w:eastAsia="Georgia" w:hAnsi="Georgia"/>
-          <w:b/>
-          <w:bCs/>
-          <w:color w:val="7A5A1A"/>
-          <w:sz w:val="17"/>
-          <w:szCs w:val="17"/>
-        </w:rPr>
-        <w:t xml:space="preserve">▸ Nur bei: Weg C · Kutsche</w:t>
+        <w:t xml:space="preserve">The coach is waiting at the edge of the village at midnight, exactly as the map said. The driver is a thin man in a good coat who introduces himself as Corvin Ash, and who is very, very friendly.</w:t>
+      </w:r>
+    </w:p>
+    <w:p>
+      <w:pPr>
+        <w:spacing w:after="110" w:line="320"/>
+      </w:pPr>
+      <w:r>
+        <w:rPr>
+          <w:rFonts w:ascii="Georgia" w:cs="Georgia" w:eastAsia="Georgia" w:hAnsi="Georgia"/>
+          <w:sz w:val="22"/>
+          <w:szCs w:val="22"/>
+        </w:rPr>
+        <w:t xml:space="preserve">He drives without a lamp. He never looks at the road. And in two hours he asks you more questions than you ask him.</w:t>
       </w:r>
     </w:p>
     <w:p>
@@ -4198,7 +4391,7 @@
           <w:sz w:val="19"/>
           <w:szCs w:val="19"/>
         </w:rPr>
-        <w:t xml:space="preserve">Die Kutsche</w:t>
+        <w:t xml:space="preserve">Am Tor</w:t>
       </w:r>
     </w:p>
     <w:p>
@@ -4211,79 +4404,6 @@
           <w:sz w:val="22"/>
           <w:szCs w:val="22"/>
         </w:rPr>
-        <w:t xml:space="preserve">The coach is waiting at the edge of the village at midnight, exactly as the map said. The driver is a thin man in a good coat who introduces himself as Corvin Ash, and who is very, very friendly.</w:t>
-      </w:r>
-    </w:p>
-    <w:p>
-      <w:pPr>
-        <w:spacing w:after="110" w:line="320"/>
-      </w:pPr>
-      <w:r>
-        <w:rPr>
-          <w:rFonts w:ascii="Georgia" w:cs="Georgia" w:eastAsia="Georgia" w:hAnsi="Georgia"/>
-          <w:sz w:val="22"/>
-          <w:szCs w:val="22"/>
-        </w:rPr>
-        <w:t xml:space="preserve">He drives without a lamp. He never looks at the road. And in two hours he asks you more questions than you ask him.</w:t>
-      </w:r>
-    </w:p>
-    <w:p>
-      <w:pPr>
-        <w:pBdr>
-          <w:left w:val="single" w:color="BFBFBF" w:sz="18" w:space="8"/>
-        </w:pBdr>
-        <w:shd w:fill="F2F2F2" w:color="auto" w:val="clear"/>
-        <w:spacing w:after="140"/>
-        <w:ind w:left="120"/>
-      </w:pPr>
-      <w:r>
-        <w:rPr>
-          <w:rFonts w:ascii="Georgia" w:cs="Georgia" w:eastAsia="Georgia" w:hAnsi="Georgia"/>
-          <w:b/>
-          <w:bCs/>
-          <w:color w:val="555555"/>
-          <w:sz w:val="16"/>
-          <w:szCs w:val="16"/>
-        </w:rPr>
-        <w:t xml:space="preserve">NUR DM:  </w:t>
-      </w:r>
-      <w:r>
-        <w:rPr>
-          <w:rFonts w:ascii="Georgia" w:cs="Georgia" w:eastAsia="Georgia" w:hAnsi="Georgia"/>
-          <w:color w:val="333333"/>
-          <w:sz w:val="18"/>
-          <w:szCs w:val="18"/>
-        </w:rPr>
-        <w:t xml:space="preserve">Spiel ihn freundlich und stell den Spielern seine Fragen: „And what are your names?“ — „And what do you want up there?“ — „You’re not from the village, are you?“
- Drei Dinge dürfen sie von selbst merken: Er sagt nie Mirelas Namen. Seine Hände sind kalt. Und im Kutschenfenster spiegelt sich alles ausser ihm. Merkt es niemand, ist das kein Problem — die Gefahr ist schon eingetragen.</w:t>
-      </w:r>
-    </w:p>
-    <w:p>
-      <w:pPr>
-        <w:spacing w:after="40" w:before="100"/>
-      </w:pPr>
-      <w:r>
-        <w:rPr>
-          <w:rFonts w:ascii="Georgia" w:cs="Georgia" w:eastAsia="Georgia" w:hAnsi="Georgia"/>
-          <w:b/>
-          <w:bCs/>
-          <w:color w:val="555555"/>
-          <w:sz w:val="19"/>
-          <w:szCs w:val="19"/>
-        </w:rPr>
-        <w:t xml:space="preserve">Am Tor</w:t>
-      </w:r>
-    </w:p>
-    <w:p>
-      <w:pPr>
-        <w:spacing w:after="110" w:line="320"/>
-      </w:pPr>
-      <w:r>
-        <w:rPr>
-          <w:rFonts w:ascii="Georgia" w:cs="Georgia" w:eastAsia="Georgia" w:hAnsi="Georgia"/>
-          <w:sz w:val="22"/>
-          <w:szCs w:val="22"/>
-        </w:rPr>
         <w:t xml:space="preserve">At the gate</w:t>
       </w:r>
       <w:r>
@@ -4293,15 +4413,6 @@
           <w:szCs w:val="22"/>
         </w:rPr>
         <w:t xml:space="preserve"> Corvin stops the coach and says four words to somebody you cannot see: “I have three guests</w:t>
-      </w:r>
-      <w:r>
-        <w:rPr>
-          <w:rFonts w:ascii="Georgia" w:cs="Georgia" w:eastAsia="Georgia" w:hAnsi="Georgia"/>
-          <w:color w:val="7A5A1A"/>
-          <w:sz w:val="18"/>
-          <w:szCs w:val="18"/>
-        </w:rPr>
-        <w:t xml:space="preserve"> [Gäste]</w:t>
       </w:r>
       <w:r>
         <w:rPr>
@@ -4430,6 +4541,36 @@
     </w:p>
     <w:p>
       <w:pPr>
+        <w:pBdr>
+          <w:left w:val="single" w:color="BFBFBF" w:sz="18" w:space="8"/>
+        </w:pBdr>
+        <w:shd w:fill="F2F2F2" w:color="auto" w:val="clear"/>
+        <w:spacing w:after="140"/>
+        <w:ind w:left="120"/>
+      </w:pPr>
+      <w:r>
+        <w:rPr>
+          <w:rFonts w:ascii="Georgia" w:cs="Georgia" w:eastAsia="Georgia" w:hAnsi="Georgia"/>
+          <w:b/>
+          <w:bCs/>
+          <w:color w:val="555555"/>
+          <w:sz w:val="16"/>
+          <w:szCs w:val="16"/>
+        </w:rPr>
+        <w:t xml:space="preserve">NUR DM:  </w:t>
+      </w:r>
+      <w:r>
+        <w:rPr>
+          <w:rFonts w:ascii="Georgia" w:cs="Georgia" w:eastAsia="Georgia" w:hAnsi="Georgia"/>
+          <w:color w:val="333333"/>
+          <w:sz w:val="18"/>
+          <w:szCs w:val="18"/>
+        </w:rPr>
+        <w:t xml:space="preserve">Sag den echten Figurennamen einer Spielerin, so wie er rechts in der Gruppe steht. Nichts an diesem Abend erschreckt zuverlässiger. Der Rabe gehört dem Bibliothekar und wiederholt nur, was er hört. Das dürfen sie ruhig erst später merken.</w:t>
+      </w:r>
+    </w:p>
+    <w:p>
+      <w:pPr>
         <w:spacing w:after="40" w:before="100"/>
       </w:pPr>
       <w:r>
@@ -4815,40 +4956,10 @@
     <w:p>
       <w:pPr>
         <w:pBdr>
-          <w:left w:val="single" w:color="BFBFBF" w:sz="18" w:space="8"/>
-        </w:pBdr>
-        <w:shd w:fill="F2F2F2" w:color="auto" w:val="clear"/>
-        <w:spacing w:after="140"/>
-        <w:ind w:left="120"/>
-      </w:pPr>
-      <w:r>
-        <w:rPr>
-          <w:rFonts w:ascii="Georgia" w:cs="Georgia" w:eastAsia="Georgia" w:hAnsi="Georgia"/>
-          <w:b/>
-          <w:bCs/>
-          <w:color w:val="555555"/>
-          <w:sz w:val="16"/>
-          <w:szCs w:val="16"/>
-        </w:rPr>
-        <w:t xml:space="preserve">NUR DM:  </w:t>
-      </w:r>
-      <w:r>
-        <w:rPr>
-          <w:rFonts w:ascii="Georgia" w:cs="Georgia" w:eastAsia="Georgia" w:hAnsi="Georgia"/>
-          <w:color w:val="333333"/>
-          <w:sz w:val="18"/>
-          <w:szCs w:val="18"/>
-        </w:rPr>
-        <w:t xml:space="preserve">Sag den echten Figurennamen einer Spielerin, so wie er rechts in der Gruppe steht. Nichts an diesem Abend erschreckt zuverlässiger. Der Rabe gehört dem Bibliothekar und wiederholt nur, was er hört. Das dürfen sie ruhig erst später merken.</w:t>
-      </w:r>
-    </w:p>
-    <w:p>
-      <w:pPr>
-        <w:pBdr>
           <w:left w:val="single" w:color="74B094" w:sz="18" w:space="8"/>
         </w:pBdr>
         <w:shd w:fill="EAF4EC" w:color="auto" w:val="clear"/>
-        <w:spacing w:after="140"/>
+        <w:spacing w:after="40"/>
         <w:ind w:left="120"/>
       </w:pPr>
       <w:r>
@@ -4860,7 +4971,7 @@
           <w:sz w:val="16"/>
           <w:szCs w:val="16"/>
         </w:rPr>
-        <w:t xml:space="preserve">AUFGABE:  </w:t>
+        <w:t xml:space="preserve">DM SAGT DEN SCHÜLERN:  </w:t>
       </w:r>
       <w:r>
         <w:rPr>
@@ -4868,7 +4979,34 @@
           <w:sz w:val="19"/>
           <w:szCs w:val="19"/>
         </w:rPr>
-        <w:t xml:space="preserve">Jede Figur sagt dem Raben einen ganzen Satz — er spricht ihn nach. Wer deutlich spricht, bekommt seinen Satz sauber zurück; wer nuschelt, bekommt Unsinn zurück.  →  Helfer-Blatt · Teil 5</w:t>
+        <w:t xml:space="preserve">“Say one whole sentence to the raven</w:t>
+      </w:r>
+      <w:r>
+        <w:rPr>
+          <w:rFonts w:ascii="Georgia" w:cs="Georgia" w:eastAsia="Georgia" w:hAnsi="Georgia"/>
+          <w:sz w:val="19"/>
+          <w:szCs w:val="19"/>
+        </w:rPr>
+        <w:t xml:space="preserve">. Speak slowly and clearly — it repeats what it hears. If you mumble, you get nonsense back.”</w:t>
+      </w:r>
+    </w:p>
+    <w:p>
+      <w:pPr>
+        <w:pBdr>
+          <w:left w:val="single" w:color="74B094" w:sz="18" w:space="8"/>
+        </w:pBdr>
+        <w:shd w:fill="EAF4EC" w:color="auto" w:val="clear"/>
+        <w:spacing w:after="140"/>
+        <w:ind w:left="120"/>
+      </w:pPr>
+      <w:r>
+        <w:rPr>
+          <w:rFonts w:ascii="Georgia" w:cs="Georgia" w:eastAsia="Georgia" w:hAnsi="Georgia"/>
+          <w:color w:val="555555"/>
+          <w:sz w:val="17"/>
+          <w:szCs w:val="17"/>
+        </w:rPr>
+        <w:t xml:space="preserve">→  Helfer-Blatt · Teil 5</w:t>
       </w:r>
     </w:p>
     <w:p>
@@ -4889,7 +5027,7 @@
           <w:sz w:val="16"/>
           <w:szCs w:val="16"/>
         </w:rPr>
-        <w:t xml:space="preserve">WENN SIE FRAGEN — ANTWORTE SO (NUR DM)  </w:t>
+        <w:t xml:space="preserve">ANTWORTMÖGLICHKEITEN (NUR DM)  </w:t>
       </w:r>
     </w:p>
     <w:p>
@@ -5184,7 +5322,7 @@
           <w:left w:val="single" w:color="74B094" w:sz="18" w:space="8"/>
         </w:pBdr>
         <w:shd w:fill="EAF4EC" w:color="auto" w:val="clear"/>
-        <w:spacing w:after="140"/>
+        <w:spacing w:after="40"/>
         <w:ind w:left="120"/>
       </w:pPr>
       <w:r>
@@ -5196,7 +5334,7 @@
           <w:sz w:val="16"/>
           <w:szCs w:val="16"/>
         </w:rPr>
-        <w:t xml:space="preserve">AUFGABE:  </w:t>
+        <w:t xml:space="preserve">DM SAGT DEN SCHÜLERN:  </w:t>
       </w:r>
       <w:r>
         <w:rPr>
@@ -5204,7 +5342,26 @@
           <w:sz w:val="19"/>
           <w:szCs w:val="19"/>
         </w:rPr>
-        <w:t xml:space="preserve">Jede Figur nennt ihre Tür und einen Grund dafür — auf Englisch, ein ganzer Satz.  →  Helfer-Blatt · Teil 3</w:t>
+        <w:t xml:space="preserve">“Each of you: which door do you want — and why? One full sentence.”</w:t>
+      </w:r>
+    </w:p>
+    <w:p>
+      <w:pPr>
+        <w:pBdr>
+          <w:left w:val="single" w:color="74B094" w:sz="18" w:space="8"/>
+        </w:pBdr>
+        <w:shd w:fill="EAF4EC" w:color="auto" w:val="clear"/>
+        <w:spacing w:after="140"/>
+        <w:ind w:left="120"/>
+      </w:pPr>
+      <w:r>
+        <w:rPr>
+          <w:rFonts w:ascii="Georgia" w:cs="Georgia" w:eastAsia="Georgia" w:hAnsi="Georgia"/>
+          <w:color w:val="555555"/>
+          <w:sz w:val="17"/>
+          <w:szCs w:val="17"/>
+        </w:rPr>
+        <w:t xml:space="preserve">→  Helfer-Blatt · Teil 3</w:t>
       </w:r>
     </w:p>
     <w:p>
@@ -5378,6 +5535,36 @@
     </w:p>
     <w:p>
       <w:pPr>
+        <w:pBdr>
+          <w:left w:val="single" w:color="BFBFBF" w:sz="18" w:space="8"/>
+        </w:pBdr>
+        <w:shd w:fill="F2F2F2" w:color="auto" w:val="clear"/>
+        <w:spacing w:after="140"/>
+        <w:ind w:left="120"/>
+      </w:pPr>
+      <w:r>
+        <w:rPr>
+          <w:rFonts w:ascii="Georgia" w:cs="Georgia" w:eastAsia="Georgia" w:hAnsi="Georgia"/>
+          <w:b/>
+          <w:bCs/>
+          <w:color w:val="555555"/>
+          <w:sz w:val="16"/>
+          <w:szCs w:val="16"/>
+        </w:rPr>
+        <w:t xml:space="preserve">NUR DM:  </w:t>
+      </w:r>
+      <w:r>
+        <w:rPr>
+          <w:rFonts w:ascii="Georgia" w:cs="Georgia" w:eastAsia="Georgia" w:hAnsi="Georgia"/>
+          <w:color w:val="333333"/>
+          <w:sz w:val="18"/>
+          <w:szCs w:val="18"/>
+        </w:rPr>
+        <w:t xml:space="preserve">Bellamy ist nicht gefährlich, solange man höflich bleibt. Er will drei wahre Sätze von jeder Figur — er hört nicht auf den Inhalt, sondern auf die Stimme, und Lügen merkt er. Danach führt er sie selbst zur Spiegeltür — und bittet um einen Gefallen: einen Brief mit ins Dorf zu nehmen. Merk dir, ob sie es versprechen; im Epilog zählt es.</w:t>
+      </w:r>
+    </w:p>
+    <w:p>
+      <w:pPr>
         <w:spacing w:after="40" w:before="100"/>
       </w:pPr>
       <w:r>
@@ -5519,40 +5706,10 @@
     <w:p>
       <w:pPr>
         <w:pBdr>
-          <w:left w:val="single" w:color="BFBFBF" w:sz="18" w:space="8"/>
-        </w:pBdr>
-        <w:shd w:fill="F2F2F2" w:color="auto" w:val="clear"/>
-        <w:spacing w:after="140"/>
-        <w:ind w:left="120"/>
-      </w:pPr>
-      <w:r>
-        <w:rPr>
-          <w:rFonts w:ascii="Georgia" w:cs="Georgia" w:eastAsia="Georgia" w:hAnsi="Georgia"/>
-          <w:b/>
-          <w:bCs/>
-          <w:color w:val="555555"/>
-          <w:sz w:val="16"/>
-          <w:szCs w:val="16"/>
-        </w:rPr>
-        <w:t xml:space="preserve">NUR DM:  </w:t>
-      </w:r>
-      <w:r>
-        <w:rPr>
-          <w:rFonts w:ascii="Georgia" w:cs="Georgia" w:eastAsia="Georgia" w:hAnsi="Georgia"/>
-          <w:color w:val="333333"/>
-          <w:sz w:val="18"/>
-          <w:szCs w:val="18"/>
-        </w:rPr>
-        <w:t xml:space="preserve">Bellamy ist nicht gefährlich, solange man höflich bleibt. Er will drei wahre Sätze von jeder Figur — er hört nicht auf den Inhalt, sondern auf die Stimme, und Lügen merkt er. Danach führt er sie selbst zur Spiegeltür — und bittet um einen Gefallen: einen Brief mit ins Dorf zu nehmen. Merk dir, ob sie es versprechen; im Epilog zählt es.</w:t>
-      </w:r>
-    </w:p>
-    <w:p>
-      <w:pPr>
-        <w:pBdr>
           <w:left w:val="single" w:color="74B094" w:sz="18" w:space="8"/>
         </w:pBdr>
         <w:shd w:fill="EAF4EC" w:color="auto" w:val="clear"/>
-        <w:spacing w:after="140"/>
+        <w:spacing w:after="40"/>
         <w:ind w:left="120"/>
       </w:pPr>
       <w:r>
@@ -5564,7 +5721,7 @@
           <w:sz w:val="16"/>
           <w:szCs w:val="16"/>
         </w:rPr>
-        <w:t xml:space="preserve">AUFGABE:  </w:t>
+        <w:t xml:space="preserve">DM SAGT DEN SCHÜLERN:  </w:t>
       </w:r>
       <w:r>
         <w:rPr>
@@ -5572,7 +5729,26 @@
           <w:sz w:val="19"/>
           <w:szCs w:val="19"/>
         </w:rPr>
-        <w:t xml:space="preserve">Jede Figur erzählt Bellamy drei wahre Sätze über sich. Gib dreissig Sekunden Bedenkzeit, dann reihum.  →  Helfer-Blatt · Teil 6</w:t>
+        <w:t xml:space="preserve">“Bellamy wants three true things about you. Take thirty seconds to think. Then one after the other.”</w:t>
+      </w:r>
+    </w:p>
+    <w:p>
+      <w:pPr>
+        <w:pBdr>
+          <w:left w:val="single" w:color="74B094" w:sz="18" w:space="8"/>
+        </w:pBdr>
+        <w:shd w:fill="EAF4EC" w:color="auto" w:val="clear"/>
+        <w:spacing w:after="140"/>
+        <w:ind w:left="120"/>
+      </w:pPr>
+      <w:r>
+        <w:rPr>
+          <w:rFonts w:ascii="Georgia" w:cs="Georgia" w:eastAsia="Georgia" w:hAnsi="Georgia"/>
+          <w:color w:val="555555"/>
+          <w:sz w:val="17"/>
+          <w:szCs w:val="17"/>
+        </w:rPr>
+        <w:t xml:space="preserve">Er hört auf die Stimme, nicht auf den Inhalt — Lügen merkt er.  →  Helfer-Blatt · Teil 6</w:t>
       </w:r>
     </w:p>
     <w:p>
@@ -5723,6 +5899,52 @@
           <w:sz w:val="17"/>
           <w:szCs w:val="17"/>
         </w:rPr>
+        <w:t xml:space="preserve">▸ Nur bei: Tür B · Kapelle, nicht: Name Anneke bekannt</w:t>
+      </w:r>
+    </w:p>
+    <w:p>
+      <w:pPr>
+        <w:pBdr>
+          <w:left w:val="single" w:color="BFBFBF" w:sz="18" w:space="8"/>
+        </w:pBdr>
+        <w:shd w:fill="F2F2F2" w:color="auto" w:val="clear"/>
+        <w:spacing w:after="140"/>
+        <w:ind w:left="120"/>
+      </w:pPr>
+      <w:r>
+        <w:rPr>
+          <w:rFonts w:ascii="Georgia" w:cs="Georgia" w:eastAsia="Georgia" w:hAnsi="Georgia"/>
+          <w:b/>
+          <w:bCs/>
+          <w:color w:val="555555"/>
+          <w:sz w:val="16"/>
+          <w:szCs w:val="16"/>
+        </w:rPr>
+        <w:t xml:space="preserve">NUR DM:  </w:t>
+      </w:r>
+      <w:r>
+        <w:rPr>
+          <w:rFonts w:ascii="Georgia" w:cs="Georgia" w:eastAsia="Georgia" w:hAnsi="Georgia"/>
+          <w:color w:val="333333"/>
+          <w:sz w:val="18"/>
+          <w:szCs w:val="18"/>
+        </w:rPr>
+        <w:t xml:space="preserve">Die Gruppe kennt ihren Namen nicht — im Wirtshaus ist er nicht gefallen. Also kämpft sie. Bei 8 Lebenspunkten hört Anneke von selbst auf und fragt „Is Greta still alive?“ — lass den Kampf dort enden, nicht bei null. Sie bleibt in der Kapelle zurück.</w:t>
+      </w:r>
+    </w:p>
+    <w:p>
+      <w:pPr>
+        <w:spacing w:after="60" w:before="120"/>
+      </w:pPr>
+      <w:r>
+        <w:rPr>
+          <w:rFonts w:ascii="Georgia" w:cs="Georgia" w:eastAsia="Georgia" w:hAnsi="Georgia"/>
+          <w:b/>
+          <w:bCs/>
+          <w:color w:val="7A5A1A"/>
+          <w:sz w:val="17"/>
+          <w:szCs w:val="17"/>
+        </w:rPr>
         <w:t xml:space="preserve">▸ Nur bei: Tür B · Kapelle</w:t>
       </w:r>
     </w:p>
@@ -5892,36 +6114,6 @@
           <w:szCs w:val="17"/>
         </w:rPr>
         <w:t xml:space="preserve">▸ Nur bei: Tür B · Kapelle, nicht: Name Anneke bekannt</w:t>
-      </w:r>
-    </w:p>
-    <w:p>
-      <w:pPr>
-        <w:pBdr>
-          <w:left w:val="single" w:color="BFBFBF" w:sz="18" w:space="8"/>
-        </w:pBdr>
-        <w:shd w:fill="F2F2F2" w:color="auto" w:val="clear"/>
-        <w:spacing w:after="140"/>
-        <w:ind w:left="120"/>
-      </w:pPr>
-      <w:r>
-        <w:rPr>
-          <w:rFonts w:ascii="Georgia" w:cs="Georgia" w:eastAsia="Georgia" w:hAnsi="Georgia"/>
-          <w:b/>
-          <w:bCs/>
-          <w:color w:val="555555"/>
-          <w:sz w:val="16"/>
-          <w:szCs w:val="16"/>
-        </w:rPr>
-        <w:t xml:space="preserve">NUR DM:  </w:t>
-      </w:r>
-      <w:r>
-        <w:rPr>
-          <w:rFonts w:ascii="Georgia" w:cs="Georgia" w:eastAsia="Georgia" w:hAnsi="Georgia"/>
-          <w:color w:val="333333"/>
-          <w:sz w:val="18"/>
-          <w:szCs w:val="18"/>
-        </w:rPr>
-        <w:t xml:space="preserve">Die Gruppe kennt ihren Namen nicht — im Wirtshaus ist er nicht gefallen. Also kämpft sie. Bei 8 Lebenspunkten hört Anneke von selbst auf und fragt „Is Greta still alive?“ — lass den Kampf dort enden, nicht bei null. Sie bleibt in der Kapelle zurück.</w:t>
       </w:r>
     </w:p>
     <w:p>
@@ -6171,6 +6363,36 @@
     </w:p>
     <w:p>
       <w:pPr>
+        <w:pBdr>
+          <w:left w:val="single" w:color="BFBFBF" w:sz="18" w:space="8"/>
+        </w:pBdr>
+        <w:shd w:fill="F2F2F2" w:color="auto" w:val="clear"/>
+        <w:spacing w:after="140"/>
+        <w:ind w:left="120"/>
+      </w:pPr>
+      <w:r>
+        <w:rPr>
+          <w:rFonts w:ascii="Georgia" w:cs="Georgia" w:eastAsia="Georgia" w:hAnsi="Georgia"/>
+          <w:b/>
+          <w:bCs/>
+          <w:color w:val="555555"/>
+          <w:sz w:val="16"/>
+          <w:szCs w:val="16"/>
+        </w:rPr>
+        <w:t xml:space="preserve">NUR DM:  </w:t>
+      </w:r>
+      <w:r>
+        <w:rPr>
+          <w:rFonts w:ascii="Georgia" w:cs="Georgia" w:eastAsia="Georgia" w:hAnsi="Georgia"/>
+          <w:color w:val="333333"/>
+          <w:sz w:val="18"/>
+          <w:szCs w:val="18"/>
+        </w:rPr>
+        <w:t xml:space="preserve">Tam ist seit sechs Jahren hier und kennt jeden Gang. Er führt sie hinauf, wenn sie freundlich sind — er fragt einmal, und er will eine echte Antwort: „Will you take me with you? Say it. Promise.“ Lass die Spieler wirklich antworten, und merk dir, was sie sagen. Im Epilog zählt es. Wer ihn anfährt oder an ihm vorbeigeht: Er schreit, und du nimmst rechts +3 Gefahr.</w:t>
+      </w:r>
+    </w:p>
+    <w:p>
+      <w:pPr>
         <w:spacing w:after="40" w:before="100"/>
       </w:pPr>
       <w:r>
@@ -6239,40 +6461,10 @@
     <w:p>
       <w:pPr>
         <w:pBdr>
-          <w:left w:val="single" w:color="BFBFBF" w:sz="18" w:space="8"/>
-        </w:pBdr>
-        <w:shd w:fill="F2F2F2" w:color="auto" w:val="clear"/>
-        <w:spacing w:after="140"/>
-        <w:ind w:left="120"/>
-      </w:pPr>
-      <w:r>
-        <w:rPr>
-          <w:rFonts w:ascii="Georgia" w:cs="Georgia" w:eastAsia="Georgia" w:hAnsi="Georgia"/>
-          <w:b/>
-          <w:bCs/>
-          <w:color w:val="555555"/>
-          <w:sz w:val="16"/>
-          <w:szCs w:val="16"/>
-        </w:rPr>
-        <w:t xml:space="preserve">NUR DM:  </w:t>
-      </w:r>
-      <w:r>
-        <w:rPr>
-          <w:rFonts w:ascii="Georgia" w:cs="Georgia" w:eastAsia="Georgia" w:hAnsi="Georgia"/>
-          <w:color w:val="333333"/>
-          <w:sz w:val="18"/>
-          <w:szCs w:val="18"/>
-        </w:rPr>
-        <w:t xml:space="preserve">Tam ist seit sechs Jahren hier und kennt jeden Gang. Er führt sie hinauf, wenn sie freundlich sind — er fragt einmal, und er will eine echte Antwort: „Will you take me with you? Say it. Promise.“ Lass die Spieler wirklich antworten, und merk dir, was sie sagen. Im Epilog zählt es. Wer ihn anfährt oder an ihm vorbeigeht: Er schreit, und du nimmst rechts +3 Gefahr.</w:t>
-      </w:r>
-    </w:p>
-    <w:p>
-      <w:pPr>
-        <w:pBdr>
           <w:left w:val="single" w:color="74B094" w:sz="18" w:space="8"/>
         </w:pBdr>
         <w:shd w:fill="EAF4EC" w:color="auto" w:val="clear"/>
-        <w:spacing w:after="140"/>
+        <w:spacing w:after="40"/>
         <w:ind w:left="120"/>
       </w:pPr>
       <w:r>
@@ -6284,7 +6476,7 @@
           <w:sz w:val="16"/>
           <w:szCs w:val="16"/>
         </w:rPr>
-        <w:t xml:space="preserve">AUFGABE:  </w:t>
+        <w:t xml:space="preserve">DM SAGT DEN SCHÜLERN:  </w:t>
       </w:r>
       <w:r>
         <w:rPr>
@@ -6292,7 +6484,26 @@
           <w:sz w:val="19"/>
           <w:szCs w:val="19"/>
         </w:rPr>
-        <w:t xml:space="preserve">Die Gruppe antwortet Tam auf seine Frage — eine echte Antwort, kein Ausweichen. Ja oder Nein, auf Englisch, mit Begründung.  →  Helfer-Blatt · Teil 6</w:t>
+        <w:t xml:space="preserve">“Tam has asked you a question. Give him a real answer — yes or no, and why. No dodging.”</w:t>
+      </w:r>
+    </w:p>
+    <w:p>
+      <w:pPr>
+        <w:pBdr>
+          <w:left w:val="single" w:color="74B094" w:sz="18" w:space="8"/>
+        </w:pBdr>
+        <w:shd w:fill="EAF4EC" w:color="auto" w:val="clear"/>
+        <w:spacing w:after="140"/>
+        <w:ind w:left="120"/>
+      </w:pPr>
+      <w:r>
+        <w:rPr>
+          <w:rFonts w:ascii="Georgia" w:cs="Georgia" w:eastAsia="Georgia" w:hAnsi="Georgia"/>
+          <w:color w:val="555555"/>
+          <w:sz w:val="17"/>
+          <w:szCs w:val="17"/>
+        </w:rPr>
+        <w:t xml:space="preserve">→  Helfer-Blatt · Teil 6</w:t>
       </w:r>
     </w:p>
     <w:p>
@@ -6424,6 +6635,83 @@
     </w:p>
     <w:p>
       <w:pPr>
+        <w:spacing w:after="60" w:before="120"/>
+      </w:pPr>
+      <w:r>
+        <w:rPr>
+          <w:rFonts w:ascii="Georgia" w:cs="Georgia" w:eastAsia="Georgia" w:hAnsi="Georgia"/>
+          <w:b/>
+          <w:bCs/>
+          <w:color w:val="7A5A1A"/>
+          <w:sz w:val="17"/>
+          <w:szCs w:val="17"/>
+        </w:rPr>
+        <w:t xml:space="preserve">▸ Nur bei: Weg C · Kutsche</w:t>
+      </w:r>
+    </w:p>
+    <w:p>
+      <w:pPr>
+        <w:pBdr>
+          <w:left w:val="single" w:color="BFBFBF" w:sz="18" w:space="8"/>
+        </w:pBdr>
+        <w:shd w:fill="F2F2F2" w:color="auto" w:val="clear"/>
+        <w:spacing w:after="140"/>
+        <w:ind w:left="120"/>
+      </w:pPr>
+      <w:r>
+        <w:rPr>
+          <w:rFonts w:ascii="Georgia" w:cs="Georgia" w:eastAsia="Georgia" w:hAnsi="Georgia"/>
+          <w:b/>
+          <w:bCs/>
+          <w:color w:val="555555"/>
+          <w:sz w:val="16"/>
+          <w:szCs w:val="16"/>
+        </w:rPr>
+        <w:t xml:space="preserve">NUR DM:  </w:t>
+      </w:r>
+      <w:r>
+        <w:rPr>
+          <w:rFonts w:ascii="Georgia" w:cs="Georgia" w:eastAsia="Georgia" w:hAnsi="Georgia"/>
+          <w:color w:val="333333"/>
+          <w:sz w:val="18"/>
+          <w:szCs w:val="18"/>
+        </w:rPr>
+        <w:t xml:space="preserve">Sie haben die Kutsche genommen. Lass sie das Mirela sagen — sie ist einen Moment lang wirklich überrascht: „Then Corvin has become slow.“</w:t>
+      </w:r>
+    </w:p>
+    <w:p>
+      <w:pPr>
+        <w:pBdr>
+          <w:left w:val="single" w:color="BFBFBF" w:sz="18" w:space="8"/>
+        </w:pBdr>
+        <w:shd w:fill="F2F2F2" w:color="auto" w:val="clear"/>
+        <w:spacing w:after="140"/>
+        <w:ind w:left="120"/>
+      </w:pPr>
+      <w:r>
+        <w:rPr>
+          <w:rFonts w:ascii="Georgia" w:cs="Georgia" w:eastAsia="Georgia" w:hAnsi="Georgia"/>
+          <w:b/>
+          <w:bCs/>
+          <w:color w:val="555555"/>
+          <w:sz w:val="16"/>
+          <w:szCs w:val="16"/>
+        </w:rPr>
+        <w:t xml:space="preserve">DIE WAHRHEIT, IN DIESER REIHENFOLGE (NUR DM):  </w:t>
+      </w:r>
+      <w:r>
+        <w:rPr>
+          <w:rFonts w:ascii="Georgia" w:cs="Georgia" w:eastAsia="Georgia" w:hAnsi="Georgia"/>
+          <w:color w:val="333333"/>
+          <w:sz w:val="18"/>
+          <w:szCs w:val="18"/>
+        </w:rPr>
+        <w:t xml:space="preserve">1. 1604 schloss Dornwald einen Vertrag mit dem Grafen: alle zwanzig Jahre ein Gast. Dafür keine Pest, keine Wölfe, kein Verhungern im Winter. Vierhundert Jahre lang hat es funktioniert.
+ 2. Die Namen auf dem Brett im Wirtshaus sind diese Gäste. Greta hat 2004 gewählt — sie wählte Anneke. — 3. Dieses Jahr sollte Lene gehen, neun Jahre alt, Tobias’ Schwester. Mirela hat sich an ihrer Stelle gemeldet. Bei Sonnenaufgang unterschreibt sie.</w:t>
+      </w:r>
+    </w:p>
+    <w:p>
+      <w:pPr>
         <w:spacing w:after="40" w:before="100"/>
       </w:pPr>
       <w:r>
@@ -6644,27 +6932,11 @@
     </w:p>
     <w:p>
       <w:pPr>
-        <w:spacing w:after="60" w:before="120"/>
-      </w:pPr>
-      <w:r>
-        <w:rPr>
-          <w:rFonts w:ascii="Georgia" w:cs="Georgia" w:eastAsia="Georgia" w:hAnsi="Georgia"/>
-          <w:b/>
-          <w:bCs/>
-          <w:color w:val="7A5A1A"/>
-          <w:sz w:val="17"/>
-          <w:szCs w:val="17"/>
-        </w:rPr>
-        <w:t xml:space="preserve">▸ Nur bei: Weg C · Kutsche</w:t>
-      </w:r>
-    </w:p>
-    <w:p>
-      <w:pPr>
-        <w:pBdr>
-          <w:left w:val="single" w:color="BFBFBF" w:sz="18" w:space="8"/>
-        </w:pBdr>
-        <w:shd w:fill="F2F2F2" w:color="auto" w:val="clear"/>
-        <w:spacing w:after="140"/>
+        <w:pBdr>
+          <w:left w:val="single" w:color="BFBFBF" w:sz="18" w:space="8"/>
+        </w:pBdr>
+        <w:shd w:fill="F2F2F2" w:color="auto" w:val="clear"/>
+        <w:spacing w:after="40"/>
         <w:ind w:left="120"/>
       </w:pPr>
       <w:r>
@@ -6676,68 +6948,7 @@
           <w:sz w:val="16"/>
           <w:szCs w:val="16"/>
         </w:rPr>
-        <w:t xml:space="preserve">NUR DM:  </w:t>
-      </w:r>
-      <w:r>
-        <w:rPr>
-          <w:rFonts w:ascii="Georgia" w:cs="Georgia" w:eastAsia="Georgia" w:hAnsi="Georgia"/>
-          <w:color w:val="333333"/>
-          <w:sz w:val="18"/>
-          <w:szCs w:val="18"/>
-        </w:rPr>
-        <w:t xml:space="preserve">Sie haben die Kutsche genommen. Lass sie das Mirela sagen — sie ist einen Moment lang wirklich überrascht: „Then Corvin has become slow.“</w:t>
-      </w:r>
-    </w:p>
-    <w:p>
-      <w:pPr>
-        <w:pBdr>
-          <w:left w:val="single" w:color="BFBFBF" w:sz="18" w:space="8"/>
-        </w:pBdr>
-        <w:shd w:fill="F2F2F2" w:color="auto" w:val="clear"/>
-        <w:spacing w:after="140"/>
-        <w:ind w:left="120"/>
-      </w:pPr>
-      <w:r>
-        <w:rPr>
-          <w:rFonts w:ascii="Georgia" w:cs="Georgia" w:eastAsia="Georgia" w:hAnsi="Georgia"/>
-          <w:b/>
-          <w:bCs/>
-          <w:color w:val="555555"/>
-          <w:sz w:val="16"/>
-          <w:szCs w:val="16"/>
-        </w:rPr>
-        <w:t xml:space="preserve">DIE WAHRHEIT, IN DIESER REIHENFOLGE (NUR DM):  </w:t>
-      </w:r>
-      <w:r>
-        <w:rPr>
-          <w:rFonts w:ascii="Georgia" w:cs="Georgia" w:eastAsia="Georgia" w:hAnsi="Georgia"/>
-          <w:color w:val="333333"/>
-          <w:sz w:val="18"/>
-          <w:szCs w:val="18"/>
-        </w:rPr>
-        <w:t xml:space="preserve">1. 1604 schloss Dornwald einen Vertrag mit dem Grafen: alle zwanzig Jahre ein Gast. Dafür keine Pest, keine Wölfe, kein Verhungern im Winter. Vierhundert Jahre lang hat es funktioniert.
- 2. Die Namen auf dem Brett im Wirtshaus sind diese Gäste. Greta hat 2004 gewählt — sie wählte Anneke. — 3. Dieses Jahr sollte Lene gehen, neun Jahre alt, Tobias’ Schwester. Mirela hat sich an ihrer Stelle gemeldet. Bei Sonnenaufgang unterschreibt sie.</w:t>
-      </w:r>
-    </w:p>
-    <w:p>
-      <w:pPr>
-        <w:pBdr>
-          <w:left w:val="single" w:color="BFBFBF" w:sz="18" w:space="8"/>
-        </w:pBdr>
-        <w:shd w:fill="F2F2F2" w:color="auto" w:val="clear"/>
-        <w:spacing w:after="40"/>
-        <w:ind w:left="120"/>
-      </w:pPr>
-      <w:r>
-        <w:rPr>
-          <w:rFonts w:ascii="Georgia" w:cs="Georgia" w:eastAsia="Georgia" w:hAnsi="Georgia"/>
-          <w:b/>
-          <w:bCs/>
-          <w:color w:val="555555"/>
-          <w:sz w:val="16"/>
-          <w:szCs w:val="16"/>
-        </w:rPr>
-        <w:t xml:space="preserve">WENN SIE FRAGEN — MIRELA ANTWORTET SO (NUR DM)  </w:t>
+        <w:t xml:space="preserve">ANTWORTMÖGLICHKEITEN (NUR DM)  </w:t>
       </w:r>
     </w:p>
     <w:p>
@@ -6938,7 +7149,7 @@
           <w:left w:val="single" w:color="74B094" w:sz="18" w:space="8"/>
         </w:pBdr>
         <w:shd w:fill="EAF4EC" w:color="auto" w:val="clear"/>
-        <w:spacing w:after="140"/>
+        <w:spacing w:after="40"/>
         <w:ind w:left="120"/>
       </w:pPr>
       <w:r>
@@ -6950,7 +7161,7 @@
           <w:sz w:val="16"/>
           <w:szCs w:val="16"/>
         </w:rPr>
-        <w:t xml:space="preserve">AUFGABE:  </w:t>
+        <w:t xml:space="preserve">DM SAGT DEN SCHÜLERN:  </w:t>
       </w:r>
       <w:r>
         <w:rPr>
@@ -6958,7 +7169,26 @@
           <w:sz w:val="19"/>
           <w:szCs w:val="19"/>
         </w:rPr>
-        <w:t xml:space="preserve">Jede Figur bringt einen echten Einwand gegen Mirelas Entscheidung — und hört sich ihre Antwort an. Mirela gibt erst nach, wenn ihr etwas Besseres angeboten wird als „wir retten dich“.  →  Helfer-Blatt · Teil 7</w:t>
+        <w:t xml:space="preserve">“Each of you: give Mirela one real reason why she should not do this. Then listen to what she says back.”</w:t>
+      </w:r>
+    </w:p>
+    <w:p>
+      <w:pPr>
+        <w:pBdr>
+          <w:left w:val="single" w:color="74B094" w:sz="18" w:space="8"/>
+        </w:pBdr>
+        <w:shd w:fill="EAF4EC" w:color="auto" w:val="clear"/>
+        <w:spacing w:after="140"/>
+        <w:ind w:left="120"/>
+      </w:pPr>
+      <w:r>
+        <w:rPr>
+          <w:rFonts w:ascii="Georgia" w:cs="Georgia" w:eastAsia="Georgia" w:hAnsi="Georgia"/>
+          <w:color w:val="555555"/>
+          <w:sz w:val="17"/>
+          <w:szCs w:val="17"/>
+        </w:rPr>
+        <w:t xml:space="preserve">Mirela gibt erst nach, wenn ihr etwas Besseres angeboten wird als „wir retten dich“.  →  Helfer-Blatt · Teil 7</w:t>
       </w:r>
     </w:p>
     <w:p>
@@ -7009,6 +7239,36 @@
     <w:p>
       <w:pPr>
         <w:pBdr>
+          <w:left w:val="single" w:color="BFBFBF" w:sz="18" w:space="8"/>
+        </w:pBdr>
+        <w:shd w:fill="F2F2F2" w:color="auto" w:val="clear"/>
+        <w:spacing w:after="140"/>
+        <w:ind w:left="120"/>
+      </w:pPr>
+      <w:r>
+        <w:rPr>
+          <w:rFonts w:ascii="Georgia" w:cs="Georgia" w:eastAsia="Georgia" w:hAnsi="Georgia"/>
+          <w:b/>
+          <w:bCs/>
+          <w:color w:val="555555"/>
+          <w:sz w:val="16"/>
+          <w:szCs w:val="16"/>
+        </w:rPr>
+        <w:t xml:space="preserve">NUR DM:  </w:t>
+      </w:r>
+      <w:r>
+        <w:rPr>
+          <w:rFonts w:ascii="Georgia" w:cs="Georgia" w:eastAsia="Georgia" w:hAnsi="Georgia"/>
+          <w:color w:val="333333"/>
+          <w:sz w:val="18"/>
+          <w:szCs w:val="18"/>
+        </w:rPr>
+        <w:t xml:space="preserve">Lass sie vor Mirela entscheiden, nicht im Nebenzimmer. Sie widerspricht — das ist der beste Dialog des Abends.</w:t>
+      </w:r>
+    </w:p>
+    <w:p>
+      <w:pPr>
+        <w:pBdr>
           <w:left w:val="single" w:color="D9A441" w:sz="18" w:space="8"/>
         </w:pBdr>
         <w:shd w:fill="FFF6DD" w:color="auto" w:val="clear"/>
@@ -7161,31 +7421,49 @@
     <w:p>
       <w:pPr>
         <w:pBdr>
-          <w:left w:val="single" w:color="BFBFBF" w:sz="18" w:space="8"/>
-        </w:pBdr>
-        <w:shd w:fill="F2F2F2" w:color="auto" w:val="clear"/>
-        <w:spacing w:after="140"/>
-        <w:ind w:left="120"/>
-      </w:pPr>
-      <w:r>
-        <w:rPr>
-          <w:rFonts w:ascii="Georgia" w:cs="Georgia" w:eastAsia="Georgia" w:hAnsi="Georgia"/>
-          <w:b/>
-          <w:bCs/>
-          <w:color w:val="555555"/>
+          <w:left w:val="single" w:color="74B094" w:sz="18" w:space="8"/>
+        </w:pBdr>
+        <w:shd w:fill="EAF4EC" w:color="auto" w:val="clear"/>
+        <w:spacing w:after="40"/>
+        <w:ind w:left="120"/>
+      </w:pPr>
+      <w:r>
+        <w:rPr>
+          <w:rFonts w:ascii="Georgia" w:cs="Georgia" w:eastAsia="Georgia" w:hAnsi="Georgia"/>
+          <w:b/>
+          <w:bCs/>
+          <w:color w:val="3A5A4C"/>
           <w:sz w:val="16"/>
           <w:szCs w:val="16"/>
         </w:rPr>
-        <w:t xml:space="preserve">NUR DM:  </w:t>
-      </w:r>
-      <w:r>
-        <w:rPr>
-          <w:rFonts w:ascii="Georgia" w:cs="Georgia" w:eastAsia="Georgia" w:hAnsi="Georgia"/>
-          <w:color w:val="333333"/>
-          <w:sz w:val="18"/>
-          <w:szCs w:val="18"/>
-        </w:rPr>
-        <w:t xml:space="preserve">Lass sie vor Mirela entscheiden, nicht im Nebenzimmer. Sie widerspricht — das ist der beste Dialog des Abends.</w:t>
+        <w:t xml:space="preserve">DM SAGT DEN SCHÜLERN:  </w:t>
+      </w:r>
+      <w:r>
+        <w:rPr>
+          <w:rFonts w:ascii="Georgia" w:cs="Georgia" w:eastAsia="Georgia" w:hAnsi="Georgia"/>
+          <w:sz w:val="19"/>
+          <w:szCs w:val="19"/>
+        </w:rPr>
+        <w:t xml:space="preserve">“Each of you says one full sentence: what should we do — and why? Mirela is listening.”</w:t>
+      </w:r>
+    </w:p>
+    <w:p>
+      <w:pPr>
+        <w:pBdr>
+          <w:left w:val="single" w:color="74B094" w:sz="18" w:space="8"/>
+        </w:pBdr>
+        <w:shd w:fill="EAF4EC" w:color="auto" w:val="clear"/>
+        <w:spacing w:after="140"/>
+        <w:ind w:left="120"/>
+      </w:pPr>
+      <w:r>
+        <w:rPr>
+          <w:rFonts w:ascii="Georgia" w:cs="Georgia" w:eastAsia="Georgia" w:hAnsi="Georgia"/>
+          <w:color w:val="555555"/>
+          <w:sz w:val="17"/>
+          <w:szCs w:val="17"/>
+        </w:rPr>
+        <w:t xml:space="preserve">→  Helfer-Blatt · Teil 3</w:t>
       </w:r>
     </w:p>
     <w:p>
@@ -7354,6 +7632,53 @@
           <w:sz w:val="17"/>
           <w:szCs w:val="17"/>
         </w:rPr>
+        <w:t xml:space="preserve">▸ Nur bei: Wahl C · Angebot</w:t>
+      </w:r>
+    </w:p>
+    <w:p>
+      <w:pPr>
+        <w:pBdr>
+          <w:left w:val="single" w:color="BFBFBF" w:sz="18" w:space="8"/>
+        </w:pBdr>
+        <w:shd w:fill="F2F2F2" w:color="auto" w:val="clear"/>
+        <w:spacing w:after="140"/>
+        <w:ind w:left="120"/>
+      </w:pPr>
+      <w:r>
+        <w:rPr>
+          <w:rFonts w:ascii="Georgia" w:cs="Georgia" w:eastAsia="Georgia" w:hAnsi="Georgia"/>
+          <w:b/>
+          <w:bCs/>
+          <w:color w:val="555555"/>
+          <w:sz w:val="16"/>
+          <w:szCs w:val="16"/>
+        </w:rPr>
+        <w:t xml:space="preserve">DIE VERHANDLUNG — WAS ER ANNIMMT (NUR DM):  </w:t>
+      </w:r>
+      <w:r>
+        <w:rPr>
+          <w:rFonts w:ascii="Georgia" w:cs="Georgia" w:eastAsia="Georgia" w:hAnsi="Georgia"/>
+          <w:color w:val="333333"/>
+          <w:sz w:val="18"/>
+          <w:szCs w:val="18"/>
+        </w:rPr>
+        <w:t xml:space="preserve">Das ist zuerst ein Gespräch, kein Kampf. Eine einzige Regel: Er nimmt jedes Angebot an, das die Gruppe etwas Echtes kostet — Zeit, ein Versprechen, einen Besuch jedes Jahr. Er lehnt alles ab, was nur ihm etwas kostet.
+ Lass die Gruppe laut überlegen, was sie geben könnte. Nimmt er an: unten „Ein neuer Vertrag“ anklicken, kein Kampf. Droht die Gruppe oder beleidigt ihn: Knopf „Verhandlung gescheitert“ — dann Kampf.</w:t>
+      </w:r>
+    </w:p>
+    <w:p>
+      <w:pPr>
+        <w:spacing w:after="60" w:before="120"/>
+      </w:pPr>
+      <w:r>
+        <w:rPr>
+          <w:rFonts w:ascii="Georgia" w:cs="Georgia" w:eastAsia="Georgia" w:hAnsi="Georgia"/>
+          <w:b/>
+          <w:bCs/>
+          <w:color w:val="7A5A1A"/>
+          <w:sz w:val="17"/>
+          <w:szCs w:val="17"/>
+        </w:rPr>
         <w:t xml:space="preserve">▸ Nur bei: Wahl A · hinaustragen</w:t>
       </w:r>
     </w:p>
@@ -7921,17 +8246,32 @@
           <w:sz w:val="16"/>
           <w:szCs w:val="16"/>
         </w:rPr>
-        <w:t xml:space="preserve">DIE VERHANDLUNG — WAS ER ANNIMMT (NUR DM):  </w:t>
-      </w:r>
-      <w:r>
-        <w:rPr>
-          <w:rFonts w:ascii="Georgia" w:cs="Georgia" w:eastAsia="Georgia" w:hAnsi="Georgia"/>
-          <w:color w:val="333333"/>
-          <w:sz w:val="18"/>
-          <w:szCs w:val="18"/>
-        </w:rPr>
-        <w:t xml:space="preserve">Das ist zuerst ein Gespräch, kein Kampf. Eine einzige Regel: Er nimmt jedes Angebot an, das die Gruppe etwas Echtes kostet — Zeit, ein Versprechen, einen Besuch jedes Jahr. Er lehnt alles ab, was nur ihm etwas kostet.
- Lass die Gruppe laut überlegen, was sie geben könnte. Nimmt er an: unten „Ein neuer Vertrag“ anklicken, kein Kampf. Droht die Gruppe oder beleidigt ihn: Knopf „Verhandlung gescheitert“ — dann Kampf.</w:t>
+        <w:t xml:space="preserve">KNOPF (NUR DM):  </w:t>
+      </w:r>
+      <w:r>
+        <w:rPr>
+          <w:rFonts w:ascii="Georgia" w:cs="Georgia" w:eastAsia="Georgia" w:hAnsi="Georgia"/>
+          <w:color w:val="333333"/>
+          <w:sz w:val="18"/>
+          <w:szCs w:val="18"/>
+        </w:rPr>
+        <w:t xml:space="preserve">Die Verhandlung ist gescheitert — eine Drohung, eine Beleidigung, ein „we’ll kill you anyway“.  →  Gefahr +4, es wird gekämpft</w:t>
+      </w:r>
+    </w:p>
+    <w:p>
+      <w:pPr>
+        <w:spacing w:after="60" w:before="120"/>
+      </w:pPr>
+      <w:r>
+        <w:rPr>
+          <w:rFonts w:ascii="Georgia" w:cs="Georgia" w:eastAsia="Georgia" w:hAnsi="Georgia"/>
+          <w:b/>
+          <w:bCs/>
+          <w:color w:val="7A5A1A"/>
+          <w:sz w:val="17"/>
+          <w:szCs w:val="17"/>
+        </w:rPr>
+        <w:t xml:space="preserve">▸ Nur bei: Gefahr 0–3</w:t>
       </w:r>
     </w:p>
     <w:p>
@@ -7952,16 +8292,16 @@
           <w:sz w:val="16"/>
           <w:szCs w:val="16"/>
         </w:rPr>
-        <w:t xml:space="preserve">KNOPF (NUR DM):  </w:t>
-      </w:r>
-      <w:r>
-        <w:rPr>
-          <w:rFonts w:ascii="Georgia" w:cs="Georgia" w:eastAsia="Georgia" w:hAnsi="Georgia"/>
-          <w:color w:val="333333"/>
-          <w:sz w:val="18"/>
-          <w:szCs w:val="18"/>
-        </w:rPr>
-        <w:t xml:space="preserve">Die Verhandlung ist gescheitert — eine Drohung, eine Beleidigung, ein „we’ll kill you anyway“.  →  Gefahr +4, es wird gekämpft</w:t>
+        <w:t xml:space="preserve">GEFAHR 0–3 · ER IST BEEINDRUCKT (NUR DM):  </w:t>
+      </w:r>
+      <w:r>
+        <w:rPr>
+          <w:rFonts w:ascii="Georgia" w:cs="Georgia" w:eastAsia="Georgia" w:hAnsi="Georgia"/>
+          <w:color w:val="333333"/>
+          <w:sz w:val="18"/>
+          <w:szCs w:val="18"/>
+        </w:rPr>
+        <w:t xml:space="preserve">„You came up my mountain without waking a single one of my people. Do you know how long it has been since anyone did that?“ — Er ist allein und lässt bis zuletzt mit sich reden. Der Knopf unten lädt ihn mit 40 statt 55 Lebenspunkten, und die Gruppe darf einmal angreifen, bevor er reagiert.</w:t>
       </w:r>
     </w:p>
     <w:p>
@@ -7977,7 +8317,7 @@
           <w:sz w:val="17"/>
           <w:szCs w:val="17"/>
         </w:rPr>
-        <w:t xml:space="preserve">▸ Nur bei: Gefahr 0–3</w:t>
+        <w:t xml:space="preserve">▸ Nur bei: Gefahr 4–7</w:t>
       </w:r>
     </w:p>
     <w:p>
@@ -7998,16 +8338,16 @@
           <w:sz w:val="16"/>
           <w:szCs w:val="16"/>
         </w:rPr>
-        <w:t xml:space="preserve">GEFAHR 0–3 · ER IST BEEINDRUCKT (NUR DM):  </w:t>
-      </w:r>
-      <w:r>
-        <w:rPr>
-          <w:rFonts w:ascii="Georgia" w:cs="Georgia" w:eastAsia="Georgia" w:hAnsi="Georgia"/>
-          <w:color w:val="333333"/>
-          <w:sz w:val="18"/>
-          <w:szCs w:val="18"/>
-        </w:rPr>
-        <w:t xml:space="preserve">„You came up my mountain without waking a single one of my people. Do you know how long it has been since anyone did that?“ — Er ist allein und lässt bis zuletzt mit sich reden. Der Knopf unten lädt ihn mit 40 statt 55 Lebenspunkten, und die Gruppe darf einmal angreifen, bevor er reagiert.</w:t>
+        <w:t xml:space="preserve">GEFAHR 4–7 · ER HAT GEWARTET (NUR DM):  </w:t>
+      </w:r>
+      <w:r>
+        <w:rPr>
+          <w:rFonts w:ascii="Georgia" w:cs="Georgia" w:eastAsia="Georgia" w:hAnsi="Georgia"/>
+          <w:color w:val="333333"/>
+          <w:sz w:val="18"/>
+          <w:szCs w:val="18"/>
+        </w:rPr>
+        <w:t xml:space="preserve">Er weiss seit Stunden, dass sie da sind, und wollte sehen, wie weit sie kommen. Volle 55 Lebenspunkte.</w:t>
       </w:r>
     </w:p>
     <w:p>
@@ -8023,7 +8363,7 @@
           <w:sz w:val="17"/>
           <w:szCs w:val="17"/>
         </w:rPr>
-        <w:t xml:space="preserve">▸ Nur bei: Gefahr 4–7</w:t>
+        <w:t xml:space="preserve">▸ Nur bei: Gefahr 8–10</w:t>
       </w:r>
     </w:p>
     <w:p>
@@ -8044,16 +8384,16 @@
           <w:sz w:val="16"/>
           <w:szCs w:val="16"/>
         </w:rPr>
-        <w:t xml:space="preserve">GEFAHR 4–7 · ER HAT GEWARTET (NUR DM):  </w:t>
-      </w:r>
-      <w:r>
-        <w:rPr>
-          <w:rFonts w:ascii="Georgia" w:cs="Georgia" w:eastAsia="Georgia" w:hAnsi="Georgia"/>
-          <w:color w:val="333333"/>
-          <w:sz w:val="18"/>
-          <w:szCs w:val="18"/>
-        </w:rPr>
-        <w:t xml:space="preserve">Er weiss seit Stunden, dass sie da sind, und wollte sehen, wie weit sie kommen. Volle 55 Lebenspunkte.</w:t>
+        <w:t xml:space="preserve">GEFAHR 8–10 · DAS HAUS IST WACH (NUR DM):  </w:t>
+      </w:r>
+      <w:r>
+        <w:rPr>
+          <w:rFonts w:ascii="Georgia" w:cs="Georgia" w:eastAsia="Georgia" w:hAnsi="Georgia"/>
+          <w:color w:val="333333"/>
+          <w:sz w:val="18"/>
+          <w:szCs w:val="18"/>
+        </w:rPr>
+        <w:t xml:space="preserve">Jede Lampe brennt. Volle 55 Lebenspunkte. Sag der Gruppe vorher, woran das liegt — sie haben es sich verdient und wissen es.</w:t>
       </w:r>
     </w:p>
     <w:p>
@@ -8069,7 +8409,7 @@
           <w:sz w:val="17"/>
           <w:szCs w:val="17"/>
         </w:rPr>
-        <w:t xml:space="preserve">▸ Nur bei: Gefahr 8–10</w:t>
+        <w:t xml:space="preserve">▸ Nur bei: nicht: Wahl B · Buch verbrennen, Gefahr 4–10</w:t>
       </w:r>
     </w:p>
     <w:p>
@@ -8090,16 +8430,16 @@
           <w:sz w:val="16"/>
           <w:szCs w:val="16"/>
         </w:rPr>
-        <w:t xml:space="preserve">GEFAHR 8–10 · DAS HAUS IST WACH (NUR DM):  </w:t>
-      </w:r>
-      <w:r>
-        <w:rPr>
-          <w:rFonts w:ascii="Georgia" w:cs="Georgia" w:eastAsia="Georgia" w:hAnsi="Georgia"/>
-          <w:color w:val="333333"/>
-          <w:sz w:val="18"/>
-          <w:szCs w:val="18"/>
-        </w:rPr>
-        <w:t xml:space="preserve">Jede Lampe brennt. Volle 55 Lebenspunkte. Sag der Gruppe vorher, woran das liegt — sie haben es sich verdient und wissen es.</w:t>
+        <w:t xml:space="preserve">ZWEI THRALLS KOMMEN DAZU (NUR DM):  </w:t>
+      </w:r>
+      <w:r>
+        <w:rPr>
+          <w:rFonts w:ascii="Georgia" w:cs="Georgia" w:eastAsia="Georgia" w:hAnsi="Georgia"/>
+          <w:color w:val="333333"/>
+          <w:sz w:val="18"/>
+          <w:szCs w:val="18"/>
+        </w:rPr>
+        <w:t xml:space="preserve">Zwei Diener des Hauses stehen mit im Raum, je 9 Lebenspunkte. Der Knopf unten lädt sie mit.</w:t>
       </w:r>
     </w:p>
     <w:p>
@@ -8115,7 +8455,7 @@
           <w:sz w:val="17"/>
           <w:szCs w:val="17"/>
         </w:rPr>
-        <w:t xml:space="preserve">▸ Nur bei: nicht: Wahl B · Buch verbrennen, Gefahr 4–10</w:t>
+        <w:t xml:space="preserve">▸ Nur bei: Wahl B · Buch verbrennen, Gefahr 4–10</w:t>
       </w:r>
     </w:p>
     <w:p>
@@ -8136,32 +8476,16 @@
           <w:sz w:val="16"/>
           <w:szCs w:val="16"/>
         </w:rPr>
-        <w:t xml:space="preserve">ZWEI THRALLS KOMMEN DAZU (NUR DM):  </w:t>
-      </w:r>
-      <w:r>
-        <w:rPr>
-          <w:rFonts w:ascii="Georgia" w:cs="Georgia" w:eastAsia="Georgia" w:hAnsi="Georgia"/>
-          <w:color w:val="333333"/>
-          <w:sz w:val="18"/>
-          <w:szCs w:val="18"/>
-        </w:rPr>
-        <w:t xml:space="preserve">Zwei Diener des Hauses stehen mit im Raum, je 9 Lebenspunkte. Der Knopf unten lädt sie mit.</w:t>
-      </w:r>
-    </w:p>
-    <w:p>
-      <w:pPr>
-        <w:spacing w:after="60" w:before="120"/>
-      </w:pPr>
-      <w:r>
-        <w:rPr>
-          <w:rFonts w:ascii="Georgia" w:cs="Georgia" w:eastAsia="Georgia" w:hAnsi="Georgia"/>
-          <w:b/>
-          <w:bCs/>
-          <w:color w:val="7A5A1A"/>
-          <w:sz w:val="17"/>
-          <w:szCs w:val="17"/>
-        </w:rPr>
-        <w:t xml:space="preserve">▸ Nur bei: Wahl B · Buch verbrennen, Gefahr 4–10</w:t>
+        <w:t xml:space="preserve">KEINE THRALLS (NUR DM):  </w:t>
+      </w:r>
+      <w:r>
+        <w:rPr>
+          <w:rFonts w:ascii="Georgia" w:cs="Georgia" w:eastAsia="Georgia" w:hAnsi="Georgia"/>
+          <w:color w:val="333333"/>
+          <w:sz w:val="18"/>
+          <w:szCs w:val="18"/>
+        </w:rPr>
+        <w:t xml:space="preserve">Das Buch hat die Diener befreit — sie liegen irgendwo im Haus und schlafen zum ersten Mal seit Jahren. Vaskir kommt allein.</w:t>
       </w:r>
     </w:p>
     <w:p>
@@ -8182,36 +8506,6 @@
           <w:sz w:val="16"/>
           <w:szCs w:val="16"/>
         </w:rPr>
-        <w:t xml:space="preserve">KEINE THRALLS (NUR DM):  </w:t>
-      </w:r>
-      <w:r>
-        <w:rPr>
-          <w:rFonts w:ascii="Georgia" w:cs="Georgia" w:eastAsia="Georgia" w:hAnsi="Georgia"/>
-          <w:color w:val="333333"/>
-          <w:sz w:val="18"/>
-          <w:szCs w:val="18"/>
-        </w:rPr>
-        <w:t xml:space="preserve">Das Buch hat die Diener befreit — sie liegen irgendwo im Haus und schlafen zum ersten Mal seit Jahren. Vaskir kommt allein.</w:t>
-      </w:r>
-    </w:p>
-    <w:p>
-      <w:pPr>
-        <w:pBdr>
-          <w:left w:val="single" w:color="BFBFBF" w:sz="18" w:space="8"/>
-        </w:pBdr>
-        <w:shd w:fill="F2F2F2" w:color="auto" w:val="clear"/>
-        <w:spacing w:after="140"/>
-        <w:ind w:left="120"/>
-      </w:pPr>
-      <w:r>
-        <w:rPr>
-          <w:rFonts w:ascii="Georgia" w:cs="Georgia" w:eastAsia="Georgia" w:hAnsi="Georgia"/>
-          <w:b/>
-          <w:bCs/>
-          <w:color w:val="555555"/>
-          <w:sz w:val="16"/>
-          <w:szCs w:val="16"/>
-        </w:rPr>
         <w:t xml:space="preserve">KNOPF (NUR DM):  </w:t>
       </w:r>
       <w:r>
@@ -8230,7 +8524,7 @@
           <w:left w:val="single" w:color="74B094" w:sz="18" w:space="8"/>
         </w:pBdr>
         <w:shd w:fill="EAF4EC" w:color="auto" w:val="clear"/>
-        <w:spacing w:after="140"/>
+        <w:spacing w:after="40"/>
         <w:ind w:left="120"/>
       </w:pPr>
       <w:r>
@@ -8242,7 +8536,7 @@
           <w:sz w:val="16"/>
           <w:szCs w:val="16"/>
         </w:rPr>
-        <w:t xml:space="preserve">AUFGABE:  </w:t>
+        <w:t xml:space="preserve">DM SAGT DEN SCHÜLERN:  </w:t>
       </w:r>
       <w:r>
         <w:rPr>
@@ -8250,7 +8544,26 @@
           <w:sz w:val="19"/>
           <w:szCs w:val="19"/>
         </w:rPr>
-        <w:t xml:space="preserve">Vor jedem Angriff — und in der Verhandlung sowieso — sagt die Figur einen englischen Satz zu Vaskir. Er antwortet immer, höflich und genau.  →  Helfer-Blatt · Teil 8</w:t>
+        <w:t xml:space="preserve">“Before every attack — and in the negotiation anyway — say one sentence to the Count. He always answers.”</w:t>
+      </w:r>
+    </w:p>
+    <w:p>
+      <w:pPr>
+        <w:pBdr>
+          <w:left w:val="single" w:color="74B094" w:sz="18" w:space="8"/>
+        </w:pBdr>
+        <w:shd w:fill="EAF4EC" w:color="auto" w:val="clear"/>
+        <w:spacing w:after="140"/>
+        <w:ind w:left="120"/>
+      </w:pPr>
+      <w:r>
+        <w:rPr>
+          <w:rFonts w:ascii="Georgia" w:cs="Georgia" w:eastAsia="Georgia" w:hAnsi="Georgia"/>
+          <w:color w:val="555555"/>
+          <w:sz w:val="17"/>
+          <w:szCs w:val="17"/>
+        </w:rPr>
+        <w:t xml:space="preserve">→  Helfer-Blatt · Teil 8</w:t>
       </w:r>
     </w:p>
     <w:p>
@@ -9202,7 +9515,7 @@
           <w:left w:val="single" w:color="74B094" w:sz="18" w:space="8"/>
         </w:pBdr>
         <w:shd w:fill="EAF4EC" w:color="auto" w:val="clear"/>
-        <w:spacing w:after="140"/>
+        <w:spacing w:after="40"/>
         <w:ind w:left="120"/>
       </w:pPr>
       <w:r>
@@ -9214,7 +9527,7 @@
           <w:sz w:val="16"/>
           <w:szCs w:val="16"/>
         </w:rPr>
-        <w:t xml:space="preserve">AUFGABE:  </w:t>
+        <w:t xml:space="preserve">DM SAGT DEN SCHÜLERN:  </w:t>
       </w:r>
       <w:r>
         <w:rPr>
@@ -9222,7 +9535,26 @@
           <w:sz w:val="19"/>
           <w:szCs w:val="19"/>
         </w:rPr>
-        <w:t xml:space="preserve">Drei Fragen in die Runde, reihum, auf Englisch: What would you do differently? — Was the village wrong? — What do you tell Tobias?  →  Helfer-Blatt · Teil 9</w:t>
+        <w:t xml:space="preserve">“Three questions. Everybody answers, one after the other: What would you do differently? Was the village wrong? What do you tell Tobias?”</w:t>
+      </w:r>
+    </w:p>
+    <w:p>
+      <w:pPr>
+        <w:pBdr>
+          <w:left w:val="single" w:color="74B094" w:sz="18" w:space="8"/>
+        </w:pBdr>
+        <w:shd w:fill="EAF4EC" w:color="auto" w:val="clear"/>
+        <w:spacing w:after="140"/>
+        <w:ind w:left="120"/>
+      </w:pPr>
+      <w:r>
+        <w:rPr>
+          <w:rFonts w:ascii="Georgia" w:cs="Georgia" w:eastAsia="Georgia" w:hAnsi="Georgia"/>
+          <w:color w:val="555555"/>
+          <w:sz w:val="17"/>
+          <w:szCs w:val="17"/>
+        </w:rPr>
+        <w:t xml:space="preserve">→  Helfer-Blatt · Teil 9</w:t>
       </w:r>
     </w:p>
     <w:sectPr>

</xml_diff>

<commit_message>
DM: feste Szenenordnung — Hintergrund, Vorlesen, Dialogmaterial; Hintergründe als kurze Zusammenfassungen
Co-Authored-By: Claude Fable 5.1 <noreply@anthropic.com>
Claude-Session: https://claude.ai/code/session_01ADUPP2jvP6dgTYk1DsQkUN
</commit_message>
<xml_diff>
--- a/helferblatt/Nachtfels_Lesetext_DM.docx
+++ b/helferblatt/Nachtfels_Lesetext_DM.docx
@@ -607,16 +607,16 @@
           <w:sz w:val="16"/>
           <w:szCs w:val="16"/>
         </w:rPr>
-        <w:t xml:space="preserve">NUR DM:  </w:t>
-      </w:r>
-      <w:r>
-        <w:rPr>
-          <w:rFonts w:ascii="Georgia" w:cs="Georgia" w:eastAsia="Georgia" w:hAnsi="Georgia"/>
-          <w:color w:val="333333"/>
-          <w:sz w:val="18"/>
-          <w:szCs w:val="18"/>
-        </w:rPr>
-        <w:t xml:space="preserve">Der Fahrer heisst Marek. Grimmig, wortkarg, will das Geld und wieder weg. Er ist kein Rätsel — er ist der Mann, der die erste Frage stellt.</w:t>
+        <w:t xml:space="preserve">HINTERGRUND (NUR DM):  </w:t>
+      </w:r>
+      <w:r>
+        <w:rPr>
+          <w:rFonts w:ascii="Georgia" w:cs="Georgia" w:eastAsia="Georgia" w:hAnsi="Georgia"/>
+          <w:color w:val="333333"/>
+          <w:sz w:val="18"/>
+          <w:szCs w:val="18"/>
+        </w:rPr>
+        <w:t xml:space="preserve">Sechs Stunden Kutschfahrt bergauf, Nebel, Mond, etwas läuft im Wald mit. Der Fahrer heisst Marek: grimmig, wortkarg, will das Geld und wieder weg — er stellt die erste Frage des Abends. Die Gruppe sind Vampirjäger, hergeführt von einem Gerücht (das liest du gleich vor). Wichtig: Jede Figur sagt Marek mindestens zwei bis drei Sätze. Die Szene endet vor dem Wirtshaus, die Kutsche fährt weg.</w:t>
       </w:r>
     </w:p>
     <w:p>
@@ -1568,260 +1568,16 @@
           <w:sz w:val="16"/>
           <w:szCs w:val="16"/>
         </w:rPr>
-        <w:t xml:space="preserve">NUR DM:  </w:t>
-      </w:r>
-      <w:r>
-        <w:rPr>
-          <w:rFonts w:ascii="Georgia" w:cs="Georgia" w:eastAsia="Georgia" w:hAnsi="Georgia"/>
-          <w:color w:val="333333"/>
-          <w:sz w:val="18"/>
-          <w:szCs w:val="18"/>
-        </w:rPr>
-        <w:t xml:space="preserve">Nur diese drei antworten. Die anderen acht sind Kulisse: Spricht jemand sie an, sagst du „They look into their drinks and say nothing“ — damit ist es erledigt, und du musst dir niemanden ausdenken. An den drei Beschreibungen oben erkennen die Schüler, wen sie ansprechen können.</w:t>
-      </w:r>
-    </w:p>
-    <w:p>
-      <w:pPr>
-        <w:pBdr>
-          <w:left w:val="single" w:color="BFBFBF" w:sz="18" w:space="8"/>
-        </w:pBdr>
-        <w:shd w:fill="F2F2F2" w:color="auto" w:val="clear"/>
-        <w:spacing w:after="40"/>
-        <w:ind w:left="120"/>
-      </w:pPr>
-      <w:r>
-        <w:rPr>
-          <w:rFonts w:ascii="Georgia" w:cs="Georgia" w:eastAsia="Georgia" w:hAnsi="Georgia"/>
-          <w:b/>
-          <w:bCs/>
-          <w:color w:val="555555"/>
-          <w:sz w:val="16"/>
-          <w:szCs w:val="16"/>
-        </w:rPr>
-        <w:t xml:space="preserve">WEN MAN ANSPRECHEN KANN (NUR DM)  </w:t>
-      </w:r>
-    </w:p>
-    <w:p>
-      <w:pPr>
-        <w:pBdr>
-          <w:left w:val="single" w:color="BFBFBF" w:sz="18" w:space="8"/>
-        </w:pBdr>
-        <w:shd w:fill="F2F2F2" w:color="auto" w:val="clear"/>
-        <w:spacing w:after="40"/>
-        <w:ind w:left="120"/>
-      </w:pPr>
-      <w:r>
-        <w:rPr>
-          <w:rFonts w:ascii="Georgia" w:cs="Georgia" w:eastAsia="Georgia" w:hAnsi="Georgia"/>
-          <w:b/>
-          <w:bCs/>
-          <w:sz w:val="18"/>
-          <w:szCs w:val="18"/>
-        </w:rPr>
-        <w:t xml:space="preserve">Greta — Wirtin, drei Finger. </w:t>
-      </w:r>
-      <w:r>
-        <w:rPr>
-          <w:rFonts w:ascii="Georgia" w:cs="Georgia" w:eastAsia="Georgia" w:hAnsi="Georgia"/>
-          <w:color w:val="333333"/>
-          <w:sz w:val="18"/>
-          <w:szCs w:val="18"/>
-        </w:rPr>
-        <w:t xml:space="preserve">Kurze Sätze. Sie lügt nie — sie wechselt das Thema. Freundlich, nicht feindlich.</w:t>
-      </w:r>
-    </w:p>
-    <w:p>
-      <w:pPr>
-        <w:pBdr>
-          <w:left w:val="single" w:color="BFBFBF" w:sz="18" w:space="8"/>
-        </w:pBdr>
-        <w:shd w:fill="F2F2F2" w:color="auto" w:val="clear"/>
-        <w:spacing w:after="40"/>
-        <w:ind w:left="120"/>
-      </w:pPr>
-      <w:r>
-        <w:rPr>
-          <w:rFonts w:ascii="Georgia" w:cs="Georgia" w:eastAsia="Georgia" w:hAnsi="Georgia"/>
-          <w:i/>
-          <w:iCs/>
-          <w:sz w:val="18"/>
-          <w:szCs w:val="18"/>
-        </w:rPr>
-        <w:t xml:space="preserve">„Mirela is gone. That is all there is.“  ·  „We don’t go up there. That is the arrangement.“  ·  „You want to help? Go home. That would help.“</w:t>
-      </w:r>
-    </w:p>
-    <w:p>
-      <w:pPr>
-        <w:pBdr>
-          <w:left w:val="single" w:color="BFBFBF" w:sz="18" w:space="8"/>
-        </w:pBdr>
-        <w:shd w:fill="F2F2F2" w:color="auto" w:val="clear"/>
-        <w:spacing w:after="40"/>
-        <w:ind w:left="120"/>
-      </w:pPr>
-      <w:r>
-        <w:rPr>
-          <w:rFonts w:ascii="Georgia" w:cs="Georgia" w:eastAsia="Georgia" w:hAnsi="Georgia"/>
-          <w:color w:val="555555"/>
-          <w:sz w:val="17"/>
-          <w:szCs w:val="17"/>
-        </w:rPr>
-        <w:t xml:space="preserve">Notfalls: Fragt sie niemand, stellt sie ungefragt drei Becher hin: „You’re going up there anyway, aren’t you.“</w:t>
-      </w:r>
-    </w:p>
-    <w:p>
-      <w:pPr>
-        <w:pBdr>
-          <w:left w:val="single" w:color="BFBFBF" w:sz="18" w:space="8"/>
-        </w:pBdr>
-        <w:shd w:fill="F2F2F2" w:color="auto" w:val="clear"/>
-        <w:spacing w:after="40"/>
-        <w:ind w:left="120"/>
-      </w:pPr>
-      <w:r>
-        <w:rPr>
-          <w:rFonts w:ascii="Georgia" w:cs="Georgia" w:eastAsia="Georgia" w:hAnsi="Georgia"/>
-          <w:b/>
-          <w:bCs/>
-          <w:sz w:val="18"/>
-          <w:szCs w:val="18"/>
-        </w:rPr>
-        <w:t xml:space="preserve">Old Pieter — Totengräber, betrunken. </w:t>
-      </w:r>
-      <w:r>
-        <w:rPr>
-          <w:rFonts w:ascii="Georgia" w:cs="Georgia" w:eastAsia="Georgia" w:hAnsi="Georgia"/>
-          <w:color w:val="333333"/>
-          <w:sz w:val="18"/>
-          <w:szCs w:val="18"/>
-        </w:rPr>
-        <w:t xml:space="preserve">Zu laut, lacht an den falschen Stellen. Er sagt die Wahrheit, darum glaubt ihm niemand.</w:t>
-      </w:r>
-    </w:p>
-    <w:p>
-      <w:pPr>
-        <w:pBdr>
-          <w:left w:val="single" w:color="BFBFBF" w:sz="18" w:space="8"/>
-        </w:pBdr>
-        <w:shd w:fill="F2F2F2" w:color="auto" w:val="clear"/>
-        <w:spacing w:after="40"/>
-        <w:ind w:left="120"/>
-      </w:pPr>
-      <w:r>
-        <w:rPr>
-          <w:rFonts w:ascii="Georgia" w:cs="Georgia" w:eastAsia="Georgia" w:hAnsi="Georgia"/>
-          <w:i/>
-          <w:iCs/>
-          <w:sz w:val="18"/>
-          <w:szCs w:val="18"/>
-        </w:rPr>
-        <w:t xml:space="preserve">„Twenty years! Ask her what happened twenty years ago!“  ·  „Ask her about Anneke! Go on — ask her about Anneke!“  ·  „I dug no grave for that girl. Because there was nothing to bury.“</w:t>
-      </w:r>
-    </w:p>
-    <w:p>
-      <w:pPr>
-        <w:pBdr>
-          <w:left w:val="single" w:color="BFBFBF" w:sz="18" w:space="8"/>
-        </w:pBdr>
-        <w:shd w:fill="F2F2F2" w:color="auto" w:val="clear"/>
-        <w:spacing w:after="40"/>
-        <w:ind w:left="120"/>
-      </w:pPr>
-      <w:r>
-        <w:rPr>
-          <w:rFonts w:ascii="Georgia" w:cs="Georgia" w:eastAsia="Georgia" w:hAnsi="Georgia"/>
-          <w:color w:val="555555"/>
-          <w:sz w:val="17"/>
-          <w:szCs w:val="17"/>
-        </w:rPr>
-        <w:t xml:space="preserve">Notfalls: Spricht ihn niemand an, ruft er den Anneke-Satz nach fünf Minuten quer durch den Raum. Der Name muss fallen.</w:t>
-      </w:r>
-    </w:p>
-    <w:p>
-      <w:pPr>
-        <w:pBdr>
-          <w:left w:val="single" w:color="BFBFBF" w:sz="18" w:space="8"/>
-        </w:pBdr>
-        <w:shd w:fill="F2F2F2" w:color="auto" w:val="clear"/>
-        <w:spacing w:after="40"/>
-        <w:ind w:left="120"/>
-      </w:pPr>
-      <w:r>
-        <w:rPr>
-          <w:rFonts w:ascii="Georgia" w:cs="Georgia" w:eastAsia="Georgia" w:hAnsi="Georgia"/>
-          <w:b/>
-          <w:bCs/>
-          <w:sz w:val="18"/>
-          <w:szCs w:val="18"/>
-        </w:rPr>
-        <w:t xml:space="preserve">Tobias — Junge an der Tür, 12. </w:t>
-      </w:r>
-      <w:r>
-        <w:rPr>
-          <w:rFonts w:ascii="Georgia" w:cs="Georgia" w:eastAsia="Georgia" w:hAnsi="Georgia"/>
-          <w:color w:val="333333"/>
-          <w:sz w:val="18"/>
-          <w:szCs w:val="18"/>
-        </w:rPr>
-        <w:t xml:space="preserve">Schnell, hoffnungsvoll, zu ehrlich. Er wartet seit drei Nächten auf jemanden wie euch.</w:t>
-      </w:r>
-    </w:p>
-    <w:p>
-      <w:pPr>
-        <w:pBdr>
-          <w:left w:val="single" w:color="BFBFBF" w:sz="18" w:space="8"/>
-        </w:pBdr>
-        <w:shd w:fill="F2F2F2" w:color="auto" w:val="clear"/>
-        <w:spacing w:after="40"/>
-        <w:ind w:left="120"/>
-      </w:pPr>
-      <w:r>
-        <w:rPr>
-          <w:rFonts w:ascii="Georgia" w:cs="Georgia" w:eastAsia="Georgia" w:hAnsi="Georgia"/>
-          <w:i/>
-          <w:iCs/>
-          <w:sz w:val="18"/>
-          <w:szCs w:val="18"/>
-        </w:rPr>
-        <w:t xml:space="preserve">„She wasn’t taken. She packed a bag.“  ·  „She said it was her turn. She said it like it was a shopping list.“  ·  „She said: tell them it’s for Lene. Lene is my sister. She’s nine.“</w:t>
-      </w:r>
-    </w:p>
-    <w:p>
-      <w:pPr>
-        <w:pBdr>
-          <w:left w:val="single" w:color="BFBFBF" w:sz="18" w:space="8"/>
-        </w:pBdr>
-        <w:shd w:fill="F2F2F2" w:color="auto" w:val="clear"/>
-        <w:spacing w:after="40"/>
-        <w:ind w:left="120"/>
-      </w:pPr>
-      <w:r>
-        <w:rPr>
-          <w:rFonts w:ascii="Georgia" w:cs="Georgia" w:eastAsia="Georgia" w:hAnsi="Georgia"/>
-          <w:color w:val="555555"/>
-          <w:sz w:val="17"/>
-          <w:szCs w:val="17"/>
-        </w:rPr>
-        <w:t xml:space="preserve">Notfalls: Redet niemand mit ihm, läuft er ihnen an der Tür nach und sagt den Satz mit dem Koffer.</w:t>
-      </w:r>
-    </w:p>
-    <w:p>
-      <w:pPr>
-        <w:pBdr>
-          <w:left w:val="single" w:color="BFBFBF" w:sz="18" w:space="8"/>
-        </w:pBdr>
-        <w:shd w:fill="F2F2F2" w:color="auto" w:val="clear"/>
-        <w:spacing w:after="140"/>
-        <w:ind w:left="120"/>
-      </w:pPr>
-      <w:r>
-        <w:rPr>
-          <w:rFonts w:ascii="Georgia" w:cs="Georgia" w:eastAsia="Georgia" w:hAnsi="Georgia"/>
-          <w:color w:val="555555"/>
-          <w:sz w:val="17"/>
-          <w:szCs w:val="17"/>
-        </w:rPr>
-        <w:t xml:space="preserve">Tobias ist Mirelas Lehrling. Er will mit ins Schloss. Er darf nicht mit — aber lass ihn fragen. Er bleibt im Dorf und wartet.</w:t>
+        <w:t xml:space="preserve">HINTERGRUND (NUR DM):  </w:t>
+      </w:r>
+      <w:r>
+        <w:rPr>
+          <w:rFonts w:ascii="Georgia" w:cs="Georgia" w:eastAsia="Georgia" w:hAnsi="Georgia"/>
+          <w:color w:val="333333"/>
+          <w:sz w:val="18"/>
+          <w:szCs w:val="18"/>
+        </w:rPr>
+        <w:t xml:space="preserve">Im Wirtshaus sitzen elf Menschen. Drei sind ansprechbar: Greta (Wirtin, drei Finger), Old Pieter (Totengräber, betrunken) und Tobias (Junge an der Tür). Die anderen acht antworten nicht — spricht jemand sie an: „They look into their drinks and say nothing.“ Wichtig: Der Name Anneke muss fallen; notfalls ruft Pieter ihn von selbst. Am Ende der Szene liegt die Karte mit den drei Wegen auf dem Tisch.</w:t>
       </w:r>
     </w:p>
     <w:p>
@@ -2163,6 +1919,250 @@
           <w:szCs w:val="17"/>
         </w:rPr>
         <w:t xml:space="preserve">Antwortmöglichkeiten unten abhaken, sobald eine Frage gestellt ist — jede nur einmal, egal von wem.  →  Helfer-Blatt · Teil 2</w:t>
+      </w:r>
+    </w:p>
+    <w:p>
+      <w:pPr>
+        <w:pBdr>
+          <w:left w:val="single" w:color="BFBFBF" w:sz="18" w:space="8"/>
+        </w:pBdr>
+        <w:shd w:fill="F2F2F2" w:color="auto" w:val="clear"/>
+        <w:spacing w:after="40"/>
+        <w:ind w:left="120"/>
+      </w:pPr>
+      <w:r>
+        <w:rPr>
+          <w:rFonts w:ascii="Georgia" w:cs="Georgia" w:eastAsia="Georgia" w:hAnsi="Georgia"/>
+          <w:b/>
+          <w:bCs/>
+          <w:color w:val="555555"/>
+          <w:sz w:val="16"/>
+          <w:szCs w:val="16"/>
+        </w:rPr>
+        <w:t xml:space="preserve">WEN MAN ANSPRECHEN KANN (NUR DM)  </w:t>
+      </w:r>
+    </w:p>
+    <w:p>
+      <w:pPr>
+        <w:pBdr>
+          <w:left w:val="single" w:color="BFBFBF" w:sz="18" w:space="8"/>
+        </w:pBdr>
+        <w:shd w:fill="F2F2F2" w:color="auto" w:val="clear"/>
+        <w:spacing w:after="40"/>
+        <w:ind w:left="120"/>
+      </w:pPr>
+      <w:r>
+        <w:rPr>
+          <w:rFonts w:ascii="Georgia" w:cs="Georgia" w:eastAsia="Georgia" w:hAnsi="Georgia"/>
+          <w:b/>
+          <w:bCs/>
+          <w:sz w:val="18"/>
+          <w:szCs w:val="18"/>
+        </w:rPr>
+        <w:t xml:space="preserve">Greta — Wirtin, drei Finger. </w:t>
+      </w:r>
+      <w:r>
+        <w:rPr>
+          <w:rFonts w:ascii="Georgia" w:cs="Georgia" w:eastAsia="Georgia" w:hAnsi="Georgia"/>
+          <w:color w:val="333333"/>
+          <w:sz w:val="18"/>
+          <w:szCs w:val="18"/>
+        </w:rPr>
+        <w:t xml:space="preserve">Kurze Sätze. Sie lügt nie — sie wechselt das Thema. Freundlich, nicht feindlich.</w:t>
+      </w:r>
+    </w:p>
+    <w:p>
+      <w:pPr>
+        <w:pBdr>
+          <w:left w:val="single" w:color="BFBFBF" w:sz="18" w:space="8"/>
+        </w:pBdr>
+        <w:shd w:fill="F2F2F2" w:color="auto" w:val="clear"/>
+        <w:spacing w:after="40"/>
+        <w:ind w:left="120"/>
+      </w:pPr>
+      <w:r>
+        <w:rPr>
+          <w:rFonts w:ascii="Georgia" w:cs="Georgia" w:eastAsia="Georgia" w:hAnsi="Georgia"/>
+          <w:i/>
+          <w:iCs/>
+          <w:sz w:val="18"/>
+          <w:szCs w:val="18"/>
+        </w:rPr>
+        <w:t xml:space="preserve">„Mirela is gone. That is all there is.“  ·  „We don’t go up there. That is the arrangement.“  ·  „You want to help? Go home. That would help.“</w:t>
+      </w:r>
+    </w:p>
+    <w:p>
+      <w:pPr>
+        <w:pBdr>
+          <w:left w:val="single" w:color="BFBFBF" w:sz="18" w:space="8"/>
+        </w:pBdr>
+        <w:shd w:fill="F2F2F2" w:color="auto" w:val="clear"/>
+        <w:spacing w:after="40"/>
+        <w:ind w:left="120"/>
+      </w:pPr>
+      <w:r>
+        <w:rPr>
+          <w:rFonts w:ascii="Georgia" w:cs="Georgia" w:eastAsia="Georgia" w:hAnsi="Georgia"/>
+          <w:color w:val="555555"/>
+          <w:sz w:val="17"/>
+          <w:szCs w:val="17"/>
+        </w:rPr>
+        <w:t xml:space="preserve">Notfalls: Fragt sie niemand, stellt sie ungefragt drei Becher hin: „You’re going up there anyway, aren’t you.“</w:t>
+      </w:r>
+    </w:p>
+    <w:p>
+      <w:pPr>
+        <w:pBdr>
+          <w:left w:val="single" w:color="BFBFBF" w:sz="18" w:space="8"/>
+        </w:pBdr>
+        <w:shd w:fill="F2F2F2" w:color="auto" w:val="clear"/>
+        <w:spacing w:after="40"/>
+        <w:ind w:left="120"/>
+      </w:pPr>
+      <w:r>
+        <w:rPr>
+          <w:rFonts w:ascii="Georgia" w:cs="Georgia" w:eastAsia="Georgia" w:hAnsi="Georgia"/>
+          <w:b/>
+          <w:bCs/>
+          <w:sz w:val="18"/>
+          <w:szCs w:val="18"/>
+        </w:rPr>
+        <w:t xml:space="preserve">Old Pieter — Totengräber, betrunken. </w:t>
+      </w:r>
+      <w:r>
+        <w:rPr>
+          <w:rFonts w:ascii="Georgia" w:cs="Georgia" w:eastAsia="Georgia" w:hAnsi="Georgia"/>
+          <w:color w:val="333333"/>
+          <w:sz w:val="18"/>
+          <w:szCs w:val="18"/>
+        </w:rPr>
+        <w:t xml:space="preserve">Zu laut, lacht an den falschen Stellen. Er sagt die Wahrheit, darum glaubt ihm niemand.</w:t>
+      </w:r>
+    </w:p>
+    <w:p>
+      <w:pPr>
+        <w:pBdr>
+          <w:left w:val="single" w:color="BFBFBF" w:sz="18" w:space="8"/>
+        </w:pBdr>
+        <w:shd w:fill="F2F2F2" w:color="auto" w:val="clear"/>
+        <w:spacing w:after="40"/>
+        <w:ind w:left="120"/>
+      </w:pPr>
+      <w:r>
+        <w:rPr>
+          <w:rFonts w:ascii="Georgia" w:cs="Georgia" w:eastAsia="Georgia" w:hAnsi="Georgia"/>
+          <w:i/>
+          <w:iCs/>
+          <w:sz w:val="18"/>
+          <w:szCs w:val="18"/>
+        </w:rPr>
+        <w:t xml:space="preserve">„Twenty years! Ask her what happened twenty years ago!“  ·  „Ask her about Anneke! Go on — ask her about Anneke!“  ·  „I dug no grave for that girl. Because there was nothing to bury.“</w:t>
+      </w:r>
+    </w:p>
+    <w:p>
+      <w:pPr>
+        <w:pBdr>
+          <w:left w:val="single" w:color="BFBFBF" w:sz="18" w:space="8"/>
+        </w:pBdr>
+        <w:shd w:fill="F2F2F2" w:color="auto" w:val="clear"/>
+        <w:spacing w:after="40"/>
+        <w:ind w:left="120"/>
+      </w:pPr>
+      <w:r>
+        <w:rPr>
+          <w:rFonts w:ascii="Georgia" w:cs="Georgia" w:eastAsia="Georgia" w:hAnsi="Georgia"/>
+          <w:color w:val="555555"/>
+          <w:sz w:val="17"/>
+          <w:szCs w:val="17"/>
+        </w:rPr>
+        <w:t xml:space="preserve">Notfalls: Spricht ihn niemand an, ruft er den Anneke-Satz nach fünf Minuten quer durch den Raum. Der Name muss fallen.</w:t>
+      </w:r>
+    </w:p>
+    <w:p>
+      <w:pPr>
+        <w:pBdr>
+          <w:left w:val="single" w:color="BFBFBF" w:sz="18" w:space="8"/>
+        </w:pBdr>
+        <w:shd w:fill="F2F2F2" w:color="auto" w:val="clear"/>
+        <w:spacing w:after="40"/>
+        <w:ind w:left="120"/>
+      </w:pPr>
+      <w:r>
+        <w:rPr>
+          <w:rFonts w:ascii="Georgia" w:cs="Georgia" w:eastAsia="Georgia" w:hAnsi="Georgia"/>
+          <w:b/>
+          <w:bCs/>
+          <w:sz w:val="18"/>
+          <w:szCs w:val="18"/>
+        </w:rPr>
+        <w:t xml:space="preserve">Tobias — Junge an der Tür, 12. </w:t>
+      </w:r>
+      <w:r>
+        <w:rPr>
+          <w:rFonts w:ascii="Georgia" w:cs="Georgia" w:eastAsia="Georgia" w:hAnsi="Georgia"/>
+          <w:color w:val="333333"/>
+          <w:sz w:val="18"/>
+          <w:szCs w:val="18"/>
+        </w:rPr>
+        <w:t xml:space="preserve">Schnell, hoffnungsvoll, zu ehrlich. Er wartet seit drei Nächten auf jemanden wie euch.</w:t>
+      </w:r>
+    </w:p>
+    <w:p>
+      <w:pPr>
+        <w:pBdr>
+          <w:left w:val="single" w:color="BFBFBF" w:sz="18" w:space="8"/>
+        </w:pBdr>
+        <w:shd w:fill="F2F2F2" w:color="auto" w:val="clear"/>
+        <w:spacing w:after="40"/>
+        <w:ind w:left="120"/>
+      </w:pPr>
+      <w:r>
+        <w:rPr>
+          <w:rFonts w:ascii="Georgia" w:cs="Georgia" w:eastAsia="Georgia" w:hAnsi="Georgia"/>
+          <w:i/>
+          <w:iCs/>
+          <w:sz w:val="18"/>
+          <w:szCs w:val="18"/>
+        </w:rPr>
+        <w:t xml:space="preserve">„She wasn’t taken. She packed a bag.“  ·  „She said it was her turn. She said it like it was a shopping list.“  ·  „She said: tell them it’s for Lene. Lene is my sister. She’s nine.“</w:t>
+      </w:r>
+    </w:p>
+    <w:p>
+      <w:pPr>
+        <w:pBdr>
+          <w:left w:val="single" w:color="BFBFBF" w:sz="18" w:space="8"/>
+        </w:pBdr>
+        <w:shd w:fill="F2F2F2" w:color="auto" w:val="clear"/>
+        <w:spacing w:after="40"/>
+        <w:ind w:left="120"/>
+      </w:pPr>
+      <w:r>
+        <w:rPr>
+          <w:rFonts w:ascii="Georgia" w:cs="Georgia" w:eastAsia="Georgia" w:hAnsi="Georgia"/>
+          <w:color w:val="555555"/>
+          <w:sz w:val="17"/>
+          <w:szCs w:val="17"/>
+        </w:rPr>
+        <w:t xml:space="preserve">Notfalls: Redet niemand mit ihm, läuft er ihnen an der Tür nach und sagt den Satz mit dem Koffer.</w:t>
+      </w:r>
+    </w:p>
+    <w:p>
+      <w:pPr>
+        <w:pBdr>
+          <w:left w:val="single" w:color="BFBFBF" w:sz="18" w:space="8"/>
+        </w:pBdr>
+        <w:shd w:fill="F2F2F2" w:color="auto" w:val="clear"/>
+        <w:spacing w:after="140"/>
+        <w:ind w:left="120"/>
+      </w:pPr>
+      <w:r>
+        <w:rPr>
+          <w:rFonts w:ascii="Georgia" w:cs="Georgia" w:eastAsia="Georgia" w:hAnsi="Georgia"/>
+          <w:color w:val="555555"/>
+          <w:sz w:val="17"/>
+          <w:szCs w:val="17"/>
+        </w:rPr>
+        <w:t xml:space="preserve">Tobias ist Mirelas Lehrling. Er will mit ins Schloss. Er darf nicht mit — aber lass ihn fragen. Er bleibt im Dorf und wartet.</w:t>
       </w:r>
     </w:p>
     <w:p>
@@ -2628,6 +2628,36 @@
     <w:p>
       <w:pPr>
         <w:pBdr>
+          <w:left w:val="single" w:color="BFBFBF" w:sz="18" w:space="8"/>
+        </w:pBdr>
+        <w:shd w:fill="F2F2F2" w:color="auto" w:val="clear"/>
+        <w:spacing w:after="140"/>
+        <w:ind w:left="120"/>
+      </w:pPr>
+      <w:r>
+        <w:rPr>
+          <w:rFonts w:ascii="Georgia" w:cs="Georgia" w:eastAsia="Georgia" w:hAnsi="Georgia"/>
+          <w:b/>
+          <w:bCs/>
+          <w:color w:val="555555"/>
+          <w:sz w:val="16"/>
+          <w:szCs w:val="16"/>
+        </w:rPr>
+        <w:t xml:space="preserve">HINTERGRUND (NUR DM):  </w:t>
+      </w:r>
+      <w:r>
+        <w:rPr>
+          <w:rFonts w:ascii="Georgia" w:cs="Georgia" w:eastAsia="Georgia" w:hAnsi="Georgia"/>
+          <w:color w:val="333333"/>
+          <w:sz w:val="18"/>
+          <w:szCs w:val="18"/>
+        </w:rPr>
+        <w:t xml:space="preserve">Drei Wege, alle enden im Hof des Schlosses — verschieden ist nur der Preis. Strasse: Wölfe, Sumpf, an Wachen vorbei, Gefahr +2. Stollen: −2 HP für alle, dann eine Wache überzeugen, Gefahr ±0. Kutsche: bequem bis in den Hof, aber das Haus weiss Bescheid, Gefahr +4. Frag reihum: „And what do you think?“ Bei Streit: „One minute, then we vote.“ Klick danach die gewählte Karte an — ab dann steht auf den nächsten Seiten nur noch euer Weg.</w:t>
+      </w:r>
+    </w:p>
+    <w:p>
+      <w:pPr>
+        <w:pBdr>
           <w:left w:val="single" w:color="D9A441" w:sz="18" w:space="8"/>
         </w:pBdr>
         <w:shd w:fill="FFF6DD" w:color="auto" w:val="clear"/>
@@ -2823,36 +2853,6 @@
           <w:szCs w:val="17"/>
         </w:rPr>
         <w:t xml:space="preserve">Reihum. Bei Streit: „One minute, then we vote.“  →  Helfer-Blatt · Teil 3</w:t>
-      </w:r>
-    </w:p>
-    <w:p>
-      <w:pPr>
-        <w:pBdr>
-          <w:left w:val="single" w:color="BFBFBF" w:sz="18" w:space="8"/>
-        </w:pBdr>
-        <w:shd w:fill="F2F2F2" w:color="auto" w:val="clear"/>
-        <w:spacing w:after="140"/>
-        <w:ind w:left="120"/>
-      </w:pPr>
-      <w:r>
-        <w:rPr>
-          <w:rFonts w:ascii="Georgia" w:cs="Georgia" w:eastAsia="Georgia" w:hAnsi="Georgia"/>
-          <w:b/>
-          <w:bCs/>
-          <w:color w:val="555555"/>
-          <w:sz w:val="16"/>
-          <w:szCs w:val="16"/>
-        </w:rPr>
-        <w:t xml:space="preserve">NUR DM:  </w:t>
-      </w:r>
-      <w:r>
-        <w:rPr>
-          <w:rFonts w:ascii="Georgia" w:cs="Georgia" w:eastAsia="Georgia" w:hAnsi="Georgia"/>
-          <w:color w:val="333333"/>
-          <w:sz w:val="18"/>
-          <w:szCs w:val="18"/>
-        </w:rPr>
-        <w:t xml:space="preserve">Frag reihum: „And what do you think?“ Wenn sie sich nicht einigen: „One minute, then we vote.“ Klick danach die gewählte Karte an — ab dann steht auf den nächsten Seiten nur noch euer Weg.</w:t>
       </w:r>
     </w:p>
     <w:p>
@@ -3042,16 +3042,16 @@
           <w:sz w:val="16"/>
           <w:szCs w:val="16"/>
         </w:rPr>
-        <w:t xml:space="preserve">NUR DM:  </w:t>
-      </w:r>
-      <w:r>
-        <w:rPr>
-          <w:rFonts w:ascii="Georgia" w:cs="Georgia" w:eastAsia="Georgia" w:hAnsi="Georgia"/>
-          <w:color w:val="333333"/>
-          <w:sz w:val="18"/>
-          <w:szCs w:val="18"/>
-        </w:rPr>
-        <w:t xml:space="preserve">Der erste Kampf des Abends. Geh ihn langsam durch: Jeder sagt zuerst auf Englisch, was er tut, dann drückt er seinen Knopf, dann liest er seinen gelben Satz vor. Fällt ein Wolf, läuft der andere weg — der Kampf muss nicht zu Ende gehen.</w:t>
+        <w:t xml:space="preserve">HINTERGRUND · STRASSE (NUR DM):  </w:t>
+      </w:r>
+      <w:r>
+        <w:rPr>
+          <w:rFonts w:ascii="Georgia" w:cs="Georgia" w:eastAsia="Georgia" w:hAnsi="Georgia"/>
+          <w:color w:val="333333"/>
+          <w:sz w:val="18"/>
+          <w:szCs w:val="18"/>
+        </w:rPr>
+        <w:t xml:space="preserve">Drei Stationen: Wölfe am Galgen (erster Kampf des Abends — langsam: jeder sagt auf Englisch, was er tut, drückt seinen Knopf, liest seinen gelben Satz vor; fällt ein Wolf, läuft der andere), der Sumpf (jeder würfelt dreimal, unter 10 = −1 HP) und die Wachen am Tor (jeder würfelt einmal; alle ≥ 10 → vorbei, sonst Kampf mit einer Wache und Gefahr +1).</w:t>
       </w:r>
     </w:p>
     <w:p>
@@ -3434,6 +3434,111 @@
     </w:p>
     <w:p>
       <w:pPr>
+        <w:spacing w:after="40" w:before="100"/>
+      </w:pPr>
+      <w:r>
+        <w:rPr>
+          <w:rFonts w:ascii="Georgia" w:cs="Georgia" w:eastAsia="Georgia" w:hAnsi="Georgia"/>
+          <w:b/>
+          <w:bCs/>
+          <w:color w:val="555555"/>
+          <w:sz w:val="19"/>
+          <w:szCs w:val="19"/>
+        </w:rPr>
+        <w:t xml:space="preserve">Die Wachen am Tor</w:t>
+      </w:r>
+    </w:p>
+    <w:p>
+      <w:pPr>
+        <w:spacing w:after="110" w:line="320"/>
+      </w:pPr>
+      <w:r>
+        <w:rPr>
+          <w:rFonts w:ascii="Georgia" w:cs="Georgia" w:eastAsia="Georgia" w:hAnsi="Georgia"/>
+          <w:sz w:val="22"/>
+          <w:szCs w:val="22"/>
+        </w:rPr>
+        <w:t xml:space="preserve">On the far side of the bog</w:t>
+      </w:r>
+      <w:r>
+        <w:rPr>
+          <w:rFonts w:ascii="Georgia" w:cs="Georgia" w:eastAsia="Georgia" w:hAnsi="Georgia"/>
+          <w:color w:val="7A5A1A"/>
+          <w:sz w:val="18"/>
+          <w:szCs w:val="18"/>
+        </w:rPr>
+        <w:t xml:space="preserve"> [Sumpf]</w:t>
+      </w:r>
+      <w:r>
+        <w:rPr>
+          <w:rFonts w:ascii="Georgia" w:cs="Georgia" w:eastAsia="Georgia" w:hAnsi="Georgia"/>
+          <w:sz w:val="22"/>
+          <w:szCs w:val="22"/>
+        </w:rPr>
+        <w:t xml:space="preserve"> the gate</w:t>
+      </w:r>
+      <w:r>
+        <w:rPr>
+          <w:rFonts w:ascii="Georgia" w:cs="Georgia" w:eastAsia="Georgia" w:hAnsi="Georgia"/>
+          <w:color w:val="7A5A1A"/>
+          <w:sz w:val="18"/>
+          <w:szCs w:val="18"/>
+        </w:rPr>
+        <w:t xml:space="preserve"> [Tor]</w:t>
+      </w:r>
+      <w:r>
+        <w:rPr>
+          <w:rFonts w:ascii="Georgia" w:cs="Georgia" w:eastAsia="Georgia" w:hAnsi="Georgia"/>
+          <w:sz w:val="22"/>
+          <w:szCs w:val="22"/>
+        </w:rPr>
+        <w:t xml:space="preserve"> of Nachtfels stands open. Two men in old grey livery</w:t>
+      </w:r>
+      <w:r>
+        <w:rPr>
+          <w:rFonts w:ascii="Georgia" w:cs="Georgia" w:eastAsia="Georgia" w:hAnsi="Georgia"/>
+          <w:color w:val="7A5A1A"/>
+          <w:sz w:val="18"/>
+          <w:szCs w:val="18"/>
+        </w:rPr>
+        <w:t xml:space="preserve"> [Dienstkleidung]</w:t>
+      </w:r>
+      <w:r>
+        <w:rPr>
+          <w:rFonts w:ascii="Georgia" w:cs="Georgia" w:eastAsia="Georgia" w:hAnsi="Georgia"/>
+          <w:sz w:val="22"/>
+          <w:szCs w:val="22"/>
+        </w:rPr>
+        <w:t xml:space="preserve"> stand beside it with lamps</w:t>
+      </w:r>
+      <w:r>
+        <w:rPr>
+          <w:rFonts w:ascii="Georgia" w:cs="Georgia" w:eastAsia="Georgia" w:hAnsi="Georgia"/>
+          <w:color w:val="7A5A1A"/>
+          <w:sz w:val="18"/>
+          <w:szCs w:val="18"/>
+        </w:rPr>
+        <w:t xml:space="preserve"> [Laternen]</w:t>
+      </w:r>
+      <w:r>
+        <w:rPr>
+          <w:rFonts w:ascii="Georgia" w:cs="Georgia" w:eastAsia="Georgia" w:hAnsi="Georgia"/>
+          <w:sz w:val="22"/>
+          <w:szCs w:val="22"/>
+        </w:rPr>
+        <w:t xml:space="preserve">. They do not move. They do not talk. They are looking at the fog</w:t>
+      </w:r>
+      <w:r>
+        <w:rPr>
+          <w:rFonts w:ascii="Georgia" w:cs="Georgia" w:eastAsia="Georgia" w:hAnsi="Georgia"/>
+          <w:sz w:val="22"/>
+          <w:szCs w:val="22"/>
+        </w:rPr>
+        <w:t xml:space="preserve">.</w:t>
+      </w:r>
+    </w:p>
+    <w:p>
+      <w:pPr>
         <w:pBdr>
           <w:left w:val="single" w:color="BFBFBF" w:sz="18" w:space="8"/>
         </w:pBdr>
@@ -3450,16 +3555,16 @@
           <w:sz w:val="16"/>
           <w:szCs w:val="16"/>
         </w:rPr>
-        <w:t xml:space="preserve">NUR DM:  </w:t>
-      </w:r>
-      <w:r>
-        <w:rPr>
-          <w:rFonts w:ascii="Georgia" w:cs="Georgia" w:eastAsia="Georgia" w:hAnsi="Georgia"/>
-          <w:color w:val="333333"/>
-          <w:sz w:val="18"/>
-          <w:szCs w:val="18"/>
-        </w:rPr>
-        <w:t xml:space="preserve">Anschleichen: jede Figur würfelt einmal. Sind alle bei 10 oder höher, kommen sie an den Wachen vorbei. Ist auch nur einer darunter: Eine Wache dreht sich um — Knopf unten, Kampf, und die Gefahr steigt um 1.</w:t>
+        <w:t xml:space="preserve">KNOPF (NUR DM):  </w:t>
+      </w:r>
+      <w:r>
+        <w:rPr>
+          <w:rFonts w:ascii="Georgia" w:cs="Georgia" w:eastAsia="Georgia" w:hAnsi="Georgia"/>
+          <w:color w:val="333333"/>
+          <w:sz w:val="18"/>
+          <w:szCs w:val="18"/>
+        </w:rPr>
+        <w:t xml:space="preserve">Das Anschleichen ist misslungen — eine Wache hat sie gesehen.  →  Kampf mit der Wache, Gefahr +1</w:t>
       </w:r>
     </w:p>
     <w:p>
@@ -3475,7 +3580,7 @@
           <w:sz w:val="19"/>
           <w:szCs w:val="19"/>
         </w:rPr>
-        <w:t xml:space="preserve">Die Wachen am Tor</w:t>
+        <w:t xml:space="preserve">Im Hof</w:t>
       </w:r>
     </w:p>
     <w:p>
@@ -3488,75 +3593,41 @@
           <w:sz w:val="22"/>
           <w:szCs w:val="22"/>
         </w:rPr>
-        <w:t xml:space="preserve">On the far side of the bog</w:t>
-      </w:r>
-      <w:r>
-        <w:rPr>
-          <w:rFonts w:ascii="Georgia" w:cs="Georgia" w:eastAsia="Georgia" w:hAnsi="Georgia"/>
-          <w:color w:val="7A5A1A"/>
-          <w:sz w:val="18"/>
-          <w:szCs w:val="18"/>
-        </w:rPr>
-        <w:t xml:space="preserve"> [Sumpf]</w:t>
-      </w:r>
-      <w:r>
-        <w:rPr>
-          <w:rFonts w:ascii="Georgia" w:cs="Georgia" w:eastAsia="Georgia" w:hAnsi="Georgia"/>
-          <w:sz w:val="22"/>
-          <w:szCs w:val="22"/>
-        </w:rPr>
-        <w:t xml:space="preserve"> the gate</w:t>
-      </w:r>
-      <w:r>
-        <w:rPr>
-          <w:rFonts w:ascii="Georgia" w:cs="Georgia" w:eastAsia="Georgia" w:hAnsi="Georgia"/>
-          <w:color w:val="7A5A1A"/>
-          <w:sz w:val="18"/>
-          <w:szCs w:val="18"/>
-        </w:rPr>
-        <w:t xml:space="preserve"> [Tor]</w:t>
-      </w:r>
-      <w:r>
-        <w:rPr>
-          <w:rFonts w:ascii="Georgia" w:cs="Georgia" w:eastAsia="Georgia" w:hAnsi="Georgia"/>
-          <w:sz w:val="22"/>
-          <w:szCs w:val="22"/>
-        </w:rPr>
-        <w:t xml:space="preserve"> of Nachtfels stands open. Two men in old grey livery</w:t>
-      </w:r>
-      <w:r>
-        <w:rPr>
-          <w:rFonts w:ascii="Georgia" w:cs="Georgia" w:eastAsia="Georgia" w:hAnsi="Georgia"/>
-          <w:color w:val="7A5A1A"/>
-          <w:sz w:val="18"/>
-          <w:szCs w:val="18"/>
-        </w:rPr>
-        <w:t xml:space="preserve"> [Dienstkleidung]</w:t>
-      </w:r>
-      <w:r>
-        <w:rPr>
-          <w:rFonts w:ascii="Georgia" w:cs="Georgia" w:eastAsia="Georgia" w:hAnsi="Georgia"/>
-          <w:sz w:val="22"/>
-          <w:szCs w:val="22"/>
-        </w:rPr>
-        <w:t xml:space="preserve"> stand beside it with lamps</w:t>
-      </w:r>
-      <w:r>
-        <w:rPr>
-          <w:rFonts w:ascii="Georgia" w:cs="Georgia" w:eastAsia="Georgia" w:hAnsi="Georgia"/>
-          <w:color w:val="7A5A1A"/>
-          <w:sz w:val="18"/>
-          <w:szCs w:val="18"/>
-        </w:rPr>
-        <w:t xml:space="preserve"> [Laternen]</w:t>
-      </w:r>
-      <w:r>
-        <w:rPr>
-          <w:rFonts w:ascii="Georgia" w:cs="Georgia" w:eastAsia="Georgia" w:hAnsi="Georgia"/>
-          <w:sz w:val="22"/>
-          <w:szCs w:val="22"/>
-        </w:rPr>
-        <w:t xml:space="preserve">. They do not move. They do not talk. They are looking at the fog</w:t>
+        <w:t xml:space="preserve">Past the guards, through the gate</w:t>
+      </w:r>
+      <w:r>
+        <w:rPr>
+          <w:rFonts w:ascii="Georgia" w:cs="Georgia" w:eastAsia="Georgia" w:hAnsi="Georgia"/>
+          <w:sz w:val="22"/>
+          <w:szCs w:val="22"/>
+        </w:rPr>
+        <w:t xml:space="preserve"> that nobody ever closed — and you are standing in a square courtyard</w:t>
+      </w:r>
+      <w:r>
+        <w:rPr>
+          <w:rFonts w:ascii="Georgia" w:cs="Georgia" w:eastAsia="Georgia" w:hAnsi="Georgia"/>
+          <w:color w:val="7A5A1A"/>
+          <w:sz w:val="18"/>
+          <w:szCs w:val="18"/>
+        </w:rPr>
+        <w:t xml:space="preserve"> [Innenhof]</w:t>
+      </w:r>
+      <w:r>
+        <w:rPr>
+          <w:rFonts w:ascii="Georgia" w:cs="Georgia" w:eastAsia="Georgia" w:hAnsi="Georgia"/>
+          <w:sz w:val="22"/>
+          <w:szCs w:val="22"/>
+        </w:rPr>
+        <w:t xml:space="preserve"> of black stone</w:t>
+      </w:r>
+      <w:r>
+        <w:rPr>
+          <w:rFonts w:ascii="Georgia" w:cs="Georgia" w:eastAsia="Georgia" w:hAnsi="Georgia"/>
+          <w:color w:val="7A5A1A"/>
+          <w:sz w:val="18"/>
+          <w:szCs w:val="18"/>
+        </w:rPr>
+        <w:t xml:space="preserve"> [schwarzer Stein]</w:t>
       </w:r>
       <w:r>
         <w:rPr>
@@ -3565,6 +3636,22 @@
           <w:szCs w:val="22"/>
         </w:rPr>
         <w:t xml:space="preserve">.</w:t>
+      </w:r>
+    </w:p>
+    <w:p>
+      <w:pPr>
+        <w:spacing w:after="60" w:before="120"/>
+      </w:pPr>
+      <w:r>
+        <w:rPr>
+          <w:rFonts w:ascii="Georgia" w:cs="Georgia" w:eastAsia="Georgia" w:hAnsi="Georgia"/>
+          <w:b/>
+          <w:bCs/>
+          <w:color w:val="7A5A1A"/>
+          <w:sz w:val="17"/>
+          <w:szCs w:val="17"/>
+        </w:rPr>
+        <w:t xml:space="preserve">▸ Nur bei: Weg B · Stollen</w:t>
       </w:r>
     </w:p>
     <w:p>
@@ -3585,16 +3672,16 @@
           <w:sz w:val="16"/>
           <w:szCs w:val="16"/>
         </w:rPr>
-        <w:t xml:space="preserve">KNOPF (NUR DM):  </w:t>
-      </w:r>
-      <w:r>
-        <w:rPr>
-          <w:rFonts w:ascii="Georgia" w:cs="Georgia" w:eastAsia="Georgia" w:hAnsi="Georgia"/>
-          <w:color w:val="333333"/>
-          <w:sz w:val="18"/>
-          <w:szCs w:val="18"/>
-        </w:rPr>
-        <w:t xml:space="preserve">Das Anschleichen ist misslungen — eine Wache hat sie gesehen.  →  Kampf mit der Wache, Gefahr +1</w:t>
+        <w:t xml:space="preserve">HINTERGRUND · STOLLEN (NUR DM):  </w:t>
+      </w:r>
+      <w:r>
+        <w:rPr>
+          <w:rFonts w:ascii="Georgia" w:cs="Georgia" w:eastAsia="Georgia" w:hAnsi="Georgia"/>
+          <w:color w:val="333333"/>
+          <w:sz w:val="18"/>
+          <w:szCs w:val="18"/>
+        </w:rPr>
+        <w:t xml:space="preserve">Vier Stunden Dunkelheit, schlechte Luft (−2 HP für alle, Knopf unten), dann ein Keller unter dem Schloss — und eine Wache mit Lampe. Hier wird nicht gewürfelt, hier wird geredet: Trägt jede Figur einen ganzen englischen Satz bei und droht niemand, glaubt er ihnen („Guests. Of course. Follow me.“). Stottert die Gruppe, droht oder greift jemand an: Knopf unten, Kampf, Gefahr +1.</w:t>
       </w:r>
     </w:p>
     <w:p>
@@ -3610,93 +3697,6 @@
           <w:sz w:val="19"/>
           <w:szCs w:val="19"/>
         </w:rPr>
-        <w:t xml:space="preserve">Im Hof</w:t>
-      </w:r>
-    </w:p>
-    <w:p>
-      <w:pPr>
-        <w:spacing w:after="110" w:line="320"/>
-      </w:pPr>
-      <w:r>
-        <w:rPr>
-          <w:rFonts w:ascii="Georgia" w:cs="Georgia" w:eastAsia="Georgia" w:hAnsi="Georgia"/>
-          <w:sz w:val="22"/>
-          <w:szCs w:val="22"/>
-        </w:rPr>
-        <w:t xml:space="preserve">Past the guards, through the gate</w:t>
-      </w:r>
-      <w:r>
-        <w:rPr>
-          <w:rFonts w:ascii="Georgia" w:cs="Georgia" w:eastAsia="Georgia" w:hAnsi="Georgia"/>
-          <w:sz w:val="22"/>
-          <w:szCs w:val="22"/>
-        </w:rPr>
-        <w:t xml:space="preserve"> that nobody ever closed — and you are standing in a square courtyard</w:t>
-      </w:r>
-      <w:r>
-        <w:rPr>
-          <w:rFonts w:ascii="Georgia" w:cs="Georgia" w:eastAsia="Georgia" w:hAnsi="Georgia"/>
-          <w:color w:val="7A5A1A"/>
-          <w:sz w:val="18"/>
-          <w:szCs w:val="18"/>
-        </w:rPr>
-        <w:t xml:space="preserve"> [Innenhof]</w:t>
-      </w:r>
-      <w:r>
-        <w:rPr>
-          <w:rFonts w:ascii="Georgia" w:cs="Georgia" w:eastAsia="Georgia" w:hAnsi="Georgia"/>
-          <w:sz w:val="22"/>
-          <w:szCs w:val="22"/>
-        </w:rPr>
-        <w:t xml:space="preserve"> of black stone</w:t>
-      </w:r>
-      <w:r>
-        <w:rPr>
-          <w:rFonts w:ascii="Georgia" w:cs="Georgia" w:eastAsia="Georgia" w:hAnsi="Georgia"/>
-          <w:color w:val="7A5A1A"/>
-          <w:sz w:val="18"/>
-          <w:szCs w:val="18"/>
-        </w:rPr>
-        <w:t xml:space="preserve"> [schwarzer Stein]</w:t>
-      </w:r>
-      <w:r>
-        <w:rPr>
-          <w:rFonts w:ascii="Georgia" w:cs="Georgia" w:eastAsia="Georgia" w:hAnsi="Georgia"/>
-          <w:sz w:val="22"/>
-          <w:szCs w:val="22"/>
-        </w:rPr>
-        <w:t xml:space="preserve">.</w:t>
-      </w:r>
-    </w:p>
-    <w:p>
-      <w:pPr>
-        <w:spacing w:after="60" w:before="120"/>
-      </w:pPr>
-      <w:r>
-        <w:rPr>
-          <w:rFonts w:ascii="Georgia" w:cs="Georgia" w:eastAsia="Georgia" w:hAnsi="Georgia"/>
-          <w:b/>
-          <w:bCs/>
-          <w:color w:val="7A5A1A"/>
-          <w:sz w:val="17"/>
-          <w:szCs w:val="17"/>
-        </w:rPr>
-        <w:t xml:space="preserve">▸ Nur bei: Weg B · Stollen</w:t>
-      </w:r>
-    </w:p>
-    <w:p>
-      <w:pPr>
-        <w:spacing w:after="40" w:before="100"/>
-      </w:pPr>
-      <w:r>
-        <w:rPr>
-          <w:rFonts w:ascii="Georgia" w:cs="Georgia" w:eastAsia="Georgia" w:hAnsi="Georgia"/>
-          <w:b/>
-          <w:bCs/>
-          <w:color w:val="555555"/>
-          <w:sz w:val="19"/>
-          <w:szCs w:val="19"/>
-        </w:rPr>
         <w:t xml:space="preserve">Der Stollen</w:t>
       </w:r>
     </w:p>
@@ -3886,36 +3886,6 @@
           <w:szCs w:val="18"/>
         </w:rPr>
         <w:t xml:space="preserve">Die schlechte Luft anwenden — dann stimmen die Werte rechts.  →  −2 HP für alle</w:t>
-      </w:r>
-    </w:p>
-    <w:p>
-      <w:pPr>
-        <w:pBdr>
-          <w:left w:val="single" w:color="BFBFBF" w:sz="18" w:space="8"/>
-        </w:pBdr>
-        <w:shd w:fill="F2F2F2" w:color="auto" w:val="clear"/>
-        <w:spacing w:after="140"/>
-        <w:ind w:left="120"/>
-      </w:pPr>
-      <w:r>
-        <w:rPr>
-          <w:rFonts w:ascii="Georgia" w:cs="Georgia" w:eastAsia="Georgia" w:hAnsi="Georgia"/>
-          <w:b/>
-          <w:bCs/>
-          <w:color w:val="555555"/>
-          <w:sz w:val="16"/>
-          <w:szCs w:val="16"/>
-        </w:rPr>
-        <w:t xml:space="preserve">NUR DM:  </w:t>
-      </w:r>
-      <w:r>
-        <w:rPr>
-          <w:rFonts w:ascii="Georgia" w:cs="Georgia" w:eastAsia="Georgia" w:hAnsi="Georgia"/>
-          <w:color w:val="333333"/>
-          <w:sz w:val="18"/>
-          <w:szCs w:val="18"/>
-        </w:rPr>
-        <w:t xml:space="preserve">Die Regel: Trägt jede Figur einen ganzen englischen Satz bei und droht niemand, glaubt er ihnen — „Guests. Of course. Follow me.“ — und bringt sie hinauf. Stottert die Gruppe, droht jemand, oder greift jemand an: Knopf unten, Kampf, und die Gefahr steigt um 1.</w:t>
       </w:r>
     </w:p>
     <w:p>
@@ -4323,17 +4293,16 @@
           <w:sz w:val="16"/>
           <w:szCs w:val="16"/>
         </w:rPr>
-        <w:t xml:space="preserve">NUR DM:  </w:t>
-      </w:r>
-      <w:r>
-        <w:rPr>
-          <w:rFonts w:ascii="Georgia" w:cs="Georgia" w:eastAsia="Georgia" w:hAnsi="Georgia"/>
-          <w:color w:val="333333"/>
-          <w:sz w:val="18"/>
-          <w:szCs w:val="18"/>
-        </w:rPr>
-        <w:t xml:space="preserve">Spiel ihn freundlich und stell den Spielern seine Fragen: „And what are your names?“ — „And what do you want up there?“ — „You’re not from the village, are you?“
- Drei Dinge dürfen sie von selbst merken: Er sagt nie Mirelas Namen. Seine Hände sind kalt. Und im Kutschenfenster spiegelt sich alles ausser ihm. Merkt es niemand, ist das kein Problem — die Gefahr ist schon eingetragen.</w:t>
+        <w:t xml:space="preserve">HINTERGRUND · KUTSCHE (NUR DM):  </w:t>
+      </w:r>
+      <w:r>
+        <w:rPr>
+          <w:rFonts w:ascii="Georgia" w:cs="Georgia" w:eastAsia="Georgia" w:hAnsi="Georgia"/>
+          <w:color w:val="333333"/>
+          <w:sz w:val="18"/>
+          <w:szCs w:val="18"/>
+        </w:rPr>
+        <w:t xml:space="preserve">Zwei Stunden mit Corvin Ash, dem Kutscher des Grafen: sehr freundlich, fährt ohne Lampe, sieht nie auf die Strasse. Spiel ihn freundlich und stell den Spielern seine Fragen: „And what are your names?“ — „And what do you want up there?“ — „You’re not from the village, are you?“ Drei Dinge dürfen sie merken: Er sagt nie Mirelas Namen, seine Hände sind kalt, im Fenster spiegelt sich alles ausser ihm. Merkt es niemand — kein Problem, die Gefahr (+4) ist schon eingetragen. Er bringt sie bis in den Hof.</w:t>
       </w:r>
     </w:p>
     <w:p>
@@ -4557,6 +4526,52 @@
           <w:sz w:val="16"/>
           <w:szCs w:val="16"/>
         </w:rPr>
+        <w:t xml:space="preserve">HINTERGRUND (NUR DM):  </w:t>
+      </w:r>
+      <w:r>
+        <w:rPr>
+          <w:rFonts w:ascii="Georgia" w:cs="Georgia" w:eastAsia="Georgia" w:hAnsi="Georgia"/>
+          <w:color w:val="333333"/>
+          <w:sz w:val="18"/>
+          <w:szCs w:val="18"/>
+        </w:rPr>
+        <w:t xml:space="preserve">Der Hof: ein gefrorener Brunnen, drei Türen (Kapelle links, Bibliotheksfenster geradeaus, Küchentreppe rechts) und ein Rabe, der nachspricht, was er hört — er gehört dem Bibliothekar, mehr kann er nicht. Wichtig: Wenn der Rabe spricht, sag den echten Figurennamen einer Spielerin, wie er rechts in der Gruppe steht. Nichts erschreckt zuverlässiger. Nur eine Tür ist möglich — sag das vorher.</w:t>
+      </w:r>
+    </w:p>
+    <w:p>
+      <w:pPr>
+        <w:spacing w:after="60" w:before="120"/>
+      </w:pPr>
+      <w:r>
+        <w:rPr>
+          <w:rFonts w:ascii="Georgia" w:cs="Georgia" w:eastAsia="Georgia" w:hAnsi="Georgia"/>
+          <w:b/>
+          <w:bCs/>
+          <w:color w:val="7A5A1A"/>
+          <w:sz w:val="17"/>
+          <w:szCs w:val="17"/>
+        </w:rPr>
+        <w:t xml:space="preserve">▸ Nur bei: Weg B · Stollen</w:t>
+      </w:r>
+    </w:p>
+    <w:p>
+      <w:pPr>
+        <w:pBdr>
+          <w:left w:val="single" w:color="BFBFBF" w:sz="18" w:space="8"/>
+        </w:pBdr>
+        <w:shd w:fill="F2F2F2" w:color="auto" w:val="clear"/>
+        <w:spacing w:after="140"/>
+        <w:ind w:left="120"/>
+      </w:pPr>
+      <w:r>
+        <w:rPr>
+          <w:rFonts w:ascii="Georgia" w:cs="Georgia" w:eastAsia="Georgia" w:hAnsi="Georgia"/>
+          <w:b/>
+          <w:bCs/>
+          <w:color w:val="555555"/>
+          <w:sz w:val="16"/>
+          <w:szCs w:val="16"/>
+        </w:rPr>
         <w:t xml:space="preserve">NUR DM:  </w:t>
       </w:r>
       <w:r>
@@ -4566,7 +4581,53 @@
           <w:sz w:val="18"/>
           <w:szCs w:val="18"/>
         </w:rPr>
-        <w:t xml:space="preserve">Sag den echten Figurennamen einer Spielerin, so wie er rechts in der Gruppe steht. Nichts an diesem Abend erschreckt zuverlässiger. Der Rabe gehört dem Bibliothekar und wiederholt nur, was er hört. Das dürfen sie ruhig erst später merken.</w:t>
+        <w:t xml:space="preserve">Ihr kamt aus dem Keller — die niedrige Tür hinter euch ist die, durch die ihr gerade gekommen seid. Sag das ruhig: Es macht den Hof zu einem Ort, an dem sie schon einen Fuss hatten.</w:t>
+      </w:r>
+    </w:p>
+    <w:p>
+      <w:pPr>
+        <w:spacing w:after="60" w:before="120"/>
+      </w:pPr>
+      <w:r>
+        <w:rPr>
+          <w:rFonts w:ascii="Georgia" w:cs="Georgia" w:eastAsia="Georgia" w:hAnsi="Georgia"/>
+          <w:b/>
+          <w:bCs/>
+          <w:color w:val="7A5A1A"/>
+          <w:sz w:val="17"/>
+          <w:szCs w:val="17"/>
+        </w:rPr>
+        <w:t xml:space="preserve">▸ Nur bei: Weg C · Kutsche</w:t>
+      </w:r>
+    </w:p>
+    <w:p>
+      <w:pPr>
+        <w:pBdr>
+          <w:left w:val="single" w:color="BFBFBF" w:sz="18" w:space="8"/>
+        </w:pBdr>
+        <w:shd w:fill="F2F2F2" w:color="auto" w:val="clear"/>
+        <w:spacing w:after="140"/>
+        <w:ind w:left="120"/>
+      </w:pPr>
+      <w:r>
+        <w:rPr>
+          <w:rFonts w:ascii="Georgia" w:cs="Georgia" w:eastAsia="Georgia" w:hAnsi="Georgia"/>
+          <w:b/>
+          <w:bCs/>
+          <w:color w:val="555555"/>
+          <w:sz w:val="16"/>
+          <w:szCs w:val="16"/>
+        </w:rPr>
+        <w:t xml:space="preserve">NUR DM:  </w:t>
+      </w:r>
+      <w:r>
+        <w:rPr>
+          <w:rFonts w:ascii="Georgia" w:cs="Georgia" w:eastAsia="Georgia" w:hAnsi="Georgia"/>
+          <w:color w:val="333333"/>
+          <w:sz w:val="18"/>
+          <w:szCs w:val="18"/>
+        </w:rPr>
+        <w:t xml:space="preserve">Corvin lädt weiter aus und beachtet euch nicht. Wenn jemand ihn anspricht: „I have work to do.“ Er bleibt im Hof — ihr seht ihn heute nicht wieder.</w:t>
       </w:r>
     </w:p>
     <w:p>
@@ -4792,98 +4853,6 @@
           <w:szCs w:val="22"/>
         </w:rPr>
         <w:t xml:space="preserve">. Somebody down there is cooking. At two in the morning.</w:t>
-      </w:r>
-    </w:p>
-    <w:p>
-      <w:pPr>
-        <w:spacing w:after="60" w:before="120"/>
-      </w:pPr>
-      <w:r>
-        <w:rPr>
-          <w:rFonts w:ascii="Georgia" w:cs="Georgia" w:eastAsia="Georgia" w:hAnsi="Georgia"/>
-          <w:b/>
-          <w:bCs/>
-          <w:color w:val="7A5A1A"/>
-          <w:sz w:val="17"/>
-          <w:szCs w:val="17"/>
-        </w:rPr>
-        <w:t xml:space="preserve">▸ Nur bei: Weg B · Stollen</w:t>
-      </w:r>
-    </w:p>
-    <w:p>
-      <w:pPr>
-        <w:pBdr>
-          <w:left w:val="single" w:color="BFBFBF" w:sz="18" w:space="8"/>
-        </w:pBdr>
-        <w:shd w:fill="F2F2F2" w:color="auto" w:val="clear"/>
-        <w:spacing w:after="140"/>
-        <w:ind w:left="120"/>
-      </w:pPr>
-      <w:r>
-        <w:rPr>
-          <w:rFonts w:ascii="Georgia" w:cs="Georgia" w:eastAsia="Georgia" w:hAnsi="Georgia"/>
-          <w:b/>
-          <w:bCs/>
-          <w:color w:val="555555"/>
-          <w:sz w:val="16"/>
-          <w:szCs w:val="16"/>
-        </w:rPr>
-        <w:t xml:space="preserve">NUR DM:  </w:t>
-      </w:r>
-      <w:r>
-        <w:rPr>
-          <w:rFonts w:ascii="Georgia" w:cs="Georgia" w:eastAsia="Georgia" w:hAnsi="Georgia"/>
-          <w:color w:val="333333"/>
-          <w:sz w:val="18"/>
-          <w:szCs w:val="18"/>
-        </w:rPr>
-        <w:t xml:space="preserve">Ihr kamt aus dem Keller — die niedrige Tür hinter euch ist die, durch die ihr gerade gekommen seid. Sag das ruhig: Es macht den Hof zu einem Ort, an dem sie schon einen Fuss hatten.</w:t>
-      </w:r>
-    </w:p>
-    <w:p>
-      <w:pPr>
-        <w:spacing w:after="60" w:before="120"/>
-      </w:pPr>
-      <w:r>
-        <w:rPr>
-          <w:rFonts w:ascii="Georgia" w:cs="Georgia" w:eastAsia="Georgia" w:hAnsi="Georgia"/>
-          <w:b/>
-          <w:bCs/>
-          <w:color w:val="7A5A1A"/>
-          <w:sz w:val="17"/>
-          <w:szCs w:val="17"/>
-        </w:rPr>
-        <w:t xml:space="preserve">▸ Nur bei: Weg C · Kutsche</w:t>
-      </w:r>
-    </w:p>
-    <w:p>
-      <w:pPr>
-        <w:pBdr>
-          <w:left w:val="single" w:color="BFBFBF" w:sz="18" w:space="8"/>
-        </w:pBdr>
-        <w:shd w:fill="F2F2F2" w:color="auto" w:val="clear"/>
-        <w:spacing w:after="140"/>
-        <w:ind w:left="120"/>
-      </w:pPr>
-      <w:r>
-        <w:rPr>
-          <w:rFonts w:ascii="Georgia" w:cs="Georgia" w:eastAsia="Georgia" w:hAnsi="Georgia"/>
-          <w:b/>
-          <w:bCs/>
-          <w:color w:val="555555"/>
-          <w:sz w:val="16"/>
-          <w:szCs w:val="16"/>
-        </w:rPr>
-        <w:t xml:space="preserve">NUR DM:  </w:t>
-      </w:r>
-      <w:r>
-        <w:rPr>
-          <w:rFonts w:ascii="Georgia" w:cs="Georgia" w:eastAsia="Georgia" w:hAnsi="Georgia"/>
-          <w:color w:val="333333"/>
-          <w:sz w:val="18"/>
-          <w:szCs w:val="18"/>
-        </w:rPr>
-        <w:t xml:space="preserve">Corvin lädt weiter aus und beachtet euch nicht. Wenn jemand ihn anspricht: „I have work to do.“ Er bleibt im Hof — ihr seht ihn heute nicht wieder.</w:t>
       </w:r>
     </w:p>
     <w:p>
@@ -5238,6 +5207,36 @@
     <w:p>
       <w:pPr>
         <w:pBdr>
+          <w:left w:val="single" w:color="BFBFBF" w:sz="18" w:space="8"/>
+        </w:pBdr>
+        <w:shd w:fill="F2F2F2" w:color="auto" w:val="clear"/>
+        <w:spacing w:after="140"/>
+        <w:ind w:left="120"/>
+      </w:pPr>
+      <w:r>
+        <w:rPr>
+          <w:rFonts w:ascii="Georgia" w:cs="Georgia" w:eastAsia="Georgia" w:hAnsi="Georgia"/>
+          <w:b/>
+          <w:bCs/>
+          <w:color w:val="555555"/>
+          <w:sz w:val="16"/>
+          <w:szCs w:val="16"/>
+        </w:rPr>
+        <w:t xml:space="preserve">HINTERGRUND (NUR DM):  </w:t>
+      </w:r>
+      <w:r>
+        <w:rPr>
+          <w:rFonts w:ascii="Georgia" w:cs="Georgia" w:eastAsia="Georgia" w:hAnsi="Georgia"/>
+          <w:color w:val="333333"/>
+          <w:sz w:val="18"/>
+          <w:szCs w:val="18"/>
+        </w:rPr>
+        <w:t xml:space="preserve">Drei Türen, alle enden an der Spiegeltür im Westgang. Bibliothek: Bellamy, ein höflicher Ghul — er redet statt zu kämpfen, will drei wahre Sätze je Figur, Gefahr +1. Kapelle: Anneke im Taufbecken — Kampf, ausser jemand ruft ihren Namen, Gefahr +2 (mit Namen +1). Küche: Tam, vierzehn, kennt jeden Gang — will ein Versprechen, Gefahr ±0. Jede Figur nennt ihre Tür mit Grund, dann wird geklickt.</w:t>
+      </w:r>
+    </w:p>
+    <w:p>
+      <w:pPr>
+        <w:pBdr>
           <w:left w:val="single" w:color="D9A441" w:sz="18" w:space="8"/>
         </w:pBdr>
         <w:shd w:fill="FFF6DD" w:color="auto" w:val="clear"/>
@@ -6933,219 +6932,6 @@
     <w:p>
       <w:pPr>
         <w:pBdr>
-          <w:left w:val="single" w:color="BFBFBF" w:sz="18" w:space="8"/>
-        </w:pBdr>
-        <w:shd w:fill="F2F2F2" w:color="auto" w:val="clear"/>
-        <w:spacing w:after="40"/>
-        <w:ind w:left="120"/>
-      </w:pPr>
-      <w:r>
-        <w:rPr>
-          <w:rFonts w:ascii="Georgia" w:cs="Georgia" w:eastAsia="Georgia" w:hAnsi="Georgia"/>
-          <w:b/>
-          <w:bCs/>
-          <w:color w:val="555555"/>
-          <w:sz w:val="16"/>
-          <w:szCs w:val="16"/>
-        </w:rPr>
-        <w:t xml:space="preserve">ANTWORTMÖGLICHKEITEN (NUR DM)  </w:t>
-      </w:r>
-    </w:p>
-    <w:p>
-      <w:pPr>
-        <w:pBdr>
-          <w:left w:val="single" w:color="BFBFBF" w:sz="18" w:space="8"/>
-        </w:pBdr>
-        <w:shd w:fill="F2F2F2" w:color="auto" w:val="clear"/>
-        <w:spacing w:after="40"/>
-        <w:ind w:left="120"/>
-      </w:pPr>
-      <w:r>
-        <w:rPr>
-          <w:rFonts w:ascii="Georgia" w:cs="Georgia" w:eastAsia="Georgia" w:hAnsi="Georgia"/>
-          <w:b/>
-          <w:bCs/>
-          <w:color w:val="333333"/>
-          <w:sz w:val="18"/>
-          <w:szCs w:val="18"/>
-        </w:rPr>
-        <w:t xml:space="preserve">Why don’t you just come with us?  </w:t>
-      </w:r>
-      <w:r>
-        <w:rPr>
-          <w:rFonts w:ascii="Georgia" w:cs="Georgia" w:eastAsia="Georgia" w:hAnsi="Georgia"/>
-          <w:i/>
-          <w:iCs/>
-          <w:color w:val="333333"/>
-          <w:sz w:val="18"/>
-          <w:szCs w:val="18"/>
-        </w:rPr>
-        <w:t xml:space="preserve">„And in February, when the wolves come back — will you be here?“</w:t>
-      </w:r>
-    </w:p>
-    <w:p>
-      <w:pPr>
-        <w:pBdr>
-          <w:left w:val="single" w:color="BFBFBF" w:sz="18" w:space="8"/>
-        </w:pBdr>
-        <w:shd w:fill="F2F2F2" w:color="auto" w:val="clear"/>
-        <w:spacing w:after="40"/>
-        <w:ind w:left="120"/>
-      </w:pPr>
-      <w:r>
-        <w:rPr>
-          <w:rFonts w:ascii="Georgia" w:cs="Georgia" w:eastAsia="Georgia" w:hAnsi="Georgia"/>
-          <w:b/>
-          <w:bCs/>
-          <w:color w:val="333333"/>
-          <w:sz w:val="18"/>
-          <w:szCs w:val="18"/>
-        </w:rPr>
-        <w:t xml:space="preserve">Did they force you?  </w:t>
-      </w:r>
-      <w:r>
-        <w:rPr>
-          <w:rFonts w:ascii="Georgia" w:cs="Georgia" w:eastAsia="Georgia" w:hAnsi="Georgia"/>
-          <w:i/>
-          <w:iCs/>
-          <w:color w:val="333333"/>
-          <w:sz w:val="18"/>
-          <w:szCs w:val="18"/>
-        </w:rPr>
-        <w:t xml:space="preserve">„Nobody forced anybody. That is the whole problem.“</w:t>
-      </w:r>
-    </w:p>
-    <w:p>
-      <w:pPr>
-        <w:pBdr>
-          <w:left w:val="single" w:color="BFBFBF" w:sz="18" w:space="8"/>
-        </w:pBdr>
-        <w:shd w:fill="F2F2F2" w:color="auto" w:val="clear"/>
-        <w:spacing w:after="40"/>
-        <w:ind w:left="120"/>
-      </w:pPr>
-      <w:r>
-        <w:rPr>
-          <w:rFonts w:ascii="Georgia" w:cs="Georgia" w:eastAsia="Georgia" w:hAnsi="Georgia"/>
-          <w:b/>
-          <w:bCs/>
-          <w:color w:val="333333"/>
-          <w:sz w:val="18"/>
-          <w:szCs w:val="18"/>
-        </w:rPr>
-        <w:t xml:space="preserve">Who chose you?  </w:t>
-      </w:r>
-      <w:r>
-        <w:rPr>
-          <w:rFonts w:ascii="Georgia" w:cs="Georgia" w:eastAsia="Georgia" w:hAnsi="Georgia"/>
-          <w:i/>
-          <w:iCs/>
-          <w:color w:val="333333"/>
-          <w:sz w:val="18"/>
-          <w:szCs w:val="18"/>
-        </w:rPr>
-        <w:t xml:space="preserve">„I chose me. The village chose Lene. She is nine.“</w:t>
-      </w:r>
-    </w:p>
-    <w:p>
-      <w:pPr>
-        <w:pBdr>
-          <w:left w:val="single" w:color="BFBFBF" w:sz="18" w:space="8"/>
-        </w:pBdr>
-        <w:shd w:fill="F2F2F2" w:color="auto" w:val="clear"/>
-        <w:spacing w:after="40"/>
-        <w:ind w:left="120"/>
-      </w:pPr>
-      <w:r>
-        <w:rPr>
-          <w:rFonts w:ascii="Georgia" w:cs="Georgia" w:eastAsia="Georgia" w:hAnsi="Georgia"/>
-          <w:b/>
-          <w:bCs/>
-          <w:color w:val="333333"/>
-          <w:sz w:val="18"/>
-          <w:szCs w:val="18"/>
-        </w:rPr>
-        <w:t xml:space="preserve">What happens at sunrise?  </w:t>
-      </w:r>
-      <w:r>
-        <w:rPr>
-          <w:rFonts w:ascii="Georgia" w:cs="Georgia" w:eastAsia="Georgia" w:hAnsi="Georgia"/>
-          <w:i/>
-          <w:iCs/>
-          <w:color w:val="333333"/>
-          <w:sz w:val="18"/>
-          <w:szCs w:val="18"/>
-        </w:rPr>
-        <w:t xml:space="preserve">„I sign the book downstairs. After that I am still me for a while. Then less.“</w:t>
-      </w:r>
-    </w:p>
-    <w:p>
-      <w:pPr>
-        <w:pBdr>
-          <w:left w:val="single" w:color="BFBFBF" w:sz="18" w:space="8"/>
-        </w:pBdr>
-        <w:shd w:fill="F2F2F2" w:color="auto" w:val="clear"/>
-        <w:spacing w:after="40"/>
-        <w:ind w:left="120"/>
-      </w:pPr>
-      <w:r>
-        <w:rPr>
-          <w:rFonts w:ascii="Georgia" w:cs="Georgia" w:eastAsia="Georgia" w:hAnsi="Georgia"/>
-          <w:b/>
-          <w:bCs/>
-          <w:color w:val="333333"/>
-          <w:sz w:val="18"/>
-          <w:szCs w:val="18"/>
-        </w:rPr>
-        <w:t xml:space="preserve">Can we just kill him?  </w:t>
-      </w:r>
-      <w:r>
-        <w:rPr>
-          <w:rFonts w:ascii="Georgia" w:cs="Georgia" w:eastAsia="Georgia" w:hAnsi="Georgia"/>
-          <w:i/>
-          <w:iCs/>
-          <w:color w:val="333333"/>
-          <w:sz w:val="18"/>
-          <w:szCs w:val="18"/>
-        </w:rPr>
-        <w:t xml:space="preserve">„People have tried. There is a board in the tavern with their names on it too — on the back.“</w:t>
-      </w:r>
-    </w:p>
-    <w:p>
-      <w:pPr>
-        <w:pBdr>
-          <w:left w:val="single" w:color="BFBFBF" w:sz="18" w:space="8"/>
-        </w:pBdr>
-        <w:shd w:fill="F2F2F2" w:color="auto" w:val="clear"/>
-        <w:spacing w:after="140"/>
-        <w:ind w:left="120"/>
-      </w:pPr>
-      <w:r>
-        <w:rPr>
-          <w:rFonts w:ascii="Georgia" w:cs="Georgia" w:eastAsia="Georgia" w:hAnsi="Georgia"/>
-          <w:b/>
-          <w:bCs/>
-          <w:color w:val="333333"/>
-          <w:sz w:val="18"/>
-          <w:szCs w:val="18"/>
-        </w:rPr>
-        <w:t xml:space="preserve">Where is he right now?  </w:t>
-      </w:r>
-      <w:r>
-        <w:rPr>
-          <w:rFonts w:ascii="Georgia" w:cs="Georgia" w:eastAsia="Georgia" w:hAnsi="Georgia"/>
-          <w:i/>
-          <w:iCs/>
-          <w:color w:val="333333"/>
-          <w:sz w:val="18"/>
-          <w:szCs w:val="18"/>
-        </w:rPr>
-        <w:t xml:space="preserve">„Asleep, two floors down, in the ice cellar. He will know you are here the moment you touch the book.“</w:t>
-      </w:r>
-    </w:p>
-    <w:p>
-      <w:pPr>
-        <w:pBdr>
           <w:left w:val="single" w:color="74B094" w:sz="18" w:space="8"/>
         </w:pBdr>
         <w:shd w:fill="EAF4EC" w:color="auto" w:val="clear"/>
@@ -7189,6 +6975,219 @@
           <w:szCs w:val="17"/>
         </w:rPr>
         <w:t xml:space="preserve">Mirela gibt erst nach, wenn ihr etwas Besseres angeboten wird als „wir retten dich“.  →  Helfer-Blatt · Teil 7</w:t>
+      </w:r>
+    </w:p>
+    <w:p>
+      <w:pPr>
+        <w:pBdr>
+          <w:left w:val="single" w:color="BFBFBF" w:sz="18" w:space="8"/>
+        </w:pBdr>
+        <w:shd w:fill="F2F2F2" w:color="auto" w:val="clear"/>
+        <w:spacing w:after="40"/>
+        <w:ind w:left="120"/>
+      </w:pPr>
+      <w:r>
+        <w:rPr>
+          <w:rFonts w:ascii="Georgia" w:cs="Georgia" w:eastAsia="Georgia" w:hAnsi="Georgia"/>
+          <w:b/>
+          <w:bCs/>
+          <w:color w:val="555555"/>
+          <w:sz w:val="16"/>
+          <w:szCs w:val="16"/>
+        </w:rPr>
+        <w:t xml:space="preserve">ANTWORTMÖGLICHKEITEN (NUR DM)  </w:t>
+      </w:r>
+    </w:p>
+    <w:p>
+      <w:pPr>
+        <w:pBdr>
+          <w:left w:val="single" w:color="BFBFBF" w:sz="18" w:space="8"/>
+        </w:pBdr>
+        <w:shd w:fill="F2F2F2" w:color="auto" w:val="clear"/>
+        <w:spacing w:after="40"/>
+        <w:ind w:left="120"/>
+      </w:pPr>
+      <w:r>
+        <w:rPr>
+          <w:rFonts w:ascii="Georgia" w:cs="Georgia" w:eastAsia="Georgia" w:hAnsi="Georgia"/>
+          <w:b/>
+          <w:bCs/>
+          <w:color w:val="333333"/>
+          <w:sz w:val="18"/>
+          <w:szCs w:val="18"/>
+        </w:rPr>
+        <w:t xml:space="preserve">Why don’t you just come with us?  </w:t>
+      </w:r>
+      <w:r>
+        <w:rPr>
+          <w:rFonts w:ascii="Georgia" w:cs="Georgia" w:eastAsia="Georgia" w:hAnsi="Georgia"/>
+          <w:i/>
+          <w:iCs/>
+          <w:color w:val="333333"/>
+          <w:sz w:val="18"/>
+          <w:szCs w:val="18"/>
+        </w:rPr>
+        <w:t xml:space="preserve">„And in February, when the wolves come back — will you be here?“</w:t>
+      </w:r>
+    </w:p>
+    <w:p>
+      <w:pPr>
+        <w:pBdr>
+          <w:left w:val="single" w:color="BFBFBF" w:sz="18" w:space="8"/>
+        </w:pBdr>
+        <w:shd w:fill="F2F2F2" w:color="auto" w:val="clear"/>
+        <w:spacing w:after="40"/>
+        <w:ind w:left="120"/>
+      </w:pPr>
+      <w:r>
+        <w:rPr>
+          <w:rFonts w:ascii="Georgia" w:cs="Georgia" w:eastAsia="Georgia" w:hAnsi="Georgia"/>
+          <w:b/>
+          <w:bCs/>
+          <w:color w:val="333333"/>
+          <w:sz w:val="18"/>
+          <w:szCs w:val="18"/>
+        </w:rPr>
+        <w:t xml:space="preserve">Did they force you?  </w:t>
+      </w:r>
+      <w:r>
+        <w:rPr>
+          <w:rFonts w:ascii="Georgia" w:cs="Georgia" w:eastAsia="Georgia" w:hAnsi="Georgia"/>
+          <w:i/>
+          <w:iCs/>
+          <w:color w:val="333333"/>
+          <w:sz w:val="18"/>
+          <w:szCs w:val="18"/>
+        </w:rPr>
+        <w:t xml:space="preserve">„Nobody forced anybody. That is the whole problem.“</w:t>
+      </w:r>
+    </w:p>
+    <w:p>
+      <w:pPr>
+        <w:pBdr>
+          <w:left w:val="single" w:color="BFBFBF" w:sz="18" w:space="8"/>
+        </w:pBdr>
+        <w:shd w:fill="F2F2F2" w:color="auto" w:val="clear"/>
+        <w:spacing w:after="40"/>
+        <w:ind w:left="120"/>
+      </w:pPr>
+      <w:r>
+        <w:rPr>
+          <w:rFonts w:ascii="Georgia" w:cs="Georgia" w:eastAsia="Georgia" w:hAnsi="Georgia"/>
+          <w:b/>
+          <w:bCs/>
+          <w:color w:val="333333"/>
+          <w:sz w:val="18"/>
+          <w:szCs w:val="18"/>
+        </w:rPr>
+        <w:t xml:space="preserve">Who chose you?  </w:t>
+      </w:r>
+      <w:r>
+        <w:rPr>
+          <w:rFonts w:ascii="Georgia" w:cs="Georgia" w:eastAsia="Georgia" w:hAnsi="Georgia"/>
+          <w:i/>
+          <w:iCs/>
+          <w:color w:val="333333"/>
+          <w:sz w:val="18"/>
+          <w:szCs w:val="18"/>
+        </w:rPr>
+        <w:t xml:space="preserve">„I chose me. The village chose Lene. She is nine.“</w:t>
+      </w:r>
+    </w:p>
+    <w:p>
+      <w:pPr>
+        <w:pBdr>
+          <w:left w:val="single" w:color="BFBFBF" w:sz="18" w:space="8"/>
+        </w:pBdr>
+        <w:shd w:fill="F2F2F2" w:color="auto" w:val="clear"/>
+        <w:spacing w:after="40"/>
+        <w:ind w:left="120"/>
+      </w:pPr>
+      <w:r>
+        <w:rPr>
+          <w:rFonts w:ascii="Georgia" w:cs="Georgia" w:eastAsia="Georgia" w:hAnsi="Georgia"/>
+          <w:b/>
+          <w:bCs/>
+          <w:color w:val="333333"/>
+          <w:sz w:val="18"/>
+          <w:szCs w:val="18"/>
+        </w:rPr>
+        <w:t xml:space="preserve">What happens at sunrise?  </w:t>
+      </w:r>
+      <w:r>
+        <w:rPr>
+          <w:rFonts w:ascii="Georgia" w:cs="Georgia" w:eastAsia="Georgia" w:hAnsi="Georgia"/>
+          <w:i/>
+          <w:iCs/>
+          <w:color w:val="333333"/>
+          <w:sz w:val="18"/>
+          <w:szCs w:val="18"/>
+        </w:rPr>
+        <w:t xml:space="preserve">„I sign the book downstairs. After that I am still me for a while. Then less.“</w:t>
+      </w:r>
+    </w:p>
+    <w:p>
+      <w:pPr>
+        <w:pBdr>
+          <w:left w:val="single" w:color="BFBFBF" w:sz="18" w:space="8"/>
+        </w:pBdr>
+        <w:shd w:fill="F2F2F2" w:color="auto" w:val="clear"/>
+        <w:spacing w:after="40"/>
+        <w:ind w:left="120"/>
+      </w:pPr>
+      <w:r>
+        <w:rPr>
+          <w:rFonts w:ascii="Georgia" w:cs="Georgia" w:eastAsia="Georgia" w:hAnsi="Georgia"/>
+          <w:b/>
+          <w:bCs/>
+          <w:color w:val="333333"/>
+          <w:sz w:val="18"/>
+          <w:szCs w:val="18"/>
+        </w:rPr>
+        <w:t xml:space="preserve">Can we just kill him?  </w:t>
+      </w:r>
+      <w:r>
+        <w:rPr>
+          <w:rFonts w:ascii="Georgia" w:cs="Georgia" w:eastAsia="Georgia" w:hAnsi="Georgia"/>
+          <w:i/>
+          <w:iCs/>
+          <w:color w:val="333333"/>
+          <w:sz w:val="18"/>
+          <w:szCs w:val="18"/>
+        </w:rPr>
+        <w:t xml:space="preserve">„People have tried. There is a board in the tavern with their names on it too — on the back.“</w:t>
+      </w:r>
+    </w:p>
+    <w:p>
+      <w:pPr>
+        <w:pBdr>
+          <w:left w:val="single" w:color="BFBFBF" w:sz="18" w:space="8"/>
+        </w:pBdr>
+        <w:shd w:fill="F2F2F2" w:color="auto" w:val="clear"/>
+        <w:spacing w:after="140"/>
+        <w:ind w:left="120"/>
+      </w:pPr>
+      <w:r>
+        <w:rPr>
+          <w:rFonts w:ascii="Georgia" w:cs="Georgia" w:eastAsia="Georgia" w:hAnsi="Georgia"/>
+          <w:b/>
+          <w:bCs/>
+          <w:color w:val="333333"/>
+          <w:sz w:val="18"/>
+          <w:szCs w:val="18"/>
+        </w:rPr>
+        <w:t xml:space="preserve">Where is he right now?  </w:t>
+      </w:r>
+      <w:r>
+        <w:rPr>
+          <w:rFonts w:ascii="Georgia" w:cs="Georgia" w:eastAsia="Georgia" w:hAnsi="Georgia"/>
+          <w:i/>
+          <w:iCs/>
+          <w:color w:val="333333"/>
+          <w:sz w:val="18"/>
+          <w:szCs w:val="18"/>
+        </w:rPr>
+        <w:t xml:space="preserve">„Asleep, two floors down, in the ice cellar. He will know you are here the moment you touch the book.“</w:t>
       </w:r>
     </w:p>
     <w:p>
@@ -7254,16 +7253,16 @@
           <w:sz w:val="16"/>
           <w:szCs w:val="16"/>
         </w:rPr>
-        <w:t xml:space="preserve">NUR DM:  </w:t>
-      </w:r>
-      <w:r>
-        <w:rPr>
-          <w:rFonts w:ascii="Georgia" w:cs="Georgia" w:eastAsia="Georgia" w:hAnsi="Georgia"/>
-          <w:color w:val="333333"/>
-          <w:sz w:val="18"/>
-          <w:szCs w:val="18"/>
-        </w:rPr>
-        <w:t xml:space="preserve">Lass sie vor Mirela entscheiden, nicht im Nebenzimmer. Sie widerspricht — das ist der beste Dialog des Abends.</w:t>
+        <w:t xml:space="preserve">HINTERGRUND (NUR DM):  </w:t>
+      </w:r>
+      <w:r>
+        <w:rPr>
+          <w:rFonts w:ascii="Georgia" w:cs="Georgia" w:eastAsia="Georgia" w:hAnsi="Georgia"/>
+          <w:color w:val="333333"/>
+          <w:sz w:val="18"/>
+          <w:szCs w:val="18"/>
+        </w:rPr>
+        <w:t xml:space="preserve">Eine Stunde bis Sonnenaufgang, Mirela im Sessel, das Blutbuch eine Etage tiefer. Hinaustragen: sicher für Mirela, aber sie schreit, Gefahr +3. Buch verbrennen: jeder Vertrag erlischt, Vaskir kommt wütend und allein, Gefahr +2. Angebot: reine Sprechszene, Gefahr ±0 — scheitert sie, Kampf. Lass sie vor Mirela entscheiden, nicht im Nebenzimmer: Sie widerspricht, und das ist der beste Dialog des Abends.</w:t>
       </w:r>
     </w:p>
     <w:p>
@@ -7621,6 +7620,36 @@
     </w:p>
     <w:p>
       <w:pPr>
+        <w:pBdr>
+          <w:left w:val="single" w:color="BFBFBF" w:sz="18" w:space="8"/>
+        </w:pBdr>
+        <w:shd w:fill="F2F2F2" w:color="auto" w:val="clear"/>
+        <w:spacing w:after="140"/>
+        <w:ind w:left="120"/>
+      </w:pPr>
+      <w:r>
+        <w:rPr>
+          <w:rFonts w:ascii="Georgia" w:cs="Georgia" w:eastAsia="Georgia" w:hAnsi="Georgia"/>
+          <w:b/>
+          <w:bCs/>
+          <w:color w:val="555555"/>
+          <w:sz w:val="16"/>
+          <w:szCs w:val="16"/>
+        </w:rPr>
+        <w:t xml:space="preserve">HINTERGRUND (NUR DM):  </w:t>
+      </w:r>
+      <w:r>
+        <w:rPr>
+          <w:rFonts w:ascii="Georgia" w:cs="Georgia" w:eastAsia="Georgia" w:hAnsi="Georgia"/>
+          <w:color w:val="333333"/>
+          <w:sz w:val="18"/>
+          <w:szCs w:val="18"/>
+        </w:rPr>
+        <w:t xml:space="preserve">Der Graf sieht aus wie ein müder Mann von fünfzig. Wie er auftritt, hängt an eurer Wahl (Übergang) und am Barometer (Lebenspunkte, Thralls) — es steht nur der Fall da, der bei euch gilt. Unter 15 Lebenspunkten hört er auf zu kämpfen und redet: Dann kann die Gruppe noch einmal wählen — töten, Vertrag, oder ihn gehen lassen. Fällt eine Figur auf 0, ist sie bewusstlos, nicht tot; der Lightbearer holt sie zurück. Am Ende trägst du unten ein, wie es ausging.</w:t>
+      </w:r>
+    </w:p>
+    <w:p>
+      <w:pPr>
         <w:spacing w:after="60" w:before="120"/>
       </w:pPr>
       <w:r>
@@ -8210,312 +8239,6 @@
           <w:szCs w:val="22"/>
         </w:rPr>
         <w:t xml:space="preserve">. Ask her who packed hers.”</w:t>
-      </w:r>
-    </w:p>
-    <w:p>
-      <w:pPr>
-        <w:spacing w:after="60" w:before="120"/>
-      </w:pPr>
-      <w:r>
-        <w:rPr>
-          <w:rFonts w:ascii="Georgia" w:cs="Georgia" w:eastAsia="Georgia" w:hAnsi="Georgia"/>
-          <w:b/>
-          <w:bCs/>
-          <w:color w:val="7A5A1A"/>
-          <w:sz w:val="17"/>
-          <w:szCs w:val="17"/>
-        </w:rPr>
-        <w:t xml:space="preserve">▸ Nur bei: Wahl C · Angebot</w:t>
-      </w:r>
-    </w:p>
-    <w:p>
-      <w:pPr>
-        <w:pBdr>
-          <w:left w:val="single" w:color="BFBFBF" w:sz="18" w:space="8"/>
-        </w:pBdr>
-        <w:shd w:fill="F2F2F2" w:color="auto" w:val="clear"/>
-        <w:spacing w:after="140"/>
-        <w:ind w:left="120"/>
-      </w:pPr>
-      <w:r>
-        <w:rPr>
-          <w:rFonts w:ascii="Georgia" w:cs="Georgia" w:eastAsia="Georgia" w:hAnsi="Georgia"/>
-          <w:b/>
-          <w:bCs/>
-          <w:color w:val="555555"/>
-          <w:sz w:val="16"/>
-          <w:szCs w:val="16"/>
-        </w:rPr>
-        <w:t xml:space="preserve">KNOPF (NUR DM):  </w:t>
-      </w:r>
-      <w:r>
-        <w:rPr>
-          <w:rFonts w:ascii="Georgia" w:cs="Georgia" w:eastAsia="Georgia" w:hAnsi="Georgia"/>
-          <w:color w:val="333333"/>
-          <w:sz w:val="18"/>
-          <w:szCs w:val="18"/>
-        </w:rPr>
-        <w:t xml:space="preserve">Die Verhandlung ist gescheitert — eine Drohung, eine Beleidigung, ein „we’ll kill you anyway“.  →  Gefahr +4, es wird gekämpft</w:t>
-      </w:r>
-    </w:p>
-    <w:p>
-      <w:pPr>
-        <w:spacing w:after="60" w:before="120"/>
-      </w:pPr>
-      <w:r>
-        <w:rPr>
-          <w:rFonts w:ascii="Georgia" w:cs="Georgia" w:eastAsia="Georgia" w:hAnsi="Georgia"/>
-          <w:b/>
-          <w:bCs/>
-          <w:color w:val="7A5A1A"/>
-          <w:sz w:val="17"/>
-          <w:szCs w:val="17"/>
-        </w:rPr>
-        <w:t xml:space="preserve">▸ Nur bei: Gefahr 0–3</w:t>
-      </w:r>
-    </w:p>
-    <w:p>
-      <w:pPr>
-        <w:pBdr>
-          <w:left w:val="single" w:color="BFBFBF" w:sz="18" w:space="8"/>
-        </w:pBdr>
-        <w:shd w:fill="F2F2F2" w:color="auto" w:val="clear"/>
-        <w:spacing w:after="140"/>
-        <w:ind w:left="120"/>
-      </w:pPr>
-      <w:r>
-        <w:rPr>
-          <w:rFonts w:ascii="Georgia" w:cs="Georgia" w:eastAsia="Georgia" w:hAnsi="Georgia"/>
-          <w:b/>
-          <w:bCs/>
-          <w:color w:val="555555"/>
-          <w:sz w:val="16"/>
-          <w:szCs w:val="16"/>
-        </w:rPr>
-        <w:t xml:space="preserve">GEFAHR 0–3 · ER IST BEEINDRUCKT (NUR DM):  </w:t>
-      </w:r>
-      <w:r>
-        <w:rPr>
-          <w:rFonts w:ascii="Georgia" w:cs="Georgia" w:eastAsia="Georgia" w:hAnsi="Georgia"/>
-          <w:color w:val="333333"/>
-          <w:sz w:val="18"/>
-          <w:szCs w:val="18"/>
-        </w:rPr>
-        <w:t xml:space="preserve">„You came up my mountain without waking a single one of my people. Do you know how long it has been since anyone did that?“ — Er ist allein und lässt bis zuletzt mit sich reden. Der Knopf unten lädt ihn mit 40 statt 55 Lebenspunkten, und die Gruppe darf einmal angreifen, bevor er reagiert.</w:t>
-      </w:r>
-    </w:p>
-    <w:p>
-      <w:pPr>
-        <w:spacing w:after="60" w:before="120"/>
-      </w:pPr>
-      <w:r>
-        <w:rPr>
-          <w:rFonts w:ascii="Georgia" w:cs="Georgia" w:eastAsia="Georgia" w:hAnsi="Georgia"/>
-          <w:b/>
-          <w:bCs/>
-          <w:color w:val="7A5A1A"/>
-          <w:sz w:val="17"/>
-          <w:szCs w:val="17"/>
-        </w:rPr>
-        <w:t xml:space="preserve">▸ Nur bei: Gefahr 4–7</w:t>
-      </w:r>
-    </w:p>
-    <w:p>
-      <w:pPr>
-        <w:pBdr>
-          <w:left w:val="single" w:color="BFBFBF" w:sz="18" w:space="8"/>
-        </w:pBdr>
-        <w:shd w:fill="F2F2F2" w:color="auto" w:val="clear"/>
-        <w:spacing w:after="140"/>
-        <w:ind w:left="120"/>
-      </w:pPr>
-      <w:r>
-        <w:rPr>
-          <w:rFonts w:ascii="Georgia" w:cs="Georgia" w:eastAsia="Georgia" w:hAnsi="Georgia"/>
-          <w:b/>
-          <w:bCs/>
-          <w:color w:val="555555"/>
-          <w:sz w:val="16"/>
-          <w:szCs w:val="16"/>
-        </w:rPr>
-        <w:t xml:space="preserve">GEFAHR 4–7 · ER HAT GEWARTET (NUR DM):  </w:t>
-      </w:r>
-      <w:r>
-        <w:rPr>
-          <w:rFonts w:ascii="Georgia" w:cs="Georgia" w:eastAsia="Georgia" w:hAnsi="Georgia"/>
-          <w:color w:val="333333"/>
-          <w:sz w:val="18"/>
-          <w:szCs w:val="18"/>
-        </w:rPr>
-        <w:t xml:space="preserve">Er weiss seit Stunden, dass sie da sind, und wollte sehen, wie weit sie kommen. Volle 55 Lebenspunkte.</w:t>
-      </w:r>
-    </w:p>
-    <w:p>
-      <w:pPr>
-        <w:spacing w:after="60" w:before="120"/>
-      </w:pPr>
-      <w:r>
-        <w:rPr>
-          <w:rFonts w:ascii="Georgia" w:cs="Georgia" w:eastAsia="Georgia" w:hAnsi="Georgia"/>
-          <w:b/>
-          <w:bCs/>
-          <w:color w:val="7A5A1A"/>
-          <w:sz w:val="17"/>
-          <w:szCs w:val="17"/>
-        </w:rPr>
-        <w:t xml:space="preserve">▸ Nur bei: Gefahr 8–10</w:t>
-      </w:r>
-    </w:p>
-    <w:p>
-      <w:pPr>
-        <w:pBdr>
-          <w:left w:val="single" w:color="BFBFBF" w:sz="18" w:space="8"/>
-        </w:pBdr>
-        <w:shd w:fill="F2F2F2" w:color="auto" w:val="clear"/>
-        <w:spacing w:after="140"/>
-        <w:ind w:left="120"/>
-      </w:pPr>
-      <w:r>
-        <w:rPr>
-          <w:rFonts w:ascii="Georgia" w:cs="Georgia" w:eastAsia="Georgia" w:hAnsi="Georgia"/>
-          <w:b/>
-          <w:bCs/>
-          <w:color w:val="555555"/>
-          <w:sz w:val="16"/>
-          <w:szCs w:val="16"/>
-        </w:rPr>
-        <w:t xml:space="preserve">GEFAHR 8–10 · DAS HAUS IST WACH (NUR DM):  </w:t>
-      </w:r>
-      <w:r>
-        <w:rPr>
-          <w:rFonts w:ascii="Georgia" w:cs="Georgia" w:eastAsia="Georgia" w:hAnsi="Georgia"/>
-          <w:color w:val="333333"/>
-          <w:sz w:val="18"/>
-          <w:szCs w:val="18"/>
-        </w:rPr>
-        <w:t xml:space="preserve">Jede Lampe brennt. Volle 55 Lebenspunkte. Sag der Gruppe vorher, woran das liegt — sie haben es sich verdient und wissen es.</w:t>
-      </w:r>
-    </w:p>
-    <w:p>
-      <w:pPr>
-        <w:spacing w:after="60" w:before="120"/>
-      </w:pPr>
-      <w:r>
-        <w:rPr>
-          <w:rFonts w:ascii="Georgia" w:cs="Georgia" w:eastAsia="Georgia" w:hAnsi="Georgia"/>
-          <w:b/>
-          <w:bCs/>
-          <w:color w:val="7A5A1A"/>
-          <w:sz w:val="17"/>
-          <w:szCs w:val="17"/>
-        </w:rPr>
-        <w:t xml:space="preserve">▸ Nur bei: nicht: Wahl B · Buch verbrennen, Gefahr 4–10</w:t>
-      </w:r>
-    </w:p>
-    <w:p>
-      <w:pPr>
-        <w:pBdr>
-          <w:left w:val="single" w:color="BFBFBF" w:sz="18" w:space="8"/>
-        </w:pBdr>
-        <w:shd w:fill="F2F2F2" w:color="auto" w:val="clear"/>
-        <w:spacing w:after="140"/>
-        <w:ind w:left="120"/>
-      </w:pPr>
-      <w:r>
-        <w:rPr>
-          <w:rFonts w:ascii="Georgia" w:cs="Georgia" w:eastAsia="Georgia" w:hAnsi="Georgia"/>
-          <w:b/>
-          <w:bCs/>
-          <w:color w:val="555555"/>
-          <w:sz w:val="16"/>
-          <w:szCs w:val="16"/>
-        </w:rPr>
-        <w:t xml:space="preserve">ZWEI THRALLS KOMMEN DAZU (NUR DM):  </w:t>
-      </w:r>
-      <w:r>
-        <w:rPr>
-          <w:rFonts w:ascii="Georgia" w:cs="Georgia" w:eastAsia="Georgia" w:hAnsi="Georgia"/>
-          <w:color w:val="333333"/>
-          <w:sz w:val="18"/>
-          <w:szCs w:val="18"/>
-        </w:rPr>
-        <w:t xml:space="preserve">Zwei Diener des Hauses stehen mit im Raum, je 9 Lebenspunkte. Der Knopf unten lädt sie mit.</w:t>
-      </w:r>
-    </w:p>
-    <w:p>
-      <w:pPr>
-        <w:spacing w:after="60" w:before="120"/>
-      </w:pPr>
-      <w:r>
-        <w:rPr>
-          <w:rFonts w:ascii="Georgia" w:cs="Georgia" w:eastAsia="Georgia" w:hAnsi="Georgia"/>
-          <w:b/>
-          <w:bCs/>
-          <w:color w:val="7A5A1A"/>
-          <w:sz w:val="17"/>
-          <w:szCs w:val="17"/>
-        </w:rPr>
-        <w:t xml:space="preserve">▸ Nur bei: Wahl B · Buch verbrennen, Gefahr 4–10</w:t>
-      </w:r>
-    </w:p>
-    <w:p>
-      <w:pPr>
-        <w:pBdr>
-          <w:left w:val="single" w:color="BFBFBF" w:sz="18" w:space="8"/>
-        </w:pBdr>
-        <w:shd w:fill="F2F2F2" w:color="auto" w:val="clear"/>
-        <w:spacing w:after="140"/>
-        <w:ind w:left="120"/>
-      </w:pPr>
-      <w:r>
-        <w:rPr>
-          <w:rFonts w:ascii="Georgia" w:cs="Georgia" w:eastAsia="Georgia" w:hAnsi="Georgia"/>
-          <w:b/>
-          <w:bCs/>
-          <w:color w:val="555555"/>
-          <w:sz w:val="16"/>
-          <w:szCs w:val="16"/>
-        </w:rPr>
-        <w:t xml:space="preserve">KEINE THRALLS (NUR DM):  </w:t>
-      </w:r>
-      <w:r>
-        <w:rPr>
-          <w:rFonts w:ascii="Georgia" w:cs="Georgia" w:eastAsia="Georgia" w:hAnsi="Georgia"/>
-          <w:color w:val="333333"/>
-          <w:sz w:val="18"/>
-          <w:szCs w:val="18"/>
-        </w:rPr>
-        <w:t xml:space="preserve">Das Buch hat die Diener befreit — sie liegen irgendwo im Haus und schlafen zum ersten Mal seit Jahren. Vaskir kommt allein.</w:t>
-      </w:r>
-    </w:p>
-    <w:p>
-      <w:pPr>
-        <w:pBdr>
-          <w:left w:val="single" w:color="BFBFBF" w:sz="18" w:space="8"/>
-        </w:pBdr>
-        <w:shd w:fill="F2F2F2" w:color="auto" w:val="clear"/>
-        <w:spacing w:after="140"/>
-        <w:ind w:left="120"/>
-      </w:pPr>
-      <w:r>
-        <w:rPr>
-          <w:rFonts w:ascii="Georgia" w:cs="Georgia" w:eastAsia="Georgia" w:hAnsi="Georgia"/>
-          <w:b/>
-          <w:bCs/>
-          <w:color w:val="555555"/>
-          <w:sz w:val="16"/>
-          <w:szCs w:val="16"/>
-        </w:rPr>
-        <w:t xml:space="preserve">KNOPF (NUR DM):  </w:t>
-      </w:r>
-      <w:r>
-        <w:rPr>
-          <w:rFonts w:ascii="Georgia" w:cs="Georgia" w:eastAsia="Georgia" w:hAnsi="Georgia"/>
-          <w:color w:val="333333"/>
-          <w:sz w:val="18"/>
-          <w:szCs w:val="18"/>
-        </w:rPr>
-        <w:t xml:space="preserve">Lade den Kampf — die Seite nimmt die richtigen Gegner nach Barometer und eurer Wahl. Bei geglückter Verhandlung brauchst du das nicht.  →  Kampf laden</w:t>
       </w:r>
     </w:p>
     <w:p>
@@ -8568,6 +8291,312 @@
     </w:p>
     <w:p>
       <w:pPr>
+        <w:spacing w:after="60" w:before="120"/>
+      </w:pPr>
+      <w:r>
+        <w:rPr>
+          <w:rFonts w:ascii="Georgia" w:cs="Georgia" w:eastAsia="Georgia" w:hAnsi="Georgia"/>
+          <w:b/>
+          <w:bCs/>
+          <w:color w:val="7A5A1A"/>
+          <w:sz w:val="17"/>
+          <w:szCs w:val="17"/>
+        </w:rPr>
+        <w:t xml:space="preserve">▸ Nur bei: Wahl C · Angebot</w:t>
+      </w:r>
+    </w:p>
+    <w:p>
+      <w:pPr>
+        <w:pBdr>
+          <w:left w:val="single" w:color="BFBFBF" w:sz="18" w:space="8"/>
+        </w:pBdr>
+        <w:shd w:fill="F2F2F2" w:color="auto" w:val="clear"/>
+        <w:spacing w:after="140"/>
+        <w:ind w:left="120"/>
+      </w:pPr>
+      <w:r>
+        <w:rPr>
+          <w:rFonts w:ascii="Georgia" w:cs="Georgia" w:eastAsia="Georgia" w:hAnsi="Georgia"/>
+          <w:b/>
+          <w:bCs/>
+          <w:color w:val="555555"/>
+          <w:sz w:val="16"/>
+          <w:szCs w:val="16"/>
+        </w:rPr>
+        <w:t xml:space="preserve">KNOPF (NUR DM):  </w:t>
+      </w:r>
+      <w:r>
+        <w:rPr>
+          <w:rFonts w:ascii="Georgia" w:cs="Georgia" w:eastAsia="Georgia" w:hAnsi="Georgia"/>
+          <w:color w:val="333333"/>
+          <w:sz w:val="18"/>
+          <w:szCs w:val="18"/>
+        </w:rPr>
+        <w:t xml:space="preserve">Die Verhandlung ist gescheitert — eine Drohung, eine Beleidigung, ein „we’ll kill you anyway“.  →  Gefahr +4, es wird gekämpft</w:t>
+      </w:r>
+    </w:p>
+    <w:p>
+      <w:pPr>
+        <w:spacing w:after="60" w:before="120"/>
+      </w:pPr>
+      <w:r>
+        <w:rPr>
+          <w:rFonts w:ascii="Georgia" w:cs="Georgia" w:eastAsia="Georgia" w:hAnsi="Georgia"/>
+          <w:b/>
+          <w:bCs/>
+          <w:color w:val="7A5A1A"/>
+          <w:sz w:val="17"/>
+          <w:szCs w:val="17"/>
+        </w:rPr>
+        <w:t xml:space="preserve">▸ Nur bei: Gefahr 0–3</w:t>
+      </w:r>
+    </w:p>
+    <w:p>
+      <w:pPr>
+        <w:pBdr>
+          <w:left w:val="single" w:color="BFBFBF" w:sz="18" w:space="8"/>
+        </w:pBdr>
+        <w:shd w:fill="F2F2F2" w:color="auto" w:val="clear"/>
+        <w:spacing w:after="140"/>
+        <w:ind w:left="120"/>
+      </w:pPr>
+      <w:r>
+        <w:rPr>
+          <w:rFonts w:ascii="Georgia" w:cs="Georgia" w:eastAsia="Georgia" w:hAnsi="Georgia"/>
+          <w:b/>
+          <w:bCs/>
+          <w:color w:val="555555"/>
+          <w:sz w:val="16"/>
+          <w:szCs w:val="16"/>
+        </w:rPr>
+        <w:t xml:space="preserve">GEFAHR 0–3 · ER IST BEEINDRUCKT (NUR DM):  </w:t>
+      </w:r>
+      <w:r>
+        <w:rPr>
+          <w:rFonts w:ascii="Georgia" w:cs="Georgia" w:eastAsia="Georgia" w:hAnsi="Georgia"/>
+          <w:color w:val="333333"/>
+          <w:sz w:val="18"/>
+          <w:szCs w:val="18"/>
+        </w:rPr>
+        <w:t xml:space="preserve">„You came up my mountain without waking a single one of my people. Do you know how long it has been since anyone did that?“ — Er ist allein und lässt bis zuletzt mit sich reden. Der Knopf unten lädt ihn mit 40 statt 55 Lebenspunkten, und die Gruppe darf einmal angreifen, bevor er reagiert.</w:t>
+      </w:r>
+    </w:p>
+    <w:p>
+      <w:pPr>
+        <w:spacing w:after="60" w:before="120"/>
+      </w:pPr>
+      <w:r>
+        <w:rPr>
+          <w:rFonts w:ascii="Georgia" w:cs="Georgia" w:eastAsia="Georgia" w:hAnsi="Georgia"/>
+          <w:b/>
+          <w:bCs/>
+          <w:color w:val="7A5A1A"/>
+          <w:sz w:val="17"/>
+          <w:szCs w:val="17"/>
+        </w:rPr>
+        <w:t xml:space="preserve">▸ Nur bei: Gefahr 4–7</w:t>
+      </w:r>
+    </w:p>
+    <w:p>
+      <w:pPr>
+        <w:pBdr>
+          <w:left w:val="single" w:color="BFBFBF" w:sz="18" w:space="8"/>
+        </w:pBdr>
+        <w:shd w:fill="F2F2F2" w:color="auto" w:val="clear"/>
+        <w:spacing w:after="140"/>
+        <w:ind w:left="120"/>
+      </w:pPr>
+      <w:r>
+        <w:rPr>
+          <w:rFonts w:ascii="Georgia" w:cs="Georgia" w:eastAsia="Georgia" w:hAnsi="Georgia"/>
+          <w:b/>
+          <w:bCs/>
+          <w:color w:val="555555"/>
+          <w:sz w:val="16"/>
+          <w:szCs w:val="16"/>
+        </w:rPr>
+        <w:t xml:space="preserve">GEFAHR 4–7 · ER HAT GEWARTET (NUR DM):  </w:t>
+      </w:r>
+      <w:r>
+        <w:rPr>
+          <w:rFonts w:ascii="Georgia" w:cs="Georgia" w:eastAsia="Georgia" w:hAnsi="Georgia"/>
+          <w:color w:val="333333"/>
+          <w:sz w:val="18"/>
+          <w:szCs w:val="18"/>
+        </w:rPr>
+        <w:t xml:space="preserve">Er weiss seit Stunden, dass sie da sind, und wollte sehen, wie weit sie kommen. Volle 55 Lebenspunkte.</w:t>
+      </w:r>
+    </w:p>
+    <w:p>
+      <w:pPr>
+        <w:spacing w:after="60" w:before="120"/>
+      </w:pPr>
+      <w:r>
+        <w:rPr>
+          <w:rFonts w:ascii="Georgia" w:cs="Georgia" w:eastAsia="Georgia" w:hAnsi="Georgia"/>
+          <w:b/>
+          <w:bCs/>
+          <w:color w:val="7A5A1A"/>
+          <w:sz w:val="17"/>
+          <w:szCs w:val="17"/>
+        </w:rPr>
+        <w:t xml:space="preserve">▸ Nur bei: Gefahr 8–10</w:t>
+      </w:r>
+    </w:p>
+    <w:p>
+      <w:pPr>
+        <w:pBdr>
+          <w:left w:val="single" w:color="BFBFBF" w:sz="18" w:space="8"/>
+        </w:pBdr>
+        <w:shd w:fill="F2F2F2" w:color="auto" w:val="clear"/>
+        <w:spacing w:after="140"/>
+        <w:ind w:left="120"/>
+      </w:pPr>
+      <w:r>
+        <w:rPr>
+          <w:rFonts w:ascii="Georgia" w:cs="Georgia" w:eastAsia="Georgia" w:hAnsi="Georgia"/>
+          <w:b/>
+          <w:bCs/>
+          <w:color w:val="555555"/>
+          <w:sz w:val="16"/>
+          <w:szCs w:val="16"/>
+        </w:rPr>
+        <w:t xml:space="preserve">GEFAHR 8–10 · DAS HAUS IST WACH (NUR DM):  </w:t>
+      </w:r>
+      <w:r>
+        <w:rPr>
+          <w:rFonts w:ascii="Georgia" w:cs="Georgia" w:eastAsia="Georgia" w:hAnsi="Georgia"/>
+          <w:color w:val="333333"/>
+          <w:sz w:val="18"/>
+          <w:szCs w:val="18"/>
+        </w:rPr>
+        <w:t xml:space="preserve">Jede Lampe brennt. Volle 55 Lebenspunkte. Sag der Gruppe vorher, woran das liegt — sie haben es sich verdient und wissen es.</w:t>
+      </w:r>
+    </w:p>
+    <w:p>
+      <w:pPr>
+        <w:spacing w:after="60" w:before="120"/>
+      </w:pPr>
+      <w:r>
+        <w:rPr>
+          <w:rFonts w:ascii="Georgia" w:cs="Georgia" w:eastAsia="Georgia" w:hAnsi="Georgia"/>
+          <w:b/>
+          <w:bCs/>
+          <w:color w:val="7A5A1A"/>
+          <w:sz w:val="17"/>
+          <w:szCs w:val="17"/>
+        </w:rPr>
+        <w:t xml:space="preserve">▸ Nur bei: nicht: Wahl B · Buch verbrennen, Gefahr 4–10</w:t>
+      </w:r>
+    </w:p>
+    <w:p>
+      <w:pPr>
+        <w:pBdr>
+          <w:left w:val="single" w:color="BFBFBF" w:sz="18" w:space="8"/>
+        </w:pBdr>
+        <w:shd w:fill="F2F2F2" w:color="auto" w:val="clear"/>
+        <w:spacing w:after="140"/>
+        <w:ind w:left="120"/>
+      </w:pPr>
+      <w:r>
+        <w:rPr>
+          <w:rFonts w:ascii="Georgia" w:cs="Georgia" w:eastAsia="Georgia" w:hAnsi="Georgia"/>
+          <w:b/>
+          <w:bCs/>
+          <w:color w:val="555555"/>
+          <w:sz w:val="16"/>
+          <w:szCs w:val="16"/>
+        </w:rPr>
+        <w:t xml:space="preserve">ZWEI THRALLS KOMMEN DAZU (NUR DM):  </w:t>
+      </w:r>
+      <w:r>
+        <w:rPr>
+          <w:rFonts w:ascii="Georgia" w:cs="Georgia" w:eastAsia="Georgia" w:hAnsi="Georgia"/>
+          <w:color w:val="333333"/>
+          <w:sz w:val="18"/>
+          <w:szCs w:val="18"/>
+        </w:rPr>
+        <w:t xml:space="preserve">Zwei Diener des Hauses stehen mit im Raum, je 9 Lebenspunkte. Der Knopf unten lädt sie mit.</w:t>
+      </w:r>
+    </w:p>
+    <w:p>
+      <w:pPr>
+        <w:spacing w:after="60" w:before="120"/>
+      </w:pPr>
+      <w:r>
+        <w:rPr>
+          <w:rFonts w:ascii="Georgia" w:cs="Georgia" w:eastAsia="Georgia" w:hAnsi="Georgia"/>
+          <w:b/>
+          <w:bCs/>
+          <w:color w:val="7A5A1A"/>
+          <w:sz w:val="17"/>
+          <w:szCs w:val="17"/>
+        </w:rPr>
+        <w:t xml:space="preserve">▸ Nur bei: Wahl B · Buch verbrennen, Gefahr 4–10</w:t>
+      </w:r>
+    </w:p>
+    <w:p>
+      <w:pPr>
+        <w:pBdr>
+          <w:left w:val="single" w:color="BFBFBF" w:sz="18" w:space="8"/>
+        </w:pBdr>
+        <w:shd w:fill="F2F2F2" w:color="auto" w:val="clear"/>
+        <w:spacing w:after="140"/>
+        <w:ind w:left="120"/>
+      </w:pPr>
+      <w:r>
+        <w:rPr>
+          <w:rFonts w:ascii="Georgia" w:cs="Georgia" w:eastAsia="Georgia" w:hAnsi="Georgia"/>
+          <w:b/>
+          <w:bCs/>
+          <w:color w:val="555555"/>
+          <w:sz w:val="16"/>
+          <w:szCs w:val="16"/>
+        </w:rPr>
+        <w:t xml:space="preserve">KEINE THRALLS (NUR DM):  </w:t>
+      </w:r>
+      <w:r>
+        <w:rPr>
+          <w:rFonts w:ascii="Georgia" w:cs="Georgia" w:eastAsia="Georgia" w:hAnsi="Georgia"/>
+          <w:color w:val="333333"/>
+          <w:sz w:val="18"/>
+          <w:szCs w:val="18"/>
+        </w:rPr>
+        <w:t xml:space="preserve">Das Buch hat die Diener befreit — sie liegen irgendwo im Haus und schlafen zum ersten Mal seit Jahren. Vaskir kommt allein.</w:t>
+      </w:r>
+    </w:p>
+    <w:p>
+      <w:pPr>
+        <w:pBdr>
+          <w:left w:val="single" w:color="BFBFBF" w:sz="18" w:space="8"/>
+        </w:pBdr>
+        <w:shd w:fill="F2F2F2" w:color="auto" w:val="clear"/>
+        <w:spacing w:after="140"/>
+        <w:ind w:left="120"/>
+      </w:pPr>
+      <w:r>
+        <w:rPr>
+          <w:rFonts w:ascii="Georgia" w:cs="Georgia" w:eastAsia="Georgia" w:hAnsi="Georgia"/>
+          <w:b/>
+          <w:bCs/>
+          <w:color w:val="555555"/>
+          <w:sz w:val="16"/>
+          <w:szCs w:val="16"/>
+        </w:rPr>
+        <w:t xml:space="preserve">KNOPF (NUR DM):  </w:t>
+      </w:r>
+      <w:r>
+        <w:rPr>
+          <w:rFonts w:ascii="Georgia" w:cs="Georgia" w:eastAsia="Georgia" w:hAnsi="Georgia"/>
+          <w:color w:val="333333"/>
+          <w:sz w:val="18"/>
+          <w:szCs w:val="18"/>
+        </w:rPr>
+        <w:t xml:space="preserve">Lade den Kampf — die Seite nimmt die richtigen Gegner nach Barometer und eurer Wahl. Bei geglückter Verhandlung brauchst du das nicht.  →  Kampf laden</w:t>
+      </w:r>
+    </w:p>
+    <w:p>
+      <w:pPr>
         <w:pBdr>
           <w:left w:val="single" w:color="BFBFBF" w:sz="18" w:space="8"/>
         </w:pBdr>
@@ -8594,37 +8623,6 @@
           <w:szCs w:val="18"/>
         </w:rPr>
         <w:t xml:space="preserve"> Trag den Schaden der Spieler rechts in seine Leiste ein. Für seinen Zug drückst du auf eine seiner Attacken — die Seite würfelt und du klickst an, wen es trifft.  Count Vaskir 55 HP</w:t>
-      </w:r>
-    </w:p>
-    <w:p>
-      <w:pPr>
-        <w:pBdr>
-          <w:left w:val="single" w:color="BFBFBF" w:sz="18" w:space="8"/>
-        </w:pBdr>
-        <w:shd w:fill="F2F2F2" w:color="auto" w:val="clear"/>
-        <w:spacing w:after="140"/>
-        <w:ind w:left="120"/>
-      </w:pPr>
-      <w:r>
-        <w:rPr>
-          <w:rFonts w:ascii="Georgia" w:cs="Georgia" w:eastAsia="Georgia" w:hAnsi="Georgia"/>
-          <w:b/>
-          <w:bCs/>
-          <w:color w:val="555555"/>
-          <w:sz w:val="16"/>
-          <w:szCs w:val="16"/>
-        </w:rPr>
-        <w:t xml:space="preserve">WIE DER KAMPF ENDET (NUR DM):  </w:t>
-      </w:r>
-      <w:r>
-        <w:rPr>
-          <w:rFonts w:ascii="Georgia" w:cs="Georgia" w:eastAsia="Georgia" w:hAnsi="Georgia"/>
-          <w:color w:val="333333"/>
-          <w:sz w:val="18"/>
-          <w:szCs w:val="18"/>
-        </w:rPr>
-        <w:t xml:space="preserve">Unter 15 Lebenspunkten hört Vaskir auf zu kämpfen und redet. Lass ihn nicht stumm zu Staub zerfallen — das ist der Moment, in dem die Gruppe noch einmal wählen kann: töten, ein Vertrag, oder ihn gehen lassen (er wird zu Nebel und ist weg).
- Fällt eine Figur auf 0, ist sie bewusstlos, nicht tot. Der Lightbearer holt sie mit Healing Light zurück.</w:t>
       </w:r>
     </w:p>
     <w:p>

</xml_diff>

<commit_message>
DM: Wiederholungen zwischen Vorlesen, Rede und Aufgabe entfernt; Regieanweisungen in den Erzähltext
Co-Authored-By: Claude Fable 5.1 <noreply@anthropic.com>
Claude-Session: https://claude.ai/code/session_01ADUPP2jvP6dgTYk1DsQkUN
</commit_message>
<xml_diff>
--- a/helferblatt/Nachtfels_Lesetext_DM.docx
+++ b/helferblatt/Nachtfels_Lesetext_DM.docx
@@ -616,7 +616,7 @@
           <w:sz w:val="18"/>
           <w:szCs w:val="18"/>
         </w:rPr>
-        <w:t xml:space="preserve">Sechs Stunden Kutschfahrt bergauf, Nebel, Mond, etwas läuft im Wald mit. Der Fahrer heisst Marek: grimmig, wortkarg, will das Geld und wieder weg — er stellt die erste Frage des Abends. Die Gruppe sind Vampirjäger, hergeführt von einem Gerücht (das liest du gleich vor). Wichtig: Jede Figur sagt Marek mindestens zwei bis drei Sätze. Die Szene endet vor dem Wirtshaus, die Kutsche fährt weg.</w:t>
+        <w:t xml:space="preserve">Sechs Stunden Kutschfahrt bergauf. Der Fahrer heisst Marek: grimmig, wortkarg — er stellt die erste Frage des Abends. Wichtig: Jede Figur antwortet ihm mit mindestens zwei bis drei Sätzen; die Vorstellung ist die erste Sprechübung. Danach liest du vor, warum die Gruppe hier ist, und die Szene endet vor dem Wirtshaus.</w:t>
       </w:r>
     </w:p>
     <w:p>
@@ -828,11 +828,24 @@
     </w:p>
     <w:p>
       <w:pPr>
+        <w:spacing w:after="110" w:line="320"/>
+      </w:pPr>
+      <w:r>
+        <w:rPr>
+          <w:rFonts w:ascii="Georgia" w:cs="Georgia" w:eastAsia="Georgia" w:hAnsi="Georgia"/>
+          <w:sz w:val="22"/>
+          <w:szCs w:val="22"/>
+        </w:rPr>
+        <w:t xml:space="preserve">And then, for the first time in six hours, he speaks — without turning round.</w:t>
+      </w:r>
+    </w:p>
+    <w:p>
+      <w:pPr>
         <w:pBdr>
           <w:left w:val="single" w:color="D9A441" w:sz="18" w:space="8"/>
         </w:pBdr>
         <w:shd w:fill="FFF6DD" w:color="auto" w:val="clear"/>
-        <w:spacing w:after="40"/>
+        <w:spacing w:after="140"/>
         <w:ind w:left="120"/>
       </w:pPr>
       <w:r>
@@ -852,24 +865,6 @@
           <w:sz w:val="21"/>
           <w:szCs w:val="21"/>
         </w:rPr>
-        <w:t xml:space="preserve">Marek says, without turning round:</w:t>
-      </w:r>
-    </w:p>
-    <w:p>
-      <w:pPr>
-        <w:pBdr>
-          <w:left w:val="single" w:color="D9A441" w:sz="18" w:space="8"/>
-        </w:pBdr>
-        <w:shd w:fill="FFF6DD" w:color="auto" w:val="clear"/>
-        <w:spacing w:after="140"/>
-        <w:ind w:left="120"/>
-      </w:pPr>
-      <w:r>
-        <w:rPr>
-          <w:rFonts w:ascii="Georgia" w:cs="Georgia" w:eastAsia="Georgia" w:hAnsi="Georgia"/>
-          <w:sz w:val="21"/>
-          <w:szCs w:val="21"/>
-        </w:rPr>
         <w:t xml:space="preserve">Nobody comes up here in November. So — who are you? And what do you want in a place like this?</w:t>
       </w:r>
     </w:p>
@@ -899,7 +894,7 @@
           <w:sz w:val="19"/>
           <w:szCs w:val="19"/>
         </w:rPr>
-        <w:t xml:space="preserve">“Marek is waiting for an answer. Each of you: tell him your name, what you are good at, and why you came up here. At least two or three sentences.”</w:t>
+        <w:t xml:space="preserve">“Answer him — each of you. At least two or three sentences.”</w:t>
       </w:r>
     </w:p>
     <w:p>
@@ -1832,7 +1827,7 @@
           <w:left w:val="single" w:color="D9A441" w:sz="18" w:space="8"/>
         </w:pBdr>
         <w:shd w:fill="FFF6DD" w:color="auto" w:val="clear"/>
-        <w:spacing w:after="40"/>
+        <w:spacing w:after="140"/>
         <w:ind w:left="120"/>
       </w:pPr>
       <w:r>
@@ -1852,24 +1847,6 @@
           <w:sz w:val="21"/>
           <w:szCs w:val="21"/>
         </w:rPr>
-        <w:t xml:space="preserve">Three people in this room are looking straight at you. The woman behind the bar, the old man by the fire, and the boy at the door.</w:t>
-      </w:r>
-    </w:p>
-    <w:p>
-      <w:pPr>
-        <w:pBdr>
-          <w:left w:val="single" w:color="D9A441" w:sz="18" w:space="8"/>
-        </w:pBdr>
-        <w:shd w:fill="FFF6DD" w:color="auto" w:val="clear"/>
-        <w:spacing w:after="140"/>
-        <w:ind w:left="120"/>
-      </w:pPr>
-      <w:r>
-        <w:rPr>
-          <w:rFonts w:ascii="Georgia" w:cs="Georgia" w:eastAsia="Georgia" w:hAnsi="Georgia"/>
-          <w:sz w:val="21"/>
-          <w:szCs w:val="21"/>
-        </w:rPr>
         <w:t xml:space="preserve">Who do you want to talk to?</w:t>
       </w:r>
     </w:p>
@@ -1899,7 +1876,7 @@
           <w:sz w:val="19"/>
           <w:szCs w:val="19"/>
         </w:rPr>
-        <w:t xml:space="preserve">“Three people in this room will talk to you. Each of you asks at least one question — and one follow-up question. Nobody in here tells you anything by themselves.”</w:t>
+        <w:t xml:space="preserve">“Each of you asks at least one question — and one follow-up question. Nobody in here tells you anything by themselves.”</w:t>
       </w:r>
     </w:p>
     <w:p>
@@ -2833,7 +2810,7 @@
           <w:sz w:val="19"/>
           <w:szCs w:val="19"/>
         </w:rPr>
-        <w:t xml:space="preserve">“Before we vote: each of you says one full sentence. Which way do you want to take — and why?”</w:t>
+        <w:t xml:space="preserve">“One full sentence each: which way — and why. Then we vote.”</w:t>
       </w:r>
     </w:p>
     <w:p>
@@ -4020,7 +3997,7 @@
           <w:sz w:val="22"/>
           <w:szCs w:val="22"/>
         </w:rPr>
-        <w:t xml:space="preserve"> stands a man with a lamp. He has heard the door. He is coming down.</w:t>
+        <w:t xml:space="preserve"> stands a man with a lamp. He has heard the door. He comes down, slowly, and holds the lamp up to your faces.</w:t>
       </w:r>
     </w:p>
     <w:p>
@@ -4029,7 +4006,7 @@
           <w:left w:val="single" w:color="D9A441" w:sz="18" w:space="8"/>
         </w:pBdr>
         <w:shd w:fill="FFF6DD" w:color="auto" w:val="clear"/>
-        <w:spacing w:after="40"/>
+        <w:spacing w:after="140"/>
         <w:ind w:left="120"/>
       </w:pPr>
       <w:r>
@@ -4049,41 +4026,6 @@
           <w:sz w:val="21"/>
           <w:szCs w:val="21"/>
         </w:rPr>
-        <w:t xml:space="preserve">The guard</w:t>
-      </w:r>
-      <w:r>
-        <w:rPr>
-          <w:rFonts w:ascii="Georgia" w:cs="Georgia" w:eastAsia="Georgia" w:hAnsi="Georgia"/>
-          <w:color w:val="7A5A1A"/>
-          <w:sz w:val="17"/>
-          <w:szCs w:val="17"/>
-        </w:rPr>
-        <w:t xml:space="preserve"> [Wache]</w:t>
-      </w:r>
-      <w:r>
-        <w:rPr>
-          <w:rFonts w:ascii="Georgia" w:cs="Georgia" w:eastAsia="Georgia" w:hAnsi="Georgia"/>
-          <w:sz w:val="21"/>
-          <w:szCs w:val="21"/>
-        </w:rPr>
-        <w:t xml:space="preserve"> holds up the lamp and says:</w:t>
-      </w:r>
-    </w:p>
-    <w:p>
-      <w:pPr>
-        <w:pBdr>
-          <w:left w:val="single" w:color="D9A441" w:sz="18" w:space="8"/>
-        </w:pBdr>
-        <w:shd w:fill="FFF6DD" w:color="auto" w:val="clear"/>
-        <w:spacing w:after="140"/>
-        <w:ind w:left="120"/>
-      </w:pPr>
-      <w:r>
-        <w:rPr>
-          <w:rFonts w:ascii="Georgia" w:cs="Georgia" w:eastAsia="Georgia" w:hAnsi="Georgia"/>
-          <w:sz w:val="21"/>
-          <w:szCs w:val="21"/>
-        </w:rPr>
         <w:t xml:space="preserve">Nobody comes in through the cellar</w:t>
       </w:r>
       <w:r>
@@ -4121,7 +4063,16 @@
           <w:sz w:val="19"/>
           <w:szCs w:val="19"/>
         </w:rPr>
-        <w:t xml:space="preserve">“The guard</w:t>
+        <w:t xml:space="preserve">“Convince him you are guests</w:t>
+      </w:r>
+      <w:r>
+        <w:rPr>
+          <w:rFonts w:ascii="Georgia" w:cs="Georgia" w:eastAsia="Georgia" w:hAnsi="Georgia"/>
+          <w:color w:val="7A5A1A"/>
+          <w:sz w:val="15"/>
+          <w:szCs w:val="15"/>
+        </w:rPr>
+        <w:t xml:space="preserve"> [Gäste]</w:t>
       </w:r>
       <w:r>
         <w:rPr>
@@ -4129,24 +4080,7 @@
           <w:sz w:val="19"/>
           <w:szCs w:val="19"/>
         </w:rPr>
-        <w:t xml:space="preserve"> is waiting. Convince him that you are guests</w:t>
-      </w:r>
-      <w:r>
-        <w:rPr>
-          <w:rFonts w:ascii="Georgia" w:cs="Georgia" w:eastAsia="Georgia" w:hAnsi="Georgia"/>
-          <w:color w:val="7A5A1A"/>
-          <w:sz w:val="15"/>
-          <w:szCs w:val="15"/>
-        </w:rPr>
-        <w:t xml:space="preserve"> [Gäste]</w:t>
-      </w:r>
-      <w:r>
-        <w:rPr>
-          <w:rFonts w:ascii="Georgia" w:cs="Georgia" w:eastAsia="Georgia" w:hAnsi="Georgia"/>
-          <w:sz w:val="19"/>
-          <w:szCs w:val="19"/>
-        </w:rPr>
-        <w:t xml:space="preserve"> — each of you one sentence. Calm, friendly, and give him a reason. No dice here. You talk.”</w:t>
+        <w:t xml:space="preserve"> — one calm sentence each, with a reason. No dice here. You talk.”</w:t>
       </w:r>
     </w:p>
     <w:p>
@@ -4948,7 +4882,7 @@
           <w:sz w:val="19"/>
           <w:szCs w:val="19"/>
         </w:rPr>
-        <w:t xml:space="preserve">“Say one whole sentence to the raven</w:t>
+        <w:t xml:space="preserve">“One whole sentence to the raven</w:t>
       </w:r>
       <w:r>
         <w:rPr>
@@ -4956,7 +4890,7 @@
           <w:sz w:val="19"/>
           <w:szCs w:val="19"/>
         </w:rPr>
-        <w:t xml:space="preserve">. Speak slowly and clearly — it repeats what it hears. If you mumble, you get nonsense back.”</w:t>
+        <w:t xml:space="preserve"> — slowly and clearly. If you mumble, you get nonsense back.”</w:t>
       </w:r>
     </w:p>
     <w:p>
@@ -5341,7 +5275,7 @@
           <w:sz w:val="19"/>
           <w:szCs w:val="19"/>
         </w:rPr>
-        <w:t xml:space="preserve">“Each of you: which door do you want — and why? One full sentence.”</w:t>
+        <w:t xml:space="preserve">“One full sentence each: which door — and why.”</w:t>
       </w:r>
     </w:p>
     <w:p>
@@ -5728,7 +5662,7 @@
           <w:sz w:val="19"/>
           <w:szCs w:val="19"/>
         </w:rPr>
-        <w:t xml:space="preserve">“Bellamy wants three true things about you. Take thirty seconds to think. Then one after the other.”</w:t>
+        <w:t xml:space="preserve">“Three true things about yourself. Thirty seconds to think — then one after the other.”</w:t>
       </w:r>
     </w:p>
     <w:p>
@@ -6483,7 +6417,7 @@
           <w:sz w:val="19"/>
           <w:szCs w:val="19"/>
         </w:rPr>
-        <w:t xml:space="preserve">“Tam has asked you a question. Give him a real answer — yes or no, and why. No dodging.”</w:t>
+        <w:t xml:space="preserve">“Give him a real answer — yes or no, and why. No dodging.”</w:t>
       </w:r>
     </w:p>
     <w:p>
@@ -6955,7 +6889,7 @@
           <w:sz w:val="19"/>
           <w:szCs w:val="19"/>
         </w:rPr>
-        <w:t xml:space="preserve">“Each of you: give Mirela one real reason why she should not do this. Then listen to what she says back.”</w:t>
+        <w:t xml:space="preserve">“One real reason each why she should not do this. Then listen to what she says back.”</w:t>
       </w:r>
     </w:p>
     <w:p>
@@ -7443,7 +7377,7 @@
           <w:sz w:val="19"/>
           <w:szCs w:val="19"/>
         </w:rPr>
-        <w:t xml:space="preserve">“Each of you says one full sentence: what should we do — and why? Mirela is listening.”</w:t>
+        <w:t xml:space="preserve">“One full sentence each: what should we do — and why? She is listening.”</w:t>
       </w:r>
     </w:p>
     <w:p>
@@ -8267,7 +8201,7 @@
           <w:sz w:val="19"/>
           <w:szCs w:val="19"/>
         </w:rPr>
-        <w:t xml:space="preserve">“Before every attack — and in the negotiation anyway — say one sentence to the Count. He always answers.”</w:t>
+        <w:t xml:space="preserve">“Before every attack, one sentence to the Count. He always answers.”</w:t>
       </w:r>
     </w:p>
     <w:p>
@@ -8623,52 +8557,6 @@
           <w:szCs w:val="18"/>
         </w:rPr>
         <w:t xml:space="preserve"> Trag den Schaden der Spieler rechts in seine Leiste ein. Für seinen Zug drückst du auf eine seiner Attacken — die Seite würfelt und du klickst an, wen es trifft.  Count Vaskir 55 HP</w:t>
-      </w:r>
-    </w:p>
-    <w:p>
-      <w:pPr>
-        <w:pBdr>
-          <w:left w:val="single" w:color="D9A441" w:sz="18" w:space="8"/>
-        </w:pBdr>
-        <w:shd w:fill="FFF6DD" w:color="auto" w:val="clear"/>
-        <w:spacing w:after="140"/>
-        <w:ind w:left="120"/>
-      </w:pPr>
-      <w:r>
-        <w:rPr>
-          <w:rFonts w:ascii="Georgia" w:cs="Georgia" w:eastAsia="Georgia" w:hAnsi="Georgia"/>
-          <w:b/>
-          <w:bCs/>
-          <w:color w:val="8A6A2C"/>
-          <w:sz w:val="16"/>
-          <w:szCs w:val="16"/>
-        </w:rPr>
-        <w:t xml:space="preserve">DM:  </w:t>
-      </w:r>
-      <w:r>
-        <w:rPr>
-          <w:rFonts w:ascii="Georgia" w:cs="Georgia" w:eastAsia="Georgia" w:hAnsi="Georgia"/>
-          <w:sz w:val="21"/>
-          <w:szCs w:val="21"/>
-        </w:rPr>
-        <w:t xml:space="preserve">Wenn es vorbei ist, sag: The sun is coming up over the pass</w:t>
-      </w:r>
-      <w:r>
-        <w:rPr>
-          <w:rFonts w:ascii="Georgia" w:cs="Georgia" w:eastAsia="Georgia" w:hAnsi="Georgia"/>
-          <w:color w:val="7A5A1A"/>
-          <w:sz w:val="17"/>
-          <w:szCs w:val="17"/>
-        </w:rPr>
-        <w:t xml:space="preserve"> [Pass (Bergübergang)]</w:t>
-      </w:r>
-      <w:r>
-        <w:rPr>
-          <w:rFonts w:ascii="Georgia" w:cs="Georgia" w:eastAsia="Georgia" w:hAnsi="Georgia"/>
-          <w:sz w:val="21"/>
-          <w:szCs w:val="21"/>
-        </w:rPr>
-        <w:t xml:space="preserve">. — Und dann trägst du unten ein, wie es ausging.</w:t>
       </w:r>
     </w:p>
     <w:p>
@@ -9533,7 +9421,7 @@
           <w:sz w:val="19"/>
           <w:szCs w:val="19"/>
         </w:rPr>
-        <w:t xml:space="preserve">“Three questions. Everybody answers, one after the other: What would you do differently? Was the village wrong? What do you tell Tobias?”</w:t>
+        <w:t xml:space="preserve">“Three questions, everybody answers: What would you do differently? Was the village wrong? What do you tell Tobias?”</w:t>
       </w:r>
     </w:p>
     <w:p>

</xml_diff>

<commit_message>
Anleitung: Englisch-Regel mit Drohung, Hintergrund zum deutschempfindlichen Grafen
Co-Authored-By: Claude Fable 5.1 <noreply@anthropic.com>
Claude-Session: https://claude.ai/code/session_01ADUPP2jvP6dgTYk1DsQkUN
</commit_message>
<xml_diff>
--- a/helferblatt/Nachtfels_Lesetext_DM.docx
+++ b/helferblatt/Nachtfels_Lesetext_DM.docx
@@ -215,7 +215,7 @@
           <w:sz w:val="21"/>
           <w:szCs w:val="21"/>
         </w:rPr>
-        <w:t xml:space="preserve">Eine Regel für heute: when your character speaks, speak English.</w:t>
+        <w:t xml:space="preserve">You always have to speak English. If you don’t — who knows what consequences it might have… (evil laugh)</w:t>
       </w:r>
     </w:p>
     <w:p>
@@ -233,7 +233,37 @@
           <w:sz w:val="21"/>
           <w:szCs w:val="21"/>
         </w:rPr>
-        <w:t xml:space="preserve">If you don’t know a word, ask me — in English. Nobody laughs.</w:t>
+        <w:t xml:space="preserve">If you don’t know a word, ask me. In English. Nobody laughs.</w:t>
+      </w:r>
+    </w:p>
+    <w:p>
+      <w:pPr>
+        <w:pBdr>
+          <w:left w:val="single" w:color="BFBFBF" w:sz="18" w:space="8"/>
+        </w:pBdr>
+        <w:shd w:fill="F2F2F2" w:color="auto" w:val="clear"/>
+        <w:spacing w:after="140"/>
+        <w:ind w:left="120"/>
+      </w:pPr>
+      <w:r>
+        <w:rPr>
+          <w:rFonts w:ascii="Georgia" w:cs="Georgia" w:eastAsia="Georgia" w:hAnsi="Georgia"/>
+          <w:b/>
+          <w:bCs/>
+          <w:color w:val="555555"/>
+          <w:sz w:val="16"/>
+          <w:szCs w:val="16"/>
+        </w:rPr>
+        <w:t xml:space="preserve">HINTERGRUND ZUR REGEL (NUR DM):  </w:t>
+      </w:r>
+      <w:r>
+        <w:rPr>
+          <w:rFonts w:ascii="Georgia" w:cs="Georgia" w:eastAsia="Georgia" w:hAnsi="Georgia"/>
+          <w:color w:val="333333"/>
+          <w:sz w:val="18"/>
+          <w:szCs w:val="18"/>
+        </w:rPr>
+        <w:t xml:space="preserve">Du kannst den Grafen deutschempfindlich machen: Er hört jeden ganzen deutschen Satz, der am Tisch fällt — für ihn ein Geräusch im Haus. Folge: Er schickt einen Diener los, der die Gruppe sucht. Lade dafür rechts einen Thrall in den Kampf, oder lass ihn nur an der Tür vorbeigehen und die Gefahr um 1 steigen. Hier darfst du improvisieren — die Drohung wirkt meist schon allein.</w:t>
       </w:r>
     </w:p>
     <w:p>

</xml_diff>

<commit_message>
DM: Aufgaben in der Stimme der Geschichte statt im Lehrerton
Co-Authored-By: Claude Fable 5.1 <noreply@anthropic.com>
Claude-Session: https://claude.ai/code/session_01ADUPP2jvP6dgTYk1DsQkUN
</commit_message>
<xml_diff>
--- a/helferblatt/Nachtfels_Lesetext_DM.docx
+++ b/helferblatt/Nachtfels_Lesetext_DM.docx
@@ -924,7 +924,7 @@
           <w:sz w:val="19"/>
           <w:szCs w:val="19"/>
         </w:rPr>
-        <w:t xml:space="preserve">“Answer him — each of you. At least two or three sentences.”</w:t>
+        <w:t xml:space="preserve">“Marek doesn’t move the horses. He’s waiting — for every one of you. And he’s heard plenty of one-word answers in his life. They don’t impress him.”</w:t>
       </w:r>
     </w:p>
     <w:p>
@@ -1906,7 +1906,7 @@
           <w:sz w:val="19"/>
           <w:szCs w:val="19"/>
         </w:rPr>
-        <w:t xml:space="preserve">“Each of you asks at least one question — and one follow-up question. Nobody in here tells you anything by themselves.”</w:t>
+        <w:t xml:space="preserve">“Nobody in here will tell you anything you don’t ask for. So ask — every one of you. And when the answer is short, ask again.”</w:t>
       </w:r>
     </w:p>
     <w:p>
@@ -2840,7 +2840,24 @@
           <w:sz w:val="19"/>
           <w:szCs w:val="19"/>
         </w:rPr>
-        <w:t xml:space="preserve">“One full sentence each: which way — and why. Then we vote.”</w:t>
+        <w:t xml:space="preserve">“The candles</w:t>
+      </w:r>
+      <w:r>
+        <w:rPr>
+          <w:rFonts w:ascii="Georgia" w:cs="Georgia" w:eastAsia="Georgia" w:hAnsi="Georgia"/>
+          <w:color w:val="7A5A1A"/>
+          <w:sz w:val="15"/>
+          <w:szCs w:val="15"/>
+        </w:rPr>
+        <w:t xml:space="preserve"> [Kerzen]</w:t>
+      </w:r>
+      <w:r>
+        <w:rPr>
+          <w:rFonts w:ascii="Georgia" w:cs="Georgia" w:eastAsia="Georgia" w:hAnsi="Georgia"/>
+          <w:sz w:val="19"/>
+          <w:szCs w:val="19"/>
+        </w:rPr>
+        <w:t xml:space="preserve"> are burning down. Everybody say it: which way, and why. Then you decide.”</w:t>
       </w:r>
     </w:p>
     <w:p>
@@ -3417,7 +3434,32 @@
           <w:sz w:val="19"/>
           <w:szCs w:val="19"/>
         </w:rPr>
-        <w:t xml:space="preserve">“Each of you rolls three times — press ‘Just roll a d20’. Under ten, your foot gets stuck and you lose one hit point. Talk to each other while you cross!”</w:t>
+        <w:t xml:space="preserve">“Three steps each through the black water</w:t>
+      </w:r>
+      <w:r>
+        <w:rPr>
+          <w:rFonts w:ascii="Georgia" w:cs="Georgia" w:eastAsia="Georgia" w:hAnsi="Georgia"/>
+          <w:sz w:val="19"/>
+          <w:szCs w:val="19"/>
+        </w:rPr>
+        <w:t xml:space="preserve"> — roll a d20 for every step. Under ten, the bog</w:t>
+      </w:r>
+      <w:r>
+        <w:rPr>
+          <w:rFonts w:ascii="Georgia" w:cs="Georgia" w:eastAsia="Georgia" w:hAnsi="Georgia"/>
+          <w:color w:val="7A5A1A"/>
+          <w:sz w:val="15"/>
+          <w:szCs w:val="15"/>
+        </w:rPr>
+        <w:t xml:space="preserve"> [Sumpf]</w:t>
+      </w:r>
+      <w:r>
+        <w:rPr>
+          <w:rFonts w:ascii="Georgia" w:cs="Georgia" w:eastAsia="Georgia" w:hAnsi="Georgia"/>
+          <w:sz w:val="19"/>
+          <w:szCs w:val="19"/>
+        </w:rPr>
+        <w:t xml:space="preserve"> has your boot: minus one hit point. And shout, or nobody will hear you sink.”</w:t>
       </w:r>
     </w:p>
     <w:p>
@@ -3466,15 +3508,6 @@
           <w:szCs w:val="22"/>
         </w:rPr>
         <w:t xml:space="preserve">On the far side of the bog</w:t>
-      </w:r>
-      <w:r>
-        <w:rPr>
-          <w:rFonts w:ascii="Georgia" w:cs="Georgia" w:eastAsia="Georgia" w:hAnsi="Georgia"/>
-          <w:color w:val="7A5A1A"/>
-          <w:sz w:val="18"/>
-          <w:szCs w:val="18"/>
-        </w:rPr>
-        <w:t xml:space="preserve"> [Sumpf]</w:t>
       </w:r>
       <w:r>
         <w:rPr>
@@ -4093,7 +4126,7 @@
           <w:sz w:val="19"/>
           <w:szCs w:val="19"/>
         </w:rPr>
-        <w:t xml:space="preserve">“Convince him you are guests</w:t>
+        <w:t xml:space="preserve">“He wants an answer, and he wants it now. Guests</w:t>
       </w:r>
       <w:r>
         <w:rPr>
@@ -4110,7 +4143,7 @@
           <w:sz w:val="19"/>
           <w:szCs w:val="19"/>
         </w:rPr>
-        <w:t xml:space="preserve"> — one calm sentence each, with a reason. No dice here. You talk.”</w:t>
+        <w:t xml:space="preserve"> — say it like you mean it, one sentence each, and give him a reason. No weapons, no dice. Just talk.”</w:t>
       </w:r>
     </w:p>
     <w:p>
@@ -4912,15 +4945,7 @@
           <w:sz w:val="19"/>
           <w:szCs w:val="19"/>
         </w:rPr>
-        <w:t xml:space="preserve">“One whole sentence to the raven</w:t>
-      </w:r>
-      <w:r>
-        <w:rPr>
-          <w:rFonts w:ascii="Georgia" w:cs="Georgia" w:eastAsia="Georgia" w:hAnsi="Georgia"/>
-          <w:sz w:val="19"/>
-          <w:szCs w:val="19"/>
-        </w:rPr>
-        <w:t xml:space="preserve"> — slowly and clearly. If you mumble, you get nonsense back.”</w:t>
+        <w:t xml:space="preserve">“It’s listening. Say something — one whole sentence, slow and clear. Mumble, and it will mumble back.”</w:t>
       </w:r>
     </w:p>
     <w:p>
@@ -5305,7 +5330,7 @@
           <w:sz w:val="19"/>
           <w:szCs w:val="19"/>
         </w:rPr>
-        <w:t xml:space="preserve">“One full sentence each: which door — and why.”</w:t>
+        <w:t xml:space="preserve">“One hour before this house wakes up. Everybody: which door, and why.”</w:t>
       </w:r>
     </w:p>
     <w:p>
@@ -5692,7 +5717,7 @@
           <w:sz w:val="19"/>
           <w:szCs w:val="19"/>
         </w:rPr>
-        <w:t xml:space="preserve">“Three true things about yourself. Thirty seconds to think — then one after the other.”</w:t>
+        <w:t xml:space="preserve">“Three true things about yourself. He can wait — he’s been waiting since 1912. Take thirty seconds, then talk.”</w:t>
       </w:r>
     </w:p>
     <w:p>
@@ -6447,7 +6472,7 @@
           <w:sz w:val="19"/>
           <w:szCs w:val="19"/>
         </w:rPr>
-        <w:t xml:space="preserve">“Give him a real answer — yes or no, and why. No dodging.”</w:t>
+        <w:t xml:space="preserve">“He asked you a question. He’s fourteen, and he’ll know if you lie. Yes or no — and why.”</w:t>
       </w:r>
     </w:p>
     <w:p>
@@ -6919,7 +6944,7 @@
           <w:sz w:val="19"/>
           <w:szCs w:val="19"/>
         </w:rPr>
-        <w:t xml:space="preserve">“One real reason each why she should not do this. Then listen to what she says back.”</w:t>
+        <w:t xml:space="preserve">“She’s not going anywhere until you give her a reason. One real reason each. Then listen to what she says back.”</w:t>
       </w:r>
     </w:p>
     <w:p>
@@ -7407,7 +7432,15 @@
           <w:sz w:val="19"/>
           <w:szCs w:val="19"/>
         </w:rPr>
-        <w:t xml:space="preserve">“One full sentence each: what should we do — and why? She is listening.”</w:t>
+        <w:t xml:space="preserve">“One hour until sunrise</w:t>
+      </w:r>
+      <w:r>
+        <w:rPr>
+          <w:rFonts w:ascii="Georgia" w:cs="Georgia" w:eastAsia="Georgia" w:hAnsi="Georgia"/>
+          <w:sz w:val="19"/>
+          <w:szCs w:val="19"/>
+        </w:rPr>
+        <w:t xml:space="preserve">. Everybody: what do we do, and why. She’s listening.”</w:t>
       </w:r>
     </w:p>
     <w:p>
@@ -8231,7 +8264,7 @@
           <w:sz w:val="19"/>
           <w:szCs w:val="19"/>
         </w:rPr>
-        <w:t xml:space="preserve">“Before every attack, one sentence to the Count. He always answers.”</w:t>
+        <w:t xml:space="preserve">“He hears everything you say — so say something. Before every attack, one sentence to him. He always answers.”</w:t>
       </w:r>
     </w:p>
     <w:p>
@@ -9451,7 +9484,7 @@
           <w:sz w:val="19"/>
           <w:szCs w:val="19"/>
         </w:rPr>
-        <w:t xml:space="preserve">“Three questions, everybody answers: What would you do differently? Was the village wrong? What do you tell Tobias?”</w:t>
+        <w:t xml:space="preserve">“It’s morning. Three questions before you go: What would you do differently? Was the village wrong? What do you tell Tobias?”</w:t>
       </w:r>
     </w:p>
     <w:p>

</xml_diff>

<commit_message>
DM: Fragen an die Spieler stehen im grünen Kasten, nicht in der Erzählung
Co-Authored-By: Claude Fable 5.1 <noreply@anthropic.com>
Claude-Session: https://claude.ai/code/session_01ADUPP2jvP6dgTYk1DsQkUN
</commit_message>
<xml_diff>
--- a/helferblatt/Nachtfels_Lesetext_DM.docx
+++ b/helferblatt/Nachtfels_Lesetext_DM.docx
@@ -1854,35 +1854,6 @@
     <w:p>
       <w:pPr>
         <w:pBdr>
-          <w:left w:val="single" w:color="D9A441" w:sz="18" w:space="8"/>
-        </w:pBdr>
-        <w:shd w:fill="FFF6DD" w:color="auto" w:val="clear"/>
-        <w:spacing w:after="140"/>
-        <w:ind w:left="120"/>
-      </w:pPr>
-      <w:r>
-        <w:rPr>
-          <w:rFonts w:ascii="Georgia" w:cs="Georgia" w:eastAsia="Georgia" w:hAnsi="Georgia"/>
-          <w:b/>
-          <w:bCs/>
-          <w:color w:val="8A6A2C"/>
-          <w:sz w:val="16"/>
-          <w:szCs w:val="16"/>
-        </w:rPr>
-        <w:t xml:space="preserve">DM:  </w:t>
-      </w:r>
-      <w:r>
-        <w:rPr>
-          <w:rFonts w:ascii="Georgia" w:cs="Georgia" w:eastAsia="Georgia" w:hAnsi="Georgia"/>
-          <w:sz w:val="21"/>
-          <w:szCs w:val="21"/>
-        </w:rPr>
-        <w:t xml:space="preserve">Who do you want to talk to?</w:t>
-      </w:r>
-    </w:p>
-    <w:p>
-      <w:pPr>
-        <w:pBdr>
           <w:left w:val="single" w:color="74B094" w:sz="18" w:space="8"/>
         </w:pBdr>
         <w:shd w:fill="EAF4EC" w:color="auto" w:val="clear"/>
@@ -1906,7 +1877,7 @@
           <w:sz w:val="19"/>
           <w:szCs w:val="19"/>
         </w:rPr>
-        <w:t xml:space="preserve">“Nobody in here will tell you anything you don’t ask for. So ask — every one of you. And when the answer is short, ask again.”</w:t>
+        <w:t xml:space="preserve">“Who do you want to talk to? Nobody in here will tell you anything you don’t ask for. So ask — every one of you. And when the answer is short, ask again.”</w:t>
       </w:r>
     </w:p>
     <w:p>
@@ -2784,7 +2755,7 @@
           <w:left w:val="single" w:color="D9A441" w:sz="18" w:space="8"/>
         </w:pBdr>
         <w:shd w:fill="FFF6DD" w:color="auto" w:val="clear"/>
-        <w:spacing w:after="40"/>
+        <w:spacing w:after="140"/>
         <w:ind w:left="120"/>
       </w:pPr>
       <w:r>
@@ -2794,24 +2765,6 @@
           <w:szCs w:val="21"/>
         </w:rPr>
         <w:t xml:space="preserve">Three: the coach. Every night at midnight a coach takes food up to the castle. You could be on it.</w:t>
-      </w:r>
-    </w:p>
-    <w:p>
-      <w:pPr>
-        <w:pBdr>
-          <w:left w:val="single" w:color="D9A441" w:sz="18" w:space="8"/>
-        </w:pBdr>
-        <w:shd w:fill="FFF6DD" w:color="auto" w:val="clear"/>
-        <w:spacing w:after="140"/>
-        <w:ind w:left="120"/>
-      </w:pPr>
-      <w:r>
-        <w:rPr>
-          <w:rFonts w:ascii="Georgia" w:cs="Georgia" w:eastAsia="Georgia" w:hAnsi="Georgia"/>
-          <w:sz w:val="21"/>
-          <w:szCs w:val="21"/>
-        </w:rPr>
-        <w:t xml:space="preserve">What are you going to do?</w:t>
       </w:r>
     </w:p>
     <w:p>
@@ -2840,7 +2793,7 @@
           <w:sz w:val="19"/>
           <w:szCs w:val="19"/>
         </w:rPr>
-        <w:t xml:space="preserve">“The candles</w:t>
+        <w:t xml:space="preserve">“What are you going to do? The candles</w:t>
       </w:r>
       <w:r>
         <w:rPr>
@@ -5229,7 +5182,7 @@
           <w:left w:val="single" w:color="D9A441" w:sz="18" w:space="8"/>
         </w:pBdr>
         <w:shd w:fill="FFF6DD" w:color="auto" w:val="clear"/>
-        <w:spacing w:after="40"/>
+        <w:spacing w:after="140"/>
         <w:ind w:left="120"/>
       </w:pPr>
       <w:r>
@@ -5283,25 +5236,7 @@
           <w:sz w:val="21"/>
           <w:szCs w:val="21"/>
         </w:rPr>
-        <w:t xml:space="preserve">, where somebody is cooking.</w:t>
-      </w:r>
-    </w:p>
-    <w:p>
-      <w:pPr>
-        <w:pBdr>
-          <w:left w:val="single" w:color="D9A441" w:sz="18" w:space="8"/>
-        </w:pBdr>
-        <w:shd w:fill="FFF6DD" w:color="auto" w:val="clear"/>
-        <w:spacing w:after="140"/>
-        <w:ind w:left="120"/>
-      </w:pPr>
-      <w:r>
-        <w:rPr>
-          <w:rFonts w:ascii="Georgia" w:cs="Georgia" w:eastAsia="Georgia" w:hAnsi="Georgia"/>
-          <w:sz w:val="21"/>
-          <w:szCs w:val="21"/>
-        </w:rPr>
-        <w:t xml:space="preserve">You have time for one of them. Which one?</w:t>
+        <w:t xml:space="preserve">, where somebody is cooking. You have time for one of them.</w:t>
       </w:r>
     </w:p>
     <w:p>
@@ -5330,7 +5265,7 @@
           <w:sz w:val="19"/>
           <w:szCs w:val="19"/>
         </w:rPr>
-        <w:t xml:space="preserve">“One hour before this house wakes up. Everybody: which door, and why.”</w:t>
+        <w:t xml:space="preserve">“Which one? One hour before this house wakes up. Everybody: which door, and why.”</w:t>
       </w:r>
     </w:p>
     <w:p>
@@ -7359,7 +7294,7 @@
           <w:left w:val="single" w:color="D9A441" w:sz="18" w:space="8"/>
         </w:pBdr>
         <w:shd w:fill="FFF6DD" w:color="auto" w:val="clear"/>
-        <w:spacing w:after="40"/>
+        <w:spacing w:after="140"/>
         <w:ind w:left="120"/>
       </w:pPr>
       <w:r>
@@ -7386,24 +7321,6 @@
           <w:szCs w:val="21"/>
         </w:rPr>
         <w:t xml:space="preserve">.</w:t>
-      </w:r>
-    </w:p>
-    <w:p>
-      <w:pPr>
-        <w:pBdr>
-          <w:left w:val="single" w:color="D9A441" w:sz="18" w:space="8"/>
-        </w:pBdr>
-        <w:shd w:fill="FFF6DD" w:color="auto" w:val="clear"/>
-        <w:spacing w:after="140"/>
-        <w:ind w:left="120"/>
-      </w:pPr>
-      <w:r>
-        <w:rPr>
-          <w:rFonts w:ascii="Georgia" w:cs="Georgia" w:eastAsia="Georgia" w:hAnsi="Georgia"/>
-          <w:sz w:val="21"/>
-          <w:szCs w:val="21"/>
-        </w:rPr>
-        <w:t xml:space="preserve">What are you going to do?</w:t>
       </w:r>
     </w:p>
     <w:p>
@@ -7432,15 +7349,7 @@
           <w:sz w:val="19"/>
           <w:szCs w:val="19"/>
         </w:rPr>
-        <w:t xml:space="preserve">“One hour until sunrise</w:t>
-      </w:r>
-      <w:r>
-        <w:rPr>
-          <w:rFonts w:ascii="Georgia" w:cs="Georgia" w:eastAsia="Georgia" w:hAnsi="Georgia"/>
-          <w:sz w:val="19"/>
-          <w:szCs w:val="19"/>
-        </w:rPr>
-        <w:t xml:space="preserve">. Everybody: what do we do, and why. She’s listening.”</w:t>
+        <w:t xml:space="preserve">“What are you going to do? Everybody: one sentence, and why. She’s listening.”</w:t>
       </w:r>
     </w:p>
     <w:p>

</xml_diff>

<commit_message>
Wirtshaus: Antwortmöglichkeiten stehen bei den Personen, je Frage abhakbar
Co-Authored-By: Claude Fable 5.1 <noreply@anthropic.com>
Claude-Session: https://claude.ai/code/session_01ADUPP2jvP6dgTYk1DsQkUN
</commit_message>
<xml_diff>
--- a/helferblatt/Nachtfels_Lesetext_DM.docx
+++ b/helferblatt/Nachtfels_Lesetext_DM.docx
@@ -1602,7 +1602,7 @@
           <w:sz w:val="18"/>
           <w:szCs w:val="18"/>
         </w:rPr>
-        <w:t xml:space="preserve">Im Wirtshaus sitzen elf Menschen. Drei sind ansprechbar: Greta (Wirtin, drei Finger), Old Pieter (Totengräber, betrunken) und Tobias (Junge an der Tür). Die anderen acht antworten nicht — spricht jemand sie an: „They look into their drinks and say nothing.“ Wichtig: Der Name Anneke muss fallen; notfalls ruft Pieter ihn von selbst. Am Ende der Szene liegt die Karte mit den drei Wegen auf dem Tisch.</w:t>
+        <w:t xml:space="preserve">Im Wirtshaus sitzen elf Menschen. Drei sind ansprechbar: Greta (Wirtin, drei Finger), Old Pieter (Totengräber, betrunken) und Tobias (Junge an der Tür). Die anderen acht antworten nicht — spricht jemand sie an: „They look into their drinks and say nothing.“ Jeder Satz der drei ist nur einmal zu haben (abhaken); wer alle drei verbraucht hat, schweigt und beachtet die Gruppe nicht mehr. Wichtig: Der Name Anneke muss fallen; notfalls ruft Pieter ihn von selbst. Am Ende der Szene liegt die Karte mit den drei Wegen auf dem Tisch.</w:t>
       </w:r>
     </w:p>
     <w:p>
@@ -1896,7 +1896,7 @@
           <w:sz w:val="17"/>
           <w:szCs w:val="17"/>
         </w:rPr>
-        <w:t xml:space="preserve">Antwortmöglichkeiten unten abhaken, sobald eine Frage gestellt ist — jede nur einmal, egal von wem.  →  Helfer-Blatt · Teil 2</w:t>
+        <w:t xml:space="preserve">Antwortmöglichkeiten stehen bei den drei Personen oben: abhaken, sobald eine Frage gestellt ist — jede nur einmal, egal von wem.  →  Helfer-Blatt · Teil 2</w:t>
       </w:r>
     </w:p>
     <w:p>
@@ -1961,12 +1961,152 @@
       <w:r>
         <w:rPr>
           <w:rFonts w:ascii="Georgia" w:cs="Georgia" w:eastAsia="Georgia" w:hAnsi="Georgia"/>
+          <w:b/>
+          <w:bCs/>
+          <w:color w:val="333333"/>
+          <w:sz w:val="18"/>
+          <w:szCs w:val="18"/>
+        </w:rPr>
+        <w:t xml:space="preserve">What happened to Mirela?  </w:t>
+      </w:r>
+      <w:r>
+        <w:rPr>
+          <w:rFonts w:ascii="Georgia" w:cs="Georgia" w:eastAsia="Georgia" w:hAnsi="Georgia"/>
           <w:i/>
           <w:iCs/>
-          <w:sz w:val="18"/>
-          <w:szCs w:val="18"/>
-        </w:rPr>
-        <w:t xml:space="preserve">„Mirela is gone. That is all there is.“  ·  „We don’t go up there. That is the arrangement.“  ·  „You want to help? Go home. That would help.“</w:t>
+          <w:color w:val="333333"/>
+          <w:sz w:val="18"/>
+          <w:szCs w:val="18"/>
+        </w:rPr>
+        <w:t xml:space="preserve">„She is gone. Three nights ago. That is all there is.“ — mehr nicht.</w:t>
+      </w:r>
+    </w:p>
+    <w:p>
+      <w:pPr>
+        <w:pBdr>
+          <w:left w:val="single" w:color="BFBFBF" w:sz="18" w:space="8"/>
+        </w:pBdr>
+        <w:shd w:fill="F2F2F2" w:color="auto" w:val="clear"/>
+        <w:spacing w:after="40"/>
+        <w:ind w:left="120"/>
+      </w:pPr>
+      <w:r>
+        <w:rPr>
+          <w:rFonts w:ascii="Georgia" w:cs="Georgia" w:eastAsia="Georgia" w:hAnsi="Georgia"/>
+          <w:b/>
+          <w:bCs/>
+          <w:color w:val="333333"/>
+          <w:sz w:val="18"/>
+          <w:szCs w:val="18"/>
+        </w:rPr>
+        <w:t xml:space="preserve">Why is nobody looking for her?  </w:t>
+      </w:r>
+      <w:r>
+        <w:rPr>
+          <w:rFonts w:ascii="Georgia" w:cs="Georgia" w:eastAsia="Georgia" w:hAnsi="Georgia"/>
+          <w:i/>
+          <w:iCs/>
+          <w:color w:val="333333"/>
+          <w:sz w:val="18"/>
+          <w:szCs w:val="18"/>
+        </w:rPr>
+        <w:t xml:space="preserve">„Because we know exactly where she is.“ Der Satz, der sie stutzig machen soll.</w:t>
+      </w:r>
+    </w:p>
+    <w:p>
+      <w:pPr>
+        <w:pBdr>
+          <w:left w:val="single" w:color="BFBFBF" w:sz="18" w:space="8"/>
+        </w:pBdr>
+        <w:shd w:fill="F2F2F2" w:color="auto" w:val="clear"/>
+        <w:spacing w:after="40"/>
+        <w:ind w:left="120"/>
+      </w:pPr>
+      <w:r>
+        <w:rPr>
+          <w:rFonts w:ascii="Georgia" w:cs="Georgia" w:eastAsia="Georgia" w:hAnsi="Georgia"/>
+          <w:b/>
+          <w:bCs/>
+          <w:color w:val="333333"/>
+          <w:sz w:val="18"/>
+          <w:szCs w:val="18"/>
+        </w:rPr>
+        <w:t xml:space="preserve">Who wrote the names on the board?  </w:t>
+      </w:r>
+      <w:r>
+        <w:rPr>
+          <w:rFonts w:ascii="Georgia" w:cs="Georgia" w:eastAsia="Georgia" w:hAnsi="Georgia"/>
+          <w:i/>
+          <w:iCs/>
+          <w:color w:val="333333"/>
+          <w:sz w:val="18"/>
+          <w:szCs w:val="18"/>
+        </w:rPr>
+        <w:t xml:space="preserve">„I did. Both times.“ Die Namen stehen in Abständen von zwanzig Jahren. Der davor: ANNEKE KOLL.</w:t>
+      </w:r>
+    </w:p>
+    <w:p>
+      <w:pPr>
+        <w:pBdr>
+          <w:left w:val="single" w:color="BFBFBF" w:sz="18" w:space="8"/>
+        </w:pBdr>
+        <w:shd w:fill="F2F2F2" w:color="auto" w:val="clear"/>
+        <w:spacing w:after="40"/>
+        <w:ind w:left="120"/>
+      </w:pPr>
+      <w:r>
+        <w:rPr>
+          <w:rFonts w:ascii="Georgia" w:cs="Georgia" w:eastAsia="Georgia" w:hAnsi="Georgia"/>
+          <w:b/>
+          <w:bCs/>
+          <w:color w:val="333333"/>
+          <w:sz w:val="18"/>
+          <w:szCs w:val="18"/>
+        </w:rPr>
+        <w:t xml:space="preserve">Will you help us? / Will you come with us?  </w:t>
+      </w:r>
+      <w:r>
+        <w:rPr>
+          <w:rFonts w:ascii="Georgia" w:cs="Georgia" w:eastAsia="Georgia" w:hAnsi="Georgia"/>
+          <w:i/>
+          <w:iCs/>
+          <w:color w:val="333333"/>
+          <w:sz w:val="18"/>
+          <w:szCs w:val="18"/>
+        </w:rPr>
+        <w:t xml:space="preserve">„You want to help? Go home. That would help. We don’t go up there — that is the arrangement.“</w:t>
+      </w:r>
+    </w:p>
+    <w:p>
+      <w:pPr>
+        <w:pBdr>
+          <w:left w:val="single" w:color="BFBFBF" w:sz="18" w:space="8"/>
+        </w:pBdr>
+        <w:shd w:fill="F2F2F2" w:color="auto" w:val="clear"/>
+        <w:spacing w:after="40"/>
+        <w:ind w:left="120"/>
+      </w:pPr>
+      <w:r>
+        <w:rPr>
+          <w:rFonts w:ascii="Georgia" w:cs="Georgia" w:eastAsia="Georgia" w:hAnsi="Georgia"/>
+          <w:b/>
+          <w:bCs/>
+          <w:color w:val="333333"/>
+          <w:sz w:val="18"/>
+          <w:szCs w:val="18"/>
+        </w:rPr>
+        <w:t xml:space="preserve">How do we get up to the castle?  </w:t>
+      </w:r>
+      <w:r>
+        <w:rPr>
+          <w:rFonts w:ascii="Georgia" w:cs="Georgia" w:eastAsia="Georgia" w:hAnsi="Georgia"/>
+          <w:i/>
+          <w:iCs/>
+          <w:color w:val="333333"/>
+          <w:sz w:val="18"/>
+          <w:szCs w:val="18"/>
+        </w:rPr>
+        <w:t xml:space="preserve">Sie holt eine alte Karte unter der Theke hervor. → Karte, vorletzter Block.</w:t>
       </w:r>
     </w:p>
     <w:p>
@@ -2029,12 +2169,88 @@
       <w:r>
         <w:rPr>
           <w:rFonts w:ascii="Georgia" w:cs="Georgia" w:eastAsia="Georgia" w:hAnsi="Georgia"/>
+          <w:b/>
+          <w:bCs/>
+          <w:color w:val="333333"/>
+          <w:sz w:val="18"/>
+          <w:szCs w:val="18"/>
+        </w:rPr>
+        <w:t xml:space="preserve">What happened twenty years ago?  </w:t>
+      </w:r>
+      <w:r>
+        <w:rPr>
+          <w:rFonts w:ascii="Georgia" w:cs="Georgia" w:eastAsia="Georgia" w:hAnsi="Georgia"/>
           <w:i/>
           <w:iCs/>
-          <w:sz w:val="18"/>
-          <w:szCs w:val="18"/>
-        </w:rPr>
-        <w:t xml:space="preserve">„Twenty years! Ask her what happened twenty years ago!“  ·  „Ask her about Anneke! Go on — ask her about Anneke!“  ·  „I dug no grave for that girl. Because there was nothing to bury.“</w:t>
+          <w:color w:val="333333"/>
+          <w:sz w:val="18"/>
+          <w:szCs w:val="18"/>
+        </w:rPr>
+        <w:t xml:space="preserve">Er lacht: „Twenty years! Ask her about Anneke! Go on — ask her about Anneke!“ → Knopf unten.</w:t>
+      </w:r>
+    </w:p>
+    <w:p>
+      <w:pPr>
+        <w:pBdr>
+          <w:left w:val="single" w:color="BFBFBF" w:sz="18" w:space="8"/>
+        </w:pBdr>
+        <w:shd w:fill="F2F2F2" w:color="auto" w:val="clear"/>
+        <w:spacing w:after="40"/>
+        <w:ind w:left="120"/>
+      </w:pPr>
+      <w:r>
+        <w:rPr>
+          <w:rFonts w:ascii="Georgia" w:cs="Georgia" w:eastAsia="Georgia" w:hAnsi="Georgia"/>
+          <w:b/>
+          <w:bCs/>
+          <w:color w:val="333333"/>
+          <w:sz w:val="18"/>
+          <w:szCs w:val="18"/>
+        </w:rPr>
+        <w:t xml:space="preserve">Who is Anneke?  </w:t>
+      </w:r>
+      <w:r>
+        <w:rPr>
+          <w:rFonts w:ascii="Georgia" w:cs="Georgia" w:eastAsia="Georgia" w:hAnsi="Georgia"/>
+          <w:i/>
+          <w:iCs/>
+          <w:color w:val="333333"/>
+          <w:sz w:val="18"/>
+          <w:szCs w:val="18"/>
+        </w:rPr>
+        <w:t xml:space="preserve">„I dug no grave for that girl. Because there was nothing to bury.“ Mehr sagt er nicht — er sieht zu Greta hinüber.</w:t>
+      </w:r>
+    </w:p>
+    <w:p>
+      <w:pPr>
+        <w:pBdr>
+          <w:left w:val="single" w:color="BFBFBF" w:sz="18" w:space="8"/>
+        </w:pBdr>
+        <w:shd w:fill="F2F2F2" w:color="auto" w:val="clear"/>
+        <w:spacing w:after="40"/>
+        <w:ind w:left="120"/>
+      </w:pPr>
+      <w:r>
+        <w:rPr>
+          <w:rFonts w:ascii="Georgia" w:cs="Georgia" w:eastAsia="Georgia" w:hAnsi="Georgia"/>
+          <w:b/>
+          <w:bCs/>
+          <w:color w:val="333333"/>
+          <w:sz w:val="18"/>
+          <w:szCs w:val="18"/>
+        </w:rPr>
+        <w:t xml:space="preserve">Have you seen it? Is it a vampire?  </w:t>
+      </w:r>
+      <w:r>
+        <w:rPr>
+          <w:rFonts w:ascii="Georgia" w:cs="Georgia" w:eastAsia="Georgia" w:hAnsi="Georgia"/>
+          <w:i/>
+          <w:iCs/>
+          <w:color w:val="333333"/>
+          <w:sz w:val="18"/>
+          <w:szCs w:val="18"/>
+        </w:rPr>
+        <w:t xml:space="preserve">„We don’t use that word in here,“ sagt Greta von der Theke. Pieter: „SHE used it!“ — und lacht.</w:t>
       </w:r>
     </w:p>
     <w:p>
@@ -2097,12 +2313,88 @@
       <w:r>
         <w:rPr>
           <w:rFonts w:ascii="Georgia" w:cs="Georgia" w:eastAsia="Georgia" w:hAnsi="Georgia"/>
+          <w:b/>
+          <w:bCs/>
+          <w:color w:val="333333"/>
+          <w:sz w:val="18"/>
+          <w:szCs w:val="18"/>
+        </w:rPr>
+        <w:t xml:space="preserve">Was she taken? / Did she go by herself?  </w:t>
+      </w:r>
+      <w:r>
+        <w:rPr>
+          <w:rFonts w:ascii="Georgia" w:cs="Georgia" w:eastAsia="Georgia" w:hAnsi="Georgia"/>
           <w:i/>
           <w:iCs/>
-          <w:sz w:val="18"/>
-          <w:szCs w:val="18"/>
-        </w:rPr>
-        <w:t xml:space="preserve">„She wasn’t taken. She packed a bag.“  ·  „She said it was her turn. She said it like it was a shopping list.“  ·  „She said: tell them it’s for Lene. Lene is my sister. She’s nine.“</w:t>
+          <w:color w:val="333333"/>
+          <w:sz w:val="18"/>
+          <w:szCs w:val="18"/>
+        </w:rPr>
+        <w:t xml:space="preserve">„She wasn’t taken. She packed a bag. She said it was her turn — like it was a shopping list.“</w:t>
+      </w:r>
+    </w:p>
+    <w:p>
+      <w:pPr>
+        <w:pBdr>
+          <w:left w:val="single" w:color="BFBFBF" w:sz="18" w:space="8"/>
+        </w:pBdr>
+        <w:shd w:fill="F2F2F2" w:color="auto" w:val="clear"/>
+        <w:spacing w:after="40"/>
+        <w:ind w:left="120"/>
+      </w:pPr>
+      <w:r>
+        <w:rPr>
+          <w:rFonts w:ascii="Georgia" w:cs="Georgia" w:eastAsia="Georgia" w:hAnsi="Georgia"/>
+          <w:b/>
+          <w:bCs/>
+          <w:color w:val="333333"/>
+          <w:sz w:val="18"/>
+          <w:szCs w:val="18"/>
+        </w:rPr>
+        <w:t xml:space="preserve">Why would she do that?  </w:t>
+      </w:r>
+      <w:r>
+        <w:rPr>
+          <w:rFonts w:ascii="Georgia" w:cs="Georgia" w:eastAsia="Georgia" w:hAnsi="Georgia"/>
+          <w:i/>
+          <w:iCs/>
+          <w:color w:val="333333"/>
+          <w:sz w:val="18"/>
+          <w:szCs w:val="18"/>
+        </w:rPr>
+        <w:t xml:space="preserve">„She said: tell them it’s for Lene. Lene is my sister. She’s nine.“</w:t>
+      </w:r>
+    </w:p>
+    <w:p>
+      <w:pPr>
+        <w:pBdr>
+          <w:left w:val="single" w:color="BFBFBF" w:sz="18" w:space="8"/>
+        </w:pBdr>
+        <w:shd w:fill="F2F2F2" w:color="auto" w:val="clear"/>
+        <w:spacing w:after="40"/>
+        <w:ind w:left="120"/>
+      </w:pPr>
+      <w:r>
+        <w:rPr>
+          <w:rFonts w:ascii="Georgia" w:cs="Georgia" w:eastAsia="Georgia" w:hAnsi="Georgia"/>
+          <w:b/>
+          <w:bCs/>
+          <w:color w:val="333333"/>
+          <w:sz w:val="18"/>
+          <w:szCs w:val="18"/>
+        </w:rPr>
+        <w:t xml:space="preserve">Can you come with us?  </w:t>
+      </w:r>
+      <w:r>
+        <w:rPr>
+          <w:rFonts w:ascii="Georgia" w:cs="Georgia" w:eastAsia="Georgia" w:hAnsi="Georgia"/>
+          <w:i/>
+          <w:iCs/>
+          <w:color w:val="333333"/>
+          <w:sz w:val="18"/>
+          <w:szCs w:val="18"/>
+        </w:rPr>
+        <w:t xml:space="preserve">„Yes! … Please?“ Er darf nicht mit — lass ihn fragen, und lass die Gruppe Nein sagen. Er bleibt im Dorf und wartet.</w:t>
       </w:r>
     </w:p>
     <w:p>
@@ -2140,252 +2432,7 @@
           <w:sz w:val="17"/>
           <w:szCs w:val="17"/>
         </w:rPr>
-        <w:t xml:space="preserve">Tobias ist Mirelas Lehrling. Er will mit ins Schloss. Er darf nicht mit — aber lass ihn fragen. Er bleibt im Dorf und wartet.</w:t>
-      </w:r>
-    </w:p>
-    <w:p>
-      <w:pPr>
-        <w:pBdr>
-          <w:left w:val="single" w:color="BFBFBF" w:sz="18" w:space="8"/>
-        </w:pBdr>
-        <w:shd w:fill="F2F2F2" w:color="auto" w:val="clear"/>
-        <w:spacing w:after="40"/>
-        <w:ind w:left="120"/>
-      </w:pPr>
-      <w:r>
-        <w:rPr>
-          <w:rFonts w:ascii="Georgia" w:cs="Georgia" w:eastAsia="Georgia" w:hAnsi="Georgia"/>
-          <w:b/>
-          <w:bCs/>
-          <w:color w:val="555555"/>
-          <w:sz w:val="16"/>
-          <w:szCs w:val="16"/>
-        </w:rPr>
-        <w:t xml:space="preserve">ANTWORTMÖGLICHKEITEN (NUR DM)  </w:t>
-      </w:r>
-    </w:p>
-    <w:p>
-      <w:pPr>
-        <w:pBdr>
-          <w:left w:val="single" w:color="BFBFBF" w:sz="18" w:space="8"/>
-        </w:pBdr>
-        <w:shd w:fill="F2F2F2" w:color="auto" w:val="clear"/>
-        <w:spacing w:after="40"/>
-        <w:ind w:left="120"/>
-      </w:pPr>
-      <w:r>
-        <w:rPr>
-          <w:rFonts w:ascii="Georgia" w:cs="Georgia" w:eastAsia="Georgia" w:hAnsi="Georgia"/>
-          <w:b/>
-          <w:bCs/>
-          <w:color w:val="333333"/>
-          <w:sz w:val="18"/>
-          <w:szCs w:val="18"/>
-        </w:rPr>
-        <w:t xml:space="preserve">What happened to Mirela?  </w:t>
-      </w:r>
-      <w:r>
-        <w:rPr>
-          <w:rFonts w:ascii="Georgia" w:cs="Georgia" w:eastAsia="Georgia" w:hAnsi="Georgia"/>
-          <w:i/>
-          <w:iCs/>
-          <w:color w:val="333333"/>
-          <w:sz w:val="18"/>
-          <w:szCs w:val="18"/>
-        </w:rPr>
-        <w:t xml:space="preserve">Greta: „She is gone. Three nights ago.“ — mehr nicht.</w:t>
-      </w:r>
-    </w:p>
-    <w:p>
-      <w:pPr>
-        <w:pBdr>
-          <w:left w:val="single" w:color="BFBFBF" w:sz="18" w:space="8"/>
-        </w:pBdr>
-        <w:shd w:fill="F2F2F2" w:color="auto" w:val="clear"/>
-        <w:spacing w:after="40"/>
-        <w:ind w:left="120"/>
-      </w:pPr>
-      <w:r>
-        <w:rPr>
-          <w:rFonts w:ascii="Georgia" w:cs="Georgia" w:eastAsia="Georgia" w:hAnsi="Georgia"/>
-          <w:b/>
-          <w:bCs/>
-          <w:color w:val="333333"/>
-          <w:sz w:val="18"/>
-          <w:szCs w:val="18"/>
-        </w:rPr>
-        <w:t xml:space="preserve">Why is nobody looking for her?  </w:t>
-      </w:r>
-      <w:r>
-        <w:rPr>
-          <w:rFonts w:ascii="Georgia" w:cs="Georgia" w:eastAsia="Georgia" w:hAnsi="Georgia"/>
-          <w:i/>
-          <w:iCs/>
-          <w:color w:val="333333"/>
-          <w:sz w:val="18"/>
-          <w:szCs w:val="18"/>
-        </w:rPr>
-        <w:t xml:space="preserve">Greta: „Because we know exactly where she is.“ Der Satz, der sie stutzig machen soll.</w:t>
-      </w:r>
-    </w:p>
-    <w:p>
-      <w:pPr>
-        <w:pBdr>
-          <w:left w:val="single" w:color="BFBFBF" w:sz="18" w:space="8"/>
-        </w:pBdr>
-        <w:shd w:fill="F2F2F2" w:color="auto" w:val="clear"/>
-        <w:spacing w:after="40"/>
-        <w:ind w:left="120"/>
-      </w:pPr>
-      <w:r>
-        <w:rPr>
-          <w:rFonts w:ascii="Georgia" w:cs="Georgia" w:eastAsia="Georgia" w:hAnsi="Georgia"/>
-          <w:b/>
-          <w:bCs/>
-          <w:color w:val="333333"/>
-          <w:sz w:val="18"/>
-          <w:szCs w:val="18"/>
-        </w:rPr>
-        <w:t xml:space="preserve">What happened twenty years ago?  </w:t>
-      </w:r>
-      <w:r>
-        <w:rPr>
-          <w:rFonts w:ascii="Georgia" w:cs="Georgia" w:eastAsia="Georgia" w:hAnsi="Georgia"/>
-          <w:i/>
-          <w:iCs/>
-          <w:color w:val="333333"/>
-          <w:sz w:val="18"/>
-          <w:szCs w:val="18"/>
-        </w:rPr>
-        <w:t xml:space="preserve">Pieter lacht: „Ask her about Anneke!“ → Knopf unten.</w:t>
-      </w:r>
-    </w:p>
-    <w:p>
-      <w:pPr>
-        <w:pBdr>
-          <w:left w:val="single" w:color="BFBFBF" w:sz="18" w:space="8"/>
-        </w:pBdr>
-        <w:shd w:fill="F2F2F2" w:color="auto" w:val="clear"/>
-        <w:spacing w:after="40"/>
-        <w:ind w:left="120"/>
-      </w:pPr>
-      <w:r>
-        <w:rPr>
-          <w:rFonts w:ascii="Georgia" w:cs="Georgia" w:eastAsia="Georgia" w:hAnsi="Georgia"/>
-          <w:b/>
-          <w:bCs/>
-          <w:color w:val="333333"/>
-          <w:sz w:val="18"/>
-          <w:szCs w:val="18"/>
-        </w:rPr>
-        <w:t xml:space="preserve">What is that board? Who wrote the names?  </w:t>
-      </w:r>
-      <w:r>
-        <w:rPr>
-          <w:rFonts w:ascii="Georgia" w:cs="Georgia" w:eastAsia="Georgia" w:hAnsi="Georgia"/>
-          <w:i/>
-          <w:iCs/>
-          <w:color w:val="333333"/>
-          <w:sz w:val="18"/>
-          <w:szCs w:val="18"/>
-        </w:rPr>
-        <w:t xml:space="preserve">Greta: „I did. Both times.“ Die Namen stehen in Abständen von zwanzig Jahren. Der davor: ANNEKE KOLL.</w:t>
-      </w:r>
-    </w:p>
-    <w:p>
-      <w:pPr>
-        <w:pBdr>
-          <w:left w:val="single" w:color="BFBFBF" w:sz="18" w:space="8"/>
-        </w:pBdr>
-        <w:shd w:fill="F2F2F2" w:color="auto" w:val="clear"/>
-        <w:spacing w:after="40"/>
-        <w:ind w:left="120"/>
-      </w:pPr>
-      <w:r>
-        <w:rPr>
-          <w:rFonts w:ascii="Georgia" w:cs="Georgia" w:eastAsia="Georgia" w:hAnsi="Georgia"/>
-          <w:b/>
-          <w:bCs/>
-          <w:color w:val="333333"/>
-          <w:sz w:val="18"/>
-          <w:szCs w:val="18"/>
-        </w:rPr>
-        <w:t xml:space="preserve">Did she go by herself?  </w:t>
-      </w:r>
-      <w:r>
-        <w:rPr>
-          <w:rFonts w:ascii="Georgia" w:cs="Georgia" w:eastAsia="Georgia" w:hAnsi="Georgia"/>
-          <w:i/>
-          <w:iCs/>
-          <w:color w:val="333333"/>
-          <w:sz w:val="18"/>
-          <w:szCs w:val="18"/>
-        </w:rPr>
-        <w:t xml:space="preserve">Tobias: „She packed a bag. She said it was her turn.“</w:t>
-      </w:r>
-    </w:p>
-    <w:p>
-      <w:pPr>
-        <w:pBdr>
-          <w:left w:val="single" w:color="BFBFBF" w:sz="18" w:space="8"/>
-        </w:pBdr>
-        <w:shd w:fill="F2F2F2" w:color="auto" w:val="clear"/>
-        <w:spacing w:after="40"/>
-        <w:ind w:left="120"/>
-      </w:pPr>
-      <w:r>
-        <w:rPr>
-          <w:rFonts w:ascii="Georgia" w:cs="Georgia" w:eastAsia="Georgia" w:hAnsi="Georgia"/>
-          <w:b/>
-          <w:bCs/>
-          <w:color w:val="333333"/>
-          <w:sz w:val="18"/>
-          <w:szCs w:val="18"/>
-        </w:rPr>
-        <w:t xml:space="preserve">How do we get up to the castle?  </w:t>
-      </w:r>
-      <w:r>
-        <w:rPr>
-          <w:rFonts w:ascii="Georgia" w:cs="Georgia" w:eastAsia="Georgia" w:hAnsi="Georgia"/>
-          <w:i/>
-          <w:iCs/>
-          <w:color w:val="333333"/>
-          <w:sz w:val="18"/>
-          <w:szCs w:val="18"/>
-        </w:rPr>
-        <w:t xml:space="preserve">Greta holt eine alte Karte unter der Theke hervor. → vorletzter Block.</w:t>
-      </w:r>
-    </w:p>
-    <w:p>
-      <w:pPr>
-        <w:pBdr>
-          <w:left w:val="single" w:color="BFBFBF" w:sz="18" w:space="8"/>
-        </w:pBdr>
-        <w:shd w:fill="F2F2F2" w:color="auto" w:val="clear"/>
-        <w:spacing w:after="140"/>
-        <w:ind w:left="120"/>
-      </w:pPr>
-      <w:r>
-        <w:rPr>
-          <w:rFonts w:ascii="Georgia" w:cs="Georgia" w:eastAsia="Georgia" w:hAnsi="Georgia"/>
-          <w:b/>
-          <w:bCs/>
-          <w:color w:val="333333"/>
-          <w:sz w:val="18"/>
-          <w:szCs w:val="18"/>
-        </w:rPr>
-        <w:t xml:space="preserve">Can we look around the room?  </w:t>
-      </w:r>
-      <w:r>
-        <w:rPr>
-          <w:rFonts w:ascii="Georgia" w:cs="Georgia" w:eastAsia="Georgia" w:hAnsi="Georgia"/>
-          <w:i/>
-          <w:iCs/>
-          <w:color w:val="333333"/>
-          <w:sz w:val="18"/>
-          <w:szCs w:val="18"/>
-        </w:rPr>
-        <w:t xml:space="preserve">Ja: das Namensbrett, ein Koffer neben der Tür mit dem Anhänger M. VANCE (nie abgeholt), und hinter der Theke die Karte.</w:t>
+        <w:t xml:space="preserve">Can we look around the room? — Ja: das Namensbrett, ein Koffer neben der Tür mit dem Anhänger M. VANCE (nie abgeholt), und hinter der Theke die Karte.</w:t>
       </w:r>
     </w:p>
     <w:p>

</xml_diff>

<commit_message>
DM: Ziel-Zeilen beschreiben die Szene, nicht die Seite
Co-Authored-By: Claude Fable 5.1 <noreply@anthropic.com>
Claude-Session: https://claude.ai/code/session_01ADUPP2jvP6dgTYk1DsQkUN
</commit_message>
<xml_diff>
--- a/helferblatt/Nachtfels_Lesetext_DM.docx
+++ b/helferblatt/Nachtfels_Lesetext_DM.docx
@@ -3029,7 +3029,7 @@
           <w:sz w:val="19"/>
           <w:szCs w:val="19"/>
         </w:rPr>
-        <w:t xml:space="preserve">Der Weg nach oben. Hier steht nur noch, was euren Weg betrifft — bis alle drei im selben Hof ankommen.  (20–30 Min.)</w:t>
+        <w:t xml:space="preserve">Die Gruppe steigt auf ihrem Weg zum Schloss hinauf — mit dem, was der Weg kostet (Kampf, schlechte Luft, Wachen) — und steht am Ende im Hof.  (20–30 Min.)</w:t>
       </w:r>
     </w:p>
     <w:p>
@@ -5484,7 +5484,7 @@
           <w:sz w:val="19"/>
           <w:szCs w:val="19"/>
         </w:rPr>
-        <w:t xml:space="preserve">Hier steht nur eure Tür. Am Ende steht die Gruppe in jedem Fall hinter der Spiegeltür am Ende des Westgangs.  (20 Min.)</w:t>
+        <w:t xml:space="preserve">Die Gruppe geht durch ihre Tür, erlebt, was dahinter wartet (Bellamy, Anneke oder Tam), und steht am Ende hinter der Spiegeltür am Ende des Westgangs.  (20 Min.)</w:t>
       </w:r>
     </w:p>
     <w:p>
@@ -7568,7 +7568,7 @@
           <w:sz w:val="19"/>
           <w:szCs w:val="19"/>
         </w:rPr>
-        <w:t xml:space="preserve">Wie er auftritt, hängt an eurer Wahl und am Barometer. Es steht nur der Fall da, der bei euch gilt. Am Ende trägst du ein, wie es ausging.  (30 Min.)</w:t>
+        <w:t xml:space="preserve">Die Begegnung mit dem Grafen — Verhandlung, Kampf oder beides. Am Ende trägst du unten ein, wie es ausging.  (30 Min.)</w:t>
       </w:r>
     </w:p>
     <w:p>
@@ -8728,7 +8728,7 @@
           <w:sz w:val="19"/>
           <w:szCs w:val="19"/>
         </w:rPr>
-        <w:t xml:space="preserve">Es steht nur da, was bei euch eingetreten ist. Das letzte Wort haben die Schüler, nicht du.  (10 Min.)</w:t>
+        <w:t xml:space="preserve">Der Morgen danach: die Folgen eurer Entscheidungen, dann drei Fragen an die Gruppe. Das letzte Wort haben die Schüler.  (10 Min.)</w:t>
       </w:r>
     </w:p>
     <w:p>

</xml_diff>

<commit_message>
Strasse: am Tor kämpfen zwei Wachen
Co-Authored-By: Claude Fable 5.1 <noreply@anthropic.com>
Claude-Session: https://claude.ai/code/session_01ADUPP2jvP6dgTYk1DsQkUN
</commit_message>
<xml_diff>
--- a/helferblatt/Nachtfels_Lesetext_DM.docx
+++ b/helferblatt/Nachtfels_Lesetext_DM.docx
@@ -3075,7 +3075,7 @@
           <w:sz w:val="18"/>
           <w:szCs w:val="18"/>
         </w:rPr>
-        <w:t xml:space="preserve">Drei Stationen: Wölfe am Galgen (erster Kampf des Abends — langsam: jeder sagt auf Englisch, was er tut, drückt seinen Knopf, liest seinen gelben Satz vor; fällt ein Wolf, läuft der andere), der Sumpf (jeder würfelt dreimal, unter 10 = −1 HP) und die Wachen am Tor (jeder würfelt einmal; alle ≥ 10 → vorbei, sonst Kampf mit einer Wache und Gefahr +1).</w:t>
+        <w:t xml:space="preserve">Drei Stationen: Wölfe am Galgen (erster Kampf des Abends — langsam: jeder sagt auf Englisch, was er tut, drückt seinen Knopf, liest seinen gelben Satz vor; fällt ein Wolf, läuft der andere), der Sumpf (jeder würfelt dreimal, unter 10 = −1 HP) und die Wachen am Tor (jeder würfelt einmal; alle ≥ 10 → vorbei, sonst Kampf mit beiden Wachen, je 9 HP, und Gefahr +1).</w:t>
       </w:r>
     </w:p>
     <w:p>
@@ -3604,7 +3604,7 @@
           <w:sz w:val="18"/>
           <w:szCs w:val="18"/>
         </w:rPr>
-        <w:t xml:space="preserve">Das Anschleichen ist misslungen — eine Wache hat sie gesehen.  →  Kampf mit der Wache, Gefahr +1</w:t>
+        <w:t xml:space="preserve">Das Anschleichen ist misslungen — die beiden Wachen haben sie gesehen.  →  Kampf mit zwei Wachen, Gefahr +1</w:t>
       </w:r>
     </w:p>
     <w:p>

</xml_diff>

<commit_message>
Hof: erst der Rabe, dann die drei Türen mit „What would you like to take a closer look at?“
Co-Authored-By: Claude Fable 5.1 <noreply@anthropic.com>
Claude-Session: https://claude.ai/code/session_01ADUPP2jvP6dgTYk1DsQkUN
</commit_message>
<xml_diff>
--- a/helferblatt/Nachtfels_Lesetext_DM.docx
+++ b/helferblatt/Nachtfels_Lesetext_DM.docx
@@ -4739,121 +4739,6 @@
     </w:p>
     <w:p>
       <w:pPr>
-        <w:spacing w:after="110" w:line="320"/>
-      </w:pPr>
-      <w:r>
-        <w:rPr>
-          <w:rFonts w:ascii="Georgia" w:cs="Georgia" w:eastAsia="Georgia" w:hAnsi="Georgia"/>
-          <w:sz w:val="22"/>
-          <w:szCs w:val="22"/>
-        </w:rPr>
-        <w:t xml:space="preserve">Three ways lead on. On the left a chapel</w:t>
-      </w:r>
-      <w:r>
-        <w:rPr>
-          <w:rFonts w:ascii="Georgia" w:cs="Georgia" w:eastAsia="Georgia" w:hAnsi="Georgia"/>
-          <w:color w:val="7A5A1A"/>
-          <w:sz w:val="18"/>
-          <w:szCs w:val="18"/>
-        </w:rPr>
-        <w:t xml:space="preserve"> [Kapelle]</w:t>
-      </w:r>
-      <w:r>
-        <w:rPr>
-          <w:rFonts w:ascii="Georgia" w:cs="Georgia" w:eastAsia="Georgia" w:hAnsi="Georgia"/>
-          <w:sz w:val="22"/>
-          <w:szCs w:val="22"/>
-        </w:rPr>
-        <w:t xml:space="preserve">; its door has been broken inwards</w:t>
-      </w:r>
-      <w:r>
-        <w:rPr>
-          <w:rFonts w:ascii="Georgia" w:cs="Georgia" w:eastAsia="Georgia" w:hAnsi="Georgia"/>
-          <w:color w:val="7A5A1A"/>
-          <w:sz w:val="18"/>
-          <w:szCs w:val="18"/>
-        </w:rPr>
-        <w:t xml:space="preserve"> [nach innen aufgebrochen]</w:t>
-      </w:r>
-      <w:r>
-        <w:rPr>
-          <w:rFonts w:ascii="Georgia" w:cs="Georgia" w:eastAsia="Georgia" w:hAnsi="Georgia"/>
-          <w:sz w:val="22"/>
-          <w:szCs w:val="22"/>
-        </w:rPr>
-        <w:t xml:space="preserve">. In front of you a tall window, warm and yellow, with bookshelves</w:t>
-      </w:r>
-      <w:r>
-        <w:rPr>
-          <w:rFonts w:ascii="Georgia" w:cs="Georgia" w:eastAsia="Georgia" w:hAnsi="Georgia"/>
-          <w:color w:val="7A5A1A"/>
-          <w:sz w:val="18"/>
-          <w:szCs w:val="18"/>
-        </w:rPr>
-        <w:t xml:space="preserve"> [Bücherregale]</w:t>
-      </w:r>
-      <w:r>
-        <w:rPr>
-          <w:rFonts w:ascii="Georgia" w:cs="Georgia" w:eastAsia="Georgia" w:hAnsi="Georgia"/>
-          <w:sz w:val="22"/>
-          <w:szCs w:val="22"/>
-        </w:rPr>
-        <w:t xml:space="preserve"> behind it. And on the right a low stair</w:t>
-      </w:r>
-      <w:r>
-        <w:rPr>
-          <w:rFonts w:ascii="Georgia" w:cs="Georgia" w:eastAsia="Georgia" w:hAnsi="Georgia"/>
-          <w:color w:val="7A5A1A"/>
-          <w:sz w:val="18"/>
-          <w:szCs w:val="18"/>
-        </w:rPr>
-        <w:t xml:space="preserve"> [Treppe]</w:t>
-      </w:r>
-      <w:r>
-        <w:rPr>
-          <w:rFonts w:ascii="Georgia" w:cs="Georgia" w:eastAsia="Georgia" w:hAnsi="Georgia"/>
-          <w:sz w:val="22"/>
-          <w:szCs w:val="22"/>
-        </w:rPr>
-        <w:t xml:space="preserve"> going down, where it smells of onions</w:t>
-      </w:r>
-      <w:r>
-        <w:rPr>
-          <w:rFonts w:ascii="Georgia" w:cs="Georgia" w:eastAsia="Georgia" w:hAnsi="Georgia"/>
-          <w:color w:val="7A5A1A"/>
-          <w:sz w:val="18"/>
-          <w:szCs w:val="18"/>
-        </w:rPr>
-        <w:t xml:space="preserve"> [Zwiebeln]</w:t>
-      </w:r>
-      <w:r>
-        <w:rPr>
-          <w:rFonts w:ascii="Georgia" w:cs="Georgia" w:eastAsia="Georgia" w:hAnsi="Georgia"/>
-          <w:sz w:val="22"/>
-          <w:szCs w:val="22"/>
-        </w:rPr>
-        <w:t xml:space="preserve"> and hot fat</w:t>
-      </w:r>
-      <w:r>
-        <w:rPr>
-          <w:rFonts w:ascii="Georgia" w:cs="Georgia" w:eastAsia="Georgia" w:hAnsi="Georgia"/>
-          <w:color w:val="7A5A1A"/>
-          <w:sz w:val="18"/>
-          <w:szCs w:val="18"/>
-        </w:rPr>
-        <w:t xml:space="preserve"> [heisses Fett]</w:t>
-      </w:r>
-      <w:r>
-        <w:rPr>
-          <w:rFonts w:ascii="Georgia" w:cs="Georgia" w:eastAsia="Georgia" w:hAnsi="Georgia"/>
-          <w:sz w:val="22"/>
-          <w:szCs w:val="22"/>
-        </w:rPr>
-        <w:t xml:space="preserve">. Somebody down there is cooking. At two in the morning.</w:t>
-      </w:r>
-    </w:p>
-    <w:p>
-      <w:pPr>
         <w:spacing w:after="40" w:before="100"/>
       </w:pPr>
       <w:r>
@@ -4965,6 +4850,201 @@
           <w:szCs w:val="17"/>
         </w:rPr>
         <w:t xml:space="preserve">→  Helfer-Blatt · Teil 5</w:t>
+      </w:r>
+    </w:p>
+    <w:p>
+      <w:pPr>
+        <w:spacing w:after="40" w:before="100"/>
+      </w:pPr>
+      <w:r>
+        <w:rPr>
+          <w:rFonts w:ascii="Georgia" w:cs="Georgia" w:eastAsia="Georgia" w:hAnsi="Georgia"/>
+          <w:b/>
+          <w:bCs/>
+          <w:color w:val="555555"/>
+          <w:sz w:val="19"/>
+          <w:szCs w:val="19"/>
+        </w:rPr>
+        <w:t xml:space="preserve">Drei Türen</w:t>
+      </w:r>
+    </w:p>
+    <w:p>
+      <w:pPr>
+        <w:spacing w:after="110" w:line="320"/>
+      </w:pPr>
+      <w:r>
+        <w:rPr>
+          <w:rFonts w:ascii="Georgia" w:cs="Georgia" w:eastAsia="Georgia" w:hAnsi="Georgia"/>
+          <w:sz w:val="22"/>
+          <w:szCs w:val="22"/>
+        </w:rPr>
+        <w:t xml:space="preserve">Three ways lead on. On the left a chapel</w:t>
+      </w:r>
+      <w:r>
+        <w:rPr>
+          <w:rFonts w:ascii="Georgia" w:cs="Georgia" w:eastAsia="Georgia" w:hAnsi="Georgia"/>
+          <w:color w:val="7A5A1A"/>
+          <w:sz w:val="18"/>
+          <w:szCs w:val="18"/>
+        </w:rPr>
+        <w:t xml:space="preserve"> [Kapelle]</w:t>
+      </w:r>
+      <w:r>
+        <w:rPr>
+          <w:rFonts w:ascii="Georgia" w:cs="Georgia" w:eastAsia="Georgia" w:hAnsi="Georgia"/>
+          <w:sz w:val="22"/>
+          <w:szCs w:val="22"/>
+        </w:rPr>
+        <w:t xml:space="preserve">; its door has been broken inwards</w:t>
+      </w:r>
+      <w:r>
+        <w:rPr>
+          <w:rFonts w:ascii="Georgia" w:cs="Georgia" w:eastAsia="Georgia" w:hAnsi="Georgia"/>
+          <w:color w:val="7A5A1A"/>
+          <w:sz w:val="18"/>
+          <w:szCs w:val="18"/>
+        </w:rPr>
+        <w:t xml:space="preserve"> [nach innen aufgebrochen]</w:t>
+      </w:r>
+      <w:r>
+        <w:rPr>
+          <w:rFonts w:ascii="Georgia" w:cs="Georgia" w:eastAsia="Georgia" w:hAnsi="Georgia"/>
+          <w:sz w:val="22"/>
+          <w:szCs w:val="22"/>
+        </w:rPr>
+        <w:t xml:space="preserve">. In front of you a tall window, warm and yellow, with bookshelves</w:t>
+      </w:r>
+      <w:r>
+        <w:rPr>
+          <w:rFonts w:ascii="Georgia" w:cs="Georgia" w:eastAsia="Georgia" w:hAnsi="Georgia"/>
+          <w:color w:val="7A5A1A"/>
+          <w:sz w:val="18"/>
+          <w:szCs w:val="18"/>
+        </w:rPr>
+        <w:t xml:space="preserve"> [Bücherregale]</w:t>
+      </w:r>
+      <w:r>
+        <w:rPr>
+          <w:rFonts w:ascii="Georgia" w:cs="Georgia" w:eastAsia="Georgia" w:hAnsi="Georgia"/>
+          <w:sz w:val="22"/>
+          <w:szCs w:val="22"/>
+        </w:rPr>
+        <w:t xml:space="preserve"> behind it. And on the right a low stair</w:t>
+      </w:r>
+      <w:r>
+        <w:rPr>
+          <w:rFonts w:ascii="Georgia" w:cs="Georgia" w:eastAsia="Georgia" w:hAnsi="Georgia"/>
+          <w:color w:val="7A5A1A"/>
+          <w:sz w:val="18"/>
+          <w:szCs w:val="18"/>
+        </w:rPr>
+        <w:t xml:space="preserve"> [Treppe]</w:t>
+      </w:r>
+      <w:r>
+        <w:rPr>
+          <w:rFonts w:ascii="Georgia" w:cs="Georgia" w:eastAsia="Georgia" w:hAnsi="Georgia"/>
+          <w:sz w:val="22"/>
+          <w:szCs w:val="22"/>
+        </w:rPr>
+        <w:t xml:space="preserve"> going down, where it smells of onions</w:t>
+      </w:r>
+      <w:r>
+        <w:rPr>
+          <w:rFonts w:ascii="Georgia" w:cs="Georgia" w:eastAsia="Georgia" w:hAnsi="Georgia"/>
+          <w:color w:val="7A5A1A"/>
+          <w:sz w:val="18"/>
+          <w:szCs w:val="18"/>
+        </w:rPr>
+        <w:t xml:space="preserve"> [Zwiebeln]</w:t>
+      </w:r>
+      <w:r>
+        <w:rPr>
+          <w:rFonts w:ascii="Georgia" w:cs="Georgia" w:eastAsia="Georgia" w:hAnsi="Georgia"/>
+          <w:sz w:val="22"/>
+          <w:szCs w:val="22"/>
+        </w:rPr>
+        <w:t xml:space="preserve"> and hot fat</w:t>
+      </w:r>
+      <w:r>
+        <w:rPr>
+          <w:rFonts w:ascii="Georgia" w:cs="Georgia" w:eastAsia="Georgia" w:hAnsi="Georgia"/>
+          <w:color w:val="7A5A1A"/>
+          <w:sz w:val="18"/>
+          <w:szCs w:val="18"/>
+        </w:rPr>
+        <w:t xml:space="preserve"> [heisses Fett]</w:t>
+      </w:r>
+      <w:r>
+        <w:rPr>
+          <w:rFonts w:ascii="Georgia" w:cs="Georgia" w:eastAsia="Georgia" w:hAnsi="Georgia"/>
+          <w:sz w:val="22"/>
+          <w:szCs w:val="22"/>
+        </w:rPr>
+        <w:t xml:space="preserve">. Somebody down there is cooking. At two in the morning.</w:t>
+      </w:r>
+    </w:p>
+    <w:p>
+      <w:pPr>
+        <w:pBdr>
+          <w:left w:val="single" w:color="74B094" w:sz="18" w:space="8"/>
+        </w:pBdr>
+        <w:shd w:fill="EAF4EC" w:color="auto" w:val="clear"/>
+        <w:spacing w:after="40"/>
+        <w:ind w:left="120"/>
+      </w:pPr>
+      <w:r>
+        <w:rPr>
+          <w:rFonts w:ascii="Georgia" w:cs="Georgia" w:eastAsia="Georgia" w:hAnsi="Georgia"/>
+          <w:b/>
+          <w:bCs/>
+          <w:color w:val="3A5A4C"/>
+          <w:sz w:val="16"/>
+          <w:szCs w:val="16"/>
+        </w:rPr>
+        <w:t xml:space="preserve">DM SAGT DEN SCHÜLERN:  </w:t>
+      </w:r>
+      <w:r>
+        <w:rPr>
+          <w:rFonts w:ascii="Georgia" w:cs="Georgia" w:eastAsia="Georgia" w:hAnsi="Georgia"/>
+          <w:sz w:val="19"/>
+          <w:szCs w:val="19"/>
+        </w:rPr>
+        <w:t xml:space="preserve">“What would you like to take a closer look at? The chapel</w:t>
+      </w:r>
+      <w:r>
+        <w:rPr>
+          <w:rFonts w:ascii="Georgia" w:cs="Georgia" w:eastAsia="Georgia" w:hAnsi="Georgia"/>
+          <w:sz w:val="19"/>
+          <w:szCs w:val="19"/>
+        </w:rPr>
+        <w:t xml:space="preserve">, the window, the stair</w:t>
+      </w:r>
+      <w:r>
+        <w:rPr>
+          <w:rFonts w:ascii="Georgia" w:cs="Georgia" w:eastAsia="Georgia" w:hAnsi="Georgia"/>
+          <w:sz w:val="19"/>
+          <w:szCs w:val="19"/>
+        </w:rPr>
+        <w:t xml:space="preserve"> — or something else?”</w:t>
+      </w:r>
+    </w:p>
+    <w:p>
+      <w:pPr>
+        <w:pBdr>
+          <w:left w:val="single" w:color="74B094" w:sz="18" w:space="8"/>
+        </w:pBdr>
+        <w:shd w:fill="EAF4EC" w:color="auto" w:val="clear"/>
+        <w:spacing w:after="140"/>
+        <w:ind w:left="120"/>
+      </w:pPr>
+      <w:r>
+        <w:rPr>
+          <w:rFonts w:ascii="Georgia" w:cs="Georgia" w:eastAsia="Georgia" w:hAnsi="Georgia"/>
+          <w:color w:val="555555"/>
+          <w:sz w:val="17"/>
+          <w:szCs w:val="17"/>
+        </w:rPr>
+        <w:t xml:space="preserve">Antwortmöglichkeiten unten, jede nur einmal. Wer alles inspiziert hat, entscheidet auf der nächsten Seite.  →  Helfer-Blatt · Teil 5</w:t>
       </w:r>
     </w:p>
     <w:p>

</xml_diff>

<commit_message>
Adaptiv: bei Gefahr 8–10 ein Gegner mehr je Kampf und eine Patrouille als Zwischenakt vor dem nächsten Akt
Co-Authored-By: Claude Fable 5.1 <noreply@anthropic.com>
Claude-Session: https://claude.ai/code/session_01ADUPP2jvP6dgTYk1DsQkUN
</commit_message>
<xml_diff>
--- a/helferblatt/Nachtfels_Lesetext_DM.docx
+++ b/helferblatt/Nachtfels_Lesetext_DM.docx
@@ -517,6 +517,38 @@
           <w:left w:val="single" w:color="BFBFBF" w:sz="18" w:space="8"/>
         </w:pBdr>
         <w:shd w:fill="F2F2F2" w:color="auto" w:val="clear"/>
+        <w:spacing w:after="40"/>
+        <w:ind w:left="120"/>
+      </w:pPr>
+      <w:r>
+        <w:rPr>
+          <w:rFonts w:ascii="Georgia" w:cs="Georgia" w:eastAsia="Georgia" w:hAnsi="Georgia"/>
+          <w:b/>
+          <w:bCs/>
+          <w:color w:val="333333"/>
+          <w:sz w:val="18"/>
+          <w:szCs w:val="18"/>
+        </w:rPr>
+        <w:t xml:space="preserve">Die Gefahr erreicht 8  </w:t>
+      </w:r>
+      <w:r>
+        <w:rPr>
+          <w:rFonts w:ascii="Georgia" w:cs="Georgia" w:eastAsia="Georgia" w:hAnsi="Georgia"/>
+          <w:i/>
+          <w:iCs/>
+          <w:color w:val="333333"/>
+          <w:sz w:val="18"/>
+          <w:szCs w:val="18"/>
+        </w:rPr>
+        <w:t xml:space="preserve">Das Haus ist wach: Ab jetzt lädt jeder Kampfknopf einen Gegner mehr, und die Seite schiebt einmal einen Zwischenakt vor den nächsten Akt — eine Patrouille, drei Wachen und ein Hund. Du musst nichts tun; oben in der Leiste erscheint „⚠ Zwischenakt“, und beim Weiterklicken kommt er von selbst. Sinkt die Gefahr vorher wieder unter 8, wird er abgeblasen.</w:t>
+      </w:r>
+    </w:p>
+    <w:p>
+      <w:pPr>
+        <w:pBdr>
+          <w:left w:val="single" w:color="BFBFBF" w:sz="18" w:space="8"/>
+        </w:pBdr>
+        <w:shd w:fill="F2F2F2" w:color="auto" w:val="clear"/>
         <w:spacing w:after="140"/>
         <w:ind w:left="120"/>
       </w:pPr>
@@ -9540,6 +9572,218 @@
           <w:szCs w:val="17"/>
         </w:rPr>
         <w:t xml:space="preserve">→  Helfer-Blatt · Teil 9</w:t>
+      </w:r>
+    </w:p>
+    <w:p>
+      <w:pPr>
+        <w:pStyle w:val="Heading1"/>
+        <w:pageBreakBefore/>
+        <w:spacing w:after="60" w:before="400"/>
+      </w:pPr>
+      <w:r>
+        <w:rPr>
+          <w:rFonts w:ascii="Georgia" w:cs="Georgia" w:eastAsia="Georgia" w:hAnsi="Georgia"/>
+          <w:b/>
+          <w:bCs/>
+          <w:color w:val="1A1A1A"/>
+          <w:sz w:val="32"/>
+          <w:szCs w:val="32"/>
+        </w:rPr>
+        <w:t xml:space="preserve">Zwischenakt · The Patrol</w:t>
+      </w:r>
+    </w:p>
+    <w:p>
+      <w:pPr>
+        <w:spacing w:after="160"/>
+      </w:pPr>
+      <w:r>
+        <w:rPr>
+          <w:rFonts w:ascii="Georgia" w:cs="Georgia" w:eastAsia="Georgia" w:hAnsi="Georgia"/>
+          <w:b/>
+          <w:bCs/>
+          <w:color w:val="7A5A1A"/>
+          <w:sz w:val="19"/>
+          <w:szCs w:val="19"/>
+        </w:rPr>
+        <w:t xml:space="preserve">Ziel: </w:t>
+      </w:r>
+      <w:r>
+        <w:rPr>
+          <w:rFonts w:ascii="Georgia" w:cs="Georgia" w:eastAsia="Georgia" w:hAnsi="Georgia"/>
+          <w:i/>
+          <w:iCs/>
+          <w:color w:val="444444"/>
+          <w:sz w:val="19"/>
+          <w:szCs w:val="19"/>
+        </w:rPr>
+        <w:t xml:space="preserve">Das Haus hat genug gehört. Eine Patrouille stellt die Gruppe — drei Wachen und ein Hund. Zu schaffen, aber es kostet.  (15 Min.)</w:t>
+      </w:r>
+    </w:p>
+    <w:p>
+      <w:pPr>
+        <w:pBdr>
+          <w:left w:val="single" w:color="BFBFBF" w:sz="18" w:space="8"/>
+        </w:pBdr>
+        <w:shd w:fill="F2F2F2" w:color="auto" w:val="clear"/>
+        <w:spacing w:after="140"/>
+        <w:ind w:left="120"/>
+      </w:pPr>
+      <w:r>
+        <w:rPr>
+          <w:rFonts w:ascii="Georgia" w:cs="Georgia" w:eastAsia="Georgia" w:hAnsi="Georgia"/>
+          <w:b/>
+          <w:bCs/>
+          <w:color w:val="555555"/>
+          <w:sz w:val="16"/>
+          <w:szCs w:val="16"/>
+        </w:rPr>
+        <w:t xml:space="preserve">HINTERGRUND (NUR DM):  </w:t>
+      </w:r>
+      <w:r>
+        <w:rPr>
+          <w:rFonts w:ascii="Georgia" w:cs="Georgia" w:eastAsia="Georgia" w:hAnsi="Georgia"/>
+          <w:color w:val="333333"/>
+          <w:sz w:val="18"/>
+          <w:szCs w:val="18"/>
+        </w:rPr>
+        <w:t xml:space="preserve">Dieser Zwischenakt kommt nur, wenn das Barometer 8 oder mehr erreicht — einmal pro Abend, vor dem nächsten Akt. Drei Wachen (je 9 HP) und ein Wachhund (14 HP): zusammen 41 Lebenspunkte gegen eure 72. Gerade noch zu schaffen: Ist der Hund gefallen und stehen die Wachen bei der Hälfte, ziehen sie sich zurück — „They don’t want to die for him.“ Lass den Lightbearer heilen, und wer die Wachen anspricht, bekommt eine Antwort. Danach geht die Geschichte weiter, wo sie war.</w:t>
+      </w:r>
+    </w:p>
+    <w:p>
+      <w:pPr>
+        <w:spacing w:after="40" w:before="100"/>
+      </w:pPr>
+      <w:r>
+        <w:rPr>
+          <w:rFonts w:ascii="Georgia" w:cs="Georgia" w:eastAsia="Georgia" w:hAnsi="Georgia"/>
+          <w:b/>
+          <w:bCs/>
+          <w:color w:val="555555"/>
+          <w:sz w:val="19"/>
+          <w:szCs w:val="19"/>
+        </w:rPr>
+        <w:t xml:space="preserve">Schritte</w:t>
+      </w:r>
+    </w:p>
+    <w:p>
+      <w:pPr>
+        <w:spacing w:after="110" w:line="320"/>
+      </w:pPr>
+      <w:r>
+        <w:rPr>
+          <w:rFonts w:ascii="Georgia" w:cs="Georgia" w:eastAsia="Georgia" w:hAnsi="Georgia"/>
+          <w:sz w:val="22"/>
+          <w:szCs w:val="22"/>
+        </w:rPr>
+        <w:t xml:space="preserve">Boots</w:t>
+      </w:r>
+      <w:r>
+        <w:rPr>
+          <w:rFonts w:ascii="Georgia" w:cs="Georgia" w:eastAsia="Georgia" w:hAnsi="Georgia"/>
+          <w:color w:val="7A5A1A"/>
+          <w:sz w:val="18"/>
+          <w:szCs w:val="18"/>
+        </w:rPr>
+        <w:t xml:space="preserve"> [Stiefel]</w:t>
+      </w:r>
+      <w:r>
+        <w:rPr>
+          <w:rFonts w:ascii="Georgia" w:cs="Georgia" w:eastAsia="Georgia" w:hAnsi="Georgia"/>
+          <w:sz w:val="22"/>
+          <w:szCs w:val="22"/>
+        </w:rPr>
+        <w:t xml:space="preserve">. Somewhere close, and getting closer — three pairs, in step. A lamp swings round the corner, and behind it comes something on a chain that is too big to be a dog and too quiet to be a wolf.</w:t>
+      </w:r>
+    </w:p>
+    <w:p>
+      <w:pPr>
+        <w:spacing w:after="110" w:line="320"/>
+      </w:pPr>
+      <w:r>
+        <w:rPr>
+          <w:rFonts w:ascii="Georgia" w:cs="Georgia" w:eastAsia="Georgia" w:hAnsi="Georgia"/>
+          <w:sz w:val="22"/>
+          <w:szCs w:val="22"/>
+        </w:rPr>
+        <w:t xml:space="preserve">The man with the lamp does not ask who you are. He already knows. “There you are,” he says — and lets go of the chain.</w:t>
+      </w:r>
+    </w:p>
+    <w:p>
+      <w:pPr>
+        <w:pBdr>
+          <w:left w:val="single" w:color="74B094" w:sz="18" w:space="8"/>
+        </w:pBdr>
+        <w:shd w:fill="EAF4EC" w:color="auto" w:val="clear"/>
+        <w:spacing w:after="40"/>
+        <w:ind w:left="120"/>
+      </w:pPr>
+      <w:r>
+        <w:rPr>
+          <w:rFonts w:ascii="Georgia" w:cs="Georgia" w:eastAsia="Georgia" w:hAnsi="Georgia"/>
+          <w:b/>
+          <w:bCs/>
+          <w:color w:val="3A5A4C"/>
+          <w:sz w:val="16"/>
+          <w:szCs w:val="16"/>
+        </w:rPr>
+        <w:t xml:space="preserve">DM SAGT DEN SCHÜLERN:  </w:t>
+      </w:r>
+      <w:r>
+        <w:rPr>
+          <w:rFonts w:ascii="Georgia" w:cs="Georgia" w:eastAsia="Georgia" w:hAnsi="Georgia"/>
+          <w:sz w:val="19"/>
+          <w:szCs w:val="19"/>
+        </w:rPr>
+        <w:t xml:space="preserve">“No talking your way out of this one. But talk to each other: who takes the hound? Who covers the healer?”</w:t>
+      </w:r>
+    </w:p>
+    <w:p>
+      <w:pPr>
+        <w:pBdr>
+          <w:left w:val="single" w:color="74B094" w:sz="18" w:space="8"/>
+        </w:pBdr>
+        <w:shd w:fill="EAF4EC" w:color="auto" w:val="clear"/>
+        <w:spacing w:after="140"/>
+        <w:ind w:left="120"/>
+      </w:pPr>
+      <w:r>
+        <w:rPr>
+          <w:rFonts w:ascii="Georgia" w:cs="Georgia" w:eastAsia="Georgia" w:hAnsi="Georgia"/>
+          <w:color w:val="555555"/>
+          <w:sz w:val="17"/>
+          <w:szCs w:val="17"/>
+        </w:rPr>
+        <w:t xml:space="preserve">→  Helfer-Blatt · Teil 8</w:t>
+      </w:r>
+    </w:p>
+    <w:p>
+      <w:pPr>
+        <w:pBdr>
+          <w:left w:val="single" w:color="BFBFBF" w:sz="18" w:space="8"/>
+        </w:pBdr>
+        <w:shd w:fill="F2F2F2" w:color="auto" w:val="clear"/>
+        <w:spacing w:after="140"/>
+        <w:ind w:left="120"/>
+      </w:pPr>
+      <w:r>
+        <w:rPr>
+          <w:rFonts w:ascii="Georgia" w:cs="Georgia" w:eastAsia="Georgia" w:hAnsi="Georgia"/>
+          <w:b/>
+          <w:bCs/>
+          <w:color w:val="8A2C2C"/>
+          <w:sz w:val="16"/>
+          <w:szCs w:val="16"/>
+        </w:rPr>
+        <w:t xml:space="preserve">KAMPF (NUR DM): The patrol  </w:t>
+      </w:r>
+      <w:r>
+        <w:rPr>
+          <w:rFonts w:ascii="Georgia" w:cs="Georgia" w:eastAsia="Georgia" w:hAnsi="Georgia"/>
+          <w:color w:val="333333"/>
+          <w:sz w:val="18"/>
+          <w:szCs w:val="18"/>
+        </w:rPr>
+        <w:t xml:space="preserve"> Drei Wachen und der Hund — der Knopf lädt alle vier.  Gate Guard 9 HP, Gate Guard 9 HP, Gate Guard 9 HP, Guard Hound 14 HP</w:t>
       </w:r>
     </w:p>
     <w:sectPr>

</xml_diff>

<commit_message>
Anleitung: drei Gefahrenstufen erklärt; bei Orange ein Zusatzgegner nach Wahl des DM
Co-Authored-By: Claude Fable 5.1 <noreply@anthropic.com>
Claude-Session: https://claude.ai/code/session_01ADUPP2jvP6dgTYk1DsQkUN
</commit_message>
<xml_diff>
--- a/helferblatt/Nachtfels_Lesetext_DM.docx
+++ b/helferblatt/Nachtfels_Lesetext_DM.docx
@@ -263,7 +263,8 @@
           <w:sz w:val="18"/>
           <w:szCs w:val="18"/>
         </w:rPr>
-        <w:t xml:space="preserve">Du kannst den Grafen deutschempfindlich machen: Er hört jeden ganzen deutschen Satz, der am Tisch fällt — für ihn ein Geräusch im Haus. Folge: Er schickt einen Diener los, der die Gruppe sucht. Lade dafür rechts einen Thrall in den Kampf, oder lass ihn nur an der Tür vorbeigehen und die Gefahr um 1 steigen. Hier darfst du improvisieren — die Drohung wirkt meist schon allein.</w:t>
+        <w:t xml:space="preserve">Du kannst den Grafen deutschempfindlich machen: Er hört jeden ganzen deutschen Satz, der am Tisch fällt — für ihn ein Geräusch im Haus. Folge: Die Gefahr steigt um 1 (Knopf rechts), oder er schickt einen Diener los — dafür einen Thrall in den Kampf laden. Hier darfst du improvisieren; die Drohung wirkt meist schon allein.
+ Das Barometer hat drei Stufen. Blau (0–3): nichts passiert. Orange (4–7): du entscheidest selbst, ob du in einem Kampf einen Gegner hinzufügst — jeder Kampfblock bietet dir dafür einen Knopf an. Rot (8–10): Sobald die dritte Stufe erreicht ist, beginnt als Zwischenakt eine Patrouille (drei Wachen, ein Hund) vor dem nächsten Akt, und jeder Kampf bekommt von selbst einen Gegner mehr.</w:t>
       </w:r>
     </w:p>
     <w:p>
@@ -529,7 +530,39 @@
           <w:sz w:val="18"/>
           <w:szCs w:val="18"/>
         </w:rPr>
-        <w:t xml:space="preserve">Die Gefahr erreicht 8  </w:t>
+        <w:t xml:space="preserve">Die Gefahr wird orange (4–7)  </w:t>
+      </w:r>
+      <w:r>
+        <w:rPr>
+          <w:rFonts w:ascii="Georgia" w:cs="Georgia" w:eastAsia="Georgia" w:hAnsi="Georgia"/>
+          <w:i/>
+          <w:iCs/>
+          <w:color w:val="333333"/>
+          <w:sz w:val="18"/>
+          <w:szCs w:val="18"/>
+        </w:rPr>
+        <w:t xml:space="preserve">Die Kämpfe bleiben, wie sie sind — aber jeder Kampfblock zeigt dir einen Knopf „+1 … dazu — deine Entscheidung“. Nimm ihn, wenn die Gruppe laut oder leichtsinnig war.</w:t>
+      </w:r>
+    </w:p>
+    <w:p>
+      <w:pPr>
+        <w:pBdr>
+          <w:left w:val="single" w:color="BFBFBF" w:sz="18" w:space="8"/>
+        </w:pBdr>
+        <w:shd w:fill="F2F2F2" w:color="auto" w:val="clear"/>
+        <w:spacing w:after="40"/>
+        <w:ind w:left="120"/>
+      </w:pPr>
+      <w:r>
+        <w:rPr>
+          <w:rFonts w:ascii="Georgia" w:cs="Georgia" w:eastAsia="Georgia" w:hAnsi="Georgia"/>
+          <w:b/>
+          <w:bCs/>
+          <w:color w:val="333333"/>
+          <w:sz w:val="18"/>
+          <w:szCs w:val="18"/>
+        </w:rPr>
+        <w:t xml:space="preserve">Die Gefahr wird rot (8–10)  </w:t>
       </w:r>
       <w:r>
         <w:rPr>

</xml_diff>

<commit_message>
DM: mittlere Spalte „Wenn … dann“ — Abzweigungen der Szene und Stärken der Figuren, fest stehend und mitscrollend
Drei Spalten ab 1380 px: links Vorlesetext, Mitte (klebt) die Abzweigungen dieser Szene als Wenn-dann-Zeilen (grün gut, rot kostet) plus Stärken der Figuren, rechts Barometer/Gruppe/Kampf. Darunter fällt die Mitte über die rechte Leiste, auf Handybreite alles untereinander. Regeln je Szene aus den Regietexten herausgezogen (Tam: ehrlich → führt, Lüge → kein Führer, Drohung → +3; Wachen: alle ≥10 → vorbei; Bellamy, Anneke, Vaskir unter 15 HP, Patrouille …). Prüfstand: Regeln nur im gewählten Zweig, vollständig gerendert, höchstens acht. Lesetext DM mit Wenn-dann-Kästen; README, index, Anleitung nachgezogen.

Co-Authored-By: Claude Fable 5.1 <noreply@anthropic.com>
Claude-Session: https://claude.ai/code/session_01ADUPP2jvP6dgTYk1DsQkUN
</commit_message>
<xml_diff>
--- a/helferblatt/Nachtfels_Lesetext_DM.docx
+++ b/helferblatt/Nachtfels_Lesetext_DM.docx
@@ -186,7 +186,7 @@
           <w:szCs w:val="18"/>
         </w:rPr>
         <w:t xml:space="preserve">Gelb heisst: wörtlich vorlesen — Erzähltext und die Sätze der Figuren stehen in einer Karte. Grün heisst: das sagst du den Schülern, ebenfalls wörtlich — es ist ihre Aufgabe. Grau heisst: nur für dich, und steht als Hintergrund oben. Rot heisst: Kampf. Ganz unten steht immer, wann es weitergeht.
- Rechts unter dem Barometer steht Stärken der Figuren: je Figur eine Zeile mit ihrem Talent — Magic Hand, Strength, Healing Touch — und, wenn die Szene eine Gelegenheit dafür hat, der Satz aus dem gelben Text, der sie ankündigt (Tam hält die verbrannte Hand an die Brust; Marek hat die Hand verbunden). Du liest den Satz vor und wartest. Anklicken zeigt die Folge. Das sind keine Aufgaben und keine Lösungen: Die Zeile sagt dir nur, was du zulassen kannst, falls der Spieler von selbst darauf kommt. Jede Szene funktioniert auch ohne. — Unter dem Titel jeder Seite steht die Lage: wo die Gruppe ist, was sie gewählt hat, was sie weiss. Auf der Seite steht immer nur, was zu diesem Weg gehört — das andere siehst du gar nicht erst. Und eine Entscheidung lässt sich erst anklicken, wenn die davor getroffen ist.</w:t>
+ In der mittleren Spalte steht, was in dieser Szene abzweigt — Wenn … dann: „Tam angelogen → kein Führer“, „alle würfeln 10 oder mehr → an den Wachen vorbei“. Sie scrollt mit, damit du beim Vorlesen nie suchen musst, was als Nächstes von der Antwort der Gruppe abhängt. — Darunter Stärken der Figuren: je Figur eine Zeile mit ihrem Talent — Magic Hand, Strength, Healing Touch — und, wenn die Szene eine Gelegenheit dafür hat, der Satz aus dem gelben Text, der sie ankündigt (Tam hält die verbrannte Hand an die Brust; Marek hat die Hand verbunden). Du liest den Satz vor und wartest. Anklicken zeigt die Folge. Das sind keine Aufgaben und keine Lösungen: Die Zeile sagt dir nur, was du zulassen kannst, falls der Spieler von selbst darauf kommt. Jede Szene funktioniert auch ohne. — Unter dem Titel jeder Seite steht die Lage: wo die Gruppe ist, was sie gewählt hat, was sie weiss. Auf der Seite steht immer nur, was zu diesem Weg gehört — das andere siehst du gar nicht erst. Und eine Entscheidung lässt sich erst anklicken, wenn die davor getroffen ist.</w:t>
       </w:r>
     </w:p>
     <w:p>
@@ -669,6 +669,117 @@
         </w:rPr>
         <w:t xml:space="preserve">1. Der Spieler liest seinen gelben Satz vor: „I hit for 9 damage.“
  2. Du tippst die 9 in die Karte des Monsters und drückst Schaden. — 3. Das Monster ist dran: Du drückst auf seine Attacke. Die Seite würfelt und sagt dir, ob es trifft. Dann klickst du an, wen es erwischt hat. — Im Kampf heilt niemand — ausser mit dem eigenen Trank. Danach heilt die Lightbearer alle: rechts „alle voll“.</w:t>
+      </w:r>
+    </w:p>
+    <w:p>
+      <w:pPr>
+        <w:pBdr>
+          <w:left w:val="single" w:color="BFBFBF" w:sz="18" w:space="8"/>
+        </w:pBdr>
+        <w:shd w:fill="F2F2F2" w:color="auto" w:val="clear"/>
+        <w:spacing w:after="40"/>
+        <w:ind w:left="120"/>
+      </w:pPr>
+      <w:r>
+        <w:rPr>
+          <w:rFonts w:ascii="Georgia" w:cs="Georgia" w:eastAsia="Georgia" w:hAnsi="Georgia"/>
+          <w:b/>
+          <w:bCs/>
+          <w:color w:val="555555"/>
+          <w:sz w:val="16"/>
+          <w:szCs w:val="16"/>
+        </w:rPr>
+        <w:t xml:space="preserve">WENN … DANN (NUR DM)  </w:t>
+      </w:r>
+    </w:p>
+    <w:p>
+      <w:pPr>
+        <w:pBdr>
+          <w:left w:val="single" w:color="BFBFBF" w:sz="18" w:space="8"/>
+        </w:pBdr>
+        <w:shd w:fill="F2F2F2" w:color="auto" w:val="clear"/>
+        <w:spacing w:after="40"/>
+        <w:ind w:left="120"/>
+      </w:pPr>
+      <w:r>
+        <w:rPr>
+          <w:rFonts w:ascii="Georgia" w:cs="Georgia" w:eastAsia="Georgia" w:hAnsi="Georgia"/>
+          <w:b/>
+          <w:bCs/>
+          <w:color w:val="333333"/>
+          <w:sz w:val="17"/>
+          <w:szCs w:val="17"/>
+        </w:rPr>
+        <w:t xml:space="preserve">Ein ganzer deutscher Satz fällt  →  </w:t>
+      </w:r>
+      <w:r>
+        <w:rPr>
+          <w:rFonts w:ascii="Georgia" w:cs="Georgia" w:eastAsia="Georgia" w:hAnsi="Georgia"/>
+          <w:color w:val="333333"/>
+          <w:sz w:val="17"/>
+          <w:szCs w:val="17"/>
+        </w:rPr>
+        <w:t xml:space="preserve">Gefahr +1 (rechts) — oder ein Thrall in den Kampf</w:t>
+      </w:r>
+    </w:p>
+    <w:p>
+      <w:pPr>
+        <w:pBdr>
+          <w:left w:val="single" w:color="BFBFBF" w:sz="18" w:space="8"/>
+        </w:pBdr>
+        <w:shd w:fill="F2F2F2" w:color="auto" w:val="clear"/>
+        <w:spacing w:after="40"/>
+        <w:ind w:left="120"/>
+      </w:pPr>
+      <w:r>
+        <w:rPr>
+          <w:rFonts w:ascii="Georgia" w:cs="Georgia" w:eastAsia="Georgia" w:hAnsi="Georgia"/>
+          <w:b/>
+          <w:bCs/>
+          <w:color w:val="333333"/>
+          <w:sz w:val="17"/>
+          <w:szCs w:val="17"/>
+        </w:rPr>
+        <w:t xml:space="preserve">Eine Figur fällt auf 0  →  </w:t>
+      </w:r>
+      <w:r>
+        <w:rPr>
+          <w:rFonts w:ascii="Georgia" w:cs="Georgia" w:eastAsia="Georgia" w:hAnsi="Georgia"/>
+          <w:color w:val="333333"/>
+          <w:sz w:val="17"/>
+          <w:szCs w:val="17"/>
+        </w:rPr>
+        <w:t xml:space="preserve">eigener Trank, oder liegen bis nach dem Kampf; dann heilt die Lightbearer alle</w:t>
+      </w:r>
+    </w:p>
+    <w:p>
+      <w:pPr>
+        <w:pBdr>
+          <w:left w:val="single" w:color="BFBFBF" w:sz="18" w:space="8"/>
+        </w:pBdr>
+        <w:shd w:fill="F2F2F2" w:color="auto" w:val="clear"/>
+        <w:spacing w:after="140"/>
+        <w:ind w:left="120"/>
+      </w:pPr>
+      <w:r>
+        <w:rPr>
+          <w:rFonts w:ascii="Georgia" w:cs="Georgia" w:eastAsia="Georgia" w:hAnsi="Georgia"/>
+          <w:b/>
+          <w:bCs/>
+          <w:color w:val="333333"/>
+          <w:sz w:val="17"/>
+          <w:szCs w:val="17"/>
+        </w:rPr>
+        <w:t xml:space="preserve">Niemand sagt etwas  →  </w:t>
+      </w:r>
+      <w:r>
+        <w:rPr>
+          <w:rFonts w:ascii="Georgia" w:cs="Georgia" w:eastAsia="Georgia" w:hAnsi="Georgia"/>
+          <w:color w:val="333333"/>
+          <w:sz w:val="17"/>
+          <w:szCs w:val="17"/>
+        </w:rPr>
+        <w:t xml:space="preserve">„Let’s go around. [Name], what does your character do?“</w:t>
       </w:r>
     </w:p>
     <w:p>
@@ -1658,6 +1769,87 @@
           <w:sz w:val="16"/>
           <w:szCs w:val="16"/>
         </w:rPr>
+        <w:t xml:space="preserve">WENN … DANN (NUR DM)  </w:t>
+      </w:r>
+    </w:p>
+    <w:p>
+      <w:pPr>
+        <w:pBdr>
+          <w:left w:val="single" w:color="BFBFBF" w:sz="18" w:space="8"/>
+        </w:pBdr>
+        <w:shd w:fill="F2F2F2" w:color="auto" w:val="clear"/>
+        <w:spacing w:after="40"/>
+        <w:ind w:left="120"/>
+      </w:pPr>
+      <w:r>
+        <w:rPr>
+          <w:rFonts w:ascii="Georgia" w:cs="Georgia" w:eastAsia="Georgia" w:hAnsi="Georgia"/>
+          <w:b/>
+          <w:bCs/>
+          <w:color w:val="333333"/>
+          <w:sz w:val="17"/>
+          <w:szCs w:val="17"/>
+        </w:rPr>
+        <w:t xml:space="preserve">Jemand antwortet mit einem Satz  →  </w:t>
+      </w:r>
+      <w:r>
+        <w:rPr>
+          <w:rFonts w:ascii="Georgia" w:cs="Georgia" w:eastAsia="Georgia" w:hAnsi="Georgia"/>
+          <w:color w:val="333333"/>
+          <w:sz w:val="17"/>
+          <w:szCs w:val="17"/>
+        </w:rPr>
+        <w:t xml:space="preserve">Marek hakt nach: „What, that’s all? Tell me a bit more.“</w:t>
+      </w:r>
+    </w:p>
+    <w:p>
+      <w:pPr>
+        <w:pBdr>
+          <w:left w:val="single" w:color="BFBFBF" w:sz="18" w:space="8"/>
+        </w:pBdr>
+        <w:shd w:fill="F2F2F2" w:color="auto" w:val="clear"/>
+        <w:spacing w:after="140"/>
+        <w:ind w:left="120"/>
+      </w:pPr>
+      <w:r>
+        <w:rPr>
+          <w:rFonts w:ascii="Georgia" w:cs="Georgia" w:eastAsia="Georgia" w:hAnsi="Georgia"/>
+          <w:b/>
+          <w:bCs/>
+          <w:color w:val="333333"/>
+          <w:sz w:val="17"/>
+          <w:szCs w:val="17"/>
+        </w:rPr>
+        <w:t xml:space="preserve">Alle drei haben zwei bis drei Sätze gesagt  →  </w:t>
+      </w:r>
+      <w:r>
+        <w:rPr>
+          <w:rFonts w:ascii="Georgia" w:cs="Georgia" w:eastAsia="Georgia" w:hAnsi="Georgia"/>
+          <w:color w:val="333333"/>
+          <w:sz w:val="17"/>
+          <w:szCs w:val="17"/>
+        </w:rPr>
+        <w:t xml:space="preserve">Auftrag vorlesen, dann die Ankunft</w:t>
+      </w:r>
+    </w:p>
+    <w:p>
+      <w:pPr>
+        <w:pBdr>
+          <w:left w:val="single" w:color="BFBFBF" w:sz="18" w:space="8"/>
+        </w:pBdr>
+        <w:shd w:fill="F2F2F2" w:color="auto" w:val="clear"/>
+        <w:spacing w:after="40"/>
+        <w:ind w:left="120"/>
+      </w:pPr>
+      <w:r>
+        <w:rPr>
+          <w:rFonts w:ascii="Georgia" w:cs="Georgia" w:eastAsia="Georgia" w:hAnsi="Georgia"/>
+          <w:b/>
+          <w:bCs/>
+          <w:color w:val="555555"/>
+          <w:sz w:val="16"/>
+          <w:szCs w:val="16"/>
+        </w:rPr>
         <w:t xml:space="preserve">OPTIONAL · GELEGENHEITEN FÜR EINZELNE FIGUREN (NUR DM) — nur, falls ein Spieler von selbst darauf kommt  </w:t>
       </w:r>
     </w:p>
@@ -2784,6 +2976,147 @@
           <w:sz w:val="16"/>
           <w:szCs w:val="16"/>
         </w:rPr>
+        <w:t xml:space="preserve">WENN … DANN (NUR DM)  </w:t>
+      </w:r>
+    </w:p>
+    <w:p>
+      <w:pPr>
+        <w:pBdr>
+          <w:left w:val="single" w:color="BFBFBF" w:sz="18" w:space="8"/>
+        </w:pBdr>
+        <w:shd w:fill="F2F2F2" w:color="auto" w:val="clear"/>
+        <w:spacing w:after="40"/>
+        <w:ind w:left="120"/>
+      </w:pPr>
+      <w:r>
+        <w:rPr>
+          <w:rFonts w:ascii="Georgia" w:cs="Georgia" w:eastAsia="Georgia" w:hAnsi="Georgia"/>
+          <w:b/>
+          <w:bCs/>
+          <w:color w:val="333333"/>
+          <w:sz w:val="17"/>
+          <w:szCs w:val="17"/>
+        </w:rPr>
+        <w:t xml:space="preserve">Eine Frage ist gestellt  →  </w:t>
+      </w:r>
+      <w:r>
+        <w:rPr>
+          <w:rFonts w:ascii="Georgia" w:cs="Georgia" w:eastAsia="Georgia" w:hAnsi="Georgia"/>
+          <w:color w:val="333333"/>
+          <w:sz w:val="17"/>
+          <w:szCs w:val="17"/>
+        </w:rPr>
+        <w:t xml:space="preserve">abhaken — jede nur einmal, egal von wem</w:t>
+      </w:r>
+    </w:p>
+    <w:p>
+      <w:pPr>
+        <w:pBdr>
+          <w:left w:val="single" w:color="BFBFBF" w:sz="18" w:space="8"/>
+        </w:pBdr>
+        <w:shd w:fill="F2F2F2" w:color="auto" w:val="clear"/>
+        <w:spacing w:after="40"/>
+        <w:ind w:left="120"/>
+      </w:pPr>
+      <w:r>
+        <w:rPr>
+          <w:rFonts w:ascii="Georgia" w:cs="Georgia" w:eastAsia="Georgia" w:hAnsi="Georgia"/>
+          <w:b/>
+          <w:bCs/>
+          <w:color w:val="333333"/>
+          <w:sz w:val="17"/>
+          <w:szCs w:val="17"/>
+        </w:rPr>
+        <w:t xml:space="preserve">Alle Fragen einer Person sind verbraucht  →  </w:t>
+      </w:r>
+      <w:r>
+        <w:rPr>
+          <w:rFonts w:ascii="Georgia" w:cs="Georgia" w:eastAsia="Georgia" w:hAnsi="Georgia"/>
+          <w:color w:val="333333"/>
+          <w:sz w:val="17"/>
+          <w:szCs w:val="17"/>
+        </w:rPr>
+        <w:t xml:space="preserve">sie schweigt und beachtet die Gruppe nicht mehr</w:t>
+      </w:r>
+    </w:p>
+    <w:p>
+      <w:pPr>
+        <w:pBdr>
+          <w:left w:val="single" w:color="BFBFBF" w:sz="18" w:space="8"/>
+        </w:pBdr>
+        <w:shd w:fill="F2F2F2" w:color="auto" w:val="clear"/>
+        <w:spacing w:after="40"/>
+        <w:ind w:left="120"/>
+      </w:pPr>
+      <w:r>
+        <w:rPr>
+          <w:rFonts w:ascii="Georgia" w:cs="Georgia" w:eastAsia="Georgia" w:hAnsi="Georgia"/>
+          <w:b/>
+          <w:bCs/>
+          <w:color w:val="333333"/>
+          <w:sz w:val="17"/>
+          <w:szCs w:val="17"/>
+        </w:rPr>
+        <w:t xml:space="preserve">Fünf Minuten lang fragt niemand nach Anneke  →  </w:t>
+      </w:r>
+      <w:r>
+        <w:rPr>
+          <w:rFonts w:ascii="Georgia" w:cs="Georgia" w:eastAsia="Georgia" w:hAnsi="Georgia"/>
+          <w:color w:val="333333"/>
+          <w:sz w:val="17"/>
+          <w:szCs w:val="17"/>
+        </w:rPr>
+        <w:t xml:space="preserve">Pieter ruft es quer durch den Raum — Knopf „Anneke ist gefallen“</w:t>
+      </w:r>
+    </w:p>
+    <w:p>
+      <w:pPr>
+        <w:pBdr>
+          <w:left w:val="single" w:color="BFBFBF" w:sz="18" w:space="8"/>
+        </w:pBdr>
+        <w:shd w:fill="F2F2F2" w:color="auto" w:val="clear"/>
+        <w:spacing w:after="140"/>
+        <w:ind w:left="120"/>
+      </w:pPr>
+      <w:r>
+        <w:rPr>
+          <w:rFonts w:ascii="Georgia" w:cs="Georgia" w:eastAsia="Georgia" w:hAnsi="Georgia"/>
+          <w:b/>
+          <w:bCs/>
+          <w:color w:val="333333"/>
+          <w:sz w:val="17"/>
+          <w:szCs w:val="17"/>
+        </w:rPr>
+        <w:t xml:space="preserve">Niemand fragt nach dem Weg  →  </w:t>
+      </w:r>
+      <w:r>
+        <w:rPr>
+          <w:rFonts w:ascii="Georgia" w:cs="Georgia" w:eastAsia="Georgia" w:hAnsi="Georgia"/>
+          <w:color w:val="333333"/>
+          <w:sz w:val="17"/>
+          <w:szCs w:val="17"/>
+        </w:rPr>
+        <w:t xml:space="preserve">Greta legt die Karte hin: „You’ll need this.“</w:t>
+      </w:r>
+    </w:p>
+    <w:p>
+      <w:pPr>
+        <w:pBdr>
+          <w:left w:val="single" w:color="BFBFBF" w:sz="18" w:space="8"/>
+        </w:pBdr>
+        <w:shd w:fill="F2F2F2" w:color="auto" w:val="clear"/>
+        <w:spacing w:after="40"/>
+        <w:ind w:left="120"/>
+      </w:pPr>
+      <w:r>
+        <w:rPr>
+          <w:rFonts w:ascii="Georgia" w:cs="Georgia" w:eastAsia="Georgia" w:hAnsi="Georgia"/>
+          <w:b/>
+          <w:bCs/>
+          <w:color w:val="555555"/>
+          <w:sz w:val="16"/>
+          <w:szCs w:val="16"/>
+        </w:rPr>
         <w:t xml:space="preserve">OPTIONAL · GELEGENHEITEN FÜR EINZELNE FIGUREN (NUR DM) — nur, falls ein Spieler von selbst darauf kommt  </w:t>
       </w:r>
     </w:p>
@@ -3235,6 +3568,87 @@
     </w:p>
     <w:p>
       <w:pPr>
+        <w:pBdr>
+          <w:left w:val="single" w:color="BFBFBF" w:sz="18" w:space="8"/>
+        </w:pBdr>
+        <w:shd w:fill="F2F2F2" w:color="auto" w:val="clear"/>
+        <w:spacing w:after="40"/>
+        <w:ind w:left="120"/>
+      </w:pPr>
+      <w:r>
+        <w:rPr>
+          <w:rFonts w:ascii="Georgia" w:cs="Georgia" w:eastAsia="Georgia" w:hAnsi="Georgia"/>
+          <w:b/>
+          <w:bCs/>
+          <w:color w:val="555555"/>
+          <w:sz w:val="16"/>
+          <w:szCs w:val="16"/>
+        </w:rPr>
+        <w:t xml:space="preserve">WENN … DANN (NUR DM)  </w:t>
+      </w:r>
+    </w:p>
+    <w:p>
+      <w:pPr>
+        <w:pBdr>
+          <w:left w:val="single" w:color="BFBFBF" w:sz="18" w:space="8"/>
+        </w:pBdr>
+        <w:shd w:fill="F2F2F2" w:color="auto" w:val="clear"/>
+        <w:spacing w:after="40"/>
+        <w:ind w:left="120"/>
+      </w:pPr>
+      <w:r>
+        <w:rPr>
+          <w:rFonts w:ascii="Georgia" w:cs="Georgia" w:eastAsia="Georgia" w:hAnsi="Georgia"/>
+          <w:b/>
+          <w:bCs/>
+          <w:color w:val="333333"/>
+          <w:sz w:val="17"/>
+          <w:szCs w:val="17"/>
+        </w:rPr>
+        <w:t xml:space="preserve">Sie streiten  →  </w:t>
+      </w:r>
+      <w:r>
+        <w:rPr>
+          <w:rFonts w:ascii="Georgia" w:cs="Georgia" w:eastAsia="Georgia" w:hAnsi="Georgia"/>
+          <w:color w:val="333333"/>
+          <w:sz w:val="17"/>
+          <w:szCs w:val="17"/>
+        </w:rPr>
+        <w:t xml:space="preserve">„One minute, then we vote.“</w:t>
+      </w:r>
+    </w:p>
+    <w:p>
+      <w:pPr>
+        <w:pBdr>
+          <w:left w:val="single" w:color="BFBFBF" w:sz="18" w:space="8"/>
+        </w:pBdr>
+        <w:shd w:fill="F2F2F2" w:color="auto" w:val="clear"/>
+        <w:spacing w:after="140"/>
+        <w:ind w:left="120"/>
+      </w:pPr>
+      <w:r>
+        <w:rPr>
+          <w:rFonts w:ascii="Georgia" w:cs="Georgia" w:eastAsia="Georgia" w:hAnsi="Georgia"/>
+          <w:b/>
+          <w:bCs/>
+          <w:color w:val="333333"/>
+          <w:sz w:val="17"/>
+          <w:szCs w:val="17"/>
+        </w:rPr>
+        <w:t xml:space="preserve">Die Karte ist geklickt  →  </w:t>
+      </w:r>
+      <w:r>
+        <w:rPr>
+          <w:rFonts w:ascii="Georgia" w:cs="Georgia" w:eastAsia="Georgia" w:hAnsi="Georgia"/>
+          <w:color w:val="333333"/>
+          <w:sz w:val="17"/>
+          <w:szCs w:val="17"/>
+        </w:rPr>
+        <w:t xml:space="preserve">auf den nächsten Seiten steht nur noch dieser Weg</w:t>
+      </w:r>
+    </w:p>
+    <w:p>
+      <w:pPr>
         <w:pStyle w:val="Heading1"/>
         <w:pageBreakBefore/>
         <w:spacing w:after="60" w:before="400"/>
@@ -4822,6 +5236,267 @@
           <w:sz w:val="16"/>
           <w:szCs w:val="16"/>
         </w:rPr>
+        <w:t xml:space="preserve">WENN … DANN (NUR DM)  </w:t>
+      </w:r>
+    </w:p>
+    <w:p>
+      <w:pPr>
+        <w:pBdr>
+          <w:left w:val="single" w:color="BFBFBF" w:sz="18" w:space="8"/>
+        </w:pBdr>
+        <w:shd w:fill="F2F2F2" w:color="auto" w:val="clear"/>
+        <w:spacing w:after="40"/>
+        <w:ind w:left="120"/>
+      </w:pPr>
+      <w:r>
+        <w:rPr>
+          <w:rFonts w:ascii="Georgia" w:cs="Georgia" w:eastAsia="Georgia" w:hAnsi="Georgia"/>
+          <w:b/>
+          <w:bCs/>
+          <w:color w:val="333333"/>
+          <w:sz w:val="17"/>
+          <w:szCs w:val="17"/>
+        </w:rPr>
+        <w:t xml:space="preserve">Nur bei: Weg A · Strasse — Ein Wolf fällt  →  </w:t>
+      </w:r>
+      <w:r>
+        <w:rPr>
+          <w:rFonts w:ascii="Georgia" w:cs="Georgia" w:eastAsia="Georgia" w:hAnsi="Georgia"/>
+          <w:color w:val="333333"/>
+          <w:sz w:val="17"/>
+          <w:szCs w:val="17"/>
+        </w:rPr>
+        <w:t xml:space="preserve">der andere läuft</w:t>
+      </w:r>
+    </w:p>
+    <w:p>
+      <w:pPr>
+        <w:pBdr>
+          <w:left w:val="single" w:color="BFBFBF" w:sz="18" w:space="8"/>
+        </w:pBdr>
+        <w:shd w:fill="F2F2F2" w:color="auto" w:val="clear"/>
+        <w:spacing w:after="40"/>
+        <w:ind w:left="120"/>
+      </w:pPr>
+      <w:r>
+        <w:rPr>
+          <w:rFonts w:ascii="Georgia" w:cs="Georgia" w:eastAsia="Georgia" w:hAnsi="Georgia"/>
+          <w:b/>
+          <w:bCs/>
+          <w:color w:val="333333"/>
+          <w:sz w:val="17"/>
+          <w:szCs w:val="17"/>
+        </w:rPr>
+        <w:t xml:space="preserve">Nur bei: Weg A · Strasse — Sumpf: ein Wurf unter 10  →  </w:t>
+      </w:r>
+      <w:r>
+        <w:rPr>
+          <w:rFonts w:ascii="Georgia" w:cs="Georgia" w:eastAsia="Georgia" w:hAnsi="Georgia"/>
+          <w:color w:val="333333"/>
+          <w:sz w:val="17"/>
+          <w:szCs w:val="17"/>
+        </w:rPr>
+        <w:t xml:space="preserve">−1 HP (rechts eintragen)</w:t>
+      </w:r>
+    </w:p>
+    <w:p>
+      <w:pPr>
+        <w:pBdr>
+          <w:left w:val="single" w:color="BFBFBF" w:sz="18" w:space="8"/>
+        </w:pBdr>
+        <w:shd w:fill="F2F2F2" w:color="auto" w:val="clear"/>
+        <w:spacing w:after="40"/>
+        <w:ind w:left="120"/>
+      </w:pPr>
+      <w:r>
+        <w:rPr>
+          <w:rFonts w:ascii="Georgia" w:cs="Georgia" w:eastAsia="Georgia" w:hAnsi="Georgia"/>
+          <w:b/>
+          <w:bCs/>
+          <w:color w:val="333333"/>
+          <w:sz w:val="17"/>
+          <w:szCs w:val="17"/>
+        </w:rPr>
+        <w:t xml:space="preserve">Nur bei: Weg A · Strasse — Wachen: alle würfeln 10 oder mehr  →  </w:t>
+      </w:r>
+      <w:r>
+        <w:rPr>
+          <w:rFonts w:ascii="Georgia" w:cs="Georgia" w:eastAsia="Georgia" w:hAnsi="Georgia"/>
+          <w:color w:val="333333"/>
+          <w:sz w:val="17"/>
+          <w:szCs w:val="17"/>
+        </w:rPr>
+        <w:t xml:space="preserve">vorbei — weiter bei „Im Hof“</w:t>
+      </w:r>
+    </w:p>
+    <w:p>
+      <w:pPr>
+        <w:pBdr>
+          <w:left w:val="single" w:color="BFBFBF" w:sz="18" w:space="8"/>
+        </w:pBdr>
+        <w:shd w:fill="F2F2F2" w:color="auto" w:val="clear"/>
+        <w:spacing w:after="40"/>
+        <w:ind w:left="120"/>
+      </w:pPr>
+      <w:r>
+        <w:rPr>
+          <w:rFonts w:ascii="Georgia" w:cs="Georgia" w:eastAsia="Georgia" w:hAnsi="Georgia"/>
+          <w:b/>
+          <w:bCs/>
+          <w:color w:val="333333"/>
+          <w:sz w:val="17"/>
+          <w:szCs w:val="17"/>
+        </w:rPr>
+        <w:t xml:space="preserve">Nur bei: Weg A · Strasse — Wachen: einer unter 10, oder jemand greift an  →  </w:t>
+      </w:r>
+      <w:r>
+        <w:rPr>
+          <w:rFonts w:ascii="Georgia" w:cs="Georgia" w:eastAsia="Georgia" w:hAnsi="Georgia"/>
+          <w:color w:val="333333"/>
+          <w:sz w:val="17"/>
+          <w:szCs w:val="17"/>
+        </w:rPr>
+        <w:t xml:space="preserve">Knopf: Kampf mit zwei Wachen, Gefahr +1</w:t>
+      </w:r>
+    </w:p>
+    <w:p>
+      <w:pPr>
+        <w:pBdr>
+          <w:left w:val="single" w:color="BFBFBF" w:sz="18" w:space="8"/>
+        </w:pBdr>
+        <w:shd w:fill="F2F2F2" w:color="auto" w:val="clear"/>
+        <w:spacing w:after="40"/>
+        <w:ind w:left="120"/>
+      </w:pPr>
+      <w:r>
+        <w:rPr>
+          <w:rFonts w:ascii="Georgia" w:cs="Georgia" w:eastAsia="Georgia" w:hAnsi="Georgia"/>
+          <w:b/>
+          <w:bCs/>
+          <w:color w:val="333333"/>
+          <w:sz w:val="17"/>
+          <w:szCs w:val="17"/>
+        </w:rPr>
+        <w:t xml:space="preserve">Nur bei: Weg B · Stollen — Jeder sagt einen ganzen Satz, niemand droht  →  </w:t>
+      </w:r>
+      <w:r>
+        <w:rPr>
+          <w:rFonts w:ascii="Georgia" w:cs="Georgia" w:eastAsia="Georgia" w:hAnsi="Georgia"/>
+          <w:color w:val="333333"/>
+          <w:sz w:val="17"/>
+          <w:szCs w:val="17"/>
+        </w:rPr>
+        <w:t xml:space="preserve">er glaubt euch: „Guests. Of course.“ — hinauf in den Hof</w:t>
+      </w:r>
+    </w:p>
+    <w:p>
+      <w:pPr>
+        <w:pBdr>
+          <w:left w:val="single" w:color="BFBFBF" w:sz="18" w:space="8"/>
+        </w:pBdr>
+        <w:shd w:fill="F2F2F2" w:color="auto" w:val="clear"/>
+        <w:spacing w:after="40"/>
+        <w:ind w:left="120"/>
+      </w:pPr>
+      <w:r>
+        <w:rPr>
+          <w:rFonts w:ascii="Georgia" w:cs="Georgia" w:eastAsia="Georgia" w:hAnsi="Georgia"/>
+          <w:b/>
+          <w:bCs/>
+          <w:color w:val="333333"/>
+          <w:sz w:val="17"/>
+          <w:szCs w:val="17"/>
+        </w:rPr>
+        <w:t xml:space="preserve">Nur bei: Weg B · Stollen — Stottern, Drohung oder Angriff  →  </w:t>
+      </w:r>
+      <w:r>
+        <w:rPr>
+          <w:rFonts w:ascii="Georgia" w:cs="Georgia" w:eastAsia="Georgia" w:hAnsi="Georgia"/>
+          <w:color w:val="333333"/>
+          <w:sz w:val="17"/>
+          <w:szCs w:val="17"/>
+        </w:rPr>
+        <w:t xml:space="preserve">Knopf: Kampf mit der Wache, Gefahr +1</w:t>
+      </w:r>
+    </w:p>
+    <w:p>
+      <w:pPr>
+        <w:pBdr>
+          <w:left w:val="single" w:color="BFBFBF" w:sz="18" w:space="8"/>
+        </w:pBdr>
+        <w:shd w:fill="F2F2F2" w:color="auto" w:val="clear"/>
+        <w:spacing w:after="40"/>
+        <w:ind w:left="120"/>
+      </w:pPr>
+      <w:r>
+        <w:rPr>
+          <w:rFonts w:ascii="Georgia" w:cs="Georgia" w:eastAsia="Georgia" w:hAnsi="Georgia"/>
+          <w:b/>
+          <w:bCs/>
+          <w:color w:val="333333"/>
+          <w:sz w:val="17"/>
+          <w:szCs w:val="17"/>
+        </w:rPr>
+        <w:t xml:space="preserve">Nur bei: Weg C · Kutsche — Jemand spricht Corvin an  →  </w:t>
+      </w:r>
+      <w:r>
+        <w:rPr>
+          <w:rFonts w:ascii="Georgia" w:cs="Georgia" w:eastAsia="Georgia" w:hAnsi="Georgia"/>
+          <w:color w:val="333333"/>
+          <w:sz w:val="17"/>
+          <w:szCs w:val="17"/>
+        </w:rPr>
+        <w:t xml:space="preserve">er fragt freundlich zurück — die Gefahr +4 ist schon eingetragen</w:t>
+      </w:r>
+    </w:p>
+    <w:p>
+      <w:pPr>
+        <w:pBdr>
+          <w:left w:val="single" w:color="BFBFBF" w:sz="18" w:space="8"/>
+        </w:pBdr>
+        <w:shd w:fill="F2F2F2" w:color="auto" w:val="clear"/>
+        <w:spacing w:after="140"/>
+        <w:ind w:left="120"/>
+      </w:pPr>
+      <w:r>
+        <w:rPr>
+          <w:rFonts w:ascii="Georgia" w:cs="Georgia" w:eastAsia="Georgia" w:hAnsi="Georgia"/>
+          <w:b/>
+          <w:bCs/>
+          <w:color w:val="333333"/>
+          <w:sz w:val="17"/>
+          <w:szCs w:val="17"/>
+        </w:rPr>
+        <w:t xml:space="preserve">Nur bei: Weg C · Kutsche — Jemand merkt: kein Spiegelbild, kalte Hände, nie Mirelas Name  →  </w:t>
+      </w:r>
+      <w:r>
+        <w:rPr>
+          <w:rFonts w:ascii="Georgia" w:cs="Georgia" w:eastAsia="Georgia" w:hAnsi="Georgia"/>
+          <w:color w:val="333333"/>
+          <w:sz w:val="17"/>
+          <w:szCs w:val="17"/>
+        </w:rPr>
+        <w:t xml:space="preserve">sag „Yes. You noticed.“ — mehr nicht</w:t>
+      </w:r>
+    </w:p>
+    <w:p>
+      <w:pPr>
+        <w:pBdr>
+          <w:left w:val="single" w:color="BFBFBF" w:sz="18" w:space="8"/>
+        </w:pBdr>
+        <w:shd w:fill="F2F2F2" w:color="auto" w:val="clear"/>
+        <w:spacing w:after="40"/>
+        <w:ind w:left="120"/>
+      </w:pPr>
+      <w:r>
+        <w:rPr>
+          <w:rFonts w:ascii="Georgia" w:cs="Georgia" w:eastAsia="Georgia" w:hAnsi="Georgia"/>
+          <w:b/>
+          <w:bCs/>
+          <w:color w:val="555555"/>
+          <w:sz w:val="16"/>
+          <w:szCs w:val="16"/>
+        </w:rPr>
         <w:t xml:space="preserve">OPTIONAL · GELEGENHEITEN FÜR EINZELNE FIGUREN (NUR DM) — nur, falls ein Spieler von selbst darauf kommt  </w:t>
       </w:r>
     </w:p>
@@ -5799,6 +6474,117 @@
           <w:sz w:val="16"/>
           <w:szCs w:val="16"/>
         </w:rPr>
+        <w:t xml:space="preserve">WENN … DANN (NUR DM)  </w:t>
+      </w:r>
+    </w:p>
+    <w:p>
+      <w:pPr>
+        <w:pBdr>
+          <w:left w:val="single" w:color="BFBFBF" w:sz="18" w:space="8"/>
+        </w:pBdr>
+        <w:shd w:fill="F2F2F2" w:color="auto" w:val="clear"/>
+        <w:spacing w:after="40"/>
+        <w:ind w:left="120"/>
+      </w:pPr>
+      <w:r>
+        <w:rPr>
+          <w:rFonts w:ascii="Georgia" w:cs="Georgia" w:eastAsia="Georgia" w:hAnsi="Georgia"/>
+          <w:b/>
+          <w:bCs/>
+          <w:color w:val="333333"/>
+          <w:sz w:val="17"/>
+          <w:szCs w:val="17"/>
+        </w:rPr>
+        <w:t xml:space="preserve">Jemand nuschelt  →  </w:t>
+      </w:r>
+      <w:r>
+        <w:rPr>
+          <w:rFonts w:ascii="Georgia" w:cs="Georgia" w:eastAsia="Georgia" w:hAnsi="Georgia"/>
+          <w:color w:val="333333"/>
+          <w:sz w:val="17"/>
+          <w:szCs w:val="17"/>
+        </w:rPr>
+        <w:t xml:space="preserve">der Rabe nuschelt zurück — noch einmal, langsam</w:t>
+      </w:r>
+    </w:p>
+    <w:p>
+      <w:pPr>
+        <w:pBdr>
+          <w:left w:val="single" w:color="BFBFBF" w:sz="18" w:space="8"/>
+        </w:pBdr>
+        <w:shd w:fill="F2F2F2" w:color="auto" w:val="clear"/>
+        <w:spacing w:after="40"/>
+        <w:ind w:left="120"/>
+      </w:pPr>
+      <w:r>
+        <w:rPr>
+          <w:rFonts w:ascii="Georgia" w:cs="Georgia" w:eastAsia="Georgia" w:hAnsi="Georgia"/>
+          <w:b/>
+          <w:bCs/>
+          <w:color w:val="333333"/>
+          <w:sz w:val="17"/>
+          <w:szCs w:val="17"/>
+        </w:rPr>
+        <w:t xml:space="preserve">Sie wollen alle drei Türen  →  </w:t>
+      </w:r>
+      <w:r>
+        <w:rPr>
+          <w:rFonts w:ascii="Georgia" w:cs="Georgia" w:eastAsia="Georgia" w:hAnsi="Georgia"/>
+          <w:color w:val="333333"/>
+          <w:sz w:val="17"/>
+          <w:szCs w:val="17"/>
+        </w:rPr>
+        <w:t xml:space="preserve">Nein: „One door. Every minute out here, somebody could look out of a window.“</w:t>
+      </w:r>
+    </w:p>
+    <w:p>
+      <w:pPr>
+        <w:pBdr>
+          <w:left w:val="single" w:color="BFBFBF" w:sz="18" w:space="8"/>
+        </w:pBdr>
+        <w:shd w:fill="F2F2F2" w:color="auto" w:val="clear"/>
+        <w:spacing w:after="140"/>
+        <w:ind w:left="120"/>
+      </w:pPr>
+      <w:r>
+        <w:rPr>
+          <w:rFonts w:ascii="Georgia" w:cs="Georgia" w:eastAsia="Georgia" w:hAnsi="Georgia"/>
+          <w:b/>
+          <w:bCs/>
+          <w:color w:val="333333"/>
+          <w:sz w:val="17"/>
+          <w:szCs w:val="17"/>
+        </w:rPr>
+        <w:t xml:space="preserve">Alle haben mit dem Raben gesprochen und die Türen angesehen  →  </w:t>
+      </w:r>
+      <w:r>
+        <w:rPr>
+          <w:rFonts w:ascii="Georgia" w:cs="Georgia" w:eastAsia="Georgia" w:hAnsi="Georgia"/>
+          <w:color w:val="333333"/>
+          <w:sz w:val="17"/>
+          <w:szCs w:val="17"/>
+        </w:rPr>
+        <w:t xml:space="preserve">weiter zu Entscheidung 2</w:t>
+      </w:r>
+    </w:p>
+    <w:p>
+      <w:pPr>
+        <w:pBdr>
+          <w:left w:val="single" w:color="BFBFBF" w:sz="18" w:space="8"/>
+        </w:pBdr>
+        <w:shd w:fill="F2F2F2" w:color="auto" w:val="clear"/>
+        <w:spacing w:after="40"/>
+        <w:ind w:left="120"/>
+      </w:pPr>
+      <w:r>
+        <w:rPr>
+          <w:rFonts w:ascii="Georgia" w:cs="Georgia" w:eastAsia="Georgia" w:hAnsi="Georgia"/>
+          <w:b/>
+          <w:bCs/>
+          <w:color w:val="555555"/>
+          <w:sz w:val="16"/>
+          <w:szCs w:val="16"/>
+        </w:rPr>
         <w:t xml:space="preserve">OPTIONAL · GELEGENHEITEN FÜR EINZELNE FIGUREN (NUR DM) — nur, falls ein Spieler von selbst darauf kommt  </w:t>
       </w:r>
     </w:p>
@@ -6128,6 +6914,87 @@
     </w:p>
     <w:p>
       <w:pPr>
+        <w:pBdr>
+          <w:left w:val="single" w:color="BFBFBF" w:sz="18" w:space="8"/>
+        </w:pBdr>
+        <w:shd w:fill="F2F2F2" w:color="auto" w:val="clear"/>
+        <w:spacing w:after="40"/>
+        <w:ind w:left="120"/>
+      </w:pPr>
+      <w:r>
+        <w:rPr>
+          <w:rFonts w:ascii="Georgia" w:cs="Georgia" w:eastAsia="Georgia" w:hAnsi="Georgia"/>
+          <w:b/>
+          <w:bCs/>
+          <w:color w:val="555555"/>
+          <w:sz w:val="16"/>
+          <w:szCs w:val="16"/>
+        </w:rPr>
+        <w:t xml:space="preserve">WENN … DANN (NUR DM)  </w:t>
+      </w:r>
+    </w:p>
+    <w:p>
+      <w:pPr>
+        <w:pBdr>
+          <w:left w:val="single" w:color="BFBFBF" w:sz="18" w:space="8"/>
+        </w:pBdr>
+        <w:shd w:fill="F2F2F2" w:color="auto" w:val="clear"/>
+        <w:spacing w:after="40"/>
+        <w:ind w:left="120"/>
+      </w:pPr>
+      <w:r>
+        <w:rPr>
+          <w:rFonts w:ascii="Georgia" w:cs="Georgia" w:eastAsia="Georgia" w:hAnsi="Georgia"/>
+          <w:b/>
+          <w:bCs/>
+          <w:color w:val="333333"/>
+          <w:sz w:val="17"/>
+          <w:szCs w:val="17"/>
+        </w:rPr>
+        <w:t xml:space="preserve">Sie streiten  →  </w:t>
+      </w:r>
+      <w:r>
+        <w:rPr>
+          <w:rFonts w:ascii="Georgia" w:cs="Georgia" w:eastAsia="Georgia" w:hAnsi="Georgia"/>
+          <w:color w:val="333333"/>
+          <w:sz w:val="17"/>
+          <w:szCs w:val="17"/>
+        </w:rPr>
+        <w:t xml:space="preserve">„One minute, then we vote.“</w:t>
+      </w:r>
+    </w:p>
+    <w:p>
+      <w:pPr>
+        <w:pBdr>
+          <w:left w:val="single" w:color="BFBFBF" w:sz="18" w:space="8"/>
+        </w:pBdr>
+        <w:shd w:fill="F2F2F2" w:color="auto" w:val="clear"/>
+        <w:spacing w:after="140"/>
+        <w:ind w:left="120"/>
+      </w:pPr>
+      <w:r>
+        <w:rPr>
+          <w:rFonts w:ascii="Georgia" w:cs="Georgia" w:eastAsia="Georgia" w:hAnsi="Georgia"/>
+          <w:b/>
+          <w:bCs/>
+          <w:color w:val="333333"/>
+          <w:sz w:val="17"/>
+          <w:szCs w:val="17"/>
+        </w:rPr>
+        <w:t xml:space="preserve">Die Karte ist geklickt  →  </w:t>
+      </w:r>
+      <w:r>
+        <w:rPr>
+          <w:rFonts w:ascii="Georgia" w:cs="Georgia" w:eastAsia="Georgia" w:hAnsi="Georgia"/>
+          <w:color w:val="333333"/>
+          <w:sz w:val="17"/>
+          <w:szCs w:val="17"/>
+        </w:rPr>
+        <w:t xml:space="preserve">auf den nächsten Seiten steht nur noch diese Tür</w:t>
+      </w:r>
+    </w:p>
+    <w:p>
+      <w:pPr>
         <w:pStyle w:val="Heading1"/>
         <w:pageBreakBefore/>
         <w:spacing w:after="60" w:before="400"/>
@@ -7543,6 +8410,327 @@
           <w:sz w:val="16"/>
           <w:szCs w:val="16"/>
         </w:rPr>
+        <w:t xml:space="preserve">WENN … DANN (NUR DM)  </w:t>
+      </w:r>
+    </w:p>
+    <w:p>
+      <w:pPr>
+        <w:pBdr>
+          <w:left w:val="single" w:color="BFBFBF" w:sz="18" w:space="8"/>
+        </w:pBdr>
+        <w:shd w:fill="F2F2F2" w:color="auto" w:val="clear"/>
+        <w:spacing w:after="40"/>
+        <w:ind w:left="120"/>
+      </w:pPr>
+      <w:r>
+        <w:rPr>
+          <w:rFonts w:ascii="Georgia" w:cs="Georgia" w:eastAsia="Georgia" w:hAnsi="Georgia"/>
+          <w:b/>
+          <w:bCs/>
+          <w:color w:val="333333"/>
+          <w:sz w:val="17"/>
+          <w:szCs w:val="17"/>
+        </w:rPr>
+        <w:t xml:space="preserve">Nur bei: Tür A · Bibliothek — Drei wahre Sätze je Figur  →  </w:t>
+      </w:r>
+      <w:r>
+        <w:rPr>
+          <w:rFonts w:ascii="Georgia" w:cs="Georgia" w:eastAsia="Georgia" w:hAnsi="Georgia"/>
+          <w:color w:val="333333"/>
+          <w:sz w:val="17"/>
+          <w:szCs w:val="17"/>
+        </w:rPr>
+        <w:t xml:space="preserve">Bellamy führt euch zum Spiegel und gibt euch den Brief</w:t>
+      </w:r>
+    </w:p>
+    <w:p>
+      <w:pPr>
+        <w:pBdr>
+          <w:left w:val="single" w:color="BFBFBF" w:sz="18" w:space="8"/>
+        </w:pBdr>
+        <w:shd w:fill="F2F2F2" w:color="auto" w:val="clear"/>
+        <w:spacing w:after="40"/>
+        <w:ind w:left="120"/>
+      </w:pPr>
+      <w:r>
+        <w:rPr>
+          <w:rFonts w:ascii="Georgia" w:cs="Georgia" w:eastAsia="Georgia" w:hAnsi="Georgia"/>
+          <w:b/>
+          <w:bCs/>
+          <w:color w:val="333333"/>
+          <w:sz w:val="17"/>
+          <w:szCs w:val="17"/>
+        </w:rPr>
+        <w:t xml:space="preserve">Nur bei: Tür A · Bibliothek — Jemand lügt oder beleidigt ihn  →  </w:t>
+      </w:r>
+      <w:r>
+        <w:rPr>
+          <w:rFonts w:ascii="Georgia" w:cs="Georgia" w:eastAsia="Georgia" w:hAnsi="Georgia"/>
+          <w:color w:val="333333"/>
+          <w:sz w:val="17"/>
+          <w:szCs w:val="17"/>
+        </w:rPr>
+        <w:t xml:space="preserve">kein Führer, kein Brief — Block „Ohne Führung“</w:t>
+      </w:r>
+    </w:p>
+    <w:p>
+      <w:pPr>
+        <w:pBdr>
+          <w:left w:val="single" w:color="BFBFBF" w:sz="18" w:space="8"/>
+        </w:pBdr>
+        <w:shd w:fill="F2F2F2" w:color="auto" w:val="clear"/>
+        <w:spacing w:after="40"/>
+        <w:ind w:left="120"/>
+      </w:pPr>
+      <w:r>
+        <w:rPr>
+          <w:rFonts w:ascii="Georgia" w:cs="Georgia" w:eastAsia="Georgia" w:hAnsi="Georgia"/>
+          <w:b/>
+          <w:bCs/>
+          <w:color w:val="333333"/>
+          <w:sz w:val="17"/>
+          <w:szCs w:val="17"/>
+        </w:rPr>
+        <w:t xml:space="preserve">Nur bei: Tür B · Kapelle, nicht: Name Anneke bekannt — Anneke ist auf 8 HP  →  </w:t>
+      </w:r>
+      <w:r>
+        <w:rPr>
+          <w:rFonts w:ascii="Georgia" w:cs="Georgia" w:eastAsia="Georgia" w:hAnsi="Georgia"/>
+          <w:color w:val="333333"/>
+          <w:sz w:val="17"/>
+          <w:szCs w:val="17"/>
+        </w:rPr>
+        <w:t xml:space="preserve">sie hört auf und fragt: „Is Greta still alive?“ — Kampf endet dort</w:t>
+      </w:r>
+    </w:p>
+    <w:p>
+      <w:pPr>
+        <w:pBdr>
+          <w:left w:val="single" w:color="BFBFBF" w:sz="18" w:space="8"/>
+        </w:pBdr>
+        <w:shd w:fill="F2F2F2" w:color="auto" w:val="clear"/>
+        <w:spacing w:after="40"/>
+        <w:ind w:left="120"/>
+      </w:pPr>
+      <w:r>
+        <w:rPr>
+          <w:rFonts w:ascii="Georgia" w:cs="Georgia" w:eastAsia="Georgia" w:hAnsi="Georgia"/>
+          <w:b/>
+          <w:bCs/>
+          <w:color w:val="333333"/>
+          <w:sz w:val="17"/>
+          <w:szCs w:val="17"/>
+        </w:rPr>
+        <w:t xml:space="preserve">Nur bei: Tür B · Kapelle, Name Anneke bekannt — Jemand ruft „Anneke!“  →  </w:t>
+      </w:r>
+      <w:r>
+        <w:rPr>
+          <w:rFonts w:ascii="Georgia" w:cs="Georgia" w:eastAsia="Georgia" w:hAnsi="Georgia"/>
+          <w:color w:val="333333"/>
+          <w:sz w:val="17"/>
+          <w:szCs w:val="17"/>
+        </w:rPr>
+        <w:t xml:space="preserve">kein Kampf — sie zeigt die Treppe hinter dem Altar</w:t>
+      </w:r>
+    </w:p>
+    <w:p>
+      <w:pPr>
+        <w:pBdr>
+          <w:left w:val="single" w:color="BFBFBF" w:sz="18" w:space="8"/>
+        </w:pBdr>
+        <w:shd w:fill="F2F2F2" w:color="auto" w:val="clear"/>
+        <w:spacing w:after="40"/>
+        <w:ind w:left="120"/>
+      </w:pPr>
+      <w:r>
+        <w:rPr>
+          <w:rFonts w:ascii="Georgia" w:cs="Georgia" w:eastAsia="Georgia" w:hAnsi="Georgia"/>
+          <w:b/>
+          <w:bCs/>
+          <w:color w:val="333333"/>
+          <w:sz w:val="17"/>
+          <w:szCs w:val="17"/>
+        </w:rPr>
+        <w:t xml:space="preserve">Nur bei: Tür C · Küche — Ehrliche Antwort auf Tams Frage — auch ein ehrliches Nein  →  </w:t>
+      </w:r>
+      <w:r>
+        <w:rPr>
+          <w:rFonts w:ascii="Georgia" w:cs="Georgia" w:eastAsia="Georgia" w:hAnsi="Georgia"/>
+          <w:color w:val="333333"/>
+          <w:sz w:val="17"/>
+          <w:szCs w:val="17"/>
+        </w:rPr>
+        <w:t xml:space="preserve">Tam führt euch zum Spiegel</w:t>
+      </w:r>
+    </w:p>
+    <w:p>
+      <w:pPr>
+        <w:pBdr>
+          <w:left w:val="single" w:color="BFBFBF" w:sz="18" w:space="8"/>
+        </w:pBdr>
+        <w:shd w:fill="F2F2F2" w:color="auto" w:val="clear"/>
+        <w:spacing w:after="40"/>
+        <w:ind w:left="120"/>
+      </w:pPr>
+      <w:r>
+        <w:rPr>
+          <w:rFonts w:ascii="Georgia" w:cs="Georgia" w:eastAsia="Georgia" w:hAnsi="Georgia"/>
+          <w:b/>
+          <w:bCs/>
+          <w:color w:val="333333"/>
+          <w:sz w:val="17"/>
+          <w:szCs w:val="17"/>
+        </w:rPr>
+        <w:t xml:space="preserve">Nur bei: Tür C · Küche — Jemand lügt ihn an oder fährt ihn an  →  </w:t>
+      </w:r>
+      <w:r>
+        <w:rPr>
+          <w:rFonts w:ascii="Georgia" w:cs="Georgia" w:eastAsia="Georgia" w:hAnsi="Georgia"/>
+          <w:color w:val="333333"/>
+          <w:sz w:val="17"/>
+          <w:szCs w:val="17"/>
+        </w:rPr>
+        <w:t xml:space="preserve">„Find it yourselves.“ — kein Führer, Block „Ohne Führung“</w:t>
+      </w:r>
+    </w:p>
+    <w:p>
+      <w:pPr>
+        <w:pBdr>
+          <w:left w:val="single" w:color="BFBFBF" w:sz="18" w:space="8"/>
+        </w:pBdr>
+        <w:shd w:fill="F2F2F2" w:color="auto" w:val="clear"/>
+        <w:spacing w:after="40"/>
+        <w:ind w:left="120"/>
+      </w:pPr>
+      <w:r>
+        <w:rPr>
+          <w:rFonts w:ascii="Georgia" w:cs="Georgia" w:eastAsia="Georgia" w:hAnsi="Georgia"/>
+          <w:b/>
+          <w:bCs/>
+          <w:color w:val="333333"/>
+          <w:sz w:val="17"/>
+          <w:szCs w:val="17"/>
+        </w:rPr>
+        <w:t xml:space="preserve">Nur bei: Tür C · Küche — Jemand bedroht ihn oder stösst ihn weg  →  </w:t>
+      </w:r>
+      <w:r>
+        <w:rPr>
+          <w:rFonts w:ascii="Georgia" w:cs="Georgia" w:eastAsia="Georgia" w:hAnsi="Georgia"/>
+          <w:color w:val="333333"/>
+          <w:sz w:val="17"/>
+          <w:szCs w:val="17"/>
+        </w:rPr>
+        <w:t xml:space="preserve">er schreit: Gefahr +3 (rechts)</w:t>
+      </w:r>
+    </w:p>
+    <w:p>
+      <w:pPr>
+        <w:pBdr>
+          <w:left w:val="single" w:color="BFBFBF" w:sz="18" w:space="8"/>
+        </w:pBdr>
+        <w:shd w:fill="F2F2F2" w:color="auto" w:val="clear"/>
+        <w:spacing w:after="40"/>
+        <w:ind w:left="120"/>
+      </w:pPr>
+      <w:r>
+        <w:rPr>
+          <w:rFonts w:ascii="Georgia" w:cs="Georgia" w:eastAsia="Georgia" w:hAnsi="Georgia"/>
+          <w:b/>
+          <w:bCs/>
+          <w:color w:val="333333"/>
+          <w:sz w:val="17"/>
+          <w:szCs w:val="17"/>
+        </w:rPr>
+        <w:t xml:space="preserve">Nur bei: Tür A · Bibliothek, Tür C · Küche — Ohne Führung: mindestens eine 10 im Wurf  →  </w:t>
+      </w:r>
+      <w:r>
+        <w:rPr>
+          <w:rFonts w:ascii="Georgia" w:cs="Georgia" w:eastAsia="Georgia" w:hAnsi="Georgia"/>
+          <w:color w:val="333333"/>
+          <w:sz w:val="17"/>
+          <w:szCs w:val="17"/>
+        </w:rPr>
+        <w:t xml:space="preserve">sie finden den Westgang leise</w:t>
+      </w:r>
+    </w:p>
+    <w:p>
+      <w:pPr>
+        <w:pBdr>
+          <w:left w:val="single" w:color="BFBFBF" w:sz="18" w:space="8"/>
+        </w:pBdr>
+        <w:shd w:fill="F2F2F2" w:color="auto" w:val="clear"/>
+        <w:spacing w:after="40"/>
+        <w:ind w:left="120"/>
+      </w:pPr>
+      <w:r>
+        <w:rPr>
+          <w:rFonts w:ascii="Georgia" w:cs="Georgia" w:eastAsia="Georgia" w:hAnsi="Georgia"/>
+          <w:b/>
+          <w:bCs/>
+          <w:color w:val="333333"/>
+          <w:sz w:val="17"/>
+          <w:szCs w:val="17"/>
+        </w:rPr>
+        <w:t xml:space="preserve">Nur bei: Tür A · Bibliothek, Tür C · Küche — Ohne Führung: keine 10  →  </w:t>
+      </w:r>
+      <w:r>
+        <w:rPr>
+          <w:rFonts w:ascii="Georgia" w:cs="Georgia" w:eastAsia="Georgia" w:hAnsi="Georgia"/>
+          <w:color w:val="333333"/>
+          <w:sz w:val="17"/>
+          <w:szCs w:val="17"/>
+        </w:rPr>
+        <w:t xml:space="preserve">sie finden ihn trotzdem — Gefahr +1</w:t>
+      </w:r>
+    </w:p>
+    <w:p>
+      <w:pPr>
+        <w:pBdr>
+          <w:left w:val="single" w:color="BFBFBF" w:sz="18" w:space="8"/>
+        </w:pBdr>
+        <w:shd w:fill="F2F2F2" w:color="auto" w:val="clear"/>
+        <w:spacing w:after="140"/>
+        <w:ind w:left="120"/>
+      </w:pPr>
+      <w:r>
+        <w:rPr>
+          <w:rFonts w:ascii="Georgia" w:cs="Georgia" w:eastAsia="Georgia" w:hAnsi="Georgia"/>
+          <w:b/>
+          <w:bCs/>
+          <w:color w:val="333333"/>
+          <w:sz w:val="17"/>
+          <w:szCs w:val="17"/>
+        </w:rPr>
+        <w:t xml:space="preserve">Jemand sieht in den Spiegel  →  </w:t>
+      </w:r>
+      <w:r>
+        <w:rPr>
+          <w:rFonts w:ascii="Georgia" w:cs="Georgia" w:eastAsia="Georgia" w:hAnsi="Georgia"/>
+          <w:color w:val="333333"/>
+          <w:sz w:val="17"/>
+          <w:szCs w:val="17"/>
+        </w:rPr>
+        <w:t xml:space="preserve">„Nobody who looked has ever told anyone.“ — kein Schaden</w:t>
+      </w:r>
+    </w:p>
+    <w:p>
+      <w:pPr>
+        <w:pBdr>
+          <w:left w:val="single" w:color="BFBFBF" w:sz="18" w:space="8"/>
+        </w:pBdr>
+        <w:shd w:fill="F2F2F2" w:color="auto" w:val="clear"/>
+        <w:spacing w:after="40"/>
+        <w:ind w:left="120"/>
+      </w:pPr>
+      <w:r>
+        <w:rPr>
+          <w:rFonts w:ascii="Georgia" w:cs="Georgia" w:eastAsia="Georgia" w:hAnsi="Georgia"/>
+          <w:b/>
+          <w:bCs/>
+          <w:color w:val="555555"/>
+          <w:sz w:val="16"/>
+          <w:szCs w:val="16"/>
+        </w:rPr>
         <w:t xml:space="preserve">OPTIONAL · GELEGENHEITEN FÜR EINZELNE FIGUREN (NUR DM) — nur, falls ein Spieler von selbst darauf kommt  </w:t>
       </w:r>
     </w:p>
@@ -8524,6 +9712,117 @@
           <w:sz w:val="16"/>
           <w:szCs w:val="16"/>
         </w:rPr>
+        <w:t xml:space="preserve">WENN … DANN (NUR DM)  </w:t>
+      </w:r>
+    </w:p>
+    <w:p>
+      <w:pPr>
+        <w:pBdr>
+          <w:left w:val="single" w:color="BFBFBF" w:sz="18" w:space="8"/>
+        </w:pBdr>
+        <w:shd w:fill="F2F2F2" w:color="auto" w:val="clear"/>
+        <w:spacing w:after="40"/>
+        <w:ind w:left="120"/>
+      </w:pPr>
+      <w:r>
+        <w:rPr>
+          <w:rFonts w:ascii="Georgia" w:cs="Georgia" w:eastAsia="Georgia" w:hAnsi="Georgia"/>
+          <w:b/>
+          <w:bCs/>
+          <w:color w:val="333333"/>
+          <w:sz w:val="17"/>
+          <w:szCs w:val="17"/>
+        </w:rPr>
+        <w:t xml:space="preserve">Nur „wir retten dich“  →  </w:t>
+      </w:r>
+      <w:r>
+        <w:rPr>
+          <w:rFonts w:ascii="Georgia" w:cs="Georgia" w:eastAsia="Georgia" w:hAnsi="Georgia"/>
+          <w:color w:val="333333"/>
+          <w:sz w:val="17"/>
+          <w:szCs w:val="17"/>
+        </w:rPr>
+        <w:t xml:space="preserve">Mirela bleibt sitzen und widerspricht</w:t>
+      </w:r>
+    </w:p>
+    <w:p>
+      <w:pPr>
+        <w:pBdr>
+          <w:left w:val="single" w:color="BFBFBF" w:sz="18" w:space="8"/>
+        </w:pBdr>
+        <w:shd w:fill="F2F2F2" w:color="auto" w:val="clear"/>
+        <w:spacing w:after="40"/>
+        <w:ind w:left="120"/>
+      </w:pPr>
+      <w:r>
+        <w:rPr>
+          <w:rFonts w:ascii="Georgia" w:cs="Georgia" w:eastAsia="Georgia" w:hAnsi="Georgia"/>
+          <w:b/>
+          <w:bCs/>
+          <w:color w:val="333333"/>
+          <w:sz w:val="17"/>
+          <w:szCs w:val="17"/>
+        </w:rPr>
+        <w:t xml:space="preserve">Ein echter Grund je Figur  →  </w:t>
+      </w:r>
+      <w:r>
+        <w:rPr>
+          <w:rFonts w:ascii="Georgia" w:cs="Georgia" w:eastAsia="Georgia" w:hAnsi="Georgia"/>
+          <w:color w:val="333333"/>
+          <w:sz w:val="17"/>
+          <w:szCs w:val="17"/>
+        </w:rPr>
+        <w:t xml:space="preserve">sie hört zu — weiter zur letzten Entscheidung</w:t>
+      </w:r>
+    </w:p>
+    <w:p>
+      <w:pPr>
+        <w:pBdr>
+          <w:left w:val="single" w:color="BFBFBF" w:sz="18" w:space="8"/>
+        </w:pBdr>
+        <w:shd w:fill="F2F2F2" w:color="auto" w:val="clear"/>
+        <w:spacing w:after="140"/>
+        <w:ind w:left="120"/>
+      </w:pPr>
+      <w:r>
+        <w:rPr>
+          <w:rFonts w:ascii="Georgia" w:cs="Georgia" w:eastAsia="Georgia" w:hAnsi="Georgia"/>
+          <w:b/>
+          <w:bCs/>
+          <w:color w:val="333333"/>
+          <w:sz w:val="17"/>
+          <w:szCs w:val="17"/>
+        </w:rPr>
+        <w:t xml:space="preserve">Nur bei: Weg C · Kutsche — Sie sagen ihr, dass sie die Kutsche genommen haben  →  </w:t>
+      </w:r>
+      <w:r>
+        <w:rPr>
+          <w:rFonts w:ascii="Georgia" w:cs="Georgia" w:eastAsia="Georgia" w:hAnsi="Georgia"/>
+          <w:color w:val="333333"/>
+          <w:sz w:val="17"/>
+          <w:szCs w:val="17"/>
+        </w:rPr>
+        <w:t xml:space="preserve">„Then Corvin has become slow.“</w:t>
+      </w:r>
+    </w:p>
+    <w:p>
+      <w:pPr>
+        <w:pBdr>
+          <w:left w:val="single" w:color="BFBFBF" w:sz="18" w:space="8"/>
+        </w:pBdr>
+        <w:shd w:fill="F2F2F2" w:color="auto" w:val="clear"/>
+        <w:spacing w:after="40"/>
+        <w:ind w:left="120"/>
+      </w:pPr>
+      <w:r>
+        <w:rPr>
+          <w:rFonts w:ascii="Georgia" w:cs="Georgia" w:eastAsia="Georgia" w:hAnsi="Georgia"/>
+          <w:b/>
+          <w:bCs/>
+          <w:color w:val="555555"/>
+          <w:sz w:val="16"/>
+          <w:szCs w:val="16"/>
+        </w:rPr>
         <w:t xml:space="preserve">OPTIONAL · GELEGENHEITEN FÜR EINZELNE FIGUREN (NUR DM) — nur, falls ein Spieler von selbst darauf kommt  </w:t>
       </w:r>
     </w:p>
@@ -8954,6 +10253,87 @@
     </w:p>
     <w:p>
       <w:pPr>
+        <w:pBdr>
+          <w:left w:val="single" w:color="BFBFBF" w:sz="18" w:space="8"/>
+        </w:pBdr>
+        <w:shd w:fill="F2F2F2" w:color="auto" w:val="clear"/>
+        <w:spacing w:after="40"/>
+        <w:ind w:left="120"/>
+      </w:pPr>
+      <w:r>
+        <w:rPr>
+          <w:rFonts w:ascii="Georgia" w:cs="Georgia" w:eastAsia="Georgia" w:hAnsi="Georgia"/>
+          <w:b/>
+          <w:bCs/>
+          <w:color w:val="555555"/>
+          <w:sz w:val="16"/>
+          <w:szCs w:val="16"/>
+        </w:rPr>
+        <w:t xml:space="preserve">WENN … DANN (NUR DM)  </w:t>
+      </w:r>
+    </w:p>
+    <w:p>
+      <w:pPr>
+        <w:pBdr>
+          <w:left w:val="single" w:color="BFBFBF" w:sz="18" w:space="8"/>
+        </w:pBdr>
+        <w:shd w:fill="F2F2F2" w:color="auto" w:val="clear"/>
+        <w:spacing w:after="40"/>
+        <w:ind w:left="120"/>
+      </w:pPr>
+      <w:r>
+        <w:rPr>
+          <w:rFonts w:ascii="Georgia" w:cs="Georgia" w:eastAsia="Georgia" w:hAnsi="Georgia"/>
+          <w:b/>
+          <w:bCs/>
+          <w:color w:val="333333"/>
+          <w:sz w:val="17"/>
+          <w:szCs w:val="17"/>
+        </w:rPr>
+        <w:t xml:space="preserve">Sie entscheiden vor Mirela  →  </w:t>
+      </w:r>
+      <w:r>
+        <w:rPr>
+          <w:rFonts w:ascii="Georgia" w:cs="Georgia" w:eastAsia="Georgia" w:hAnsi="Georgia"/>
+          <w:color w:val="333333"/>
+          <w:sz w:val="17"/>
+          <w:szCs w:val="17"/>
+        </w:rPr>
+        <w:t xml:space="preserve">sie widerspricht — der beste Dialog des Abends</w:t>
+      </w:r>
+    </w:p>
+    <w:p>
+      <w:pPr>
+        <w:pBdr>
+          <w:left w:val="single" w:color="BFBFBF" w:sz="18" w:space="8"/>
+        </w:pBdr>
+        <w:shd w:fill="F2F2F2" w:color="auto" w:val="clear"/>
+        <w:spacing w:after="140"/>
+        <w:ind w:left="120"/>
+      </w:pPr>
+      <w:r>
+        <w:rPr>
+          <w:rFonts w:ascii="Georgia" w:cs="Georgia" w:eastAsia="Georgia" w:hAnsi="Georgia"/>
+          <w:b/>
+          <w:bCs/>
+          <w:color w:val="333333"/>
+          <w:sz w:val="17"/>
+          <w:szCs w:val="17"/>
+        </w:rPr>
+        <w:t xml:space="preserve">Die Karte ist geklickt  →  </w:t>
+      </w:r>
+      <w:r>
+        <w:rPr>
+          <w:rFonts w:ascii="Georgia" w:cs="Georgia" w:eastAsia="Georgia" w:hAnsi="Georgia"/>
+          <w:color w:val="333333"/>
+          <w:sz w:val="17"/>
+          <w:szCs w:val="17"/>
+        </w:rPr>
+        <w:t xml:space="preserve">im Finale steht nur noch dieser Fall</w:t>
+      </w:r>
+    </w:p>
+    <w:p>
+      <w:pPr>
         <w:pStyle w:val="Heading1"/>
         <w:pageBreakBefore/>
         <w:spacing w:after="60" w:before="400"/>
@@ -10205,6 +11585,177 @@
           <w:sz w:val="16"/>
           <w:szCs w:val="16"/>
         </w:rPr>
+        <w:t xml:space="preserve">WENN … DANN (NUR DM)  </w:t>
+      </w:r>
+    </w:p>
+    <w:p>
+      <w:pPr>
+        <w:pBdr>
+          <w:left w:val="single" w:color="BFBFBF" w:sz="18" w:space="8"/>
+        </w:pBdr>
+        <w:shd w:fill="F2F2F2" w:color="auto" w:val="clear"/>
+        <w:spacing w:after="40"/>
+        <w:ind w:left="120"/>
+      </w:pPr>
+      <w:r>
+        <w:rPr>
+          <w:rFonts w:ascii="Georgia" w:cs="Georgia" w:eastAsia="Georgia" w:hAnsi="Georgia"/>
+          <w:b/>
+          <w:bCs/>
+          <w:color w:val="333333"/>
+          <w:sz w:val="17"/>
+          <w:szCs w:val="17"/>
+        </w:rPr>
+        <w:t xml:space="preserve">Nur bei: Wahl C · Angebot — Das Angebot kostet die Gruppe etwas Echtes  →  </w:t>
+      </w:r>
+      <w:r>
+        <w:rPr>
+          <w:rFonts w:ascii="Georgia" w:cs="Georgia" w:eastAsia="Georgia" w:hAnsi="Georgia"/>
+          <w:color w:val="333333"/>
+          <w:sz w:val="17"/>
+          <w:szCs w:val="17"/>
+        </w:rPr>
+        <w:t xml:space="preserve">er nimmt an — unten „Ein neuer Vertrag“, kein Kampf</w:t>
+      </w:r>
+    </w:p>
+    <w:p>
+      <w:pPr>
+        <w:pBdr>
+          <w:left w:val="single" w:color="BFBFBF" w:sz="18" w:space="8"/>
+        </w:pBdr>
+        <w:shd w:fill="F2F2F2" w:color="auto" w:val="clear"/>
+        <w:spacing w:after="40"/>
+        <w:ind w:left="120"/>
+      </w:pPr>
+      <w:r>
+        <w:rPr>
+          <w:rFonts w:ascii="Georgia" w:cs="Georgia" w:eastAsia="Georgia" w:hAnsi="Georgia"/>
+          <w:b/>
+          <w:bCs/>
+          <w:color w:val="333333"/>
+          <w:sz w:val="17"/>
+          <w:szCs w:val="17"/>
+        </w:rPr>
+        <w:t xml:space="preserve">Nur bei: Wahl C · Angebot — Drohung, Beleidigung, „we’ll kill you anyway“  →  </w:t>
+      </w:r>
+      <w:r>
+        <w:rPr>
+          <w:rFonts w:ascii="Georgia" w:cs="Georgia" w:eastAsia="Georgia" w:hAnsi="Georgia"/>
+          <w:color w:val="333333"/>
+          <w:sz w:val="17"/>
+          <w:szCs w:val="17"/>
+        </w:rPr>
+        <w:t xml:space="preserve">Knopf: Gefahr +4, Kampf</w:t>
+      </w:r>
+    </w:p>
+    <w:p>
+      <w:pPr>
+        <w:pBdr>
+          <w:left w:val="single" w:color="BFBFBF" w:sz="18" w:space="8"/>
+        </w:pBdr>
+        <w:shd w:fill="F2F2F2" w:color="auto" w:val="clear"/>
+        <w:spacing w:after="40"/>
+        <w:ind w:left="120"/>
+      </w:pPr>
+      <w:r>
+        <w:rPr>
+          <w:rFonts w:ascii="Georgia" w:cs="Georgia" w:eastAsia="Georgia" w:hAnsi="Georgia"/>
+          <w:b/>
+          <w:bCs/>
+          <w:color w:val="333333"/>
+          <w:sz w:val="17"/>
+          <w:szCs w:val="17"/>
+        </w:rPr>
+        <w:t xml:space="preserve">Vaskir unter 15 HP  →  </w:t>
+      </w:r>
+      <w:r>
+        <w:rPr>
+          <w:rFonts w:ascii="Georgia" w:cs="Georgia" w:eastAsia="Georgia" w:hAnsi="Georgia"/>
+          <w:color w:val="333333"/>
+          <w:sz w:val="17"/>
+          <w:szCs w:val="17"/>
+        </w:rPr>
+        <w:t xml:space="preserve">er hört auf und redet: töten, Vertrag oder gehen lassen</w:t>
+      </w:r>
+    </w:p>
+    <w:p>
+      <w:pPr>
+        <w:pBdr>
+          <w:left w:val="single" w:color="BFBFBF" w:sz="18" w:space="8"/>
+        </w:pBdr>
+        <w:shd w:fill="F2F2F2" w:color="auto" w:val="clear"/>
+        <w:spacing w:after="40"/>
+        <w:ind w:left="120"/>
+      </w:pPr>
+      <w:r>
+        <w:rPr>
+          <w:rFonts w:ascii="Georgia" w:cs="Georgia" w:eastAsia="Georgia" w:hAnsi="Georgia"/>
+          <w:b/>
+          <w:bCs/>
+          <w:color w:val="333333"/>
+          <w:sz w:val="17"/>
+          <w:szCs w:val="17"/>
+        </w:rPr>
+        <w:t xml:space="preserve">Eine Figur fällt auf 0  →  </w:t>
+      </w:r>
+      <w:r>
+        <w:rPr>
+          <w:rFonts w:ascii="Georgia" w:cs="Georgia" w:eastAsia="Georgia" w:hAnsi="Georgia"/>
+          <w:color w:val="333333"/>
+          <w:sz w:val="17"/>
+          <w:szCs w:val="17"/>
+        </w:rPr>
+        <w:t xml:space="preserve">Trank — oder liegen bis nach dem Kampf</w:t>
+      </w:r>
+    </w:p>
+    <w:p>
+      <w:pPr>
+        <w:pBdr>
+          <w:left w:val="single" w:color="BFBFBF" w:sz="18" w:space="8"/>
+        </w:pBdr>
+        <w:shd w:fill="F2F2F2" w:color="auto" w:val="clear"/>
+        <w:spacing w:after="140"/>
+        <w:ind w:left="120"/>
+      </w:pPr>
+      <w:r>
+        <w:rPr>
+          <w:rFonts w:ascii="Georgia" w:cs="Georgia" w:eastAsia="Georgia" w:hAnsi="Georgia"/>
+          <w:b/>
+          <w:bCs/>
+          <w:color w:val="333333"/>
+          <w:sz w:val="17"/>
+          <w:szCs w:val="17"/>
+        </w:rPr>
+        <w:t xml:space="preserve">Der Kampf ist entschieden  →  </w:t>
+      </w:r>
+      <w:r>
+        <w:rPr>
+          <w:rFonts w:ascii="Georgia" w:cs="Georgia" w:eastAsia="Georgia" w:hAnsi="Georgia"/>
+          <w:color w:val="333333"/>
+          <w:sz w:val="17"/>
+          <w:szCs w:val="17"/>
+        </w:rPr>
+        <w:t xml:space="preserve">unten eintragen, wie es ausging</w:t>
+      </w:r>
+    </w:p>
+    <w:p>
+      <w:pPr>
+        <w:pBdr>
+          <w:left w:val="single" w:color="BFBFBF" w:sz="18" w:space="8"/>
+        </w:pBdr>
+        <w:shd w:fill="F2F2F2" w:color="auto" w:val="clear"/>
+        <w:spacing w:after="40"/>
+        <w:ind w:left="120"/>
+      </w:pPr>
+      <w:r>
+        <w:rPr>
+          <w:rFonts w:ascii="Georgia" w:cs="Georgia" w:eastAsia="Georgia" w:hAnsi="Georgia"/>
+          <w:b/>
+          <w:bCs/>
+          <w:color w:val="555555"/>
+          <w:sz w:val="16"/>
+          <w:szCs w:val="16"/>
+        </w:rPr>
         <w:t xml:space="preserve">OPTIONAL · GELEGENHEITEN FÜR EINZELNE FIGUREN (NUR DM) — nur, falls ein Spieler von selbst darauf kommt  </w:t>
       </w:r>
     </w:p>
@@ -11136,6 +12687,147 @@
     </w:p>
     <w:p>
       <w:pPr>
+        <w:pBdr>
+          <w:left w:val="single" w:color="BFBFBF" w:sz="18" w:space="8"/>
+        </w:pBdr>
+        <w:shd w:fill="F2F2F2" w:color="auto" w:val="clear"/>
+        <w:spacing w:after="40"/>
+        <w:ind w:left="120"/>
+      </w:pPr>
+      <w:r>
+        <w:rPr>
+          <w:rFonts w:ascii="Georgia" w:cs="Georgia" w:eastAsia="Georgia" w:hAnsi="Georgia"/>
+          <w:b/>
+          <w:bCs/>
+          <w:color w:val="555555"/>
+          <w:sz w:val="16"/>
+          <w:szCs w:val="16"/>
+        </w:rPr>
+        <w:t xml:space="preserve">WENN … DANN (NUR DM)  </w:t>
+      </w:r>
+    </w:p>
+    <w:p>
+      <w:pPr>
+        <w:pBdr>
+          <w:left w:val="single" w:color="BFBFBF" w:sz="18" w:space="8"/>
+        </w:pBdr>
+        <w:shd w:fill="F2F2F2" w:color="auto" w:val="clear"/>
+        <w:spacing w:after="40"/>
+        <w:ind w:left="120"/>
+      </w:pPr>
+      <w:r>
+        <w:rPr>
+          <w:rFonts w:ascii="Georgia" w:cs="Georgia" w:eastAsia="Georgia" w:hAnsi="Georgia"/>
+          <w:b/>
+          <w:bCs/>
+          <w:color w:val="333333"/>
+          <w:sz w:val="17"/>
+          <w:szCs w:val="17"/>
+        </w:rPr>
+        <w:t xml:space="preserve">Nur bei: Tür C · Küche — Versprechen gehalten  →  </w:t>
+      </w:r>
+      <w:r>
+        <w:rPr>
+          <w:rFonts w:ascii="Georgia" w:cs="Georgia" w:eastAsia="Georgia" w:hAnsi="Georgia"/>
+          <w:color w:val="333333"/>
+          <w:sz w:val="17"/>
+          <w:szCs w:val="17"/>
+        </w:rPr>
+        <w:t xml:space="preserve">Tam kocht ab heute im Wirtshaus</w:t>
+      </w:r>
+    </w:p>
+    <w:p>
+      <w:pPr>
+        <w:pBdr>
+          <w:left w:val="single" w:color="BFBFBF" w:sz="18" w:space="8"/>
+        </w:pBdr>
+        <w:shd w:fill="F2F2F2" w:color="auto" w:val="clear"/>
+        <w:spacing w:after="40"/>
+        <w:ind w:left="120"/>
+      </w:pPr>
+      <w:r>
+        <w:rPr>
+          <w:rFonts w:ascii="Georgia" w:cs="Georgia" w:eastAsia="Georgia" w:hAnsi="Georgia"/>
+          <w:b/>
+          <w:bCs/>
+          <w:color w:val="333333"/>
+          <w:sz w:val="17"/>
+          <w:szCs w:val="17"/>
+        </w:rPr>
+        <w:t xml:space="preserve">Nur bei: Tür C · Küche — Versprechen gebrochen  →  </w:t>
+      </w:r>
+      <w:r>
+        <w:rPr>
+          <w:rFonts w:ascii="Georgia" w:cs="Georgia" w:eastAsia="Georgia" w:hAnsi="Georgia"/>
+          <w:color w:val="333333"/>
+          <w:sz w:val="17"/>
+          <w:szCs w:val="17"/>
+        </w:rPr>
+        <w:t xml:space="preserve">beiläufig sagen, ohne Vorwurf</w:t>
+      </w:r>
+    </w:p>
+    <w:p>
+      <w:pPr>
+        <w:pBdr>
+          <w:left w:val="single" w:color="BFBFBF" w:sz="18" w:space="8"/>
+        </w:pBdr>
+        <w:shd w:fill="F2F2F2" w:color="auto" w:val="clear"/>
+        <w:spacing w:after="40"/>
+        <w:ind w:left="120"/>
+      </w:pPr>
+      <w:r>
+        <w:rPr>
+          <w:rFonts w:ascii="Georgia" w:cs="Georgia" w:eastAsia="Georgia" w:hAnsi="Georgia"/>
+          <w:b/>
+          <w:bCs/>
+          <w:color w:val="333333"/>
+          <w:sz w:val="17"/>
+          <w:szCs w:val="17"/>
+        </w:rPr>
+        <w:t xml:space="preserve">Nur bei: Tür A · Bibliothek — Brief eingeworfen  →  </w:t>
+      </w:r>
+      <w:r>
+        <w:rPr>
+          <w:rFonts w:ascii="Georgia" w:cs="Georgia" w:eastAsia="Georgia" w:hAnsi="Georgia"/>
+          <w:color w:val="333333"/>
+          <w:sz w:val="17"/>
+          <w:szCs w:val="17"/>
+        </w:rPr>
+        <w:t xml:space="preserve">nach zwei Wochen eine Antwort im Gepäck</w:t>
+      </w:r>
+    </w:p>
+    <w:p>
+      <w:pPr>
+        <w:pBdr>
+          <w:left w:val="single" w:color="BFBFBF" w:sz="18" w:space="8"/>
+        </w:pBdr>
+        <w:shd w:fill="F2F2F2" w:color="auto" w:val="clear"/>
+        <w:spacing w:after="140"/>
+        <w:ind w:left="120"/>
+      </w:pPr>
+      <w:r>
+        <w:rPr>
+          <w:rFonts w:ascii="Georgia" w:cs="Georgia" w:eastAsia="Georgia" w:hAnsi="Georgia"/>
+          <w:b/>
+          <w:bCs/>
+          <w:color w:val="333333"/>
+          <w:sz w:val="17"/>
+          <w:szCs w:val="17"/>
+        </w:rPr>
+        <w:t xml:space="preserve">Die drei Fragen sind beantwortet  →  </w:t>
+      </w:r>
+      <w:r>
+        <w:rPr>
+          <w:rFonts w:ascii="Georgia" w:cs="Georgia" w:eastAsia="Georgia" w:hAnsi="Georgia"/>
+          <w:color w:val="333333"/>
+          <w:sz w:val="17"/>
+          <w:szCs w:val="17"/>
+        </w:rPr>
+        <w:t xml:space="preserve">Fertig. Gut gemacht.</w:t>
+      </w:r>
+    </w:p>
+    <w:p>
+      <w:pPr>
         <w:pStyle w:val="Heading1"/>
         <w:pageBreakBefore/>
         <w:spacing w:after="60" w:before="400"/>
@@ -11344,6 +13036,117 @@
           <w:szCs w:val="18"/>
         </w:rPr>
         <w:t xml:space="preserve"> Drei Wachen und der Hund — der Knopf lädt alle vier.  Castle Guard 9 HP, Castle Guard 9 HP, Castle Guard 9 HP, Guard Hound 14 HP</w:t>
+      </w:r>
+    </w:p>
+    <w:p>
+      <w:pPr>
+        <w:pBdr>
+          <w:left w:val="single" w:color="BFBFBF" w:sz="18" w:space="8"/>
+        </w:pBdr>
+        <w:shd w:fill="F2F2F2" w:color="auto" w:val="clear"/>
+        <w:spacing w:after="40"/>
+        <w:ind w:left="120"/>
+      </w:pPr>
+      <w:r>
+        <w:rPr>
+          <w:rFonts w:ascii="Georgia" w:cs="Georgia" w:eastAsia="Georgia" w:hAnsi="Georgia"/>
+          <w:b/>
+          <w:bCs/>
+          <w:color w:val="555555"/>
+          <w:sz w:val="16"/>
+          <w:szCs w:val="16"/>
+        </w:rPr>
+        <w:t xml:space="preserve">WENN … DANN (NUR DM)  </w:t>
+      </w:r>
+    </w:p>
+    <w:p>
+      <w:pPr>
+        <w:pBdr>
+          <w:left w:val="single" w:color="BFBFBF" w:sz="18" w:space="8"/>
+        </w:pBdr>
+        <w:shd w:fill="F2F2F2" w:color="auto" w:val="clear"/>
+        <w:spacing w:after="40"/>
+        <w:ind w:left="120"/>
+      </w:pPr>
+      <w:r>
+        <w:rPr>
+          <w:rFonts w:ascii="Georgia" w:cs="Georgia" w:eastAsia="Georgia" w:hAnsi="Georgia"/>
+          <w:b/>
+          <w:bCs/>
+          <w:color w:val="333333"/>
+          <w:sz w:val="17"/>
+          <w:szCs w:val="17"/>
+        </w:rPr>
+        <w:t xml:space="preserve">Der Hund ist gefallen und die Wachen stehen bei der Hälfte  →  </w:t>
+      </w:r>
+      <w:r>
+        <w:rPr>
+          <w:rFonts w:ascii="Georgia" w:cs="Georgia" w:eastAsia="Georgia" w:hAnsi="Georgia"/>
+          <w:color w:val="333333"/>
+          <w:sz w:val="17"/>
+          <w:szCs w:val="17"/>
+        </w:rPr>
+        <w:t xml:space="preserve">sie ziehen sich zurück: „They don’t want to die for him.“</w:t>
+      </w:r>
+    </w:p>
+    <w:p>
+      <w:pPr>
+        <w:pBdr>
+          <w:left w:val="single" w:color="BFBFBF" w:sz="18" w:space="8"/>
+        </w:pBdr>
+        <w:shd w:fill="F2F2F2" w:color="auto" w:val="clear"/>
+        <w:spacing w:after="40"/>
+        <w:ind w:left="120"/>
+      </w:pPr>
+      <w:r>
+        <w:rPr>
+          <w:rFonts w:ascii="Georgia" w:cs="Georgia" w:eastAsia="Georgia" w:hAnsi="Georgia"/>
+          <w:b/>
+          <w:bCs/>
+          <w:color w:val="333333"/>
+          <w:sz w:val="17"/>
+          <w:szCs w:val="17"/>
+        </w:rPr>
+        <w:t xml:space="preserve">Jemand redet mit den Wachen  →  </w:t>
+      </w:r>
+      <w:r>
+        <w:rPr>
+          <w:rFonts w:ascii="Georgia" w:cs="Georgia" w:eastAsia="Georgia" w:hAnsi="Georgia"/>
+          <w:color w:val="333333"/>
+          <w:sz w:val="17"/>
+          <w:szCs w:val="17"/>
+        </w:rPr>
+        <w:t xml:space="preserve">keine Antwort — sie haben Befehle</w:t>
+      </w:r>
+    </w:p>
+    <w:p>
+      <w:pPr>
+        <w:pBdr>
+          <w:left w:val="single" w:color="BFBFBF" w:sz="18" w:space="8"/>
+        </w:pBdr>
+        <w:shd w:fill="F2F2F2" w:color="auto" w:val="clear"/>
+        <w:spacing w:after="140"/>
+        <w:ind w:left="120"/>
+      </w:pPr>
+      <w:r>
+        <w:rPr>
+          <w:rFonts w:ascii="Georgia" w:cs="Georgia" w:eastAsia="Georgia" w:hAnsi="Georgia"/>
+          <w:b/>
+          <w:bCs/>
+          <w:color w:val="333333"/>
+          <w:sz w:val="17"/>
+          <w:szCs w:val="17"/>
+        </w:rPr>
+        <w:t xml:space="preserve">Die Patrouille ist vorbei  →  </w:t>
+      </w:r>
+      <w:r>
+        <w:rPr>
+          <w:rFonts w:ascii="Georgia" w:cs="Georgia" w:eastAsia="Georgia" w:hAnsi="Georgia"/>
+          <w:color w:val="333333"/>
+          <w:sz w:val="17"/>
+          <w:szCs w:val="17"/>
+        </w:rPr>
+        <w:t xml:space="preserve">„Zurück zur Geschichte“ — die Lightbearer heilt alle</w:t>
       </w:r>
     </w:p>
     <w:p>

</xml_diff>

<commit_message>
Carriage: Einstieg gekürzt, Schüler sprechen früher
Der Vorlesetext vor dem ersten Sprechanlass ist von neun auf vier kurze
Absätze geschrumpft. Danach sagt jede Figur eine Vermutung („Maybe …“ /
„I think …“), erst dann folgen die knappe Fahrt und Mareks Frage.
Wortstützen ergänzt, Lesetexte neu erzeugt.

Co-Authored-By: Claude Opus 5.5 <noreply@anthropic.com>
Claude-Session: https://claude.ai/code/session_01ADUPP2jvP6dgTYk1DsQkUN
</commit_message>
<xml_diff>
--- a/helferblatt/Nachtfels_Lesetext_DM.docx
+++ b/helferblatt/Nachtfels_Lesetext_DM.docx
@@ -93,7 +93,7 @@
           <w:sz w:val="19"/>
           <w:szCs w:val="19"/>
         </w:rPr>
-        <w:t xml:space="preserve">Diese Seite führt dich Satz für Satz. Du musst nichts vorbereiten und die Geschichte nicht kennen.  (5 Min.)</w:t>
+        <w:t xml:space="preserve">Diese Seite führt dich Satz für Satz. Du musst nichts vorbereiten und die Geschichte nicht kennen.  (2 Min.)</w:t>
       </w:r>
     </w:p>
     <w:p>
@@ -186,7 +186,7 @@
           <w:szCs w:val="18"/>
         </w:rPr>
         <w:t xml:space="preserve">1 · Gold lesen. Englische Erzählung und Figurenrede — wörtlich. 2 · Grün fragen. Jede Figur äussert eine eigene Absicht oder Frage und danach einen Grund oder eine Reaktion. 3 · Ergebnis klicken. Nur markieren, was am Tisch passiert ist — Antworten abhaken, Entscheidungen anklicken.
- Rechts neben dem Text stehen die Hilfen auf der Höhe der Stelle, zu der sie gehören. Unten steht immer, wann es weitergeht. Die Gefahr stellst du oben ein: 0–3 ruhig, 4–7 du darfst in einem Kampf einen Gegner dazunehmen, 8–10 eine Patrouille vor dem nächsten Akt. Rückgängig oben nimmt den letzten Spielschritt zurück.</w:t>
+ Rechts neben dem Text stehen die Hilfen auf der Höhe der Stelle, zu der sie gehören. Unten steht immer, wann es weitergeht. Die Gefahr stellst du an der Säule rechts ein — die Lasche ‹ GEFAHR klappt die Knöpfe heraus: 0–3 ruhig, 4–7 du darfst in einem Kampf einen Gegner dazunehmen, 8–10 eine Patrouille vor dem nächsten Akt. Rückgängig oben nimmt den letzten Spielschritt zurück.</w:t>
       </w:r>
     </w:p>
     <w:p>
@@ -794,7 +794,7 @@
           <w:sz w:val="19"/>
           <w:szCs w:val="19"/>
         </w:rPr>
-        <w:t xml:space="preserve">Die Gruppe stellt sich vor, erfährt ihren Auftrag und steigt vor dem Wirtshaus aus.  (15 Min.)</w:t>
+        <w:t xml:space="preserve">Die Gruppe stellt sich vor, erfährt ihren Auftrag und steigt vor dem Wirtshaus aus.  (3 Min.)</w:t>
       </w:r>
     </w:p>
     <w:p>
@@ -824,7 +824,7 @@
           <w:sz w:val="18"/>
           <w:szCs w:val="18"/>
         </w:rPr>
-        <w:t xml:space="preserve">Sechs Stunden Kutschfahrt bergauf. Der Fahrer heisst Marek: grimmig, wortkarg — er stellt die erste Frage des Abends. Wichtig: Jede Figur antwortet ihm mit mindestens zwei bis drei Sätzen; die Vorstellung ist die erste Sprechübung. Zuerst liest du vor, wer sie sind und warum sie hier sind — dann die Fahrt. Die Szene endet vor dem Wirtshaus.</w:t>
+        <w:t xml:space="preserve">Sechs Stunden Kutschfahrt bergauf. Der Fahrer heisst Marek: grimmig, wortkarg — er stellt die erste Frage des Abends. Wichtig: Jede Figur antwortet ihm mit mindestens zwei bis drei Sätzen; die Vorstellung ist die erste Sprechübung. Zuerst liest du vor, wer sie sind und warum sie hier sind; dann sprechen die Schüler schon einmal kurz (eine Vermutung je Figur) — erst danach die Fahrt und Marek. Die Szene endet vor dem Wirtshaus.</w:t>
       </w:r>
     </w:p>
     <w:p>
@@ -866,7 +866,7 @@
           <w:sz w:val="22"/>
           <w:szCs w:val="22"/>
         </w:rPr>
-        <w:t xml:space="preserve">Three weeks ago a rumour</w:t>
+        <w:t xml:space="preserve">Three weeks ago you heard a rumour</w:t>
       </w:r>
       <w:r>
         <w:rPr>
@@ -883,7 +883,7 @@
           <w:sz w:val="22"/>
           <w:szCs w:val="22"/>
         </w:rPr>
-        <w:t xml:space="preserve"> reached you: somewhere in these mountains there is a valley</w:t>
+        <w:t xml:space="preserve">: in a valley</w:t>
       </w:r>
       <w:r>
         <w:rPr>
@@ -900,7 +900,7 @@
           <w:sz w:val="22"/>
           <w:szCs w:val="22"/>
         </w:rPr>
-        <w:t xml:space="preserve"> where people disappear</w:t>
+        <w:t xml:space="preserve"> in these mountains, people disappear</w:t>
       </w:r>
       <w:r>
         <w:rPr>
@@ -917,24 +917,7 @@
           <w:sz w:val="22"/>
           <w:szCs w:val="22"/>
         </w:rPr>
-        <w:t xml:space="preserve"> on a schedule</w:t>
-      </w:r>
-      <w:r>
-        <w:rPr>
-          <w:rFonts w:ascii="Georgia" w:cs="Georgia" w:eastAsia="Georgia" w:hAnsi="Georgia"/>
-          <w:color w:val="7A5A1A"/>
-          <w:sz w:val="18"/>
-          <w:szCs w:val="18"/>
-        </w:rPr>
-        <w:t xml:space="preserve"> [Zeitplan]</w:t>
-      </w:r>
-      <w:r>
-        <w:rPr>
-          <w:rFonts w:ascii="Georgia" w:cs="Georgia" w:eastAsia="Georgia" w:hAnsi="Georgia"/>
-          <w:sz w:val="22"/>
-          <w:szCs w:val="22"/>
-        </w:rPr>
-        <w:t xml:space="preserve">. Not often — once every twenty years. And always exactly one.</w:t>
+        <w:t xml:space="preserve">. Once every twenty years — and always exactly one.</w:t>
       </w:r>
     </w:p>
     <w:p>
@@ -947,24 +930,7 @@
           <w:sz w:val="22"/>
           <w:szCs w:val="22"/>
         </w:rPr>
-        <w:t xml:space="preserve">Three nights ago it happened again. A woman was taken from the village of Dornwald. Her name is Mirela Vance. She is twenty-six years old and she grows medicine</w:t>
-      </w:r>
-      <w:r>
-        <w:rPr>
-          <w:rFonts w:ascii="Georgia" w:cs="Georgia" w:eastAsia="Georgia" w:hAnsi="Georgia"/>
-          <w:color w:val="7A5A1A"/>
-          <w:sz w:val="18"/>
-          <w:szCs w:val="18"/>
-        </w:rPr>
-        <w:t xml:space="preserve"> [Heilmittel]</w:t>
-      </w:r>
-      <w:r>
-        <w:rPr>
-          <w:rFonts w:ascii="Georgia" w:cs="Georgia" w:eastAsia="Georgia" w:hAnsi="Georgia"/>
-          <w:sz w:val="22"/>
-          <w:szCs w:val="22"/>
-        </w:rPr>
-        <w:t xml:space="preserve"> in her garden.</w:t>
+        <w:t xml:space="preserve">Three nights ago it happened again. A young woman, Mirela Vance, was taken from the village of Dornwald.</w:t>
       </w:r>
     </w:p>
     <w:p>
@@ -977,35 +943,70 @@
           <w:sz w:val="22"/>
           <w:szCs w:val="22"/>
         </w:rPr>
-        <w:t xml:space="preserve">And nobody in Dornwald is looking for her. Nobody. That is the part that should worry you.</w:t>
-      </w:r>
-    </w:p>
-    <w:p>
-      <w:pPr>
-        <w:spacing w:after="110" w:line="320"/>
-      </w:pPr>
-      <w:r>
-        <w:rPr>
-          <w:rFonts w:ascii="Georgia" w:cs="Georgia" w:eastAsia="Georgia" w:hAnsi="Georgia"/>
-          <w:sz w:val="22"/>
-          <w:szCs w:val="22"/>
-        </w:rPr>
-        <w:t xml:space="preserve">Above the village, they say, there is a castle. And whatever takes them lives up there.</w:t>
-      </w:r>
-    </w:p>
-    <w:p>
-      <w:pPr>
-        <w:spacing w:after="40" w:before="100"/>
-      </w:pPr>
-      <w:r>
-        <w:rPr>
-          <w:rFonts w:ascii="Georgia" w:cs="Georgia" w:eastAsia="Georgia" w:hAnsi="Georgia"/>
-          <w:b/>
-          <w:bCs/>
-          <w:color w:val="555555"/>
+        <w:t xml:space="preserve">And nobody in Dornwald is looking for her. Nobody.</w:t>
+      </w:r>
+    </w:p>
+    <w:p>
+      <w:pPr>
+        <w:pBdr>
+          <w:left w:val="single" w:color="74B094" w:sz="18" w:space="8"/>
+        </w:pBdr>
+        <w:shd w:fill="EAF4EC" w:color="auto" w:val="clear"/>
+        <w:spacing w:after="40"/>
+        <w:ind w:left="120"/>
+      </w:pPr>
+      <w:r>
+        <w:rPr>
+          <w:rFonts w:ascii="Georgia" w:cs="Georgia" w:eastAsia="Georgia" w:hAnsi="Georgia"/>
+          <w:b/>
+          <w:bCs/>
+          <w:color w:val="3A5A4C"/>
+          <w:sz w:val="16"/>
+          <w:szCs w:val="16"/>
+        </w:rPr>
+        <w:t xml:space="preserve">GESPRÄCHSAUFFORDERUNG — DAS SAGST DU DEN SCHÜLERN:  </w:t>
+      </w:r>
+      <w:r>
+        <w:rPr>
+          <w:rFonts w:ascii="Georgia" w:cs="Georgia" w:eastAsia="Georgia" w:hAnsi="Georgia"/>
           <w:sz w:val="19"/>
           <w:szCs w:val="19"/>
         </w:rPr>
+        <w:t xml:space="preserve">“Why is nobody looking for her? What do you think is going on in Dornwald? Each of you: one idea. Start with “Maybe …” or “I think …”.”</w:t>
+      </w:r>
+    </w:p>
+    <w:p>
+      <w:pPr>
+        <w:pBdr>
+          <w:left w:val="single" w:color="74B094" w:sz="18" w:space="8"/>
+        </w:pBdr>
+        <w:shd w:fill="EAF4EC" w:color="auto" w:val="clear"/>
+        <w:spacing w:after="140"/>
+        <w:ind w:left="120"/>
+      </w:pPr>
+      <w:r>
+        <w:rPr>
+          <w:rFonts w:ascii="Georgia" w:cs="Georgia" w:eastAsia="Georgia" w:hAnsi="Georgia"/>
+          <w:color w:val="555555"/>
+          <w:sz w:val="17"/>
+          <w:szCs w:val="17"/>
+        </w:rPr>
+        <w:t xml:space="preserve">Eine Runde, eine Vermutung je Figur. Nichts bestätigen, nichts widerlegen — die Antwort kommt im Wirtshaus.</w:t>
+      </w:r>
+    </w:p>
+    <w:p>
+      <w:pPr>
+        <w:spacing w:after="40" w:before="100"/>
+      </w:pPr>
+      <w:r>
+        <w:rPr>
+          <w:rFonts w:ascii="Georgia" w:cs="Georgia" w:eastAsia="Georgia" w:hAnsi="Georgia"/>
+          <w:b/>
+          <w:bCs/>
+          <w:color w:val="555555"/>
+          <w:sz w:val="19"/>
+          <w:szCs w:val="19"/>
+        </w:rPr>
         <w:t xml:space="preserve">Die Fahrt</w:t>
       </w:r>
     </w:p>
@@ -1036,24 +1037,7 @@
           <w:sz w:val="22"/>
           <w:szCs w:val="22"/>
         </w:rPr>
-        <w:t xml:space="preserve"> has been climbing for six hours. The windows</w:t>
-      </w:r>
-      <w:r>
-        <w:rPr>
-          <w:rFonts w:ascii="Georgia" w:cs="Georgia" w:eastAsia="Georgia" w:hAnsi="Georgia"/>
-          <w:color w:val="7A5A1A"/>
-          <w:sz w:val="18"/>
-          <w:szCs w:val="18"/>
-        </w:rPr>
-        <w:t xml:space="preserve"> [Fenster]</w:t>
-      </w:r>
-      <w:r>
-        <w:rPr>
-          <w:rFonts w:ascii="Georgia" w:cs="Georgia" w:eastAsia="Georgia" w:hAnsi="Georgia"/>
-          <w:sz w:val="22"/>
-          <w:szCs w:val="22"/>
-        </w:rPr>
-        <w:t xml:space="preserve"> are cold and wet, and outside there is nothing but pine trees</w:t>
+        <w:t xml:space="preserve"> has been climbing for six hours. Outside there is nothing but pine trees</w:t>
       </w:r>
       <w:r>
         <w:rPr>
@@ -1087,15 +1071,41 @@
           <w:sz w:val="22"/>
           <w:szCs w:val="22"/>
         </w:rPr>
-        <w:t xml:space="preserve">. The moon is up there somewhere — you can see its light on the fog</w:t>
-      </w:r>
-      <w:r>
-        <w:rPr>
-          <w:rFonts w:ascii="Georgia" w:cs="Georgia" w:eastAsia="Georgia" w:hAnsi="Georgia"/>
-          <w:sz w:val="22"/>
-          <w:szCs w:val="22"/>
-        </w:rPr>
-        <w:t xml:space="preserve">, but you cannot see the sky.</w:t>
+        <w:t xml:space="preserve">, and everything in here is damp</w:t>
+      </w:r>
+      <w:r>
+        <w:rPr>
+          <w:rFonts w:ascii="Georgia" w:cs="Georgia" w:eastAsia="Georgia" w:hAnsi="Georgia"/>
+          <w:color w:val="7A5A1A"/>
+          <w:sz w:val="18"/>
+          <w:szCs w:val="18"/>
+        </w:rPr>
+        <w:t xml:space="preserve"> [feucht, klamm]</w:t>
+      </w:r>
+      <w:r>
+        <w:rPr>
+          <w:rFonts w:ascii="Georgia" w:cs="Georgia" w:eastAsia="Georgia" w:hAnsi="Georgia"/>
+          <w:sz w:val="22"/>
+          <w:szCs w:val="22"/>
+        </w:rPr>
+        <w:t xml:space="preserve"> — your coats</w:t>
+      </w:r>
+      <w:r>
+        <w:rPr>
+          <w:rFonts w:ascii="Georgia" w:cs="Georgia" w:eastAsia="Georgia" w:hAnsi="Georgia"/>
+          <w:color w:val="7A5A1A"/>
+          <w:sz w:val="18"/>
+          <w:szCs w:val="18"/>
+        </w:rPr>
+        <w:t xml:space="preserve"> [Mäntel]</w:t>
+      </w:r>
+      <w:r>
+        <w:rPr>
+          <w:rFonts w:ascii="Georgia" w:cs="Georgia" w:eastAsia="Georgia" w:hAnsi="Georgia"/>
+          <w:sz w:val="22"/>
+          <w:szCs w:val="22"/>
+        </w:rPr>
+        <w:t xml:space="preserve">, your bags, the seats.</w:t>
       </w:r>
     </w:p>
     <w:p>
@@ -1108,53 +1118,6 @@
           <w:sz w:val="22"/>
           <w:szCs w:val="22"/>
         </w:rPr>
-        <w:t xml:space="preserve">Everything in here is damp</w:t>
-      </w:r>
-      <w:r>
-        <w:rPr>
-          <w:rFonts w:ascii="Georgia" w:cs="Georgia" w:eastAsia="Georgia" w:hAnsi="Georgia"/>
-          <w:color w:val="7A5A1A"/>
-          <w:sz w:val="18"/>
-          <w:szCs w:val="18"/>
-        </w:rPr>
-        <w:t xml:space="preserve"> [feucht, klamm]</w:t>
-      </w:r>
-      <w:r>
-        <w:rPr>
-          <w:rFonts w:ascii="Georgia" w:cs="Georgia" w:eastAsia="Georgia" w:hAnsi="Georgia"/>
-          <w:sz w:val="22"/>
-          <w:szCs w:val="22"/>
-        </w:rPr>
-        <w:t xml:space="preserve">. Your coats</w:t>
-      </w:r>
-      <w:r>
-        <w:rPr>
-          <w:rFonts w:ascii="Georgia" w:cs="Georgia" w:eastAsia="Georgia" w:hAnsi="Georgia"/>
-          <w:color w:val="7A5A1A"/>
-          <w:sz w:val="18"/>
-          <w:szCs w:val="18"/>
-        </w:rPr>
-        <w:t xml:space="preserve"> [Mäntel]</w:t>
-      </w:r>
-      <w:r>
-        <w:rPr>
-          <w:rFonts w:ascii="Georgia" w:cs="Georgia" w:eastAsia="Georgia" w:hAnsi="Georgia"/>
-          <w:sz w:val="22"/>
-          <w:szCs w:val="22"/>
-        </w:rPr>
-        <w:t xml:space="preserve">, your bags, the seats. Nobody has spoken for a long time.</w:t>
-      </w:r>
-    </w:p>
-    <w:p>
-      <w:pPr>
-        <w:spacing w:after="110" w:line="320"/>
-      </w:pPr>
-      <w:r>
-        <w:rPr>
-          <w:rFonts w:ascii="Georgia" w:cs="Georgia" w:eastAsia="Georgia" w:hAnsi="Georgia"/>
-          <w:sz w:val="22"/>
-          <w:szCs w:val="22"/>
-        </w:rPr>
         <w:t xml:space="preserve">Then something moves in the trees. It stays level with</w:t>
       </w:r>
       <w:r>
@@ -1180,7 +1143,7 @@
           <w:sz w:val="22"/>
           <w:szCs w:val="22"/>
         </w:rPr>
-        <w:t xml:space="preserve"> for about twenty seconds — fast, low, quiet. Then it is gone. The driver does not slow down</w:t>
+        <w:t xml:space="preserve"> for twenty seconds — fast, low, quiet. Then it is gone. The driver does not slow down</w:t>
       </w:r>
       <w:r>
         <w:rPr>
@@ -1197,7 +1160,7 @@
           <w:sz w:val="22"/>
           <w:szCs w:val="22"/>
         </w:rPr>
-        <w:t xml:space="preserve">. The driver does not look.</w:t>
+        <w:t xml:space="preserve">. He does not look.</w:t>
       </w:r>
     </w:p>
     <w:p>
@@ -1552,6 +1515,15 @@
           <w:szCs w:val="22"/>
         </w:rPr>
         <w:t xml:space="preserve"> with no bell in it. There is exactly one building with light in the windows</w:t>
+      </w:r>
+      <w:r>
+        <w:rPr>
+          <w:rFonts w:ascii="Georgia" w:cs="Georgia" w:eastAsia="Georgia" w:hAnsi="Georgia"/>
+          <w:color w:val="7A5A1A"/>
+          <w:sz w:val="18"/>
+          <w:szCs w:val="18"/>
+        </w:rPr>
+        <w:t xml:space="preserve"> [Fenster]</w:t>
       </w:r>
       <w:r>
         <w:rPr>
@@ -1943,7 +1915,7 @@
           <w:sz w:val="19"/>
           <w:szCs w:val="19"/>
         </w:rPr>
-        <w:t xml:space="preserve">Die Gruppe spricht mit drei Menschen, erfährt zwei Dinge und bekommt am Ende die Karte.  (25 Min.)</w:t>
+        <w:t xml:space="preserve">Die Gruppe spricht mit drei Menschen, erfährt zwei Dinge und bekommt am Ende die Karte.  (8 Min.)</w:t>
       </w:r>
     </w:p>
     <w:p>
@@ -3137,7 +3109,7 @@
           <w:sz w:val="19"/>
           <w:szCs w:val="19"/>
         </w:rPr>
-        <w:t xml:space="preserve">Die Gruppe wählt einen der drei Wege. Alle drei enden im Hof des Schlosses — sie unterscheiden sich nur im Preis.  (10 Min.)</w:t>
+        <w:t xml:space="preserve">Die Gruppe wählt einen der drei Wege. Alle drei enden im Hof des Schlosses — sie unterscheiden sich nur im Preis.  (4 Min.)</w:t>
       </w:r>
     </w:p>
     <w:p>
@@ -3634,7 +3606,7 @@
           <w:sz w:val="19"/>
           <w:szCs w:val="19"/>
         </w:rPr>
-        <w:t xml:space="preserve">Die Gruppe steigt auf ihrem Weg zum Schloss hinauf — mit dem, was der Weg kostet (Kampf, schlechte Luft, Wachen) — und steht am Ende im Hof.  (20–30 Min.)</w:t>
+        <w:t xml:space="preserve">Die Gruppe steigt auf ihrem Weg zum Schloss hinauf — mit dem, was der Weg kostet (Kampf, schlechte Luft, Wachen) — und steht am Ende im Hof.  (10 Min.)</w:t>
       </w:r>
     </w:p>
     <w:p>
@@ -3680,7 +3652,7 @@
           <w:sz w:val="18"/>
           <w:szCs w:val="18"/>
         </w:rPr>
-        <w:t xml:space="preserve">Drei Stationen: Wölfe am Galgen (erster Kampf des Abends — langsam: jeder sagt auf Englisch, was er tut, drückt seinen Knopf, liest seinen gelben Satz vor; fällt ein Wolf, läuft der andere), der Sumpf (jeder würfelt dreimal, unter 7 = −1 HP) und die Wachen am Tor — Leute des Hauses, nicht freundlich: Die Gruppe schleicht (jeder würfelt einmal; alle ≥ 7 → vorbei) oder greift an. Misslingt das Schleichen oder greift jemand an: Knopf unten, Kampf mit beiden Wachen, Gefahr +1.</w:t>
+        <w:t xml:space="preserve">Drei Stationen: Wölfe am Galgen (erster Kampf des Abends — langsam: jeder sagt auf Englisch, was er tut, drückt seinen Knopf, liest seinen gelben Satz vor; fällt ein Wolf, läuft der andere), der Sumpf (jeder würfelt einmal; wer unter 7 feststeckt, ruft auf Englisch um Hilfe — sagt jemand, wie er hilft, passiert nichts, sonst −1 HP) und die Wachen am Tor — Leute des Hauses, nicht freundlich: Die Gruppe schleicht (jeder würfelt einmal; alle ≥ 7 → vorbei) oder greift an. Misslingt das Schleichen oder greift jemand an: Knopf unten, Kampf mit beiden Wachen, Gefahr +1.</w:t>
       </w:r>
     </w:p>
     <w:p>
@@ -4126,7 +4098,7 @@
           <w:sz w:val="19"/>
           <w:szCs w:val="19"/>
         </w:rPr>
-        <w:t xml:space="preserve">“Before your three steps, explain how you will cross and how you could help someone.”</w:t>
+        <w:t xml:space="preserve">“Each of you: how will you cross — slowly, fast, or holding on to someone? And if somebody gets stuck, how could you help them?”</w:t>
       </w:r>
     </w:p>
     <w:p>
@@ -4145,7 +4117,7 @@
           <w:sz w:val="17"/>
           <w:szCs w:val="17"/>
         </w:rPr>
-        <w:t xml:space="preserve">Erst reden lassen — dann die zweite Aufforderung.</w:t>
+        <w:t xml:space="preserve">Erst reden lassen — dann würfeln.</w:t>
       </w:r>
     </w:p>
     <w:p>
@@ -4174,7 +4146,7 @@
           <w:sz w:val="19"/>
           <w:szCs w:val="19"/>
         </w:rPr>
-        <w:t xml:space="preserve">“Roll both dice for each step. Under seven: lose one hit point.”</w:t>
+        <w:t xml:space="preserve">“Now each of you rolls both dice — once. Seven or more: you are across. Under seven: you are stuck. Call for help — in English. Who helps you, and how?”</w:t>
       </w:r>
     </w:p>
     <w:p>
@@ -4193,7 +4165,7 @@
           <w:sz w:val="17"/>
           <w:szCs w:val="17"/>
         </w:rPr>
-        <w:t xml:space="preserve">Schaden im Reiter Charakter-Übersicht / Kampf eintragen.</w:t>
+        <w:t xml:space="preserve">Drei Würfe, einer pro Figur. Wer feststeckt, ruft (Help! I’m stuck!); eine andere Figur sagt auf Englisch, wie sie hilft → kein Schaden. Kommt keine Hilfe: −1 HP im Reiter Charakter-Übersicht / Kampf.</w:t>
       </w:r>
     </w:p>
     <w:p>
@@ -5360,7 +5332,7 @@
           <w:sz w:val="17"/>
           <w:szCs w:val="17"/>
         </w:rPr>
-        <w:t xml:space="preserve">−1 HP — im Reiter Charakter-Übersicht eintragen</w:t>
+        <w:t xml:space="preserve">steckt fest und ruft auf Englisch um Hilfe. Sagt jemand, wie er hilft → nichts passiert; sonst −1 HP (im Reiter eintragen)</w:t>
       </w:r>
     </w:p>
     <w:p>
@@ -5621,7 +5593,7 @@
           <w:sz w:val="17"/>
           <w:szCs w:val="17"/>
         </w:rPr>
-        <w:t xml:space="preserve">Nur bei: Weg A · Strasse — vorgelesen: “takes real strength” — Der Sumpf gibt Stiefel nur mit Kraft wieder her.  → Wer feststeckt und den Blade neben sich hat, verliert den Punkt nicht — Blade zieht ihn heraus. Gilt für einen Fehlwurf je Figur, und nur, wenn der Blade-Spieler es sagt.</w:t>
+        <w:t xml:space="preserve">Nur bei: Weg A · Strasse — vorgelesen: “takes real strength” — Der Sumpf gibt Stiefel nur mit Kraft wieder her.  → Wer feststeckt, kann den Blade rufen: Blade zieht ihn heraus, ohne dass jemand eine andere Idee braucht — wenn der Blade-Spieler auf Englisch sagt, wie.</w:t>
       </w:r>
     </w:p>
     <w:p>
@@ -6742,7 +6714,7 @@
           <w:sz w:val="19"/>
           <w:szCs w:val="19"/>
         </w:rPr>
-        <w:t xml:space="preserve">Die Gruppe geht durch ihre Tür, erlebt, was dahinter wartet (Bellamy, Anneke oder Tam), und steht am Ende hinter der Spiegeltür am Ende des Westgangs.  (20 Min.)</w:t>
+        <w:t xml:space="preserve">Die Gruppe geht durch ihre Tür, erlebt, was dahinter wartet (Bellamy, Anneke oder Tam), und steht am Ende hinter der Spiegeltür am Ende des Westgangs.  (8 Min.)</w:t>
       </w:r>
     </w:p>
     <w:p>
@@ -8659,7 +8631,7 @@
           <w:sz w:val="17"/>
           <w:szCs w:val="17"/>
         </w:rPr>
-        <w:t xml:space="preserve">er schreit: Gefahr +3 (oben einstellen)</w:t>
+        <w:t xml:space="preserve">er schreit: Gefahr +3 (rechts an der Säule einstellen)</w:t>
       </w:r>
     </w:p>
     <w:p>
@@ -8935,7 +8907,7 @@
           <w:sz w:val="19"/>
           <w:szCs w:val="19"/>
         </w:rPr>
-        <w:t xml:space="preserve">Die Gruppe erfährt die Wahrheit und redet mit Mirela. Hier wird am meisten gesprochen — nimm dir Zeit.  (25 Min.)</w:t>
+        <w:t xml:space="preserve">Die Gruppe erfährt die Wahrheit und redet mit Mirela. Hier wird am meisten gesprochen — nimm dir Zeit.  (11 Min.)</w:t>
       </w:r>
     </w:p>
     <w:p>
@@ -9948,7 +9920,7 @@
           <w:sz w:val="19"/>
           <w:szCs w:val="19"/>
         </w:rPr>
-        <w:t xml:space="preserve">Die letzte Entscheidung. Keine ist sauber, und Mirela hört zu, während sie getroffen wird.  (10 Min.)</w:t>
+        <w:t xml:space="preserve">Die letzte Entscheidung. Keine ist sauber, und Mirela hört zu, während sie getroffen wird.  (5 Min.)</w:t>
       </w:r>
     </w:p>
     <w:p>
@@ -10375,7 +10347,7 @@
           <w:sz w:val="19"/>
           <w:szCs w:val="19"/>
         </w:rPr>
-        <w:t xml:space="preserve">Die Begegnung mit dem Grafen — Verhandlung, Kampf oder beides. Am Ende trägst du unten ein, wie es ausging.  (30 Min.)</w:t>
+        <w:t xml:space="preserve">Die Begegnung mit dem Grafen — Verhandlung, Kampf oder beides. Am Ende trägst du unten ein, wie es ausging.  (15 Min.)</w:t>
       </w:r>
     </w:p>
     <w:p>

</xml_diff>

<commit_message>
Marek sagt, wenn er mit den Antworten zufrieden ist
Personenkarte und Wenn-dann-Regel der Kutsche: auf eine gute Antwort
„Good. That’s an answer.“, wenn alle drei geantwortet haben „Hm. That’ll do.
Now I know who I’m driving.“ Lesetexte neu erzeugt.

Co-Authored-By: Claude Opus 5.5 <noreply@anthropic.com>
Claude-Session: https://claude.ai/code/session_01ADUPP2jvP6dgTYk1DsQkUN
</commit_message>
<xml_diff>
--- a/helferblatt/Nachtfels_Lesetext_DM.docx
+++ b/helferblatt/Nachtfels_Lesetext_DM.docx
@@ -1300,7 +1300,7 @@
           <w:sz w:val="18"/>
           <w:szCs w:val="18"/>
         </w:rPr>
-        <w:t xml:space="preserve">Grimmig, wortkarg. Er antwortet auf jede Frage — kurz. Wer nur einen Satz sagt, bekommt: „What, that’s all? Tell me a bit more.“</w:t>
+        <w:t xml:space="preserve">Grimmig, wortkarg. Er antwortet auf jede Frage — kurz. Wer nur einen Satz sagt, bekommt: „What, that’s all? Tell me a bit more.“ Ist er mit einer Antwort zufrieden, sagt er es — knapp, aber hörbar: „Good. That’s an answer.“ Haben alle drei so geantwortet: „Hm. That’ll do. Now I know who I’m driving.“</w:t>
       </w:r>
     </w:p>
     <w:p>
@@ -1819,7 +1819,7 @@
           <w:sz w:val="17"/>
           <w:szCs w:val="17"/>
         </w:rPr>
-        <w:t xml:space="preserve">Auftrag vorlesen, dann die Ankunft</w:t>
+        <w:t xml:space="preserve">Marek ist zufrieden und sagt es: „Hm. That’ll do. Now I know who I’m driving.“ Dann die Ankunft</w:t>
       </w:r>
     </w:p>
     <w:p>

</xml_diff>

<commit_message>
Entscheidungen auf der Seite, Blutruf im Kampf, Tam nur nach der Küche
- Wachen am Tor (Weg A) und im Keller (Weg B): „Kommen sie vorbei?“ bzw.
  „Glaubt die Wache ihnen?“ — der Kampfknopf erscheint erst bei „Nein“.
- Kapelle: „Nennt jemand sie beim Namen?“ entscheidet, ob Anneke kämpft.
- Vampire Spawn: nicht mehr auf der Vaskir-Seite, sondern als Bonusaktion
  „Blutruf“ in seiner Karte im Kampfbildschirm — Fenster mit Vorlesesatz,
  Preis (12 HP) und Gewinnchance vorher/nachher, einmal pro Kampf, rückgängig.
- Tams Epilog erscheint nur, wenn die Gruppe die Küchenseite erlebt hat.
Prüfstand spielt die neuen Weichen mit; V1 unverändert grün.

Co-Authored-By: Claude Opus 5.5 <noreply@anthropic.com>
Claude-Session: https://claude.ai/code/session_01ADUPP2jvP6dgTYk1DsQkUN
</commit_message>
<xml_diff>
--- a/helferblatt/Nachtfels_Lesetext_DM.docx
+++ b/helferblatt/Nachtfels_Lesetext_DM.docx
@@ -4343,510 +4343,16 @@
           <w:sz w:val="17"/>
           <w:szCs w:val="17"/>
         </w:rPr>
-        <w:t xml:space="preserve">Alle ≥ 7 → weiter unten bei „Im Hof“. Einer darunter, oder sie greifen an → Knopf.</w:t>
-      </w:r>
-    </w:p>
-    <w:p>
-      <w:pPr>
-        <w:pBdr>
-          <w:left w:val="single" w:color="BFBFBF" w:sz="18" w:space="8"/>
-        </w:pBdr>
-        <w:shd w:fill="F2F2F2" w:color="auto" w:val="clear"/>
-        <w:spacing w:after="140"/>
-        <w:ind w:left="120"/>
-      </w:pPr>
-      <w:r>
-        <w:rPr>
-          <w:rFonts w:ascii="Georgia" w:cs="Georgia" w:eastAsia="Georgia" w:hAnsi="Georgia"/>
-          <w:b/>
-          <w:bCs/>
-          <w:color w:val="555555"/>
-          <w:sz w:val="16"/>
-          <w:szCs w:val="16"/>
-        </w:rPr>
-        <w:t xml:space="preserve">KNOPF (NUR DM):  </w:t>
-      </w:r>
-      <w:r>
-        <w:rPr>
-          <w:rFonts w:ascii="Georgia" w:cs="Georgia" w:eastAsia="Georgia" w:hAnsi="Georgia"/>
-          <w:color w:val="333333"/>
-          <w:sz w:val="18"/>
-          <w:szCs w:val="18"/>
-        </w:rPr>
-        <w:t xml:space="preserve">Das Anschleichen ist misslungen — die beiden Wachen haben sie gesehen.  →  Kampf mit zwei Wachen, Gefahr +1</w:t>
-      </w:r>
-    </w:p>
-    <w:p>
-      <w:pPr>
-        <w:spacing w:after="40" w:before="100"/>
-      </w:pPr>
-      <w:r>
-        <w:rPr>
-          <w:rFonts w:ascii="Georgia" w:cs="Georgia" w:eastAsia="Georgia" w:hAnsi="Georgia"/>
-          <w:b/>
-          <w:bCs/>
-          <w:color w:val="555555"/>
-          <w:sz w:val="19"/>
-          <w:szCs w:val="19"/>
-        </w:rPr>
-        <w:t xml:space="preserve">Im Hof</w:t>
-      </w:r>
-    </w:p>
-    <w:p>
-      <w:pPr>
-        <w:spacing w:after="110" w:line="320"/>
-      </w:pPr>
-      <w:r>
-        <w:rPr>
-          <w:rFonts w:ascii="Georgia" w:cs="Georgia" w:eastAsia="Georgia" w:hAnsi="Georgia"/>
-          <w:sz w:val="22"/>
-          <w:szCs w:val="22"/>
-        </w:rPr>
-        <w:t xml:space="preserve">Past the guards, through the gate</w:t>
-      </w:r>
-      <w:r>
-        <w:rPr>
-          <w:rFonts w:ascii="Georgia" w:cs="Georgia" w:eastAsia="Georgia" w:hAnsi="Georgia"/>
-          <w:sz w:val="22"/>
-          <w:szCs w:val="22"/>
-        </w:rPr>
-        <w:t xml:space="preserve"> that nobody ever closed — and you are standing in a square courtyard</w:t>
-      </w:r>
-      <w:r>
-        <w:rPr>
-          <w:rFonts w:ascii="Georgia" w:cs="Georgia" w:eastAsia="Georgia" w:hAnsi="Georgia"/>
-          <w:color w:val="7A5A1A"/>
-          <w:sz w:val="18"/>
-          <w:szCs w:val="18"/>
-        </w:rPr>
-        <w:t xml:space="preserve"> [Innenhof]</w:t>
-      </w:r>
-      <w:r>
-        <w:rPr>
-          <w:rFonts w:ascii="Georgia" w:cs="Georgia" w:eastAsia="Georgia" w:hAnsi="Georgia"/>
-          <w:sz w:val="22"/>
-          <w:szCs w:val="22"/>
-        </w:rPr>
-        <w:t xml:space="preserve"> of black stone</w:t>
-      </w:r>
-      <w:r>
-        <w:rPr>
-          <w:rFonts w:ascii="Georgia" w:cs="Georgia" w:eastAsia="Georgia" w:hAnsi="Georgia"/>
-          <w:color w:val="7A5A1A"/>
-          <w:sz w:val="18"/>
-          <w:szCs w:val="18"/>
-        </w:rPr>
-        <w:t xml:space="preserve"> [schwarzer Stein]</w:t>
-      </w:r>
-      <w:r>
-        <w:rPr>
-          <w:rFonts w:ascii="Georgia" w:cs="Georgia" w:eastAsia="Georgia" w:hAnsi="Georgia"/>
-          <w:sz w:val="22"/>
-          <w:szCs w:val="22"/>
-        </w:rPr>
-        <w:t xml:space="preserve">.</w:t>
-      </w:r>
-    </w:p>
-    <w:p>
-      <w:pPr>
-        <w:spacing w:after="60" w:before="120"/>
-      </w:pPr>
-      <w:r>
-        <w:rPr>
-          <w:rFonts w:ascii="Georgia" w:cs="Georgia" w:eastAsia="Georgia" w:hAnsi="Georgia"/>
-          <w:b/>
-          <w:bCs/>
-          <w:color w:val="7A5A1A"/>
-          <w:sz w:val="17"/>
-          <w:szCs w:val="17"/>
-        </w:rPr>
-        <w:t xml:space="preserve">▸ Nur bei: Weg B · Stollen</w:t>
-      </w:r>
-    </w:p>
-    <w:p>
-      <w:pPr>
-        <w:pBdr>
-          <w:left w:val="single" w:color="BFBFBF" w:sz="18" w:space="8"/>
-        </w:pBdr>
-        <w:shd w:fill="F2F2F2" w:color="auto" w:val="clear"/>
-        <w:spacing w:after="140"/>
-        <w:ind w:left="120"/>
-      </w:pPr>
-      <w:r>
-        <w:rPr>
-          <w:rFonts w:ascii="Georgia" w:cs="Georgia" w:eastAsia="Georgia" w:hAnsi="Georgia"/>
-          <w:b/>
-          <w:bCs/>
-          <w:color w:val="555555"/>
-          <w:sz w:val="16"/>
-          <w:szCs w:val="16"/>
-        </w:rPr>
-        <w:t xml:space="preserve">HINTERGRUND · STOLLEN (NUR DM):  </w:t>
-      </w:r>
-      <w:r>
-        <w:rPr>
-          <w:rFonts w:ascii="Georgia" w:cs="Georgia" w:eastAsia="Georgia" w:hAnsi="Georgia"/>
-          <w:color w:val="333333"/>
-          <w:sz w:val="18"/>
-          <w:szCs w:val="18"/>
-        </w:rPr>
-        <w:t xml:space="preserve">Vier Stunden Dunkelheit, schlechte Luft (−2 HP für alle, Knopf unten), dann ein Keller unter dem Schloss — und eine Wache mit Lampe. Hier wird nicht gewürfelt, hier wird geredet: Trägt jede Figur einen ganzen englischen Satz bei und droht niemand, glaubt er ihnen. Stottert die Gruppe, droht oder greift jemand an: Knopf unten, Kampf, Gefahr +1.</w:t>
-      </w:r>
-    </w:p>
-    <w:p>
-      <w:pPr>
-        <w:spacing w:after="40" w:before="100"/>
-      </w:pPr>
-      <w:r>
-        <w:rPr>
-          <w:rFonts w:ascii="Georgia" w:cs="Georgia" w:eastAsia="Georgia" w:hAnsi="Georgia"/>
-          <w:b/>
-          <w:bCs/>
-          <w:color w:val="555555"/>
-          <w:sz w:val="19"/>
-          <w:szCs w:val="19"/>
-        </w:rPr>
-        <w:t xml:space="preserve">Der Stollen</w:t>
-      </w:r>
-    </w:p>
-    <w:p>
-      <w:pPr>
-        <w:spacing w:after="110" w:line="320"/>
-      </w:pPr>
-      <w:r>
-        <w:rPr>
-          <w:rFonts w:ascii="Georgia" w:cs="Georgia" w:eastAsia="Georgia" w:hAnsi="Georgia"/>
-          <w:sz w:val="22"/>
-          <w:szCs w:val="22"/>
-        </w:rPr>
-        <w:t xml:space="preserve">The mine entrance</w:t>
-      </w:r>
-      <w:r>
-        <w:rPr>
-          <w:rFonts w:ascii="Georgia" w:cs="Georgia" w:eastAsia="Georgia" w:hAnsi="Georgia"/>
-          <w:color w:val="7A5A1A"/>
-          <w:sz w:val="18"/>
-          <w:szCs w:val="18"/>
-        </w:rPr>
-        <w:t xml:space="preserve"> [Stolleneingang]</w:t>
-      </w:r>
-      <w:r>
-        <w:rPr>
-          <w:rFonts w:ascii="Georgia" w:cs="Georgia" w:eastAsia="Georgia" w:hAnsi="Georgia"/>
-          <w:sz w:val="22"/>
-          <w:szCs w:val="22"/>
-        </w:rPr>
-        <w:t xml:space="preserve"> is a hole behind a dead tree</w:t>
-      </w:r>
-      <w:r>
-        <w:rPr>
-          <w:rFonts w:ascii="Georgia" w:cs="Georgia" w:eastAsia="Georgia" w:hAnsi="Georgia"/>
-          <w:color w:val="7A5A1A"/>
-          <w:sz w:val="18"/>
-          <w:szCs w:val="18"/>
-        </w:rPr>
-        <w:t xml:space="preserve"> [toter Baum]</w:t>
-      </w:r>
-      <w:r>
-        <w:rPr>
-          <w:rFonts w:ascii="Georgia" w:cs="Georgia" w:eastAsia="Georgia" w:hAnsi="Georgia"/>
-          <w:sz w:val="22"/>
-          <w:szCs w:val="22"/>
-        </w:rPr>
-        <w:t xml:space="preserve"> above the village, and it is smaller than all of you.</w:t>
-      </w:r>
-    </w:p>
-    <w:p>
-      <w:pPr>
-        <w:spacing w:after="110" w:line="320"/>
-      </w:pPr>
-      <w:r>
-        <w:rPr>
-          <w:rFonts w:ascii="Georgia" w:cs="Georgia" w:eastAsia="Georgia" w:hAnsi="Georgia"/>
-          <w:sz w:val="22"/>
-          <w:szCs w:val="22"/>
-        </w:rPr>
-        <w:t xml:space="preserve">Four hours in the dark. After two, the air turns sweet and heavy</w:t>
-      </w:r>
-      <w:r>
-        <w:rPr>
-          <w:rFonts w:ascii="Georgia" w:cs="Georgia" w:eastAsia="Georgia" w:hAnsi="Georgia"/>
-          <w:color w:val="7A5A1A"/>
-          <w:sz w:val="18"/>
-          <w:szCs w:val="18"/>
-        </w:rPr>
-        <w:t xml:space="preserve"> [süss und schwer]</w:t>
-      </w:r>
-      <w:r>
-        <w:rPr>
-          <w:rFonts w:ascii="Georgia" w:cs="Georgia" w:eastAsia="Georgia" w:hAnsi="Georgia"/>
-          <w:sz w:val="22"/>
-          <w:szCs w:val="22"/>
-        </w:rPr>
-        <w:t xml:space="preserve"> and everybody’s head starts to hurt</w:t>
-      </w:r>
-      <w:r>
-        <w:rPr>
-          <w:rFonts w:ascii="Georgia" w:cs="Georgia" w:eastAsia="Georgia" w:hAnsi="Georgia"/>
-          <w:sz w:val="22"/>
-          <w:szCs w:val="22"/>
-        </w:rPr>
-        <w:t xml:space="preserve"> — you each lose two hit points.</w:t>
-      </w:r>
-    </w:p>
-    <w:p>
-      <w:pPr>
-        <w:spacing w:after="110" w:line="320"/>
-      </w:pPr>
-      <w:r>
-        <w:rPr>
-          <w:rFonts w:ascii="Georgia" w:cs="Georgia" w:eastAsia="Georgia" w:hAnsi="Georgia"/>
-          <w:sz w:val="22"/>
-          <w:szCs w:val="22"/>
-        </w:rPr>
-        <w:t xml:space="preserve">After three, you find what is left of the Kessler family: tools</w:t>
-      </w:r>
-      <w:r>
-        <w:rPr>
-          <w:rFonts w:ascii="Georgia" w:cs="Georgia" w:eastAsia="Georgia" w:hAnsi="Georgia"/>
-          <w:color w:val="7A5A1A"/>
-          <w:sz w:val="18"/>
-          <w:szCs w:val="18"/>
-        </w:rPr>
-        <w:t xml:space="preserve"> [Werkzeuge]</w:t>
-      </w:r>
-      <w:r>
-        <w:rPr>
-          <w:rFonts w:ascii="Georgia" w:cs="Georgia" w:eastAsia="Georgia" w:hAnsi="Georgia"/>
-          <w:sz w:val="22"/>
-          <w:szCs w:val="22"/>
-        </w:rPr>
-        <w:t xml:space="preserve">, a child’s shoe</w:t>
-      </w:r>
-      <w:r>
-        <w:rPr>
-          <w:rFonts w:ascii="Georgia" w:cs="Georgia" w:eastAsia="Georgia" w:hAnsi="Georgia"/>
-          <w:color w:val="7A5A1A"/>
-          <w:sz w:val="18"/>
-          <w:szCs w:val="18"/>
-        </w:rPr>
-        <w:t xml:space="preserve"> [Kinderschuh]</w:t>
-      </w:r>
-      <w:r>
-        <w:rPr>
-          <w:rFonts w:ascii="Georgia" w:cs="Georgia" w:eastAsia="Georgia" w:hAnsi="Georgia"/>
-          <w:sz w:val="22"/>
-          <w:szCs w:val="22"/>
-        </w:rPr>
-        <w:t xml:space="preserve">, and a lamp that somebody put down neatly</w:t>
-      </w:r>
-      <w:r>
-        <w:rPr>
-          <w:rFonts w:ascii="Georgia" w:cs="Georgia" w:eastAsia="Georgia" w:hAnsi="Georgia"/>
-          <w:color w:val="7A5A1A"/>
-          <w:sz w:val="18"/>
-          <w:szCs w:val="18"/>
-        </w:rPr>
-        <w:t xml:space="preserve"> [ordentlich]</w:t>
-      </w:r>
-      <w:r>
-        <w:rPr>
-          <w:rFonts w:ascii="Georgia" w:cs="Georgia" w:eastAsia="Georgia" w:hAnsi="Georgia"/>
-          <w:sz w:val="22"/>
-          <w:szCs w:val="22"/>
-        </w:rPr>
-        <w:t xml:space="preserve"> before they stopped needing it.</w:t>
-      </w:r>
-    </w:p>
-    <w:p>
-      <w:pPr>
-        <w:pBdr>
-          <w:left w:val="single" w:color="BFBFBF" w:sz="18" w:space="8"/>
-        </w:pBdr>
-        <w:shd w:fill="F2F2F2" w:color="auto" w:val="clear"/>
-        <w:spacing w:after="140"/>
-        <w:ind w:left="120"/>
-      </w:pPr>
-      <w:r>
-        <w:rPr>
-          <w:rFonts w:ascii="Georgia" w:cs="Georgia" w:eastAsia="Georgia" w:hAnsi="Georgia"/>
-          <w:b/>
-          <w:bCs/>
-          <w:color w:val="555555"/>
-          <w:sz w:val="16"/>
-          <w:szCs w:val="16"/>
-        </w:rPr>
-        <w:t xml:space="preserve">KNOPF (NUR DM):  </w:t>
-      </w:r>
-      <w:r>
-        <w:rPr>
-          <w:rFonts w:ascii="Georgia" w:cs="Georgia" w:eastAsia="Georgia" w:hAnsi="Georgia"/>
-          <w:color w:val="333333"/>
-          <w:sz w:val="18"/>
-          <w:szCs w:val="18"/>
-        </w:rPr>
-        <w:t xml:space="preserve">Die schlechte Luft anwenden — dann stimmen die Werte im Reiter Charakter-Übersicht.  →  −2 HP für alle</w:t>
-      </w:r>
-    </w:p>
-    <w:p>
-      <w:pPr>
-        <w:spacing w:after="40" w:before="100"/>
-      </w:pPr>
-      <w:r>
-        <w:rPr>
-          <w:rFonts w:ascii="Georgia" w:cs="Georgia" w:eastAsia="Georgia" w:hAnsi="Georgia"/>
-          <w:b/>
-          <w:bCs/>
-          <w:color w:val="555555"/>
-          <w:sz w:val="19"/>
-          <w:szCs w:val="19"/>
-        </w:rPr>
-        <w:t xml:space="preserve">Der Keller</w:t>
-      </w:r>
-    </w:p>
-    <w:p>
-      <w:pPr>
-        <w:spacing w:after="110" w:line="320"/>
-      </w:pPr>
-      <w:r>
-        <w:rPr>
-          <w:rFonts w:ascii="Georgia" w:cs="Georgia" w:eastAsia="Georgia" w:hAnsi="Georgia"/>
-          <w:sz w:val="22"/>
-          <w:szCs w:val="22"/>
-        </w:rPr>
-        <w:t xml:space="preserve">The tunnel ends at a rotten</w:t>
-      </w:r>
-      <w:r>
-        <w:rPr>
-          <w:rFonts w:ascii="Georgia" w:cs="Georgia" w:eastAsia="Georgia" w:hAnsi="Georgia"/>
-          <w:color w:val="7A5A1A"/>
-          <w:sz w:val="18"/>
-          <w:szCs w:val="18"/>
-        </w:rPr>
-        <w:t xml:space="preserve"> [morsch]</w:t>
-      </w:r>
-      <w:r>
-        <w:rPr>
-          <w:rFonts w:ascii="Georgia" w:cs="Georgia" w:eastAsia="Georgia" w:hAnsi="Georgia"/>
-          <w:sz w:val="22"/>
-          <w:szCs w:val="22"/>
-        </w:rPr>
-        <w:t xml:space="preserve"> wooden door. Behind it: a cellar</w:t>
-      </w:r>
-      <w:r>
-        <w:rPr>
-          <w:rFonts w:ascii="Georgia" w:cs="Georgia" w:eastAsia="Georgia" w:hAnsi="Georgia"/>
-          <w:color w:val="7A5A1A"/>
-          <w:sz w:val="18"/>
-          <w:szCs w:val="18"/>
-        </w:rPr>
-        <w:t xml:space="preserve"> [Keller]</w:t>
-      </w:r>
-      <w:r>
-        <w:rPr>
-          <w:rFonts w:ascii="Georgia" w:cs="Georgia" w:eastAsia="Georgia" w:hAnsi="Georgia"/>
-          <w:sz w:val="22"/>
-          <w:szCs w:val="22"/>
-        </w:rPr>
-        <w:t xml:space="preserve"> full of barrels</w:t>
-      </w:r>
-      <w:r>
-        <w:rPr>
-          <w:rFonts w:ascii="Georgia" w:cs="Georgia" w:eastAsia="Georgia" w:hAnsi="Georgia"/>
-          <w:color w:val="7A5A1A"/>
-          <w:sz w:val="18"/>
-          <w:szCs w:val="18"/>
-        </w:rPr>
-        <w:t xml:space="preserve"> [Fässer]</w:t>
-      </w:r>
-      <w:r>
-        <w:rPr>
-          <w:rFonts w:ascii="Georgia" w:cs="Georgia" w:eastAsia="Georgia" w:hAnsi="Georgia"/>
-          <w:sz w:val="22"/>
-          <w:szCs w:val="22"/>
-        </w:rPr>
-        <w:t xml:space="preserve">, a smell of wine and wet stone</w:t>
-      </w:r>
-      <w:r>
-        <w:rPr>
-          <w:rFonts w:ascii="Georgia" w:cs="Georgia" w:eastAsia="Georgia" w:hAnsi="Georgia"/>
-          <w:color w:val="7A5A1A"/>
-          <w:sz w:val="18"/>
-          <w:szCs w:val="18"/>
-        </w:rPr>
-        <w:t xml:space="preserve"> [nasser Stein]</w:t>
-      </w:r>
-      <w:r>
-        <w:rPr>
-          <w:rFonts w:ascii="Georgia" w:cs="Georgia" w:eastAsia="Georgia" w:hAnsi="Georgia"/>
-          <w:sz w:val="22"/>
-          <w:szCs w:val="22"/>
-        </w:rPr>
-        <w:t xml:space="preserve">, and a stair</w:t>
-      </w:r>
-      <w:r>
-        <w:rPr>
-          <w:rFonts w:ascii="Georgia" w:cs="Georgia" w:eastAsia="Georgia" w:hAnsi="Georgia"/>
-          <w:color w:val="7A5A1A"/>
-          <w:sz w:val="18"/>
-          <w:szCs w:val="18"/>
-        </w:rPr>
-        <w:t xml:space="preserve"> [Treppe]</w:t>
-      </w:r>
-      <w:r>
-        <w:rPr>
-          <w:rFonts w:ascii="Georgia" w:cs="Georgia" w:eastAsia="Georgia" w:hAnsi="Georgia"/>
-          <w:sz w:val="22"/>
-          <w:szCs w:val="22"/>
-        </w:rPr>
-        <w:t xml:space="preserve"> going up. In the corner, behind an iron grille, a shelf of small bottles — and one of them gives off a faint, pale</w:t>
-      </w:r>
-      <w:r>
-        <w:rPr>
-          <w:rFonts w:ascii="Georgia" w:cs="Georgia" w:eastAsia="Georgia" w:hAnsi="Georgia"/>
-          <w:color w:val="7A5A1A"/>
-          <w:sz w:val="18"/>
-          <w:szCs w:val="18"/>
-        </w:rPr>
-        <w:t xml:space="preserve"> [blass, hell]</w:t>
-      </w:r>
-      <w:r>
-        <w:rPr>
-          <w:rFonts w:ascii="Georgia" w:cs="Georgia" w:eastAsia="Georgia" w:hAnsi="Georgia"/>
-          <w:sz w:val="22"/>
-          <w:szCs w:val="22"/>
-        </w:rPr>
-        <w:t xml:space="preserve"> light.</w:t>
-      </w:r>
-    </w:p>
-    <w:p>
-      <w:pPr>
-        <w:spacing w:after="110" w:line="320"/>
-      </w:pPr>
-      <w:r>
-        <w:rPr>
-          <w:rFonts w:ascii="Georgia" w:cs="Georgia" w:eastAsia="Georgia" w:hAnsi="Georgia"/>
-          <w:sz w:val="22"/>
-          <w:szCs w:val="22"/>
-        </w:rPr>
-        <w:t xml:space="preserve">At the top of the stair</w:t>
-      </w:r>
-      <w:r>
-        <w:rPr>
-          <w:rFonts w:ascii="Georgia" w:cs="Georgia" w:eastAsia="Georgia" w:hAnsi="Georgia"/>
-          <w:sz w:val="22"/>
-          <w:szCs w:val="22"/>
-        </w:rPr>
-        <w:t xml:space="preserve"> stands a man with a lamp. He has heard the door. He comes down, slowly, coughing — a cough that has clearly been going on for weeks — and holds the lamp up to your faces.</w:t>
-      </w:r>
-    </w:p>
-    <w:p>
-      <w:pPr>
-        <w:pBdr>
-          <w:left w:val="single" w:color="D9A441" w:sz="18" w:space="8"/>
-        </w:pBdr>
-        <w:shd w:fill="FFF6DD" w:color="auto" w:val="clear"/>
-        <w:spacing w:after="140"/>
+        <w:t xml:space="preserve">Würfeln lassen, dann unten anklicken, was passiert ist.</w:t>
+      </w:r>
+    </w:p>
+    <w:p>
+      <w:pPr>
+        <w:pBdr>
+          <w:left w:val="single" w:color="BFBFBF" w:sz="18" w:space="8"/>
+        </w:pBdr>
+        <w:shd w:fill="F2F2F2" w:color="auto" w:val="clear"/>
+        <w:spacing w:after="40"/>
         <w:ind w:left="120"/>
       </w:pPr>
       <w:r>
@@ -4858,6 +4364,585 @@
           <w:sz w:val="16"/>
           <w:szCs w:val="16"/>
         </w:rPr>
+        <w:t xml:space="preserve">WAS IST PASSIERT? (NUR DM): Kommen sie an den Wachen vorbei?  </w:t>
+      </w:r>
+    </w:p>
+    <w:p>
+      <w:pPr>
+        <w:pBdr>
+          <w:left w:val="single" w:color="BFBFBF" w:sz="18" w:space="8"/>
+        </w:pBdr>
+        <w:shd w:fill="F2F2F2" w:color="auto" w:val="clear"/>
+        <w:spacing w:after="40"/>
+        <w:ind w:left="120"/>
+      </w:pPr>
+      <w:r>
+        <w:rPr>
+          <w:rFonts w:ascii="Georgia" w:cs="Georgia" w:eastAsia="Georgia" w:hAnsi="Georgia"/>
+          <w:b/>
+          <w:bCs/>
+          <w:color w:val="333333"/>
+          <w:sz w:val="18"/>
+          <w:szCs w:val="18"/>
+        </w:rPr>
+        <w:t xml:space="preserve">Ja — vorbeigeschlichen  </w:t>
+      </w:r>
+      <w:r>
+        <w:rPr>
+          <w:rFonts w:ascii="Georgia" w:cs="Georgia" w:eastAsia="Georgia" w:hAnsi="Georgia"/>
+          <w:i/>
+          <w:iCs/>
+          <w:color w:val="555555"/>
+          <w:sz w:val="18"/>
+          <w:szCs w:val="18"/>
+        </w:rPr>
+        <w:t xml:space="preserve">Alle haben 7 oder mehr gewürfelt.</w:t>
+      </w:r>
+    </w:p>
+    <w:p>
+      <w:pPr>
+        <w:pBdr>
+          <w:left w:val="single" w:color="BFBFBF" w:sz="18" w:space="8"/>
+        </w:pBdr>
+        <w:shd w:fill="F2F2F2" w:color="auto" w:val="clear"/>
+        <w:spacing w:after="140"/>
+        <w:ind w:left="120"/>
+      </w:pPr>
+      <w:r>
+        <w:rPr>
+          <w:rFonts w:ascii="Georgia" w:cs="Georgia" w:eastAsia="Georgia" w:hAnsi="Georgia"/>
+          <w:b/>
+          <w:bCs/>
+          <w:color w:val="333333"/>
+          <w:sz w:val="18"/>
+          <w:szCs w:val="18"/>
+        </w:rPr>
+        <w:t xml:space="preserve">Nein — entdeckt  </w:t>
+      </w:r>
+      <w:r>
+        <w:rPr>
+          <w:rFonts w:ascii="Georgia" w:cs="Georgia" w:eastAsia="Georgia" w:hAnsi="Georgia"/>
+          <w:i/>
+          <w:iCs/>
+          <w:color w:val="555555"/>
+          <w:sz w:val="18"/>
+          <w:szCs w:val="18"/>
+        </w:rPr>
+        <w:t xml:space="preserve">Einer unter 7, oder jemand greift an.</w:t>
+      </w:r>
+    </w:p>
+    <w:p>
+      <w:pPr>
+        <w:pBdr>
+          <w:left w:val="single" w:color="BFBFBF" w:sz="18" w:space="8"/>
+        </w:pBdr>
+        <w:shd w:fill="F2F2F2" w:color="auto" w:val="clear"/>
+        <w:spacing w:after="140"/>
+        <w:ind w:left="120"/>
+      </w:pPr>
+      <w:r>
+        <w:rPr>
+          <w:rFonts w:ascii="Georgia" w:cs="Georgia" w:eastAsia="Georgia" w:hAnsi="Georgia"/>
+          <w:b/>
+          <w:bCs/>
+          <w:color w:val="555555"/>
+          <w:sz w:val="16"/>
+          <w:szCs w:val="16"/>
+        </w:rPr>
+        <w:t xml:space="preserve">KNOPF (NUR DM):  </w:t>
+      </w:r>
+      <w:r>
+        <w:rPr>
+          <w:rFonts w:ascii="Georgia" w:cs="Georgia" w:eastAsia="Georgia" w:hAnsi="Georgia"/>
+          <w:color w:val="333333"/>
+          <w:sz w:val="18"/>
+          <w:szCs w:val="18"/>
+        </w:rPr>
+        <w:t xml:space="preserve">Das Anschleichen ist misslungen — die beiden Wachen haben sie gesehen.  →  Kampf mit zwei Wachen, Gefahr +1</w:t>
+      </w:r>
+    </w:p>
+    <w:p>
+      <w:pPr>
+        <w:spacing w:after="40" w:before="100"/>
+      </w:pPr>
+      <w:r>
+        <w:rPr>
+          <w:rFonts w:ascii="Georgia" w:cs="Georgia" w:eastAsia="Georgia" w:hAnsi="Georgia"/>
+          <w:b/>
+          <w:bCs/>
+          <w:color w:val="555555"/>
+          <w:sz w:val="19"/>
+          <w:szCs w:val="19"/>
+        </w:rPr>
+        <w:t xml:space="preserve">Im Hof</w:t>
+      </w:r>
+    </w:p>
+    <w:p>
+      <w:pPr>
+        <w:spacing w:after="110" w:line="320"/>
+      </w:pPr>
+      <w:r>
+        <w:rPr>
+          <w:rFonts w:ascii="Georgia" w:cs="Georgia" w:eastAsia="Georgia" w:hAnsi="Georgia"/>
+          <w:sz w:val="22"/>
+          <w:szCs w:val="22"/>
+        </w:rPr>
+        <w:t xml:space="preserve">Past the guards, through the gate</w:t>
+      </w:r>
+      <w:r>
+        <w:rPr>
+          <w:rFonts w:ascii="Georgia" w:cs="Georgia" w:eastAsia="Georgia" w:hAnsi="Georgia"/>
+          <w:sz w:val="22"/>
+          <w:szCs w:val="22"/>
+        </w:rPr>
+        <w:t xml:space="preserve"> that nobody ever closed — and you are standing in a square courtyard</w:t>
+      </w:r>
+      <w:r>
+        <w:rPr>
+          <w:rFonts w:ascii="Georgia" w:cs="Georgia" w:eastAsia="Georgia" w:hAnsi="Georgia"/>
+          <w:color w:val="7A5A1A"/>
+          <w:sz w:val="18"/>
+          <w:szCs w:val="18"/>
+        </w:rPr>
+        <w:t xml:space="preserve"> [Innenhof]</w:t>
+      </w:r>
+      <w:r>
+        <w:rPr>
+          <w:rFonts w:ascii="Georgia" w:cs="Georgia" w:eastAsia="Georgia" w:hAnsi="Georgia"/>
+          <w:sz w:val="22"/>
+          <w:szCs w:val="22"/>
+        </w:rPr>
+        <w:t xml:space="preserve"> of black stone</w:t>
+      </w:r>
+      <w:r>
+        <w:rPr>
+          <w:rFonts w:ascii="Georgia" w:cs="Georgia" w:eastAsia="Georgia" w:hAnsi="Georgia"/>
+          <w:color w:val="7A5A1A"/>
+          <w:sz w:val="18"/>
+          <w:szCs w:val="18"/>
+        </w:rPr>
+        <w:t xml:space="preserve"> [schwarzer Stein]</w:t>
+      </w:r>
+      <w:r>
+        <w:rPr>
+          <w:rFonts w:ascii="Georgia" w:cs="Georgia" w:eastAsia="Georgia" w:hAnsi="Georgia"/>
+          <w:sz w:val="22"/>
+          <w:szCs w:val="22"/>
+        </w:rPr>
+        <w:t xml:space="preserve">.</w:t>
+      </w:r>
+    </w:p>
+    <w:p>
+      <w:pPr>
+        <w:spacing w:after="60" w:before="120"/>
+      </w:pPr>
+      <w:r>
+        <w:rPr>
+          <w:rFonts w:ascii="Georgia" w:cs="Georgia" w:eastAsia="Georgia" w:hAnsi="Georgia"/>
+          <w:b/>
+          <w:bCs/>
+          <w:color w:val="7A5A1A"/>
+          <w:sz w:val="17"/>
+          <w:szCs w:val="17"/>
+        </w:rPr>
+        <w:t xml:space="preserve">▸ Nur bei: Weg B · Stollen</w:t>
+      </w:r>
+    </w:p>
+    <w:p>
+      <w:pPr>
+        <w:pBdr>
+          <w:left w:val="single" w:color="BFBFBF" w:sz="18" w:space="8"/>
+        </w:pBdr>
+        <w:shd w:fill="F2F2F2" w:color="auto" w:val="clear"/>
+        <w:spacing w:after="140"/>
+        <w:ind w:left="120"/>
+      </w:pPr>
+      <w:r>
+        <w:rPr>
+          <w:rFonts w:ascii="Georgia" w:cs="Georgia" w:eastAsia="Georgia" w:hAnsi="Georgia"/>
+          <w:b/>
+          <w:bCs/>
+          <w:color w:val="555555"/>
+          <w:sz w:val="16"/>
+          <w:szCs w:val="16"/>
+        </w:rPr>
+        <w:t xml:space="preserve">HINTERGRUND · STOLLEN (NUR DM):  </w:t>
+      </w:r>
+      <w:r>
+        <w:rPr>
+          <w:rFonts w:ascii="Georgia" w:cs="Georgia" w:eastAsia="Georgia" w:hAnsi="Georgia"/>
+          <w:color w:val="333333"/>
+          <w:sz w:val="18"/>
+          <w:szCs w:val="18"/>
+        </w:rPr>
+        <w:t xml:space="preserve">Vier Stunden Dunkelheit, schlechte Luft (−2 HP für alle, Knopf unten), dann ein Keller unter dem Schloss — und eine Wache mit Lampe. Hier wird nicht gewürfelt, hier wird geredet: Trägt jede Figur einen ganzen englischen Satz bei und droht niemand, glaubt er ihnen. Stottert die Gruppe, droht oder greift jemand an: Knopf unten, Kampf, Gefahr +1.</w:t>
+      </w:r>
+    </w:p>
+    <w:p>
+      <w:pPr>
+        <w:spacing w:after="40" w:before="100"/>
+      </w:pPr>
+      <w:r>
+        <w:rPr>
+          <w:rFonts w:ascii="Georgia" w:cs="Georgia" w:eastAsia="Georgia" w:hAnsi="Georgia"/>
+          <w:b/>
+          <w:bCs/>
+          <w:color w:val="555555"/>
+          <w:sz w:val="19"/>
+          <w:szCs w:val="19"/>
+        </w:rPr>
+        <w:t xml:space="preserve">Der Stollen</w:t>
+      </w:r>
+    </w:p>
+    <w:p>
+      <w:pPr>
+        <w:spacing w:after="110" w:line="320"/>
+      </w:pPr>
+      <w:r>
+        <w:rPr>
+          <w:rFonts w:ascii="Georgia" w:cs="Georgia" w:eastAsia="Georgia" w:hAnsi="Georgia"/>
+          <w:sz w:val="22"/>
+          <w:szCs w:val="22"/>
+        </w:rPr>
+        <w:t xml:space="preserve">The mine entrance</w:t>
+      </w:r>
+      <w:r>
+        <w:rPr>
+          <w:rFonts w:ascii="Georgia" w:cs="Georgia" w:eastAsia="Georgia" w:hAnsi="Georgia"/>
+          <w:color w:val="7A5A1A"/>
+          <w:sz w:val="18"/>
+          <w:szCs w:val="18"/>
+        </w:rPr>
+        <w:t xml:space="preserve"> [Stolleneingang]</w:t>
+      </w:r>
+      <w:r>
+        <w:rPr>
+          <w:rFonts w:ascii="Georgia" w:cs="Georgia" w:eastAsia="Georgia" w:hAnsi="Georgia"/>
+          <w:sz w:val="22"/>
+          <w:szCs w:val="22"/>
+        </w:rPr>
+        <w:t xml:space="preserve"> is a hole behind a dead tree</w:t>
+      </w:r>
+      <w:r>
+        <w:rPr>
+          <w:rFonts w:ascii="Georgia" w:cs="Georgia" w:eastAsia="Georgia" w:hAnsi="Georgia"/>
+          <w:color w:val="7A5A1A"/>
+          <w:sz w:val="18"/>
+          <w:szCs w:val="18"/>
+        </w:rPr>
+        <w:t xml:space="preserve"> [toter Baum]</w:t>
+      </w:r>
+      <w:r>
+        <w:rPr>
+          <w:rFonts w:ascii="Georgia" w:cs="Georgia" w:eastAsia="Georgia" w:hAnsi="Georgia"/>
+          <w:sz w:val="22"/>
+          <w:szCs w:val="22"/>
+        </w:rPr>
+        <w:t xml:space="preserve"> above the village, and it is smaller than all of you.</w:t>
+      </w:r>
+    </w:p>
+    <w:p>
+      <w:pPr>
+        <w:spacing w:after="110" w:line="320"/>
+      </w:pPr>
+      <w:r>
+        <w:rPr>
+          <w:rFonts w:ascii="Georgia" w:cs="Georgia" w:eastAsia="Georgia" w:hAnsi="Georgia"/>
+          <w:sz w:val="22"/>
+          <w:szCs w:val="22"/>
+        </w:rPr>
+        <w:t xml:space="preserve">Four hours in the dark. After two, the air turns sweet and heavy</w:t>
+      </w:r>
+      <w:r>
+        <w:rPr>
+          <w:rFonts w:ascii="Georgia" w:cs="Georgia" w:eastAsia="Georgia" w:hAnsi="Georgia"/>
+          <w:color w:val="7A5A1A"/>
+          <w:sz w:val="18"/>
+          <w:szCs w:val="18"/>
+        </w:rPr>
+        <w:t xml:space="preserve"> [süss und schwer]</w:t>
+      </w:r>
+      <w:r>
+        <w:rPr>
+          <w:rFonts w:ascii="Georgia" w:cs="Georgia" w:eastAsia="Georgia" w:hAnsi="Georgia"/>
+          <w:sz w:val="22"/>
+          <w:szCs w:val="22"/>
+        </w:rPr>
+        <w:t xml:space="preserve"> and everybody’s head starts to hurt</w:t>
+      </w:r>
+      <w:r>
+        <w:rPr>
+          <w:rFonts w:ascii="Georgia" w:cs="Georgia" w:eastAsia="Georgia" w:hAnsi="Georgia"/>
+          <w:sz w:val="22"/>
+          <w:szCs w:val="22"/>
+        </w:rPr>
+        <w:t xml:space="preserve"> — you each lose two hit points.</w:t>
+      </w:r>
+    </w:p>
+    <w:p>
+      <w:pPr>
+        <w:spacing w:after="110" w:line="320"/>
+      </w:pPr>
+      <w:r>
+        <w:rPr>
+          <w:rFonts w:ascii="Georgia" w:cs="Georgia" w:eastAsia="Georgia" w:hAnsi="Georgia"/>
+          <w:sz w:val="22"/>
+          <w:szCs w:val="22"/>
+        </w:rPr>
+        <w:t xml:space="preserve">After three, you find what is left of the Kessler family: tools</w:t>
+      </w:r>
+      <w:r>
+        <w:rPr>
+          <w:rFonts w:ascii="Georgia" w:cs="Georgia" w:eastAsia="Georgia" w:hAnsi="Georgia"/>
+          <w:color w:val="7A5A1A"/>
+          <w:sz w:val="18"/>
+          <w:szCs w:val="18"/>
+        </w:rPr>
+        <w:t xml:space="preserve"> [Werkzeuge]</w:t>
+      </w:r>
+      <w:r>
+        <w:rPr>
+          <w:rFonts w:ascii="Georgia" w:cs="Georgia" w:eastAsia="Georgia" w:hAnsi="Georgia"/>
+          <w:sz w:val="22"/>
+          <w:szCs w:val="22"/>
+        </w:rPr>
+        <w:t xml:space="preserve">, a child’s shoe</w:t>
+      </w:r>
+      <w:r>
+        <w:rPr>
+          <w:rFonts w:ascii="Georgia" w:cs="Georgia" w:eastAsia="Georgia" w:hAnsi="Georgia"/>
+          <w:color w:val="7A5A1A"/>
+          <w:sz w:val="18"/>
+          <w:szCs w:val="18"/>
+        </w:rPr>
+        <w:t xml:space="preserve"> [Kinderschuh]</w:t>
+      </w:r>
+      <w:r>
+        <w:rPr>
+          <w:rFonts w:ascii="Georgia" w:cs="Georgia" w:eastAsia="Georgia" w:hAnsi="Georgia"/>
+          <w:sz w:val="22"/>
+          <w:szCs w:val="22"/>
+        </w:rPr>
+        <w:t xml:space="preserve">, and a lamp that somebody put down neatly</w:t>
+      </w:r>
+      <w:r>
+        <w:rPr>
+          <w:rFonts w:ascii="Georgia" w:cs="Georgia" w:eastAsia="Georgia" w:hAnsi="Georgia"/>
+          <w:color w:val="7A5A1A"/>
+          <w:sz w:val="18"/>
+          <w:szCs w:val="18"/>
+        </w:rPr>
+        <w:t xml:space="preserve"> [ordentlich]</w:t>
+      </w:r>
+      <w:r>
+        <w:rPr>
+          <w:rFonts w:ascii="Georgia" w:cs="Georgia" w:eastAsia="Georgia" w:hAnsi="Georgia"/>
+          <w:sz w:val="22"/>
+          <w:szCs w:val="22"/>
+        </w:rPr>
+        <w:t xml:space="preserve"> before they stopped needing it.</w:t>
+      </w:r>
+    </w:p>
+    <w:p>
+      <w:pPr>
+        <w:pBdr>
+          <w:left w:val="single" w:color="BFBFBF" w:sz="18" w:space="8"/>
+        </w:pBdr>
+        <w:shd w:fill="F2F2F2" w:color="auto" w:val="clear"/>
+        <w:spacing w:after="140"/>
+        <w:ind w:left="120"/>
+      </w:pPr>
+      <w:r>
+        <w:rPr>
+          <w:rFonts w:ascii="Georgia" w:cs="Georgia" w:eastAsia="Georgia" w:hAnsi="Georgia"/>
+          <w:b/>
+          <w:bCs/>
+          <w:color w:val="555555"/>
+          <w:sz w:val="16"/>
+          <w:szCs w:val="16"/>
+        </w:rPr>
+        <w:t xml:space="preserve">KNOPF (NUR DM):  </w:t>
+      </w:r>
+      <w:r>
+        <w:rPr>
+          <w:rFonts w:ascii="Georgia" w:cs="Georgia" w:eastAsia="Georgia" w:hAnsi="Georgia"/>
+          <w:color w:val="333333"/>
+          <w:sz w:val="18"/>
+          <w:szCs w:val="18"/>
+        </w:rPr>
+        <w:t xml:space="preserve">Die schlechte Luft anwenden — dann stimmen die Werte im Reiter Charakter-Übersicht.  →  −2 HP für alle</w:t>
+      </w:r>
+    </w:p>
+    <w:p>
+      <w:pPr>
+        <w:spacing w:after="40" w:before="100"/>
+      </w:pPr>
+      <w:r>
+        <w:rPr>
+          <w:rFonts w:ascii="Georgia" w:cs="Georgia" w:eastAsia="Georgia" w:hAnsi="Georgia"/>
+          <w:b/>
+          <w:bCs/>
+          <w:color w:val="555555"/>
+          <w:sz w:val="19"/>
+          <w:szCs w:val="19"/>
+        </w:rPr>
+        <w:t xml:space="preserve">Der Keller</w:t>
+      </w:r>
+    </w:p>
+    <w:p>
+      <w:pPr>
+        <w:spacing w:after="110" w:line="320"/>
+      </w:pPr>
+      <w:r>
+        <w:rPr>
+          <w:rFonts w:ascii="Georgia" w:cs="Georgia" w:eastAsia="Georgia" w:hAnsi="Georgia"/>
+          <w:sz w:val="22"/>
+          <w:szCs w:val="22"/>
+        </w:rPr>
+        <w:t xml:space="preserve">The tunnel ends at a rotten</w:t>
+      </w:r>
+      <w:r>
+        <w:rPr>
+          <w:rFonts w:ascii="Georgia" w:cs="Georgia" w:eastAsia="Georgia" w:hAnsi="Georgia"/>
+          <w:color w:val="7A5A1A"/>
+          <w:sz w:val="18"/>
+          <w:szCs w:val="18"/>
+        </w:rPr>
+        <w:t xml:space="preserve"> [morsch]</w:t>
+      </w:r>
+      <w:r>
+        <w:rPr>
+          <w:rFonts w:ascii="Georgia" w:cs="Georgia" w:eastAsia="Georgia" w:hAnsi="Georgia"/>
+          <w:sz w:val="22"/>
+          <w:szCs w:val="22"/>
+        </w:rPr>
+        <w:t xml:space="preserve"> wooden door. Behind it: a cellar</w:t>
+      </w:r>
+      <w:r>
+        <w:rPr>
+          <w:rFonts w:ascii="Georgia" w:cs="Georgia" w:eastAsia="Georgia" w:hAnsi="Georgia"/>
+          <w:color w:val="7A5A1A"/>
+          <w:sz w:val="18"/>
+          <w:szCs w:val="18"/>
+        </w:rPr>
+        <w:t xml:space="preserve"> [Keller]</w:t>
+      </w:r>
+      <w:r>
+        <w:rPr>
+          <w:rFonts w:ascii="Georgia" w:cs="Georgia" w:eastAsia="Georgia" w:hAnsi="Georgia"/>
+          <w:sz w:val="22"/>
+          <w:szCs w:val="22"/>
+        </w:rPr>
+        <w:t xml:space="preserve"> full of barrels</w:t>
+      </w:r>
+      <w:r>
+        <w:rPr>
+          <w:rFonts w:ascii="Georgia" w:cs="Georgia" w:eastAsia="Georgia" w:hAnsi="Georgia"/>
+          <w:color w:val="7A5A1A"/>
+          <w:sz w:val="18"/>
+          <w:szCs w:val="18"/>
+        </w:rPr>
+        <w:t xml:space="preserve"> [Fässer]</w:t>
+      </w:r>
+      <w:r>
+        <w:rPr>
+          <w:rFonts w:ascii="Georgia" w:cs="Georgia" w:eastAsia="Georgia" w:hAnsi="Georgia"/>
+          <w:sz w:val="22"/>
+          <w:szCs w:val="22"/>
+        </w:rPr>
+        <w:t xml:space="preserve">, a smell of wine and wet stone</w:t>
+      </w:r>
+      <w:r>
+        <w:rPr>
+          <w:rFonts w:ascii="Georgia" w:cs="Georgia" w:eastAsia="Georgia" w:hAnsi="Georgia"/>
+          <w:color w:val="7A5A1A"/>
+          <w:sz w:val="18"/>
+          <w:szCs w:val="18"/>
+        </w:rPr>
+        <w:t xml:space="preserve"> [nasser Stein]</w:t>
+      </w:r>
+      <w:r>
+        <w:rPr>
+          <w:rFonts w:ascii="Georgia" w:cs="Georgia" w:eastAsia="Georgia" w:hAnsi="Georgia"/>
+          <w:sz w:val="22"/>
+          <w:szCs w:val="22"/>
+        </w:rPr>
+        <w:t xml:space="preserve">, and a stair</w:t>
+      </w:r>
+      <w:r>
+        <w:rPr>
+          <w:rFonts w:ascii="Georgia" w:cs="Georgia" w:eastAsia="Georgia" w:hAnsi="Georgia"/>
+          <w:color w:val="7A5A1A"/>
+          <w:sz w:val="18"/>
+          <w:szCs w:val="18"/>
+        </w:rPr>
+        <w:t xml:space="preserve"> [Treppe]</w:t>
+      </w:r>
+      <w:r>
+        <w:rPr>
+          <w:rFonts w:ascii="Georgia" w:cs="Georgia" w:eastAsia="Georgia" w:hAnsi="Georgia"/>
+          <w:sz w:val="22"/>
+          <w:szCs w:val="22"/>
+        </w:rPr>
+        <w:t xml:space="preserve"> going up. In the corner, behind an iron grille, a shelf of small bottles — and one of them gives off a faint, pale</w:t>
+      </w:r>
+      <w:r>
+        <w:rPr>
+          <w:rFonts w:ascii="Georgia" w:cs="Georgia" w:eastAsia="Georgia" w:hAnsi="Georgia"/>
+          <w:color w:val="7A5A1A"/>
+          <w:sz w:val="18"/>
+          <w:szCs w:val="18"/>
+        </w:rPr>
+        <w:t xml:space="preserve"> [blass, hell]</w:t>
+      </w:r>
+      <w:r>
+        <w:rPr>
+          <w:rFonts w:ascii="Georgia" w:cs="Georgia" w:eastAsia="Georgia" w:hAnsi="Georgia"/>
+          <w:sz w:val="22"/>
+          <w:szCs w:val="22"/>
+        </w:rPr>
+        <w:t xml:space="preserve"> light.</w:t>
+      </w:r>
+    </w:p>
+    <w:p>
+      <w:pPr>
+        <w:spacing w:after="110" w:line="320"/>
+      </w:pPr>
+      <w:r>
+        <w:rPr>
+          <w:rFonts w:ascii="Georgia" w:cs="Georgia" w:eastAsia="Georgia" w:hAnsi="Georgia"/>
+          <w:sz w:val="22"/>
+          <w:szCs w:val="22"/>
+        </w:rPr>
+        <w:t xml:space="preserve">At the top of the stair</w:t>
+      </w:r>
+      <w:r>
+        <w:rPr>
+          <w:rFonts w:ascii="Georgia" w:cs="Georgia" w:eastAsia="Georgia" w:hAnsi="Georgia"/>
+          <w:sz w:val="22"/>
+          <w:szCs w:val="22"/>
+        </w:rPr>
+        <w:t xml:space="preserve"> stands a man with a lamp. He has heard the door. He comes down, slowly, coughing — a cough that has clearly been going on for weeks — and holds the lamp up to your faces.</w:t>
+      </w:r>
+    </w:p>
+    <w:p>
+      <w:pPr>
+        <w:pBdr>
+          <w:left w:val="single" w:color="D9A441" w:sz="18" w:space="8"/>
+        </w:pBdr>
+        <w:shd w:fill="FFF6DD" w:color="auto" w:val="clear"/>
+        <w:spacing w:after="140"/>
+        <w:ind w:left="120"/>
+      </w:pPr>
+      <w:r>
+        <w:rPr>
+          <w:rFonts w:ascii="Georgia" w:cs="Georgia" w:eastAsia="Georgia" w:hAnsi="Georgia"/>
+          <w:b/>
+          <w:bCs/>
+          <w:color w:val="8A6A2C"/>
+          <w:sz w:val="16"/>
+          <w:szCs w:val="16"/>
+        </w:rPr>
         <w:t xml:space="preserve">DIE WACHE (rau, müde, gelangweilt):  </w:t>
       </w:r>
       <w:r>
@@ -4939,27 +5024,165 @@
           <w:sz w:val="17"/>
           <w:szCs w:val="17"/>
         </w:rPr>
-        <w:t xml:space="preserve">Jeder ein ganzer Satz, keine Drohung → er glaubt ihnen: „Guests. Of course. Nobody tells me anything. Up the stair, wait in the courtyard — somebody will come for you.“ (Niemand kommt.) Sonst der Knopf unten.</w:t>
-      </w:r>
-    </w:p>
-    <w:p>
-      <w:pPr>
-        <w:pBdr>
-          <w:left w:val="single" w:color="BFBFBF" w:sz="18" w:space="8"/>
-        </w:pBdr>
-        <w:shd w:fill="F2F2F2" w:color="auto" w:val="clear"/>
-        <w:spacing w:after="140"/>
-        <w:ind w:left="120"/>
-      </w:pPr>
-      <w:r>
-        <w:rPr>
-          <w:rFonts w:ascii="Georgia" w:cs="Georgia" w:eastAsia="Georgia" w:hAnsi="Georgia"/>
-          <w:b/>
-          <w:bCs/>
-          <w:color w:val="555555"/>
+        <w:t xml:space="preserve">Reden lassen, dann unten anklicken, was passiert ist. Jeder ein ganzer Satz und niemand droht → er glaubt ihnen. Stottert die Gruppe, droht oder greift jemand an → Kampf.</w:t>
+      </w:r>
+    </w:p>
+    <w:p>
+      <w:pPr>
+        <w:pBdr>
+          <w:left w:val="single" w:color="BFBFBF" w:sz="18" w:space="8"/>
+        </w:pBdr>
+        <w:shd w:fill="F2F2F2" w:color="auto" w:val="clear"/>
+        <w:spacing w:after="40"/>
+        <w:ind w:left="120"/>
+      </w:pPr>
+      <w:r>
+        <w:rPr>
+          <w:rFonts w:ascii="Georgia" w:cs="Georgia" w:eastAsia="Georgia" w:hAnsi="Georgia"/>
+          <w:b/>
+          <w:bCs/>
+          <w:color w:val="8A6A2C"/>
           <w:sz w:val="16"/>
           <w:szCs w:val="16"/>
         </w:rPr>
+        <w:t xml:space="preserve">WAS IST PASSIERT? (NUR DM): Glaubt die Wache ihnen?  </w:t>
+      </w:r>
+    </w:p>
+    <w:p>
+      <w:pPr>
+        <w:pBdr>
+          <w:left w:val="single" w:color="BFBFBF" w:sz="18" w:space="8"/>
+        </w:pBdr>
+        <w:shd w:fill="F2F2F2" w:color="auto" w:val="clear"/>
+        <w:spacing w:after="40"/>
+        <w:ind w:left="120"/>
+      </w:pPr>
+      <w:r>
+        <w:rPr>
+          <w:rFonts w:ascii="Georgia" w:cs="Georgia" w:eastAsia="Georgia" w:hAnsi="Georgia"/>
+          <w:b/>
+          <w:bCs/>
+          <w:color w:val="333333"/>
+          <w:sz w:val="18"/>
+          <w:szCs w:val="18"/>
+        </w:rPr>
+        <w:t xml:space="preserve">Ja — er glaubt ihnen  </w:t>
+      </w:r>
+      <w:r>
+        <w:rPr>
+          <w:rFonts w:ascii="Georgia" w:cs="Georgia" w:eastAsia="Georgia" w:hAnsi="Georgia"/>
+          <w:i/>
+          <w:iCs/>
+          <w:color w:val="555555"/>
+          <w:sz w:val="18"/>
+          <w:szCs w:val="18"/>
+        </w:rPr>
+        <w:t xml:space="preserve">Jede Figur ein ganzer Satz, niemand droht.</w:t>
+      </w:r>
+    </w:p>
+    <w:p>
+      <w:pPr>
+        <w:pBdr>
+          <w:left w:val="single" w:color="BFBFBF" w:sz="18" w:space="8"/>
+        </w:pBdr>
+        <w:shd w:fill="F2F2F2" w:color="auto" w:val="clear"/>
+        <w:spacing w:after="140"/>
+        <w:ind w:left="120"/>
+      </w:pPr>
+      <w:r>
+        <w:rPr>
+          <w:rFonts w:ascii="Georgia" w:cs="Georgia" w:eastAsia="Georgia" w:hAnsi="Georgia"/>
+          <w:b/>
+          <w:bCs/>
+          <w:color w:val="333333"/>
+          <w:sz w:val="18"/>
+          <w:szCs w:val="18"/>
+        </w:rPr>
+        <w:t xml:space="preserve">Nein — Kampf  </w:t>
+      </w:r>
+      <w:r>
+        <w:rPr>
+          <w:rFonts w:ascii="Georgia" w:cs="Georgia" w:eastAsia="Georgia" w:hAnsi="Georgia"/>
+          <w:i/>
+          <w:iCs/>
+          <w:color w:val="555555"/>
+          <w:sz w:val="18"/>
+          <w:szCs w:val="18"/>
+        </w:rPr>
+        <w:t xml:space="preserve">Gestottert, gedroht oder angegriffen.</w:t>
+      </w:r>
+    </w:p>
+    <w:p>
+      <w:pPr>
+        <w:pBdr>
+          <w:left w:val="single" w:color="D9A441" w:sz="18" w:space="8"/>
+        </w:pBdr>
+        <w:shd w:fill="FFF6DD" w:color="auto" w:val="clear"/>
+        <w:spacing w:after="140"/>
+        <w:ind w:left="120"/>
+      </w:pPr>
+      <w:r>
+        <w:rPr>
+          <w:rFonts w:ascii="Georgia" w:cs="Georgia" w:eastAsia="Georgia" w:hAnsi="Georgia"/>
+          <w:b/>
+          <w:bCs/>
+          <w:color w:val="8A6A2C"/>
+          <w:sz w:val="16"/>
+          <w:szCs w:val="16"/>
+        </w:rPr>
+        <w:t xml:space="preserve">DIE WACHE (rau, müde, gelangweilt):  </w:t>
+      </w:r>
+      <w:r>
+        <w:rPr>
+          <w:rFonts w:ascii="Georgia" w:cs="Georgia" w:eastAsia="Georgia" w:hAnsi="Georgia"/>
+          <w:sz w:val="21"/>
+          <w:szCs w:val="21"/>
+        </w:rPr>
+        <w:t xml:space="preserve">Guests</w:t>
+      </w:r>
+      <w:r>
+        <w:rPr>
+          <w:rFonts w:ascii="Georgia" w:cs="Georgia" w:eastAsia="Georgia" w:hAnsi="Georgia"/>
+          <w:sz w:val="21"/>
+          <w:szCs w:val="21"/>
+        </w:rPr>
+        <w:t xml:space="preserve">. Of course. Nobody tells me anything. Up the stair</w:t>
+      </w:r>
+      <w:r>
+        <w:rPr>
+          <w:rFonts w:ascii="Georgia" w:cs="Georgia" w:eastAsia="Georgia" w:hAnsi="Georgia"/>
+          <w:sz w:val="21"/>
+          <w:szCs w:val="21"/>
+        </w:rPr>
+        <w:t xml:space="preserve">, wait in the courtyard</w:t>
+      </w:r>
+      <w:r>
+        <w:rPr>
+          <w:rFonts w:ascii="Georgia" w:cs="Georgia" w:eastAsia="Georgia" w:hAnsi="Georgia"/>
+          <w:sz w:val="21"/>
+          <w:szCs w:val="21"/>
+        </w:rPr>
+        <w:t xml:space="preserve"> — somebody will come for you.</w:t>
+      </w:r>
+    </w:p>
+    <w:p>
+      <w:pPr>
+        <w:pBdr>
+          <w:left w:val="single" w:color="BFBFBF" w:sz="18" w:space="8"/>
+        </w:pBdr>
+        <w:shd w:fill="F2F2F2" w:color="auto" w:val="clear"/>
+        <w:spacing w:after="140"/>
+        <w:ind w:left="120"/>
+      </w:pPr>
+      <w:r>
+        <w:rPr>
+          <w:rFonts w:ascii="Georgia" w:cs="Georgia" w:eastAsia="Georgia" w:hAnsi="Georgia"/>
+          <w:b/>
+          <w:bCs/>
+          <w:color w:val="555555"/>
+          <w:sz w:val="16"/>
+          <w:szCs w:val="16"/>
+        </w:rPr>
         <w:t xml:space="preserve">KNOPF (NUR DM):  </w:t>
       </w:r>
       <w:r>
@@ -5362,7 +5585,7 @@
           <w:sz w:val="17"/>
           <w:szCs w:val="17"/>
         </w:rPr>
-        <w:t xml:space="preserve">vorbei — weiter bei „Im Hof“</w:t>
+        <w:t xml:space="preserve">unten „Ja — vorbeigeschlichen“ anklicken → weiter ohne Kampf</w:t>
       </w:r>
     </w:p>
     <w:p>
@@ -5392,7 +5615,7 @@
           <w:sz w:val="17"/>
           <w:szCs w:val="17"/>
         </w:rPr>
-        <w:t xml:space="preserve">Knopf: Kampf mit zwei Wachen, Gefahr +1</w:t>
+        <w:t xml:space="preserve">unten „Nein — entdeckt“ anklicken → erst dann erscheint der Kampf (zwei Wachen, Gefahr +1)</w:t>
       </w:r>
     </w:p>
     <w:p>
@@ -5422,7 +5645,7 @@
           <w:sz w:val="17"/>
           <w:szCs w:val="17"/>
         </w:rPr>
-        <w:t xml:space="preserve">er glaubt euch: „Guests. Of course.“ — hinauf in den Hof</w:t>
+        <w:t xml:space="preserve">unten „Ja — er glaubt ihnen“ anklicken → weiter ohne Kampf</w:t>
       </w:r>
     </w:p>
     <w:p>
@@ -5452,7 +5675,7 @@
           <w:sz w:val="17"/>
           <w:szCs w:val="17"/>
         </w:rPr>
-        <w:t xml:space="preserve">Knopf: Kampf mit der Wache, Gefahr +1</w:t>
+        <w:t xml:space="preserve">unten „Nein — Kampf“ anklicken → erst dann erscheint der Kampf (eine Wache, Gefahr +1)</w:t>
       </w:r>
     </w:p>
     <w:p>
@@ -7249,7 +7472,7 @@
           <w:sz w:val="17"/>
           <w:szCs w:val="17"/>
         </w:rPr>
-        <w:t xml:space="preserve">▸ Nur bei: Tür B · Kapelle, nicht: Name Anneke bekannt</w:t>
+        <w:t xml:space="preserve">▸ Nur bei: Tür B · Kapelle</w:t>
       </w:r>
     </w:p>
     <w:p>
@@ -7279,23 +7502,7 @@
           <w:sz w:val="18"/>
           <w:szCs w:val="18"/>
         </w:rPr>
-        <w:t xml:space="preserve">Die Gruppe kennt ihren Namen nicht — im Wirtshaus ist er nicht gefallen. Also sagt Anneke einen Satz (gelb unten) und greift an. Bei 8 Lebenspunkten hört Anneke von selbst auf und fragt „Is Greta still alive?“ — lass den Kampf dort enden, nicht bei null. Sie bleibt in der Kapelle zurück.</w:t>
-      </w:r>
-    </w:p>
-    <w:p>
-      <w:pPr>
-        <w:spacing w:after="60" w:before="120"/>
-      </w:pPr>
-      <w:r>
-        <w:rPr>
-          <w:rFonts w:ascii="Georgia" w:cs="Georgia" w:eastAsia="Georgia" w:hAnsi="Georgia"/>
-          <w:b/>
-          <w:bCs/>
-          <w:color w:val="7A5A1A"/>
-          <w:sz w:val="17"/>
-          <w:szCs w:val="17"/>
-        </w:rPr>
-        <w:t xml:space="preserve">▸ Nur bei: Tür B · Kapelle</w:t>
+        <w:t xml:space="preserve">Anneke steht auf und sagt einen Satz (gelb unten). Dann entscheidet sich, ob es einen Kampf gibt: Nennt jemand sie beim Namen? Den Namen können sie nur aus dem Wirtshaus kennen (Old Pieter). Unten anklicken, was am Tisch passiert.</w:t>
       </w:r>
     </w:p>
     <w:p>
@@ -7448,22 +7655,6 @@
           <w:szCs w:val="22"/>
         </w:rPr>
         <w:t xml:space="preserve"> at all, and that is worse.</w:t>
-      </w:r>
-    </w:p>
-    <w:p>
-      <w:pPr>
-        <w:spacing w:after="60" w:before="120"/>
-      </w:pPr>
-      <w:r>
-        <w:rPr>
-          <w:rFonts w:ascii="Georgia" w:cs="Georgia" w:eastAsia="Georgia" w:hAnsi="Georgia"/>
-          <w:b/>
-          <w:bCs/>
-          <w:color w:val="7A5A1A"/>
-          <w:sz w:val="17"/>
-          <w:szCs w:val="17"/>
-        </w:rPr>
-        <w:t xml:space="preserve">▸ Nur bei: Tür B · Kapelle, nicht: Name Anneke bekannt</w:t>
       </w:r>
     </w:p>
     <w:p>
@@ -7509,6 +7700,122 @@
           <w:rFonts w:ascii="Georgia" w:cs="Georgia" w:eastAsia="Georgia" w:hAnsi="Georgia"/>
           <w:b/>
           <w:bCs/>
+          <w:color w:val="8A6A2C"/>
+          <w:sz w:val="16"/>
+          <w:szCs w:val="16"/>
+        </w:rPr>
+        <w:t xml:space="preserve">WAS IST PASSIERT? (NUR DM): Nennt jemand sie beim Namen?  </w:t>
+      </w:r>
+    </w:p>
+    <w:p>
+      <w:pPr>
+        <w:pBdr>
+          <w:left w:val="single" w:color="BFBFBF" w:sz="18" w:space="8"/>
+        </w:pBdr>
+        <w:shd w:fill="F2F2F2" w:color="auto" w:val="clear"/>
+        <w:spacing w:after="40"/>
+        <w:ind w:left="120"/>
+      </w:pPr>
+      <w:r>
+        <w:rPr>
+          <w:rFonts w:ascii="Georgia" w:cs="Georgia" w:eastAsia="Georgia" w:hAnsi="Georgia"/>
+          <w:b/>
+          <w:bCs/>
+          <w:color w:val="333333"/>
+          <w:sz w:val="18"/>
+          <w:szCs w:val="18"/>
+        </w:rPr>
+        <w:t xml:space="preserve">Ja — jemand ruft „Anneke!“  </w:t>
+      </w:r>
+      <w:r>
+        <w:rPr>
+          <w:rFonts w:ascii="Georgia" w:cs="Georgia" w:eastAsia="Georgia" w:hAnsi="Georgia"/>
+          <w:i/>
+          <w:iCs/>
+          <w:color w:val="555555"/>
+          <w:sz w:val="18"/>
+          <w:szCs w:val="18"/>
+        </w:rPr>
+        <w:t xml:space="preserve">Sie hält an. Kein Kampf.</w:t>
+      </w:r>
+    </w:p>
+    <w:p>
+      <w:pPr>
+        <w:pBdr>
+          <w:left w:val="single" w:color="BFBFBF" w:sz="18" w:space="8"/>
+        </w:pBdr>
+        <w:shd w:fill="F2F2F2" w:color="auto" w:val="clear"/>
+        <w:spacing w:after="140"/>
+        <w:ind w:left="120"/>
+      </w:pPr>
+      <w:r>
+        <w:rPr>
+          <w:rFonts w:ascii="Georgia" w:cs="Georgia" w:eastAsia="Georgia" w:hAnsi="Georgia"/>
+          <w:b/>
+          <w:bCs/>
+          <w:color w:val="333333"/>
+          <w:sz w:val="18"/>
+          <w:szCs w:val="18"/>
+        </w:rPr>
+        <w:t xml:space="preserve">Nein — niemand kennt sie  </w:t>
+      </w:r>
+      <w:r>
+        <w:rPr>
+          <w:rFonts w:ascii="Georgia" w:cs="Georgia" w:eastAsia="Georgia" w:hAnsi="Georgia"/>
+          <w:i/>
+          <w:iCs/>
+          <w:color w:val="555555"/>
+          <w:sz w:val="18"/>
+          <w:szCs w:val="18"/>
+        </w:rPr>
+        <w:t xml:space="preserve">Sie greift an.</w:t>
+      </w:r>
+    </w:p>
+    <w:p>
+      <w:pPr>
+        <w:pBdr>
+          <w:left w:val="single" w:color="BFBFBF" w:sz="18" w:space="8"/>
+        </w:pBdr>
+        <w:shd w:fill="F2F2F2" w:color="auto" w:val="clear"/>
+        <w:spacing w:after="140"/>
+        <w:ind w:left="120"/>
+      </w:pPr>
+      <w:r>
+        <w:rPr>
+          <w:rFonts w:ascii="Georgia" w:cs="Georgia" w:eastAsia="Georgia" w:hAnsi="Georgia"/>
+          <w:b/>
+          <w:bCs/>
+          <w:color w:val="555555"/>
+          <w:sz w:val="16"/>
+          <w:szCs w:val="16"/>
+        </w:rPr>
+        <w:t xml:space="preserve">SIE KENNEN IHREN NAMEN — KEIN KAMPF (NUR DM):  </w:t>
+      </w:r>
+      <w:r>
+        <w:rPr>
+          <w:rFonts w:ascii="Georgia" w:cs="Georgia" w:eastAsia="Georgia" w:hAnsi="Georgia"/>
+          <w:color w:val="333333"/>
+          <w:sz w:val="18"/>
+          <w:szCs w:val="18"/>
+        </w:rPr>
+        <w:t xml:space="preserve">Anneke hält mitten in der Bewegung an und setzt sich zurück ins Becken. Dann fragt sie: „Is Greta still alive?“
+ Sie erzählt, was vor zwanzig Jahren geschah, und zeigt der Gruppe die Treppe hinter dem Altar. Sag laut, woran das lag: „Because you listened to the old man in the tavern, this fight never happens.“</w:t>
+      </w:r>
+    </w:p>
+    <w:p>
+      <w:pPr>
+        <w:pBdr>
+          <w:left w:val="single" w:color="BFBFBF" w:sz="18" w:space="8"/>
+        </w:pBdr>
+        <w:shd w:fill="F2F2F2" w:color="auto" w:val="clear"/>
+        <w:spacing w:after="40"/>
+        <w:ind w:left="120"/>
+      </w:pPr>
+      <w:r>
+        <w:rPr>
+          <w:rFonts w:ascii="Georgia" w:cs="Georgia" w:eastAsia="Georgia" w:hAnsi="Georgia"/>
+          <w:b/>
+          <w:bCs/>
           <w:color w:val="8A2C2C"/>
           <w:sz w:val="16"/>
           <w:szCs w:val="16"/>
@@ -7522,7 +7829,7 @@
           <w:sz w:val="18"/>
           <w:szCs w:val="18"/>
         </w:rPr>
-        <w:t xml:space="preserve"> 22 Lebenspunkte. Sie kämpft ohne Wut, was schlimmer ist.  Anneke 22 HP</w:t>
+        <w:t xml:space="preserve"> 22 Lebenspunkte. Sie kämpft ohne Wut, was schlimmer ist. Bei 8 Lebenspunkten hört sie von selbst auf und fragt „Is Greta still alive?“ — lass den Kampf dort enden, nicht bei null. Sie bleibt in der Kapelle zurück.  Anneke 22 HP</w:t>
       </w:r>
     </w:p>
     <w:p>
@@ -7564,69 +7871,6 @@
           <w:szCs w:val="17"/>
         </w:rPr>
         <w:t xml:space="preserve">Sie kämpft ohne Wut, was schlimmer ist. Bei 8 Lebenspunkten hört sie von selbst auf und fragt: „Is Greta still alive?“ — dort endet der Kampf.</w:t>
-      </w:r>
-    </w:p>
-    <w:p>
-      <w:pPr>
-        <w:spacing w:after="60" w:before="120"/>
-      </w:pPr>
-      <w:r>
-        <w:rPr>
-          <w:rFonts w:ascii="Georgia" w:cs="Georgia" w:eastAsia="Georgia" w:hAnsi="Georgia"/>
-          <w:b/>
-          <w:bCs/>
-          <w:color w:val="7A5A1A"/>
-          <w:sz w:val="17"/>
-          <w:szCs w:val="17"/>
-        </w:rPr>
-        <w:t xml:space="preserve">▸ Nur bei: Tür B · Kapelle, Name Anneke bekannt</w:t>
-      </w:r>
-    </w:p>
-    <w:p>
-      <w:pPr>
-        <w:pBdr>
-          <w:left w:val="single" w:color="BFBFBF" w:sz="18" w:space="8"/>
-        </w:pBdr>
-        <w:shd w:fill="F2F2F2" w:color="auto" w:val="clear"/>
-        <w:spacing w:after="140"/>
-        <w:ind w:left="120"/>
-      </w:pPr>
-      <w:r>
-        <w:rPr>
-          <w:rFonts w:ascii="Georgia" w:cs="Georgia" w:eastAsia="Georgia" w:hAnsi="Georgia"/>
-          <w:b/>
-          <w:bCs/>
-          <w:color w:val="555555"/>
-          <w:sz w:val="16"/>
-          <w:szCs w:val="16"/>
-        </w:rPr>
-        <w:t xml:space="preserve">SIE KENNEN IHREN NAMEN — KEIN KAMPF (NUR DM):  </w:t>
-      </w:r>
-      <w:r>
-        <w:rPr>
-          <w:rFonts w:ascii="Georgia" w:cs="Georgia" w:eastAsia="Georgia" w:hAnsi="Georgia"/>
-          <w:color w:val="333333"/>
-          <w:sz w:val="18"/>
-          <w:szCs w:val="18"/>
-        </w:rPr>
-        <w:t xml:space="preserve">Ruft jemand „Anneke!“, hält sie mitten in der Bewegung an und setzt sich zurück ins Becken. Dann fragt sie: „Is Greta still alive?“
- Sie erzählt, was vor zwanzig Jahren geschah, und zeigt der Gruppe die Treppe hinter dem Altar. Die Gefahr ist dafür schon richtig eingetragen — +1 statt +2. Sag laut, woran das lag: „Because you listened to the old man in the tavern, this fight never happens.“</w:t>
-      </w:r>
-    </w:p>
-    <w:p>
-      <w:pPr>
-        <w:spacing w:after="60" w:before="120"/>
-      </w:pPr>
-      <w:r>
-        <w:rPr>
-          <w:rFonts w:ascii="Georgia" w:cs="Georgia" w:eastAsia="Georgia" w:hAnsi="Georgia"/>
-          <w:b/>
-          <w:bCs/>
-          <w:color w:val="7A5A1A"/>
-          <w:sz w:val="17"/>
-          <w:szCs w:val="17"/>
-        </w:rPr>
-        <w:t xml:space="preserve">▸ Nur bei: Tür B · Kapelle</w:t>
       </w:r>
     </w:p>
     <w:p>
@@ -11640,37 +11884,6 @@
           <w:szCs w:val="18"/>
         </w:rPr>
         <w:t xml:space="preserve">Das Buch hat die Diener befreit — sie liegen irgendwo im Haus und schlafen zum ersten Mal seit Jahren. Vaskir kommt allein.</w:t>
-      </w:r>
-    </w:p>
-    <w:p>
-      <w:pPr>
-        <w:pBdr>
-          <w:left w:val="single" w:color="BFBFBF" w:sz="18" w:space="8"/>
-        </w:pBdr>
-        <w:shd w:fill="F2F2F2" w:color="auto" w:val="clear"/>
-        <w:spacing w:after="140"/>
-        <w:ind w:left="120"/>
-      </w:pPr>
-      <w:r>
-        <w:rPr>
-          <w:rFonts w:ascii="Georgia" w:cs="Georgia" w:eastAsia="Georgia" w:hAnsi="Georgia"/>
-          <w:b/>
-          <w:bCs/>
-          <w:color w:val="555555"/>
-          <w:sz w:val="16"/>
-          <w:szCs w:val="16"/>
-        </w:rPr>
-        <w:t xml:space="preserve">VAMPIRE SPAWN — WENN ER NICHT MEHR ALLEIN KÄMPFEN WILL (NUR DM):  </w:t>
-      </w:r>
-      <w:r>
-        <w:rPr>
-          <w:rFonts w:ascii="Georgia" w:cs="Georgia" w:eastAsia="Georgia" w:hAnsi="Georgia"/>
-          <w:color w:val="333333"/>
-          <w:sz w:val="18"/>
-          <w:szCs w:val="18"/>
-        </w:rPr>
-        <w:t xml:space="preserve">Vaskir kann Spawn rufen: Er beisst sich in die eigene Hand und lässt zwei Tropfen auf die Dielen fallen. Was daraus aufsteht, war heute Nacht noch ein Mensch. Es hat 30 Lebenspunkte und schlägt mit Claws 2d6+5 — härter als alles andere im Haus.
- Es kostet ihn etwas, und zwar sichtbar: Zwei Tropfen sind 6 Lebenspunkte von Vaskir selbst. Tipp die 6 in seine Karte und drück Schaden, dann den Knopf + Vampire Spawn. Unter 15 hört er auf zu kämpfen und redet — wer dreimal ruft, redet also früher. Sag den Schülern, was sie sehen: dass er dafür bezahlt. — Wie viele? Drei Spawn allein sind ein ausgerechneter Gleichstand — die Gruppe gewinnt in genau der Hälfte der Fälle, ohne Tränke und ohne Talente. Neben Vaskir nimmst du einen. Zwei neben ihm gewinnt die Gruppe noch in einem von drei Fällen, drei fast nie. Also: einen, wenn die Gruppe zu leicht durchkommt — und keinen, wenn schon jemand liegt. — Fällt Vaskir, fallen sie mit ihm. Nimm sie dann vom Tisch, egal wie viele Lebenspunkte sie noch haben: Der Kampf endet mit ihm, nicht mit ihnen.</w:t>
       </w:r>
     </w:p>
     <w:p>

</xml_diff>

<commit_message>
Hilfespalte: Doppelungen entfernt, echte Lehrertipps statt Wenn-dann
Die rechte Spalte wiederholte Hinweise, Weichen, Regie und FAQ. Jetzt
stehen dort Tipps, wie eine Lehrperson sie nebenbei gibt: der typische
Fehler an dieser Stelle und der Satz, mit dem man reagiert. Doppelte
Regie- und Hinweistexte gekürzt, der Kampfbildschirm zeigt nur noch die
Tipps zum Kampf.

Co-Authored-By: Claude Opus 5.5 <noreply@anthropic.com>
Claude-Session: https://claude.ai/code/session_01ADUPP2jvP6dgTYk1DsQkUN
</commit_message>
<xml_diff>
--- a/helferblatt/Nachtfels_Lesetext_DM.docx
+++ b/helferblatt/Nachtfels_Lesetext_DM.docx
@@ -186,7 +186,7 @@
           <w:szCs w:val="18"/>
         </w:rPr>
         <w:t xml:space="preserve">1 · Gold lesen. Englische Erzählung und Figurenrede — wörtlich. 2 · Grün fragen. Jede Figur äussert eine eigene Absicht oder Frage und danach einen Grund oder eine Reaktion. 3 · Ergebnis klicken. Nur markieren, was am Tisch passiert ist — Antworten abhaken, Entscheidungen anklicken.
- Rechts neben dem Text stehen die Hilfen auf der Höhe der Stelle, zu der sie gehören. Unten steht immer, wann es weitergeht. Die Gefahr stellst du an der Säule rechts ein — die Lasche ‹ GEFAHR klappt die Knöpfe heraus: 0–3 ruhig, 4–7 du darfst in einem Kampf einen Gegner dazunehmen, 8–10 eine Patrouille vor dem nächsten Akt. Rückgängig oben nimmt den letzten Spielschritt zurück.</w:t>
+ Rechts neben dem Text stehen die Tipps auf der Höhe der Stelle, zu der sie gehören: typische Stolpersteine genau dort und was du dann sagst. Unten steht immer, wann es weitergeht. Die Gefahr stellst du an der Säule rechts ein — die Lasche ‹ GEFAHR klappt die Knöpfe heraus: 0–3 ruhig, 4–7 du darfst in einem Kampf einen Gegner dazunehmen, 8–10 eine Patrouille vor dem nächsten Akt.</w:t>
       </w:r>
     </w:p>
     <w:p>
@@ -583,19 +583,19 @@
           <w:left w:val="single" w:color="BFBFBF" w:sz="18" w:space="8"/>
         </w:pBdr>
         <w:shd w:fill="F2F2F2" w:color="auto" w:val="clear"/>
-        <w:spacing w:after="40"/>
-        <w:ind w:left="120"/>
-      </w:pPr>
-      <w:r>
-        <w:rPr>
-          <w:rFonts w:ascii="Georgia" w:cs="Georgia" w:eastAsia="Georgia" w:hAnsi="Georgia"/>
-          <w:b/>
-          <w:bCs/>
-          <w:color w:val="333333"/>
-          <w:sz w:val="18"/>
-          <w:szCs w:val="18"/>
-        </w:rPr>
-        <w:t xml:space="preserve">Ein Fehlklick  </w:t>
+        <w:spacing w:after="140"/>
+        <w:ind w:left="120"/>
+      </w:pPr>
+      <w:r>
+        <w:rPr>
+          <w:rFonts w:ascii="Georgia" w:cs="Georgia" w:eastAsia="Georgia" w:hAnsi="Georgia"/>
+          <w:b/>
+          <w:bCs/>
+          <w:color w:val="333333"/>
+          <w:sz w:val="18"/>
+          <w:szCs w:val="18"/>
+        </w:rPr>
+        <w:t xml:space="preserve">Zeit knapp  </w:t>
       </w:r>
       <w:r>
         <w:rPr>
@@ -606,39 +606,7 @@
           <w:sz w:val="18"/>
           <w:szCs w:val="18"/>
         </w:rPr>
-        <w:t xml:space="preserve">Rückgängig oben in der Leiste nimmt den letzten vollständigen Spielschritt zurück. Bei Umwahl werden davon abhängige Entscheidungen und Zusagen verworfen.</w:t>
-      </w:r>
-    </w:p>
-    <w:p>
-      <w:pPr>
-        <w:pBdr>
-          <w:left w:val="single" w:color="BFBFBF" w:sz="18" w:space="8"/>
-        </w:pBdr>
-        <w:shd w:fill="F2F2F2" w:color="auto" w:val="clear"/>
-        <w:spacing w:after="140"/>
-        <w:ind w:left="120"/>
-      </w:pPr>
-      <w:r>
-        <w:rPr>
-          <w:rFonts w:ascii="Georgia" w:cs="Georgia" w:eastAsia="Georgia" w:hAnsi="Georgia"/>
-          <w:b/>
-          <w:bCs/>
-          <w:color w:val="333333"/>
-          <w:sz w:val="18"/>
-          <w:szCs w:val="18"/>
-        </w:rPr>
-        <w:t xml:space="preserve">Zeit knapp  </w:t>
-      </w:r>
-      <w:r>
-        <w:rPr>
-          <w:rFonts w:ascii="Georgia" w:cs="Georgia" w:eastAsia="Georgia" w:hAnsi="Georgia"/>
-          <w:i/>
-          <w:iCs/>
-          <w:color w:val="333333"/>
-          <w:sz w:val="18"/>
-          <w:szCs w:val="18"/>
-        </w:rPr>
-        <w:t xml:space="preserve">Kürzer vorlesen, eine Antwortrunde statt zwei. Zehn Minuten vor Schluss kommt der Graf von selbst, solange die Uhr läuft. Bei Unterbrechungen die Uhr anhalten.</w:t>
+        <w:t xml:space="preserve">Kürzer vorlesen, eine Antwortrunde statt zwei. Bei Unterbrechungen die Uhr anhalten.</w:t>
       </w:r>
     </w:p>
     <w:p>
@@ -659,67 +627,37 @@
           <w:sz w:val="16"/>
           <w:szCs w:val="16"/>
         </w:rPr>
-        <w:t xml:space="preserve">WENN … DANN (NUR DM)  </w:t>
-      </w:r>
-    </w:p>
-    <w:p>
-      <w:pPr>
-        <w:pBdr>
-          <w:left w:val="single" w:color="BFBFBF" w:sz="18" w:space="8"/>
-        </w:pBdr>
-        <w:shd w:fill="F2F2F2" w:color="auto" w:val="clear"/>
-        <w:spacing w:after="40"/>
-        <w:ind w:left="120"/>
-      </w:pPr>
-      <w:r>
-        <w:rPr>
-          <w:rFonts w:ascii="Georgia" w:cs="Georgia" w:eastAsia="Georgia" w:hAnsi="Georgia"/>
-          <w:b/>
-          <w:bCs/>
-          <w:color w:val="333333"/>
-          <w:sz w:val="17"/>
-          <w:szCs w:val="17"/>
-        </w:rPr>
-        <w:t xml:space="preserve">Deutsch fällt  →  </w:t>
-      </w:r>
-      <w:r>
-        <w:rPr>
-          <w:rFonts w:ascii="Georgia" w:cs="Georgia" w:eastAsia="Georgia" w:hAnsi="Georgia"/>
-          <w:color w:val="333333"/>
-          <w:sz w:val="17"/>
-          <w:szCs w:val="17"/>
-        </w:rPr>
-        <w:t xml:space="preserve">fehlendes Wort geben, „Try your idea in English.“ — keine Spielstrafe</w:t>
-      </w:r>
-    </w:p>
-    <w:p>
-      <w:pPr>
-        <w:pBdr>
-          <w:left w:val="single" w:color="BFBFBF" w:sz="18" w:space="8"/>
-        </w:pBdr>
-        <w:shd w:fill="F2F2F2" w:color="auto" w:val="clear"/>
-        <w:spacing w:after="40"/>
-        <w:ind w:left="120"/>
-      </w:pPr>
-      <w:r>
-        <w:rPr>
-          <w:rFonts w:ascii="Georgia" w:cs="Georgia" w:eastAsia="Georgia" w:hAnsi="Georgia"/>
-          <w:b/>
-          <w:bCs/>
-          <w:color w:val="333333"/>
-          <w:sz w:val="17"/>
-          <w:szCs w:val="17"/>
-        </w:rPr>
-        <w:t xml:space="preserve">Eine Figur fällt auf 0  →  </w:t>
-      </w:r>
-      <w:r>
-        <w:rPr>
-          <w:rFonts w:ascii="Georgia" w:cs="Georgia" w:eastAsia="Georgia" w:hAnsi="Georgia"/>
-          <w:color w:val="333333"/>
-          <w:sz w:val="17"/>
-          <w:szCs w:val="17"/>
-        </w:rPr>
-        <w:t xml:space="preserve">eigener Trank, oder liegen bis nach dem Kampf; dann heilt die Lightbearer alle</w:t>
+        <w:t xml:space="preserve">TIPPS (NUR DM)  </w:t>
+      </w:r>
+    </w:p>
+    <w:p>
+      <w:pPr>
+        <w:pBdr>
+          <w:left w:val="single" w:color="BFBFBF" w:sz="18" w:space="8"/>
+        </w:pBdr>
+        <w:shd w:fill="F2F2F2" w:color="auto" w:val="clear"/>
+        <w:spacing w:after="40"/>
+        <w:ind w:left="120"/>
+      </w:pPr>
+      <w:r>
+        <w:rPr>
+          <w:rFonts w:ascii="Georgia" w:cs="Georgia" w:eastAsia="Georgia" w:hAnsi="Georgia"/>
+          <w:b/>
+          <w:bCs/>
+          <w:color w:val="333333"/>
+          <w:sz w:val="17"/>
+          <w:szCs w:val="17"/>
+        </w:rPr>
+        <w:t xml:space="preserve">Ein Fehler, der das Verständnis nicht stört  →  </w:t>
+      </w:r>
+      <w:r>
+        <w:rPr>
+          <w:rFonts w:ascii="Georgia" w:cs="Georgia" w:eastAsia="Georgia" w:hAnsi="Georgia"/>
+          <w:color w:val="333333"/>
+          <w:sz w:val="17"/>
+          <w:szCs w:val="17"/>
+        </w:rPr>
+        <w:t xml:space="preserve">Nicht korrigieren. Als Figur richtig zurückgeben: „You went up there alone? Brave.“ — nie „No: went!“</w:t>
       </w:r>
     </w:p>
     <w:p>
@@ -740,16 +678,16 @@
           <w:sz w:val="17"/>
           <w:szCs w:val="17"/>
         </w:rPr>
-        <w:t xml:space="preserve">Niemand sagt etwas  →  </w:t>
-      </w:r>
-      <w:r>
-        <w:rPr>
-          <w:rFonts w:ascii="Georgia" w:cs="Georgia" w:eastAsia="Georgia" w:hAnsi="Georgia"/>
-          <w:color w:val="333333"/>
-          <w:sz w:val="17"/>
-          <w:szCs w:val="17"/>
-        </w:rPr>
-        <w:t xml:space="preserve">20 Sekunden Denkzeit, dann „What do you notice? What could you do?“</w:t>
+        <w:t xml:space="preserve">Du willst trotzdem etwas festhalten  →  </w:t>
+      </w:r>
+      <w:r>
+        <w:rPr>
+          <w:rFonts w:ascii="Georgia" w:cs="Georgia" w:eastAsia="Georgia" w:hAnsi="Georgia"/>
+          <w:color w:val="333333"/>
+          <w:sz w:val="17"/>
+          <w:szCs w:val="17"/>
+        </w:rPr>
+        <w:t xml:space="preserve">Nach der Szene, ein Satz, als Geschenk: „New phrase for you: …“ — höchstens einer pro Seite</w:t>
       </w:r>
     </w:p>
     <w:p>
@@ -824,7 +762,7 @@
           <w:sz w:val="18"/>
           <w:szCs w:val="18"/>
         </w:rPr>
-        <w:t xml:space="preserve">Sechs Stunden Kutschfahrt bergauf. Der Fahrer heisst Marek: grimmig, wortkarg — er stellt die erste Frage des Abends. Wichtig: Jede Figur antwortet ihm mit mindestens zwei bis drei Sätzen; die Vorstellung ist die erste Sprechübung. Zuerst liest du vor, wer sie sind und warum sie hier sind; dann sprechen die Schüler schon einmal kurz (eine Vermutung je Figur) — erst danach die Fahrt und Marek. Die Szene endet vor dem Wirtshaus.</w:t>
+        <w:t xml:space="preserve">Sechs Stunden Kutschfahrt bergauf. Der Fahrer heisst Marek: grimmig, wortkarg — er stellt die erste Frage des Abends, und die Vorstellung ist die erste Sprechübung. Die Szene endet vor dem Wirtshaus.</w:t>
       </w:r>
     </w:p>
     <w:p>
@@ -1250,7 +1188,7 @@
           <w:sz w:val="17"/>
           <w:szCs w:val="17"/>
         </w:rPr>
-        <w:t xml:space="preserve">Wer nur einen Satz sagt, bekommt von Marek: „What, that’s all? There’s plenty of time — tell me a bit more.“ Und er hakt nach: „Where are you from?“ — „What can you actually do?“ — „Why would anyone come up here in November?“ — „Who is paying you?“</w:t>
+        <w:t xml:space="preserve">Zwei bis drei Sätze je Figur. Stockt es, hakt Marek nach: „Where are you from?“ — „What can you actually do?“ — „Why would anyone come up here in November?“ — „Who is paying you?“</w:t>
       </w:r>
     </w:p>
     <w:p>
@@ -1759,37 +1697,97 @@
           <w:sz w:val="16"/>
           <w:szCs w:val="16"/>
         </w:rPr>
-        <w:t xml:space="preserve">WENN … DANN (NUR DM)  </w:t>
-      </w:r>
-    </w:p>
-    <w:p>
-      <w:pPr>
-        <w:pBdr>
-          <w:left w:val="single" w:color="BFBFBF" w:sz="18" w:space="8"/>
-        </w:pBdr>
-        <w:shd w:fill="F2F2F2" w:color="auto" w:val="clear"/>
-        <w:spacing w:after="40"/>
-        <w:ind w:left="120"/>
-      </w:pPr>
-      <w:r>
-        <w:rPr>
-          <w:rFonts w:ascii="Georgia" w:cs="Georgia" w:eastAsia="Georgia" w:hAnsi="Georgia"/>
-          <w:b/>
-          <w:bCs/>
-          <w:color w:val="333333"/>
-          <w:sz w:val="17"/>
-          <w:szCs w:val="17"/>
-        </w:rPr>
-        <w:t xml:space="preserve">Jemand antwortet mit einem Satz  →  </w:t>
-      </w:r>
-      <w:r>
-        <w:rPr>
-          <w:rFonts w:ascii="Georgia" w:cs="Georgia" w:eastAsia="Georgia" w:hAnsi="Georgia"/>
-          <w:color w:val="333333"/>
-          <w:sz w:val="17"/>
-          <w:szCs w:val="17"/>
-        </w:rPr>
-        <w:t xml:space="preserve">Marek hakt nach: „What, that’s all? Tell me a bit more.“</w:t>
+        <w:t xml:space="preserve">TIPPS (NUR DM)  </w:t>
+      </w:r>
+    </w:p>
+    <w:p>
+      <w:pPr>
+        <w:pBdr>
+          <w:left w:val="single" w:color="BFBFBF" w:sz="18" w:space="8"/>
+        </w:pBdr>
+        <w:shd w:fill="F2F2F2" w:color="auto" w:val="clear"/>
+        <w:spacing w:after="40"/>
+        <w:ind w:left="120"/>
+      </w:pPr>
+      <w:r>
+        <w:rPr>
+          <w:rFonts w:ascii="Georgia" w:cs="Georgia" w:eastAsia="Georgia" w:hAnsi="Georgia"/>
+          <w:b/>
+          <w:bCs/>
+          <w:color w:val="333333"/>
+          <w:sz w:val="17"/>
+          <w:szCs w:val="17"/>
+        </w:rPr>
+        <w:t xml:space="preserve">„I mean, they are afraid.“  →  </w:t>
+      </w:r>
+      <w:r>
+        <w:rPr>
+          <w:rFonts w:ascii="Georgia" w:cs="Georgia" w:eastAsia="Georgia" w:hAnsi="Georgia"/>
+          <w:color w:val="333333"/>
+          <w:sz w:val="17"/>
+          <w:szCs w:val="17"/>
+        </w:rPr>
+        <w:t xml:space="preserve">„I mean“ heisst „ich will sagen“. Für eine Meinung: „I think …“ oder „Maybe …“ — kurz vorsprechen, weiter</w:t>
+      </w:r>
+    </w:p>
+    <w:p>
+      <w:pPr>
+        <w:pBdr>
+          <w:left w:val="single" w:color="BFBFBF" w:sz="18" w:space="8"/>
+        </w:pBdr>
+        <w:shd w:fill="F2F2F2" w:color="auto" w:val="clear"/>
+        <w:spacing w:after="40"/>
+        <w:ind w:left="120"/>
+      </w:pPr>
+      <w:r>
+        <w:rPr>
+          <w:rFonts w:ascii="Georgia" w:cs="Georgia" w:eastAsia="Georgia" w:hAnsi="Georgia"/>
+          <w:b/>
+          <w:bCs/>
+          <w:color w:val="333333"/>
+          <w:sz w:val="17"/>
+          <w:szCs w:val="17"/>
+        </w:rPr>
+        <w:t xml:space="preserve">„I have fifteen years.“  →  </w:t>
+      </w:r>
+      <w:r>
+        <w:rPr>
+          <w:rFonts w:ascii="Georgia" w:cs="Georgia" w:eastAsia="Georgia" w:hAnsi="Georgia"/>
+          <w:color w:val="333333"/>
+          <w:sz w:val="17"/>
+          <w:szCs w:val="17"/>
+        </w:rPr>
+        <w:t xml:space="preserve">„I’m fifteen.“ — Alter immer mit be. Marek gibt es richtig zurück: „Fifteen? And already hunting vampires.“</w:t>
+      </w:r>
+    </w:p>
+    <w:p>
+      <w:pPr>
+        <w:pBdr>
+          <w:left w:val="single" w:color="BFBFBF" w:sz="18" w:space="8"/>
+        </w:pBdr>
+        <w:shd w:fill="F2F2F2" w:color="auto" w:val="clear"/>
+        <w:spacing w:after="40"/>
+        <w:ind w:left="120"/>
+      </w:pPr>
+      <w:r>
+        <w:rPr>
+          <w:rFonts w:ascii="Georgia" w:cs="Georgia" w:eastAsia="Georgia" w:hAnsi="Georgia"/>
+          <w:b/>
+          <w:bCs/>
+          <w:color w:val="333333"/>
+          <w:sz w:val="17"/>
+          <w:szCs w:val="17"/>
+        </w:rPr>
+        <w:t xml:space="preserve">„We are hunters since two years.“  →  </w:t>
+      </w:r>
+      <w:r>
+        <w:rPr>
+          <w:rFonts w:ascii="Georgia" w:cs="Georgia" w:eastAsia="Georgia" w:hAnsi="Georgia"/>
+          <w:color w:val="333333"/>
+          <w:sz w:val="17"/>
+          <w:szCs w:val="17"/>
+        </w:rPr>
+        <w:t xml:space="preserve">„We’ve been hunters for two years.“ — since nur mit Zeitpunkt (since June), for mit Dauer. Marek fragt einfach nach: „For two years? Hm.“</w:t>
       </w:r>
     </w:p>
     <w:p>
@@ -1810,16 +1808,16 @@
           <w:sz w:val="17"/>
           <w:szCs w:val="17"/>
         </w:rPr>
-        <w:t xml:space="preserve">Alle drei haben zwei bis drei Sätze gesagt  →  </w:t>
-      </w:r>
-      <w:r>
-        <w:rPr>
-          <w:rFonts w:ascii="Georgia" w:cs="Georgia" w:eastAsia="Georgia" w:hAnsi="Georgia"/>
-          <w:color w:val="333333"/>
-          <w:sz w:val="17"/>
-          <w:szCs w:val="17"/>
-        </w:rPr>
-        <w:t xml:space="preserve">Marek ist zufrieden und sagt es: „Hm. That’ll do. Now I know who I’m driving.“ Dann die Ankunft</w:t>
+        <w:t xml:space="preserve">Jemand erfindet etwas Wildes über sich  →  </w:t>
+      </w:r>
+      <w:r>
+        <w:rPr>
+          <w:rFonts w:ascii="Georgia" w:cs="Georgia" w:eastAsia="Georgia" w:hAnsi="Georgia"/>
+          <w:color w:val="333333"/>
+          <w:sz w:val="17"/>
+          <w:szCs w:val="17"/>
+        </w:rPr>
+        <w:t xml:space="preserve">Gelten lassen — Marek glaubt kein Wort und fragt genau deshalb weiter. Erfinden ist Sprechen</w:t>
       </w:r>
     </w:p>
     <w:p>
@@ -1945,7 +1943,7 @@
           <w:sz w:val="18"/>
           <w:szCs w:val="18"/>
         </w:rPr>
-        <w:t xml:space="preserve">Im Wirtshaus sitzen elf Menschen. Drei sind ansprechbar: Greta (Wirtin, drei Finger), Old Pieter (Totengräber, betrunken) und Tobias (Junge an der Tür). Die anderen acht antworten nicht — spricht jemand sie an: „They look into their drinks and say nothing.“ Jeder Satz der drei ist nur einmal zu haben (abhaken); wer alle drei verbraucht hat, schweigt und beachtet die Gruppe nicht mehr. Wichtig: Der Name Anneke muss fallen; notfalls ruft Pieter ihn von selbst. Anneke Koll war Gretas jüngere Schwester — darum fragt sie in der Kapelle „Is Greta still alive?“. Am Ende der Szene liegt die Karte mit den drei Wegen auf dem Tisch.</w:t>
+        <w:t xml:space="preserve">Im Wirtshaus sitzen elf Menschen. Drei sind ansprechbar: Greta (Wirtin, drei Finger), Old Pieter (Totengräber, betrunken) und Tobias (Junge an der Tür). Die anderen acht antworten nicht — spricht jemand sie an: „They look into their drinks and say nothing.“ Wichtig: Der Name Anneke muss fallen. Anneke Koll war Gretas jüngere Schwester — darum fragt sie in der Kapelle „Is Greta still alive?“. Am Ende der Szene liegt die Karte mit den drei Wegen auf dem Tisch.</w:t>
       </w:r>
     </w:p>
     <w:p>
@@ -2166,7 +2164,7 @@
           <w:sz w:val="17"/>
           <w:szCs w:val="17"/>
         </w:rPr>
-        <w:t xml:space="preserve">Antwortmöglichkeiten stehen bei den drei Personen darunter: abhaken, sobald eine Frage gestellt ist — jede nur einmal, egal von wem.</w:t>
+        <w:t xml:space="preserve">Abhaken, sobald eine Frage gestellt ist — jede nur einmal, egal von wem. Wer bei einer Person alles gefragt hat, bekommt von ihr nichts mehr.</w:t>
       </w:r>
     </w:p>
     <w:p>
@@ -2893,97 +2891,67 @@
           <w:sz w:val="16"/>
           <w:szCs w:val="16"/>
         </w:rPr>
-        <w:t xml:space="preserve">WENN … DANN (NUR DM)  </w:t>
-      </w:r>
-    </w:p>
-    <w:p>
-      <w:pPr>
-        <w:pBdr>
-          <w:left w:val="single" w:color="BFBFBF" w:sz="18" w:space="8"/>
-        </w:pBdr>
-        <w:shd w:fill="F2F2F2" w:color="auto" w:val="clear"/>
-        <w:spacing w:after="40"/>
-        <w:ind w:left="120"/>
-      </w:pPr>
-      <w:r>
-        <w:rPr>
-          <w:rFonts w:ascii="Georgia" w:cs="Georgia" w:eastAsia="Georgia" w:hAnsi="Georgia"/>
-          <w:b/>
-          <w:bCs/>
-          <w:color w:val="333333"/>
-          <w:sz w:val="17"/>
-          <w:szCs w:val="17"/>
-        </w:rPr>
-        <w:t xml:space="preserve">Eine Frage ist gestellt  →  </w:t>
-      </w:r>
-      <w:r>
-        <w:rPr>
-          <w:rFonts w:ascii="Georgia" w:cs="Georgia" w:eastAsia="Georgia" w:hAnsi="Georgia"/>
-          <w:color w:val="333333"/>
-          <w:sz w:val="17"/>
-          <w:szCs w:val="17"/>
-        </w:rPr>
-        <w:t xml:space="preserve">abhaken — jede nur einmal, egal von wem</w:t>
-      </w:r>
-    </w:p>
-    <w:p>
-      <w:pPr>
-        <w:pBdr>
-          <w:left w:val="single" w:color="BFBFBF" w:sz="18" w:space="8"/>
-        </w:pBdr>
-        <w:shd w:fill="F2F2F2" w:color="auto" w:val="clear"/>
-        <w:spacing w:after="40"/>
-        <w:ind w:left="120"/>
-      </w:pPr>
-      <w:r>
-        <w:rPr>
-          <w:rFonts w:ascii="Georgia" w:cs="Georgia" w:eastAsia="Georgia" w:hAnsi="Georgia"/>
-          <w:b/>
-          <w:bCs/>
-          <w:color w:val="333333"/>
-          <w:sz w:val="17"/>
-          <w:szCs w:val="17"/>
-        </w:rPr>
-        <w:t xml:space="preserve">Alle Fragen einer Person sind verbraucht  →  </w:t>
-      </w:r>
-      <w:r>
-        <w:rPr>
-          <w:rFonts w:ascii="Georgia" w:cs="Georgia" w:eastAsia="Georgia" w:hAnsi="Georgia"/>
-          <w:color w:val="333333"/>
-          <w:sz w:val="17"/>
-          <w:szCs w:val="17"/>
-        </w:rPr>
-        <w:t xml:space="preserve">sie schweigt und beachtet die Gruppe nicht mehr</w:t>
-      </w:r>
-    </w:p>
-    <w:p>
-      <w:pPr>
-        <w:pBdr>
-          <w:left w:val="single" w:color="BFBFBF" w:sz="18" w:space="8"/>
-        </w:pBdr>
-        <w:shd w:fill="F2F2F2" w:color="auto" w:val="clear"/>
-        <w:spacing w:after="40"/>
-        <w:ind w:left="120"/>
-      </w:pPr>
-      <w:r>
-        <w:rPr>
-          <w:rFonts w:ascii="Georgia" w:cs="Georgia" w:eastAsia="Georgia" w:hAnsi="Georgia"/>
-          <w:b/>
-          <w:bCs/>
-          <w:color w:val="333333"/>
-          <w:sz w:val="17"/>
-          <w:szCs w:val="17"/>
-        </w:rPr>
-        <w:t xml:space="preserve">Fünf Minuten lang fragt niemand nach Anneke  →  </w:t>
-      </w:r>
-      <w:r>
-        <w:rPr>
-          <w:rFonts w:ascii="Georgia" w:cs="Georgia" w:eastAsia="Georgia" w:hAnsi="Georgia"/>
-          <w:color w:val="333333"/>
-          <w:sz w:val="17"/>
-          <w:szCs w:val="17"/>
-        </w:rPr>
-        <w:t xml:space="preserve">Pieter ruft es quer durch den Raum — Knopf „Anneke ist gefallen“</w:t>
+        <w:t xml:space="preserve">TIPPS (NUR DM)  </w:t>
+      </w:r>
+    </w:p>
+    <w:p>
+      <w:pPr>
+        <w:pBdr>
+          <w:left w:val="single" w:color="BFBFBF" w:sz="18" w:space="8"/>
+        </w:pBdr>
+        <w:shd w:fill="F2F2F2" w:color="auto" w:val="clear"/>
+        <w:spacing w:after="40"/>
+        <w:ind w:left="120"/>
+      </w:pPr>
+      <w:r>
+        <w:rPr>
+          <w:rFonts w:ascii="Georgia" w:cs="Georgia" w:eastAsia="Georgia" w:hAnsi="Georgia"/>
+          <w:b/>
+          <w:bCs/>
+          <w:color w:val="333333"/>
+          <w:sz w:val="17"/>
+          <w:szCs w:val="17"/>
+        </w:rPr>
+        <w:t xml:space="preserve">„Why nobody looks for her?“  →  </w:t>
+      </w:r>
+      <w:r>
+        <w:rPr>
+          <w:rFonts w:ascii="Georgia" w:cs="Georgia" w:eastAsia="Georgia" w:hAnsi="Georgia"/>
+          <w:color w:val="333333"/>
+          <w:sz w:val="17"/>
+          <w:szCs w:val="17"/>
+        </w:rPr>
+        <w:t xml:space="preserve">Nicht verbessern — Greta sieht fragend: „Sorry?“ Meist kommt die Frage dann richtig. Sonst vorsprechen: „Why is nobody looking for her?“</w:t>
+      </w:r>
+    </w:p>
+    <w:p>
+      <w:pPr>
+        <w:pBdr>
+          <w:left w:val="single" w:color="BFBFBF" w:sz="18" w:space="8"/>
+        </w:pBdr>
+        <w:shd w:fill="F2F2F2" w:color="auto" w:val="clear"/>
+        <w:spacing w:after="40"/>
+        <w:ind w:left="120"/>
+      </w:pPr>
+      <w:r>
+        <w:rPr>
+          <w:rFonts w:ascii="Georgia" w:cs="Georgia" w:eastAsia="Georgia" w:hAnsi="Georgia"/>
+          <w:b/>
+          <w:bCs/>
+          <w:color w:val="333333"/>
+          <w:sz w:val="17"/>
+          <w:szCs w:val="17"/>
+        </w:rPr>
+        <w:t xml:space="preserve">„Can you say me the way?“  →  </w:t>
+      </w:r>
+      <w:r>
+        <w:rPr>
+          <w:rFonts w:ascii="Georgia" w:cs="Georgia" w:eastAsia="Georgia" w:hAnsi="Georgia"/>
+          <w:color w:val="333333"/>
+          <w:sz w:val="17"/>
+          <w:szCs w:val="17"/>
+        </w:rPr>
+        <w:t xml:space="preserve">„Can you tell me …?“ — say me gibt es nicht. Greta darf es beiläufig richtig nehmen: „Tell you? All right.“</w:t>
       </w:r>
     </w:p>
     <w:p>
@@ -3004,16 +2972,16 @@
           <w:sz w:val="17"/>
           <w:szCs w:val="17"/>
         </w:rPr>
-        <w:t xml:space="preserve">Niemand fragt nach dem Weg  →  </w:t>
-      </w:r>
-      <w:r>
-        <w:rPr>
-          <w:rFonts w:ascii="Georgia" w:cs="Georgia" w:eastAsia="Georgia" w:hAnsi="Georgia"/>
-          <w:color w:val="333333"/>
-          <w:sz w:val="17"/>
-          <w:szCs w:val="17"/>
-        </w:rPr>
-        <w:t xml:space="preserve">Greta legt die Karte hin: „You’ll need this.“</w:t>
+        <w:t xml:space="preserve">Alle reden nur mit Greta  →  </w:t>
+      </w:r>
+      <w:r>
+        <w:rPr>
+          <w:rFonts w:ascii="Georgia" w:cs="Georgia" w:eastAsia="Georgia" w:hAnsi="Georgia"/>
+          <w:color w:val="333333"/>
+          <w:sz w:val="17"/>
+          <w:szCs w:val="17"/>
+        </w:rPr>
+        <w:t xml:space="preserve">Pieter lacht laut in ihre Frage hinein, Tobias räuspert sich an der Tür — ein Blick zu den beiden genügt, die anderen Figuren gehen hin</w:t>
       </w:r>
     </w:p>
     <w:p>
@@ -3139,7 +3107,7 @@
           <w:sz w:val="18"/>
           <w:szCs w:val="18"/>
         </w:rPr>
-        <w:t xml:space="preserve">Preis und Gefahr jedes Wegs stehen auf den drei Karten unten — du musst sie nicht vorher kennen. Frag reihum: „And what do you think?“ Bei Streit: „One minute, then we vote.“ Klick danach die gewählte Karte an — ab dann steht auf den nächsten Seiten nur noch euer Weg.</w:t>
+        <w:t xml:space="preserve">Preis und Gefahr jedes Wegs stehen auf den drei Karten unten — du musst sie nicht vorher kennen. Frag reihum: „And what do you think?“ Klick danach die gewählte Karte an — ab dann steht auf den nächsten Seiten nur noch euer Weg.</w:t>
       </w:r>
     </w:p>
     <w:p>
@@ -3501,37 +3469,67 @@
           <w:sz w:val="16"/>
           <w:szCs w:val="16"/>
         </w:rPr>
-        <w:t xml:space="preserve">WENN … DANN (NUR DM)  </w:t>
-      </w:r>
-    </w:p>
-    <w:p>
-      <w:pPr>
-        <w:pBdr>
-          <w:left w:val="single" w:color="BFBFBF" w:sz="18" w:space="8"/>
-        </w:pBdr>
-        <w:shd w:fill="F2F2F2" w:color="auto" w:val="clear"/>
-        <w:spacing w:after="40"/>
-        <w:ind w:left="120"/>
-      </w:pPr>
-      <w:r>
-        <w:rPr>
-          <w:rFonts w:ascii="Georgia" w:cs="Georgia" w:eastAsia="Georgia" w:hAnsi="Georgia"/>
-          <w:b/>
-          <w:bCs/>
-          <w:color w:val="333333"/>
-          <w:sz w:val="17"/>
-          <w:szCs w:val="17"/>
-        </w:rPr>
-        <w:t xml:space="preserve">Sie streiten  →  </w:t>
-      </w:r>
-      <w:r>
-        <w:rPr>
-          <w:rFonts w:ascii="Georgia" w:cs="Georgia" w:eastAsia="Georgia" w:hAnsi="Georgia"/>
-          <w:color w:val="333333"/>
-          <w:sz w:val="17"/>
-          <w:szCs w:val="17"/>
-        </w:rPr>
-        <w:t xml:space="preserve">„One minute, then we vote.“</w:t>
+        <w:t xml:space="preserve">TIPPS (NUR DM)  </w:t>
+      </w:r>
+    </w:p>
+    <w:p>
+      <w:pPr>
+        <w:pBdr>
+          <w:left w:val="single" w:color="BFBFBF" w:sz="18" w:space="8"/>
+        </w:pBdr>
+        <w:shd w:fill="F2F2F2" w:color="auto" w:val="clear"/>
+        <w:spacing w:after="40"/>
+        <w:ind w:left="120"/>
+      </w:pPr>
+      <w:r>
+        <w:rPr>
+          <w:rFonts w:ascii="Georgia" w:cs="Georgia" w:eastAsia="Georgia" w:hAnsi="Georgia"/>
+          <w:b/>
+          <w:bCs/>
+          <w:color w:val="333333"/>
+          <w:sz w:val="17"/>
+          <w:szCs w:val="17"/>
+        </w:rPr>
+        <w:t xml:space="preserve">„Because dangerous.“  →  </w:t>
+      </w:r>
+      <w:r>
+        <w:rPr>
+          <w:rFonts w:ascii="Georgia" w:cs="Georgia" w:eastAsia="Georgia" w:hAnsi="Georgia"/>
+          <w:color w:val="333333"/>
+          <w:sz w:val="17"/>
+          <w:szCs w:val="17"/>
+        </w:rPr>
+        <w:t xml:space="preserve">„Because it’s dangerous.“ — nach because kommt ein ganzer Satz mit Verb. Einmal nachsprechen lassen, dann weiter</w:t>
+      </w:r>
+    </w:p>
+    <w:p>
+      <w:pPr>
+        <w:pBdr>
+          <w:left w:val="single" w:color="BFBFBF" w:sz="18" w:space="8"/>
+        </w:pBdr>
+        <w:shd w:fill="F2F2F2" w:color="auto" w:val="clear"/>
+        <w:spacing w:after="40"/>
+        <w:ind w:left="120"/>
+      </w:pPr>
+      <w:r>
+        <w:rPr>
+          <w:rFonts w:ascii="Georgia" w:cs="Georgia" w:eastAsia="Georgia" w:hAnsi="Georgia"/>
+          <w:b/>
+          <w:bCs/>
+          <w:color w:val="333333"/>
+          <w:sz w:val="17"/>
+          <w:szCs w:val="17"/>
+        </w:rPr>
+        <w:t xml:space="preserve">„The mine is more safe.“  →  </w:t>
+      </w:r>
+      <w:r>
+        <w:rPr>
+          <w:rFonts w:ascii="Georgia" w:cs="Georgia" w:eastAsia="Georgia" w:hAnsi="Georgia"/>
+          <w:color w:val="333333"/>
+          <w:sz w:val="17"/>
+          <w:szCs w:val="17"/>
+        </w:rPr>
+        <w:t xml:space="preserve">„safer“ — kurze Adjektive mit -er: safer, faster, darker. Beiläufig zurück: „Safer, yes. But darker.“</w:t>
       </w:r>
     </w:p>
     <w:p>
@@ -3552,16 +3550,16 @@
           <w:sz w:val="17"/>
           <w:szCs w:val="17"/>
         </w:rPr>
-        <w:t xml:space="preserve">Die Karte ist geklickt  →  </w:t>
-      </w:r>
-      <w:r>
-        <w:rPr>
-          <w:rFonts w:ascii="Georgia" w:cs="Georgia" w:eastAsia="Georgia" w:hAnsi="Georgia"/>
-          <w:color w:val="333333"/>
-          <w:sz w:val="17"/>
-          <w:szCs w:val="17"/>
-        </w:rPr>
-        <w:t xml:space="preserve">auf den nächsten Seiten steht nur noch dieser Weg</w:t>
+        <w:t xml:space="preserve">Sie fragen dich, welcher Weg der beste ist  →  </w:t>
+      </w:r>
+      <w:r>
+        <w:rPr>
+          <w:rFonts w:ascii="Georgia" w:cs="Georgia" w:eastAsia="Georgia" w:hAnsi="Georgia"/>
+          <w:color w:val="333333"/>
+          <w:sz w:val="17"/>
+          <w:szCs w:val="17"/>
+        </w:rPr>
+        <w:t xml:space="preserve">Nicht verraten: „I’m only the narrator. What would your character do?“ Keiner ist der richtige — alle drei führen in den Hof</w:t>
       </w:r>
     </w:p>
     <w:p>
@@ -3652,7 +3650,7 @@
           <w:sz w:val="18"/>
           <w:szCs w:val="18"/>
         </w:rPr>
-        <w:t xml:space="preserve">Drei Stationen: Wölfe am Galgen — hilft jemand dem verletzten Wolf, ziehen beide ab; sonst Kampf (der erste des Abends — langsam: jeder sagt auf Englisch, was er tut, drückt seinen Knopf, liest seinen gelben Satz vor; unter 5 Lebenspunkten haut ein Wolf ab), der Sumpf (jeder würfelt einmal; wer unter 7 feststeckt, ruft auf Englisch um Hilfe — sagt jemand, wie er hilft, passiert nichts, sonst −1 HP) und die Wachen am Tor — Leute des Hauses, nicht freundlich: Die Gruppe schleicht (jeder würfelt einmal; alle ≥ 7 → vorbei) oder greift an. Misslingt das Schleichen oder greift jemand an: Knopf unten, Kampf mit beiden Wachen, Gefahr +1.</w:t>
+        <w:t xml:space="preserve">Drei Stationen: die Wölfe am Galgen, der Sumpf und die Wachen am Tor. Kommt es bei den Wölfen zum Kampf, ist es der erste des Abends — nimm dir Zeit: Jeder sagt auf Englisch, was er tut, drückt seinen Knopf und liest seinen gelben Satz vor.</w:t>
       </w:r>
     </w:p>
     <w:p>
@@ -5033,7 +5031,7 @@
           <w:sz w:val="18"/>
           <w:szCs w:val="18"/>
         </w:rPr>
-        <w:t xml:space="preserve">Vier Stunden Dunkelheit, schlechte Luft (−2 HP für alle, Knopf unten), dann ein Keller unter dem Schloss — und eine Wache mit Lampe. Hier wird nicht gewürfelt, hier wird geredet: Trägt jede Figur einen ganzen englischen Satz bei und droht niemand, glaubt er ihnen. Stottert die Gruppe, droht oder greift jemand an: Knopf unten, Kampf, Gefahr +1.</w:t>
+        <w:t xml:space="preserve">Vier Stunden Dunkelheit, schlechte Luft (−2 HP für alle, Knopf unten), dann ein Keller unter dem Schloss — und eine Wache mit Lampe. Hier wird nicht gewürfelt, hier wird geredet.</w:t>
       </w:r>
     </w:p>
     <w:p>
@@ -5482,7 +5480,7 @@
           <w:sz w:val="17"/>
           <w:szCs w:val="17"/>
         </w:rPr>
-        <w:t xml:space="preserve">Reden lassen, dann unten anklicken, was passiert ist. Jeder ein ganzer Satz und niemand droht → er glaubt ihnen. Stottert die Gruppe, droht oder greift jemand an → Kampf.</w:t>
+        <w:t xml:space="preserve">Reden lassen, dann unten anklicken, was passiert ist.</w:t>
       </w:r>
     </w:p>
     <w:p>
@@ -6001,277 +5999,187 @@
           <w:sz w:val="16"/>
           <w:szCs w:val="16"/>
         </w:rPr>
-        <w:t xml:space="preserve">WENN … DANN (NUR DM)  </w:t>
-      </w:r>
-    </w:p>
-    <w:p>
-      <w:pPr>
-        <w:pBdr>
-          <w:left w:val="single" w:color="BFBFBF" w:sz="18" w:space="8"/>
-        </w:pBdr>
-        <w:shd w:fill="F2F2F2" w:color="auto" w:val="clear"/>
-        <w:spacing w:after="40"/>
-        <w:ind w:left="120"/>
-      </w:pPr>
-      <w:r>
-        <w:rPr>
-          <w:rFonts w:ascii="Georgia" w:cs="Georgia" w:eastAsia="Georgia" w:hAnsi="Georgia"/>
-          <w:b/>
-          <w:bCs/>
-          <w:color w:val="333333"/>
-          <w:sz w:val="17"/>
-          <w:szCs w:val="17"/>
-        </w:rPr>
-        <w:t xml:space="preserve">Nur bei: Weg A · Strasse — Jemand hilft dem verletzten Wolf — ruhig, ohne Waffe  →  </w:t>
-      </w:r>
-      <w:r>
-        <w:rPr>
-          <w:rFonts w:ascii="Georgia" w:cs="Georgia" w:eastAsia="Georgia" w:hAnsi="Georgia"/>
-          <w:color w:val="333333"/>
-          <w:sz w:val="17"/>
-          <w:szCs w:val="17"/>
-        </w:rPr>
-        <w:t xml:space="preserve">unten „Geholfen“ anklicken: beide ziehen ab, kein Kampf</w:t>
-      </w:r>
-    </w:p>
-    <w:p>
-      <w:pPr>
-        <w:pBdr>
-          <w:left w:val="single" w:color="BFBFBF" w:sz="18" w:space="8"/>
-        </w:pBdr>
-        <w:shd w:fill="F2F2F2" w:color="auto" w:val="clear"/>
-        <w:spacing w:after="40"/>
-        <w:ind w:left="120"/>
-      </w:pPr>
-      <w:r>
-        <w:rPr>
-          <w:rFonts w:ascii="Georgia" w:cs="Georgia" w:eastAsia="Georgia" w:hAnsi="Georgia"/>
-          <w:b/>
-          <w:bCs/>
-          <w:color w:val="333333"/>
-          <w:sz w:val="17"/>
-          <w:szCs w:val="17"/>
-        </w:rPr>
-        <w:t xml:space="preserve">Nur bei: Weg A · Strasse — Sie greifen an, oder niemand hilft  →  </w:t>
-      </w:r>
-      <w:r>
-        <w:rPr>
-          <w:rFonts w:ascii="Georgia" w:cs="Georgia" w:eastAsia="Georgia" w:hAnsi="Georgia"/>
-          <w:color w:val="333333"/>
-          <w:sz w:val="17"/>
-          <w:szCs w:val="17"/>
-        </w:rPr>
-        <w:t xml:space="preserve">„Kampf“ anklicken: zwei Wölfe. Fällt einer unter 5 Lebenspunkte, haut er ab</w:t>
-      </w:r>
-    </w:p>
-    <w:p>
-      <w:pPr>
-        <w:pBdr>
-          <w:left w:val="single" w:color="BFBFBF" w:sz="18" w:space="8"/>
-        </w:pBdr>
-        <w:shd w:fill="F2F2F2" w:color="auto" w:val="clear"/>
-        <w:spacing w:after="40"/>
-        <w:ind w:left="120"/>
-      </w:pPr>
-      <w:r>
-        <w:rPr>
-          <w:rFonts w:ascii="Georgia" w:cs="Georgia" w:eastAsia="Georgia" w:hAnsi="Georgia"/>
-          <w:b/>
-          <w:bCs/>
-          <w:color w:val="333333"/>
-          <w:sz w:val="17"/>
-          <w:szCs w:val="17"/>
-        </w:rPr>
-        <w:t xml:space="preserve">Nur bei: Weg A · Strasse — Laut, grob oder ungeschickt  →  </w:t>
-      </w:r>
-      <w:r>
-        <w:rPr>
-          <w:rFonts w:ascii="Georgia" w:cs="Georgia" w:eastAsia="Georgia" w:hAnsi="Georgia"/>
-          <w:color w:val="333333"/>
-          <w:sz w:val="17"/>
-          <w:szCs w:val="17"/>
-        </w:rPr>
-        <w:t xml:space="preserve">„Verpatzt“ anklicken: ein dritter Wolf kommt aus dem Nebel</w:t>
-      </w:r>
-    </w:p>
-    <w:p>
-      <w:pPr>
-        <w:pBdr>
-          <w:left w:val="single" w:color="BFBFBF" w:sz="18" w:space="8"/>
-        </w:pBdr>
-        <w:shd w:fill="F2F2F2" w:color="auto" w:val="clear"/>
-        <w:spacing w:after="40"/>
-        <w:ind w:left="120"/>
-      </w:pPr>
-      <w:r>
-        <w:rPr>
-          <w:rFonts w:ascii="Georgia" w:cs="Georgia" w:eastAsia="Georgia" w:hAnsi="Georgia"/>
-          <w:b/>
-          <w:bCs/>
-          <w:color w:val="333333"/>
-          <w:sz w:val="17"/>
-          <w:szCs w:val="17"/>
-        </w:rPr>
-        <w:t xml:space="preserve">Nur bei: Weg A · Strasse — Sumpf: ein Wurf unter 7  →  </w:t>
-      </w:r>
-      <w:r>
-        <w:rPr>
-          <w:rFonts w:ascii="Georgia" w:cs="Georgia" w:eastAsia="Georgia" w:hAnsi="Georgia"/>
-          <w:color w:val="333333"/>
-          <w:sz w:val="17"/>
-          <w:szCs w:val="17"/>
-        </w:rPr>
-        <w:t xml:space="preserve">steckt fest und ruft auf Englisch um Hilfe. Sagt jemand, wie er hilft → nichts passiert; sonst −1 HP (im Reiter eintragen)</w:t>
-      </w:r>
-    </w:p>
-    <w:p>
-      <w:pPr>
-        <w:pBdr>
-          <w:left w:val="single" w:color="BFBFBF" w:sz="18" w:space="8"/>
-        </w:pBdr>
-        <w:shd w:fill="F2F2F2" w:color="auto" w:val="clear"/>
-        <w:spacing w:after="40"/>
-        <w:ind w:left="120"/>
-      </w:pPr>
-      <w:r>
-        <w:rPr>
-          <w:rFonts w:ascii="Georgia" w:cs="Georgia" w:eastAsia="Georgia" w:hAnsi="Georgia"/>
-          <w:b/>
-          <w:bCs/>
-          <w:color w:val="333333"/>
-          <w:sz w:val="17"/>
-          <w:szCs w:val="17"/>
-        </w:rPr>
-        <w:t xml:space="preserve">Nur bei: Weg A · Strasse — Wachen: alle würfeln 7 oder mehr  →  </w:t>
-      </w:r>
-      <w:r>
-        <w:rPr>
-          <w:rFonts w:ascii="Georgia" w:cs="Georgia" w:eastAsia="Georgia" w:hAnsi="Georgia"/>
-          <w:color w:val="333333"/>
-          <w:sz w:val="17"/>
-          <w:szCs w:val="17"/>
-        </w:rPr>
-        <w:t xml:space="preserve">unten „Ja — vorbeigeschlichen“ anklicken → weiter ohne Kampf</w:t>
-      </w:r>
-    </w:p>
-    <w:p>
-      <w:pPr>
-        <w:pBdr>
-          <w:left w:val="single" w:color="BFBFBF" w:sz="18" w:space="8"/>
-        </w:pBdr>
-        <w:shd w:fill="F2F2F2" w:color="auto" w:val="clear"/>
-        <w:spacing w:after="40"/>
-        <w:ind w:left="120"/>
-      </w:pPr>
-      <w:r>
-        <w:rPr>
-          <w:rFonts w:ascii="Georgia" w:cs="Georgia" w:eastAsia="Georgia" w:hAnsi="Georgia"/>
-          <w:b/>
-          <w:bCs/>
-          <w:color w:val="333333"/>
-          <w:sz w:val="17"/>
-          <w:szCs w:val="17"/>
-        </w:rPr>
-        <w:t xml:space="preserve">Nur bei: Weg A · Strasse — Wachen: einer unter 7, oder jemand greift an  →  </w:t>
-      </w:r>
-      <w:r>
-        <w:rPr>
-          <w:rFonts w:ascii="Georgia" w:cs="Georgia" w:eastAsia="Georgia" w:hAnsi="Georgia"/>
-          <w:color w:val="333333"/>
-          <w:sz w:val="17"/>
-          <w:szCs w:val="17"/>
-        </w:rPr>
-        <w:t xml:space="preserve">unten „Nein — entdeckt“ anklicken → erst dann erscheint der Kampf (zwei Wachen, Gefahr +1)</w:t>
-      </w:r>
-    </w:p>
-    <w:p>
-      <w:pPr>
-        <w:pBdr>
-          <w:left w:val="single" w:color="BFBFBF" w:sz="18" w:space="8"/>
-        </w:pBdr>
-        <w:shd w:fill="F2F2F2" w:color="auto" w:val="clear"/>
-        <w:spacing w:after="40"/>
-        <w:ind w:left="120"/>
-      </w:pPr>
-      <w:r>
-        <w:rPr>
-          <w:rFonts w:ascii="Georgia" w:cs="Georgia" w:eastAsia="Georgia" w:hAnsi="Georgia"/>
-          <w:b/>
-          <w:bCs/>
-          <w:color w:val="333333"/>
-          <w:sz w:val="17"/>
-          <w:szCs w:val="17"/>
-        </w:rPr>
-        <w:t xml:space="preserve">Nur bei: Weg B · Stollen — Jeder sagt einen ganzen Satz, niemand droht  →  </w:t>
-      </w:r>
-      <w:r>
-        <w:rPr>
-          <w:rFonts w:ascii="Georgia" w:cs="Georgia" w:eastAsia="Georgia" w:hAnsi="Georgia"/>
-          <w:color w:val="333333"/>
-          <w:sz w:val="17"/>
-          <w:szCs w:val="17"/>
-        </w:rPr>
-        <w:t xml:space="preserve">unten „Ja — er glaubt ihnen“ anklicken → weiter ohne Kampf</w:t>
-      </w:r>
-    </w:p>
-    <w:p>
-      <w:pPr>
-        <w:pBdr>
-          <w:left w:val="single" w:color="BFBFBF" w:sz="18" w:space="8"/>
-        </w:pBdr>
-        <w:shd w:fill="F2F2F2" w:color="auto" w:val="clear"/>
-        <w:spacing w:after="40"/>
-        <w:ind w:left="120"/>
-      </w:pPr>
-      <w:r>
-        <w:rPr>
-          <w:rFonts w:ascii="Georgia" w:cs="Georgia" w:eastAsia="Georgia" w:hAnsi="Georgia"/>
-          <w:b/>
-          <w:bCs/>
-          <w:color w:val="333333"/>
-          <w:sz w:val="17"/>
-          <w:szCs w:val="17"/>
-        </w:rPr>
-        <w:t xml:space="preserve">Nur bei: Weg B · Stollen — Stottern, Drohung oder Angriff  →  </w:t>
-      </w:r>
-      <w:r>
-        <w:rPr>
-          <w:rFonts w:ascii="Georgia" w:cs="Georgia" w:eastAsia="Georgia" w:hAnsi="Georgia"/>
-          <w:color w:val="333333"/>
-          <w:sz w:val="17"/>
-          <w:szCs w:val="17"/>
-        </w:rPr>
-        <w:t xml:space="preserve">unten „Nein — Kampf“ anklicken → erst dann erscheint der Kampf (eine Wache, Gefahr +1)</w:t>
-      </w:r>
-    </w:p>
-    <w:p>
-      <w:pPr>
-        <w:pBdr>
-          <w:left w:val="single" w:color="BFBFBF" w:sz="18" w:space="8"/>
-        </w:pBdr>
-        <w:shd w:fill="F2F2F2" w:color="auto" w:val="clear"/>
-        <w:spacing w:after="40"/>
-        <w:ind w:left="120"/>
-      </w:pPr>
-      <w:r>
-        <w:rPr>
-          <w:rFonts w:ascii="Georgia" w:cs="Georgia" w:eastAsia="Georgia" w:hAnsi="Georgia"/>
-          <w:b/>
-          <w:bCs/>
-          <w:color w:val="333333"/>
-          <w:sz w:val="17"/>
-          <w:szCs w:val="17"/>
-        </w:rPr>
-        <w:t xml:space="preserve">Nur bei: Weg C · Kutsche — Jemand spricht Corvin an  →  </w:t>
-      </w:r>
-      <w:r>
-        <w:rPr>
-          <w:rFonts w:ascii="Georgia" w:cs="Georgia" w:eastAsia="Georgia" w:hAnsi="Georgia"/>
-          <w:color w:val="333333"/>
-          <w:sz w:val="17"/>
-          <w:szCs w:val="17"/>
-        </w:rPr>
-        <w:t xml:space="preserve">er fragt freundlich zurück — die Gefahr +4 ist schon eingetragen</w:t>
+        <w:t xml:space="preserve">TIPPS (NUR DM)  </w:t>
+      </w:r>
+    </w:p>
+    <w:p>
+      <w:pPr>
+        <w:pBdr>
+          <w:left w:val="single" w:color="BFBFBF" w:sz="18" w:space="8"/>
+        </w:pBdr>
+        <w:shd w:fill="F2F2F2" w:color="auto" w:val="clear"/>
+        <w:spacing w:after="40"/>
+        <w:ind w:left="120"/>
+      </w:pPr>
+      <w:r>
+        <w:rPr>
+          <w:rFonts w:ascii="Georgia" w:cs="Georgia" w:eastAsia="Georgia" w:hAnsi="Georgia"/>
+          <w:b/>
+          <w:bCs/>
+          <w:color w:val="333333"/>
+          <w:sz w:val="17"/>
+          <w:szCs w:val="17"/>
+        </w:rPr>
+        <w:t xml:space="preserve">Nur bei: Weg A · Strasse — „I help the wolf.“ — und nicht mehr  →  </w:t>
+      </w:r>
+      <w:r>
+        <w:rPr>
+          <w:rFonts w:ascii="Georgia" w:cs="Georgia" w:eastAsia="Georgia" w:hAnsi="Georgia"/>
+          <w:color w:val="333333"/>
+          <w:sz w:val="17"/>
+          <w:szCs w:val="17"/>
+        </w:rPr>
+        <w:t xml:space="preserve">„How? What do you do with your hands?“ Geholfen ist erst, was jemand beschreibt: „I open the trap, slowly.“</w:t>
+      </w:r>
+    </w:p>
+    <w:p>
+      <w:pPr>
+        <w:pBdr>
+          <w:left w:val="single" w:color="BFBFBF" w:sz="18" w:space="8"/>
+        </w:pBdr>
+        <w:shd w:fill="F2F2F2" w:color="auto" w:val="clear"/>
+        <w:spacing w:after="40"/>
+        <w:ind w:left="120"/>
+      </w:pPr>
+      <w:r>
+        <w:rPr>
+          <w:rFonts w:ascii="Georgia" w:cs="Georgia" w:eastAsia="Georgia" w:hAnsi="Georgia"/>
+          <w:b/>
+          <w:bCs/>
+          <w:color w:val="333333"/>
+          <w:sz w:val="17"/>
+          <w:szCs w:val="17"/>
+        </w:rPr>
+        <w:t xml:space="preserve">Nur bei: Weg A · Strasse — Im Kampf nur „I attack.“  →  </w:t>
+      </w:r>
+      <w:r>
+        <w:rPr>
+          <w:rFonts w:ascii="Georgia" w:cs="Georgia" w:eastAsia="Georgia" w:hAnsi="Georgia"/>
+          <w:color w:val="333333"/>
+          <w:sz w:val="17"/>
+          <w:szCs w:val="17"/>
+        </w:rPr>
+        <w:t xml:space="preserve">„With what? Where do you hit it?“ — erst der Satz, dann der Knopf. Der gelbe Satz auf dem Spielerblatt ist die Belohnung</w:t>
+      </w:r>
+    </w:p>
+    <w:p>
+      <w:pPr>
+        <w:pBdr>
+          <w:left w:val="single" w:color="BFBFBF" w:sz="18" w:space="8"/>
+        </w:pBdr>
+        <w:shd w:fill="F2F2F2" w:color="auto" w:val="clear"/>
+        <w:spacing w:after="40"/>
+        <w:ind w:left="120"/>
+      </w:pPr>
+      <w:r>
+        <w:rPr>
+          <w:rFonts w:ascii="Georgia" w:cs="Georgia" w:eastAsia="Georgia" w:hAnsi="Georgia"/>
+          <w:b/>
+          <w:bCs/>
+          <w:color w:val="333333"/>
+          <w:sz w:val="17"/>
+          <w:szCs w:val="17"/>
+        </w:rPr>
+        <w:t xml:space="preserve">Nur bei: Weg A · Strasse — „Help! I am stucked!“  →  </w:t>
+      </w:r>
+      <w:r>
+        <w:rPr>
+          <w:rFonts w:ascii="Georgia" w:cs="Georgia" w:eastAsia="Georgia" w:hAnsi="Georgia"/>
+          <w:color w:val="333333"/>
+          <w:sz w:val="17"/>
+          <w:szCs w:val="17"/>
+        </w:rPr>
+        <w:t xml:space="preserve">„I’m stuck!“ — ohne -ed. Als Hilfe reicht ein kurzer Satz: „Take my hand!“ — „Hold on to me!“</w:t>
+      </w:r>
+    </w:p>
+    <w:p>
+      <w:pPr>
+        <w:pBdr>
+          <w:left w:val="single" w:color="BFBFBF" w:sz="18" w:space="8"/>
+        </w:pBdr>
+        <w:shd w:fill="F2F2F2" w:color="auto" w:val="clear"/>
+        <w:spacing w:after="40"/>
+        <w:ind w:left="120"/>
+      </w:pPr>
+      <w:r>
+        <w:rPr>
+          <w:rFonts w:ascii="Georgia" w:cs="Georgia" w:eastAsia="Georgia" w:hAnsi="Georgia"/>
+          <w:b/>
+          <w:bCs/>
+          <w:color w:val="333333"/>
+          <w:sz w:val="17"/>
+          <w:szCs w:val="17"/>
+        </w:rPr>
+        <w:t xml:space="preserve">Nur bei: Weg A · Strasse — Sie planen auf Deutsch, „weil es leise sein muss“  →  </w:t>
+      </w:r>
+      <w:r>
+        <w:rPr>
+          <w:rFonts w:ascii="Georgia" w:cs="Georgia" w:eastAsia="Georgia" w:hAnsi="Georgia"/>
+          <w:color w:val="333333"/>
+          <w:sz w:val="17"/>
+          <w:szCs w:val="17"/>
+        </w:rPr>
+        <w:t xml:space="preserve">Flüstern geht auch auf Englisch. Gib vier Wörter vor: „Quiet!“ — „Wait.“ — „Now!“ — „Follow me.“</w:t>
+      </w:r>
+    </w:p>
+    <w:p>
+      <w:pPr>
+        <w:pBdr>
+          <w:left w:val="single" w:color="BFBFBF" w:sz="18" w:space="8"/>
+        </w:pBdr>
+        <w:shd w:fill="F2F2F2" w:color="auto" w:val="clear"/>
+        <w:spacing w:after="40"/>
+        <w:ind w:left="120"/>
+      </w:pPr>
+      <w:r>
+        <w:rPr>
+          <w:rFonts w:ascii="Georgia" w:cs="Georgia" w:eastAsia="Georgia" w:hAnsi="Georgia"/>
+          <w:b/>
+          <w:bCs/>
+          <w:color w:val="333333"/>
+          <w:sz w:val="17"/>
+          <w:szCs w:val="17"/>
+        </w:rPr>
+        <w:t xml:space="preserve">Nur bei: Weg B · Stollen — „We are invited from the Count.“  →  </w:t>
+      </w:r>
+      <w:r>
+        <w:rPr>
+          <w:rFonts w:ascii="Georgia" w:cs="Georgia" w:eastAsia="Georgia" w:hAnsi="Georgia"/>
+          <w:color w:val="333333"/>
+          <w:sz w:val="17"/>
+          <w:szCs w:val="17"/>
+        </w:rPr>
+        <w:t xml:space="preserve">„The Count invited us.“ — oder „invited by“. Die Wache darf es langsam wiederholen: „Invited. By the Count. I see.“</w:t>
+      </w:r>
+    </w:p>
+    <w:p>
+      <w:pPr>
+        <w:pBdr>
+          <w:left w:val="single" w:color="BFBFBF" w:sz="18" w:space="8"/>
+        </w:pBdr>
+        <w:shd w:fill="F2F2F2" w:color="auto" w:val="clear"/>
+        <w:spacing w:after="40"/>
+        <w:ind w:left="120"/>
+      </w:pPr>
+      <w:r>
+        <w:rPr>
+          <w:rFonts w:ascii="Georgia" w:cs="Georgia" w:eastAsia="Georgia" w:hAnsi="Georgia"/>
+          <w:b/>
+          <w:bCs/>
+          <w:color w:val="333333"/>
+          <w:sz w:val="17"/>
+          <w:szCs w:val="17"/>
+        </w:rPr>
+        <w:t xml:space="preserve">Nur bei: Weg C · Kutsche — Jemand merkt: kein Spiegelbild, kalte Hände, nie Mirelas Name  →  </w:t>
+      </w:r>
+      <w:r>
+        <w:rPr>
+          <w:rFonts w:ascii="Georgia" w:cs="Georgia" w:eastAsia="Georgia" w:hAnsi="Georgia"/>
+          <w:color w:val="333333"/>
+          <w:sz w:val="17"/>
+          <w:szCs w:val="17"/>
+        </w:rPr>
+        <w:t xml:space="preserve">Sag nur „Yes. You noticed.“ — nicht erklären. Das Unheimliche wirkt, solange es niemand ausspricht</w:t>
       </w:r>
     </w:p>
     <w:p>
@@ -6292,16 +6200,16 @@
           <w:sz w:val="17"/>
           <w:szCs w:val="17"/>
         </w:rPr>
-        <w:t xml:space="preserve">Nur bei: Weg C · Kutsche — Jemand merkt: kein Spiegelbild, kalte Hände, nie Mirelas Name  →  </w:t>
-      </w:r>
-      <w:r>
-        <w:rPr>
-          <w:rFonts w:ascii="Georgia" w:cs="Georgia" w:eastAsia="Georgia" w:hAnsi="Georgia"/>
-          <w:color w:val="333333"/>
-          <w:sz w:val="17"/>
-          <w:szCs w:val="17"/>
-        </w:rPr>
-        <w:t xml:space="preserve">sag „Yes. You noticed.“ — mehr nicht</w:t>
+        <w:t xml:space="preserve">Nur bei: Weg C · Kutsche — Jemand lügt Corvin an  →  </w:t>
+      </w:r>
+      <w:r>
+        <w:rPr>
+          <w:rFonts w:ascii="Georgia" w:cs="Georgia" w:eastAsia="Georgia" w:hAnsi="Georgia"/>
+          <w:color w:val="333333"/>
+          <w:sz w:val="17"/>
+          <w:szCs w:val="17"/>
+        </w:rPr>
+        <w:t xml:space="preserve">Mitspielen — Corvin glaubt alles und lächelt. Eine gute Lüge ist gutes Englisch</w:t>
       </w:r>
     </w:p>
     <w:p>
@@ -7168,16 +7076,16 @@
           <w:sz w:val="16"/>
           <w:szCs w:val="16"/>
         </w:rPr>
-        <w:t xml:space="preserve">HINTERGRUND (NUR DM):  </w:t>
-      </w:r>
-      <w:r>
-        <w:rPr>
-          <w:rFonts w:ascii="Georgia" w:cs="Georgia" w:eastAsia="Georgia" w:hAnsi="Georgia"/>
-          <w:color w:val="333333"/>
-          <w:sz w:val="18"/>
-          <w:szCs w:val="18"/>
-        </w:rPr>
-        <w:t xml:space="preserve">Der Turm hat vom Hof aus keine Tür (das hat die Gruppe gerade gehört). Sein Zugang ist ein hoher Spiegel am Ende des Westgangs: Man geht rückwärts hindurch, ohne hinzusehen. Das erfährt die Gruppe erst hinter ihrer Tür — von Bellamy, von der Kreideschrift in der Kapelle oder von Tam. Preis und Gefahr jeder Tür stehen auf den Karten unten. Jede Figur nennt ihre Tür mit Grund, dann wird geklickt.</w:t>
+        <w:t xml:space="preserve">WAS DU WEISST, SIE NOCH NICHT (NUR DM):  </w:t>
+      </w:r>
+      <w:r>
+        <w:rPr>
+          <w:rFonts w:ascii="Georgia" w:cs="Georgia" w:eastAsia="Georgia" w:hAnsi="Georgia"/>
+          <w:color w:val="333333"/>
+          <w:sz w:val="18"/>
+          <w:szCs w:val="18"/>
+        </w:rPr>
+        <w:t xml:space="preserve">Der Zugang zum Turm ist ein hoher Spiegel am Ende des Westgangs: Man geht rückwärts hindurch, ohne hinzusehen. Das erfährt die Gruppe erst hinter ihrer Tür — von Bellamy, von der Kreideschrift in der Kapelle oder von Tam. Nicht vorher verraten.</w:t>
       </w:r>
     </w:p>
     <w:p>
@@ -7368,67 +7276,67 @@
           <w:sz w:val="16"/>
           <w:szCs w:val="16"/>
         </w:rPr>
-        <w:t xml:space="preserve">WENN … DANN (NUR DM)  </w:t>
-      </w:r>
-    </w:p>
-    <w:p>
-      <w:pPr>
-        <w:pBdr>
-          <w:left w:val="single" w:color="BFBFBF" w:sz="18" w:space="8"/>
-        </w:pBdr>
-        <w:shd w:fill="F2F2F2" w:color="auto" w:val="clear"/>
-        <w:spacing w:after="40"/>
-        <w:ind w:left="120"/>
-      </w:pPr>
-      <w:r>
-        <w:rPr>
-          <w:rFonts w:ascii="Georgia" w:cs="Georgia" w:eastAsia="Georgia" w:hAnsi="Georgia"/>
-          <w:b/>
-          <w:bCs/>
-          <w:color w:val="333333"/>
-          <w:sz w:val="17"/>
-          <w:szCs w:val="17"/>
-        </w:rPr>
-        <w:t xml:space="preserve">Sie wollen alle drei Türen  →  </w:t>
-      </w:r>
-      <w:r>
-        <w:rPr>
-          <w:rFonts w:ascii="Georgia" w:cs="Georgia" w:eastAsia="Georgia" w:hAnsi="Georgia"/>
-          <w:color w:val="333333"/>
-          <w:sz w:val="17"/>
-          <w:szCs w:val="17"/>
-        </w:rPr>
-        <w:t xml:space="preserve">Nein: „One door. Every minute out here, somebody could look out of a window.“</w:t>
-      </w:r>
-    </w:p>
-    <w:p>
-      <w:pPr>
-        <w:pBdr>
-          <w:left w:val="single" w:color="BFBFBF" w:sz="18" w:space="8"/>
-        </w:pBdr>
-        <w:shd w:fill="F2F2F2" w:color="auto" w:val="clear"/>
-        <w:spacing w:after="40"/>
-        <w:ind w:left="120"/>
-      </w:pPr>
-      <w:r>
-        <w:rPr>
-          <w:rFonts w:ascii="Georgia" w:cs="Georgia" w:eastAsia="Georgia" w:hAnsi="Georgia"/>
-          <w:b/>
-          <w:bCs/>
-          <w:color w:val="333333"/>
-          <w:sz w:val="17"/>
-          <w:szCs w:val="17"/>
-        </w:rPr>
-        <w:t xml:space="preserve">Sie streiten  →  </w:t>
-      </w:r>
-      <w:r>
-        <w:rPr>
-          <w:rFonts w:ascii="Georgia" w:cs="Georgia" w:eastAsia="Georgia" w:hAnsi="Georgia"/>
-          <w:color w:val="333333"/>
-          <w:sz w:val="17"/>
-          <w:szCs w:val="17"/>
-        </w:rPr>
-        <w:t xml:space="preserve">„One minute. Each person gives a reason. Then vote.“</w:t>
+        <w:t xml:space="preserve">TIPPS (NUR DM)  </w:t>
+      </w:r>
+    </w:p>
+    <w:p>
+      <w:pPr>
+        <w:pBdr>
+          <w:left w:val="single" w:color="BFBFBF" w:sz="18" w:space="8"/>
+        </w:pBdr>
+        <w:shd w:fill="F2F2F2" w:color="auto" w:val="clear"/>
+        <w:spacing w:after="40"/>
+        <w:ind w:left="120"/>
+      </w:pPr>
+      <w:r>
+        <w:rPr>
+          <w:rFonts w:ascii="Georgia" w:cs="Georgia" w:eastAsia="Georgia" w:hAnsi="Georgia"/>
+          <w:b/>
+          <w:bCs/>
+          <w:color w:val="333333"/>
+          <w:sz w:val="17"/>
+          <w:szCs w:val="17"/>
+        </w:rPr>
+        <w:t xml:space="preserve">„I am agree with Lara.“  →  </w:t>
+      </w:r>
+      <w:r>
+        <w:rPr>
+          <w:rFonts w:ascii="Georgia" w:cs="Georgia" w:eastAsia="Georgia" w:hAnsi="Georgia"/>
+          <w:color w:val="333333"/>
+          <w:sz w:val="17"/>
+          <w:szCs w:val="17"/>
+        </w:rPr>
+        <w:t xml:space="preserve">„I agree with Lara.“ — agree ist ein Verb, ohne am. Gib den Satzanfang für die Antwort auf die anderen: „I agree, because …“ / „I see it differently: …“</w:t>
+      </w:r>
+    </w:p>
+    <w:p>
+      <w:pPr>
+        <w:pBdr>
+          <w:left w:val="single" w:color="BFBFBF" w:sz="18" w:space="8"/>
+        </w:pBdr>
+        <w:shd w:fill="F2F2F2" w:color="auto" w:val="clear"/>
+        <w:spacing w:after="40"/>
+        <w:ind w:left="120"/>
+      </w:pPr>
+      <w:r>
+        <w:rPr>
+          <w:rFonts w:ascii="Georgia" w:cs="Georgia" w:eastAsia="Georgia" w:hAnsi="Georgia"/>
+          <w:b/>
+          <w:bCs/>
+          <w:color w:val="333333"/>
+          <w:sz w:val="17"/>
+          <w:szCs w:val="17"/>
+        </w:rPr>
+        <w:t xml:space="preserve">„I would go in the library.“  →  </w:t>
+      </w:r>
+      <w:r>
+        <w:rPr>
+          <w:rFonts w:ascii="Georgia" w:cs="Georgia" w:eastAsia="Georgia" w:hAnsi="Georgia"/>
+          <w:color w:val="333333"/>
+          <w:sz w:val="17"/>
+          <w:szCs w:val="17"/>
+        </w:rPr>
+        <w:t xml:space="preserve">„into the library“. Nicht unterbrechen — beim Nachfragen richtig verwenden: „Into the library — why?“</w:t>
       </w:r>
     </w:p>
     <w:p>
@@ -7449,16 +7357,16 @@
           <w:sz w:val="17"/>
           <w:szCs w:val="17"/>
         </w:rPr>
-        <w:t xml:space="preserve">Die Karte ist geklickt  →  </w:t>
-      </w:r>
-      <w:r>
-        <w:rPr>
-          <w:rFonts w:ascii="Georgia" w:cs="Georgia" w:eastAsia="Georgia" w:hAnsi="Georgia"/>
-          <w:color w:val="333333"/>
-          <w:sz w:val="17"/>
-          <w:szCs w:val="17"/>
-        </w:rPr>
-        <w:t xml:space="preserve">auf den nächsten Seiten steht nur noch diese Tür</w:t>
+        <w:t xml:space="preserve">„Can we look through the window first?“  →  </w:t>
+      </w:r>
+      <w:r>
+        <w:rPr>
+          <w:rFonts w:ascii="Georgia" w:cs="Georgia" w:eastAsia="Georgia" w:hAnsi="Georgia"/>
+          <w:color w:val="333333"/>
+          <w:sz w:val="17"/>
+          <w:szCs w:val="17"/>
+        </w:rPr>
+        <w:t xml:space="preserve">Ja — genau dafür ist die Liste unten da. Jede Antwort nur einmal, und dann wird entschieden</w:t>
       </w:r>
     </w:p>
     <w:p>
@@ -7549,7 +7457,7 @@
           <w:sz w:val="18"/>
           <w:szCs w:val="18"/>
         </w:rPr>
-        <w:t xml:space="preserve">Bellamy ist nicht gefährlich, solange man höflich bleibt. Er will drei wahre Sätze von jeder Figur — er hört nicht auf den Inhalt, sondern auf die Stimme, und Lügen merkt er. Wer lügt oder ihn beleidigt, bekommt weder Führung noch Brief: Er steigt auf seine Leiter zurück — „The west corridor. Find it yourselves.“ — und die Gruppe sucht den Weg selbst (Block Ohne Führung unten). Sonst führt er sie selbst zum Spiegel — und bittet um einen Gefallen (steht im Text): einen Brief mit ins Dorf zu nehmen. Merk dir, ob sie Ja sagen; im Epilog zählt es.</w:t>
+        <w:t xml:space="preserve">Bellamy ist nicht gefährlich, solange man höflich bleibt. Er will drei wahre Sätze von jeder Figur. Wer lügt oder ihn beleidigt, bekommt weder Führung noch Brief: Er steigt auf seine Leiter zurück — „The west corridor. Find it yourselves.“ Führt er sie, bittet er am Spiegel um einen Gefallen (steht im Text): einen Brief mit ins Dorf zu nehmen.</w:t>
       </w:r>
     </w:p>
     <w:p>
@@ -8682,7 +8590,7 @@
           <w:sz w:val="18"/>
           <w:szCs w:val="18"/>
         </w:rPr>
-        <w:t xml:space="preserve">Tam ist seit sechs Jahren hier und kennt jeden Gang. Er hält die verbrannte Hand an die Brust und wartet — ob jemand etwas dazu sagt, ist ihre Sache (Hilfekasten neben dem Text). Dann bittet er einmal (gelb unten). Lass die drei laut besprechen, was sie mit ihm machen wollen; ein ehrliches Nein ist eine gute Antwort. In jedem Fall bleibt er noch kurz, um die Töpfe vom Feuer zu nehmen. Unten festhalten, was sie ihm gesagt haben — das zählt im Epilog. Danach führt er sie, wenn sie ehrlich waren; wer ihn anlügt oder wegstösst, sucht den Spiegel selbst.</w:t>
+        <w:t xml:space="preserve">Tam ist seit sechs Jahren hier und kennt jeden Gang. Er bittet einmal (gelb unten). Ein ehrliches Nein ist eine gute Antwort — besser als ein Versprechen, das niemand halten will. Bedroht ihn jemand oder stösst ihn weg, schreit er: Gefahr +3 rechts an der Säule.</w:t>
       </w:r>
     </w:p>
     <w:p>
@@ -8852,7 +8760,7 @@
           <w:sz w:val="17"/>
           <w:szCs w:val="17"/>
         </w:rPr>
-        <w:t xml:space="preserve">Erst besprechen lassen, dann unten festhalten. Tam bleibt in jedem Fall noch kurz, um die Töpfe vom Feuer zu nehmen.</w:t>
+        <w:t xml:space="preserve">Erst besprechen lassen, dann unten festhalten — das zählt im Epilog. Tam bleibt in jedem Fall noch kurz, um die Töpfe vom Feuer zu nehmen.</w:t>
       </w:r>
     </w:p>
     <w:p>
@@ -9311,277 +9219,157 @@
           <w:sz w:val="16"/>
           <w:szCs w:val="16"/>
         </w:rPr>
-        <w:t xml:space="preserve">WENN … DANN (NUR DM)  </w:t>
-      </w:r>
-    </w:p>
-    <w:p>
-      <w:pPr>
-        <w:pBdr>
-          <w:left w:val="single" w:color="BFBFBF" w:sz="18" w:space="8"/>
-        </w:pBdr>
-        <w:shd w:fill="F2F2F2" w:color="auto" w:val="clear"/>
-        <w:spacing w:after="40"/>
-        <w:ind w:left="120"/>
-      </w:pPr>
-      <w:r>
-        <w:rPr>
-          <w:rFonts w:ascii="Georgia" w:cs="Georgia" w:eastAsia="Georgia" w:hAnsi="Georgia"/>
-          <w:b/>
-          <w:bCs/>
-          <w:color w:val="333333"/>
-          <w:sz w:val="17"/>
-          <w:szCs w:val="17"/>
-        </w:rPr>
-        <w:t xml:space="preserve">Nur bei: Tür A · Bibliothek — Drei wahre Sätze je Figur  →  </w:t>
-      </w:r>
-      <w:r>
-        <w:rPr>
-          <w:rFonts w:ascii="Georgia" w:cs="Georgia" w:eastAsia="Georgia" w:hAnsi="Georgia"/>
-          <w:color w:val="333333"/>
-          <w:sz w:val="17"/>
-          <w:szCs w:val="17"/>
-        </w:rPr>
-        <w:t xml:space="preserve">Bellamy führt euch zum Spiegel und gibt euch den Brief</w:t>
-      </w:r>
-    </w:p>
-    <w:p>
-      <w:pPr>
-        <w:pBdr>
-          <w:left w:val="single" w:color="BFBFBF" w:sz="18" w:space="8"/>
-        </w:pBdr>
-        <w:shd w:fill="F2F2F2" w:color="auto" w:val="clear"/>
-        <w:spacing w:after="40"/>
-        <w:ind w:left="120"/>
-      </w:pPr>
-      <w:r>
-        <w:rPr>
-          <w:rFonts w:ascii="Georgia" w:cs="Georgia" w:eastAsia="Georgia" w:hAnsi="Georgia"/>
-          <w:b/>
-          <w:bCs/>
-          <w:color w:val="333333"/>
-          <w:sz w:val="17"/>
-          <w:szCs w:val="17"/>
-        </w:rPr>
-        <w:t xml:space="preserve">Nur bei: Tür A · Bibliothek — Jemand lügt oder beleidigt ihn  →  </w:t>
-      </w:r>
-      <w:r>
-        <w:rPr>
-          <w:rFonts w:ascii="Georgia" w:cs="Georgia" w:eastAsia="Georgia" w:hAnsi="Georgia"/>
-          <w:color w:val="333333"/>
-          <w:sz w:val="17"/>
-          <w:szCs w:val="17"/>
-        </w:rPr>
-        <w:t xml:space="preserve">kein Führer, kein Brief — Block „Ohne Führung“</w:t>
-      </w:r>
-    </w:p>
-    <w:p>
-      <w:pPr>
-        <w:pBdr>
-          <w:left w:val="single" w:color="BFBFBF" w:sz="18" w:space="8"/>
-        </w:pBdr>
-        <w:shd w:fill="F2F2F2" w:color="auto" w:val="clear"/>
-        <w:spacing w:after="40"/>
-        <w:ind w:left="120"/>
-      </w:pPr>
-      <w:r>
-        <w:rPr>
-          <w:rFonts w:ascii="Georgia" w:cs="Georgia" w:eastAsia="Georgia" w:hAnsi="Georgia"/>
-          <w:b/>
-          <w:bCs/>
-          <w:color w:val="333333"/>
-          <w:sz w:val="17"/>
-          <w:szCs w:val="17"/>
-        </w:rPr>
-        <w:t xml:space="preserve">Nur bei: Tür B · Kapelle, nicht: Name Anneke bekannt — Anneke ist auf 8 HP  →  </w:t>
-      </w:r>
-      <w:r>
-        <w:rPr>
-          <w:rFonts w:ascii="Georgia" w:cs="Georgia" w:eastAsia="Georgia" w:hAnsi="Georgia"/>
-          <w:color w:val="333333"/>
-          <w:sz w:val="17"/>
-          <w:szCs w:val="17"/>
-        </w:rPr>
-        <w:t xml:space="preserve">sie hört auf und fragt: „Is Greta still alive?“ — Kampf endet dort</w:t>
-      </w:r>
-    </w:p>
-    <w:p>
-      <w:pPr>
-        <w:pBdr>
-          <w:left w:val="single" w:color="BFBFBF" w:sz="18" w:space="8"/>
-        </w:pBdr>
-        <w:shd w:fill="F2F2F2" w:color="auto" w:val="clear"/>
-        <w:spacing w:after="40"/>
-        <w:ind w:left="120"/>
-      </w:pPr>
-      <w:r>
-        <w:rPr>
-          <w:rFonts w:ascii="Georgia" w:cs="Georgia" w:eastAsia="Georgia" w:hAnsi="Georgia"/>
-          <w:b/>
-          <w:bCs/>
-          <w:color w:val="333333"/>
-          <w:sz w:val="17"/>
-          <w:szCs w:val="17"/>
-        </w:rPr>
-        <w:t xml:space="preserve">Nur bei: Tür B · Kapelle, Name Anneke bekannt — Jemand ruft „Anneke!“  →  </w:t>
-      </w:r>
-      <w:r>
-        <w:rPr>
-          <w:rFonts w:ascii="Georgia" w:cs="Georgia" w:eastAsia="Georgia" w:hAnsi="Georgia"/>
-          <w:color w:val="333333"/>
-          <w:sz w:val="17"/>
-          <w:szCs w:val="17"/>
-        </w:rPr>
-        <w:t xml:space="preserve">kein Kampf — sie zeigt die Treppe hinter dem Altar</w:t>
-      </w:r>
-    </w:p>
-    <w:p>
-      <w:pPr>
-        <w:pBdr>
-          <w:left w:val="single" w:color="BFBFBF" w:sz="18" w:space="8"/>
-        </w:pBdr>
-        <w:shd w:fill="F2F2F2" w:color="auto" w:val="clear"/>
-        <w:spacing w:after="40"/>
-        <w:ind w:left="120"/>
-      </w:pPr>
-      <w:r>
-        <w:rPr>
-          <w:rFonts w:ascii="Georgia" w:cs="Georgia" w:eastAsia="Georgia" w:hAnsi="Georgia"/>
-          <w:b/>
-          <w:bCs/>
-          <w:color w:val="333333"/>
-          <w:sz w:val="17"/>
-          <w:szCs w:val="17"/>
-        </w:rPr>
-        <w:t xml:space="preserve">Nur bei: Tür C · Küche — Ehrliche Antwort auf Tams Frage — auch ein ehrliches Nein  →  </w:t>
-      </w:r>
-      <w:r>
-        <w:rPr>
-          <w:rFonts w:ascii="Georgia" w:cs="Georgia" w:eastAsia="Georgia" w:hAnsi="Georgia"/>
-          <w:color w:val="333333"/>
-          <w:sz w:val="17"/>
-          <w:szCs w:val="17"/>
-        </w:rPr>
-        <w:t xml:space="preserve">Tam führt euch zum Spiegel</w:t>
-      </w:r>
-    </w:p>
-    <w:p>
-      <w:pPr>
-        <w:pBdr>
-          <w:left w:val="single" w:color="BFBFBF" w:sz="18" w:space="8"/>
-        </w:pBdr>
-        <w:shd w:fill="F2F2F2" w:color="auto" w:val="clear"/>
-        <w:spacing w:after="40"/>
-        <w:ind w:left="120"/>
-      </w:pPr>
-      <w:r>
-        <w:rPr>
-          <w:rFonts w:ascii="Georgia" w:cs="Georgia" w:eastAsia="Georgia" w:hAnsi="Georgia"/>
-          <w:b/>
-          <w:bCs/>
-          <w:color w:val="333333"/>
-          <w:sz w:val="17"/>
-          <w:szCs w:val="17"/>
-        </w:rPr>
-        <w:t xml:space="preserve">Nur bei: Tür C · Küche — Jemand lügt ihn an oder fährt ihn an  →  </w:t>
-      </w:r>
-      <w:r>
-        <w:rPr>
-          <w:rFonts w:ascii="Georgia" w:cs="Georgia" w:eastAsia="Georgia" w:hAnsi="Georgia"/>
-          <w:color w:val="333333"/>
-          <w:sz w:val="17"/>
-          <w:szCs w:val="17"/>
-        </w:rPr>
-        <w:t xml:space="preserve">„Find it yourselves.“ — kein Führer, Block „Ohne Führung“</w:t>
-      </w:r>
-    </w:p>
-    <w:p>
-      <w:pPr>
-        <w:pBdr>
-          <w:left w:val="single" w:color="BFBFBF" w:sz="18" w:space="8"/>
-        </w:pBdr>
-        <w:shd w:fill="F2F2F2" w:color="auto" w:val="clear"/>
-        <w:spacing w:after="40"/>
-        <w:ind w:left="120"/>
-      </w:pPr>
-      <w:r>
-        <w:rPr>
-          <w:rFonts w:ascii="Georgia" w:cs="Georgia" w:eastAsia="Georgia" w:hAnsi="Georgia"/>
-          <w:b/>
-          <w:bCs/>
-          <w:color w:val="333333"/>
-          <w:sz w:val="17"/>
-          <w:szCs w:val="17"/>
-        </w:rPr>
-        <w:t xml:space="preserve">Nur bei: Tür C · Küche — Jemand bedroht ihn oder stösst ihn weg  →  </w:t>
-      </w:r>
-      <w:r>
-        <w:rPr>
-          <w:rFonts w:ascii="Georgia" w:cs="Georgia" w:eastAsia="Georgia" w:hAnsi="Georgia"/>
-          <w:color w:val="333333"/>
-          <w:sz w:val="17"/>
-          <w:szCs w:val="17"/>
-        </w:rPr>
-        <w:t xml:space="preserve">er schreit: Gefahr +3 (rechts an der Säule einstellen)</w:t>
-      </w:r>
-    </w:p>
-    <w:p>
-      <w:pPr>
-        <w:pBdr>
-          <w:left w:val="single" w:color="BFBFBF" w:sz="18" w:space="8"/>
-        </w:pBdr>
-        <w:shd w:fill="F2F2F2" w:color="auto" w:val="clear"/>
-        <w:spacing w:after="40"/>
-        <w:ind w:left="120"/>
-      </w:pPr>
-      <w:r>
-        <w:rPr>
-          <w:rFonts w:ascii="Georgia" w:cs="Georgia" w:eastAsia="Georgia" w:hAnsi="Georgia"/>
-          <w:b/>
-          <w:bCs/>
-          <w:color w:val="333333"/>
-          <w:sz w:val="17"/>
-          <w:szCs w:val="17"/>
-        </w:rPr>
-        <w:t xml:space="preserve">Nur bei: Tür A · Bibliothek, Tür C · Küche, „Nein — ihr sucht selbst“ — Ohne Führung: mindestens eine 10 im Wurf  →  </w:t>
-      </w:r>
-      <w:r>
-        <w:rPr>
-          <w:rFonts w:ascii="Georgia" w:cs="Georgia" w:eastAsia="Georgia" w:hAnsi="Georgia"/>
-          <w:color w:val="333333"/>
-          <w:sz w:val="17"/>
-          <w:szCs w:val="17"/>
-        </w:rPr>
-        <w:t xml:space="preserve">sie finden den Westgang leise</w:t>
-      </w:r>
-    </w:p>
-    <w:p>
-      <w:pPr>
-        <w:pBdr>
-          <w:left w:val="single" w:color="BFBFBF" w:sz="18" w:space="8"/>
-        </w:pBdr>
-        <w:shd w:fill="F2F2F2" w:color="auto" w:val="clear"/>
-        <w:spacing w:after="40"/>
-        <w:ind w:left="120"/>
-      </w:pPr>
-      <w:r>
-        <w:rPr>
-          <w:rFonts w:ascii="Georgia" w:cs="Georgia" w:eastAsia="Georgia" w:hAnsi="Georgia"/>
-          <w:b/>
-          <w:bCs/>
-          <w:color w:val="333333"/>
-          <w:sz w:val="17"/>
-          <w:szCs w:val="17"/>
-        </w:rPr>
-        <w:t xml:space="preserve">Nur bei: Tür A · Bibliothek, Tür C · Küche, „Nein — ihr sucht selbst“ — Ohne Führung: keine 10  →  </w:t>
-      </w:r>
-      <w:r>
-        <w:rPr>
-          <w:rFonts w:ascii="Georgia" w:cs="Georgia" w:eastAsia="Georgia" w:hAnsi="Georgia"/>
-          <w:color w:val="333333"/>
-          <w:sz w:val="17"/>
-          <w:szCs w:val="17"/>
-        </w:rPr>
-        <w:t xml:space="preserve">sie finden ihn trotzdem — Gefahr +1</w:t>
+        <w:t xml:space="preserve">TIPPS (NUR DM)  </w:t>
+      </w:r>
+    </w:p>
+    <w:p>
+      <w:pPr>
+        <w:pBdr>
+          <w:left w:val="single" w:color="BFBFBF" w:sz="18" w:space="8"/>
+        </w:pBdr>
+        <w:shd w:fill="F2F2F2" w:color="auto" w:val="clear"/>
+        <w:spacing w:after="40"/>
+        <w:ind w:left="120"/>
+      </w:pPr>
+      <w:r>
+        <w:rPr>
+          <w:rFonts w:ascii="Georgia" w:cs="Georgia" w:eastAsia="Georgia" w:hAnsi="Georgia"/>
+          <w:b/>
+          <w:bCs/>
+          <w:color w:val="333333"/>
+          <w:sz w:val="17"/>
+          <w:szCs w:val="17"/>
+        </w:rPr>
+        <w:t xml:space="preserve">Nur bei: Tür A · Bibliothek — „I am fifteen. I live in Zurich. I like pizza.“  →  </w:t>
+      </w:r>
+      <w:r>
+        <w:rPr>
+          <w:rFonts w:ascii="Georgia" w:cs="Georgia" w:eastAsia="Georgia" w:hAnsi="Georgia"/>
+          <w:color w:val="333333"/>
+          <w:sz w:val="17"/>
+          <w:szCs w:val="17"/>
+        </w:rPr>
+        <w:t xml:space="preserve">Gilt — aber Bellamy seufzt: „True. And terribly dull. Tell me something that costs you a little.“ Der zweite Versuch darf persönlicher werden</w:t>
+      </w:r>
+    </w:p>
+    <w:p>
+      <w:pPr>
+        <w:pBdr>
+          <w:left w:val="single" w:color="BFBFBF" w:sz="18" w:space="8"/>
+        </w:pBdr>
+        <w:shd w:fill="F2F2F2" w:color="auto" w:val="clear"/>
+        <w:spacing w:after="40"/>
+        <w:ind w:left="120"/>
+      </w:pPr>
+      <w:r>
+        <w:rPr>
+          <w:rFonts w:ascii="Georgia" w:cs="Georgia" w:eastAsia="Georgia" w:hAnsi="Georgia"/>
+          <w:b/>
+          <w:bCs/>
+          <w:color w:val="333333"/>
+          <w:sz w:val="17"/>
+          <w:szCs w:val="17"/>
+        </w:rPr>
+        <w:t xml:space="preserve">Nur bei: Tür A · Bibliothek — „I lie never.“  →  </w:t>
+      </w:r>
+      <w:r>
+        <w:rPr>
+          <w:rFonts w:ascii="Georgia" w:cs="Georgia" w:eastAsia="Georgia" w:hAnsi="Georgia"/>
+          <w:color w:val="333333"/>
+          <w:sz w:val="17"/>
+          <w:szCs w:val="17"/>
+        </w:rPr>
+        <w:t xml:space="preserve">„I never lie.“ — never, always, often stehen vor dem Verb. Bellamy lächelt: „Never? Now that is a lie.“</w:t>
+      </w:r>
+    </w:p>
+    <w:p>
+      <w:pPr>
+        <w:pBdr>
+          <w:left w:val="single" w:color="BFBFBF" w:sz="18" w:space="8"/>
+        </w:pBdr>
+        <w:shd w:fill="F2F2F2" w:color="auto" w:val="clear"/>
+        <w:spacing w:after="40"/>
+        <w:ind w:left="120"/>
+      </w:pPr>
+      <w:r>
+        <w:rPr>
+          <w:rFonts w:ascii="Georgia" w:cs="Georgia" w:eastAsia="Georgia" w:hAnsi="Georgia"/>
+          <w:b/>
+          <w:bCs/>
+          <w:color w:val="333333"/>
+          <w:sz w:val="17"/>
+          <w:szCs w:val="17"/>
+        </w:rPr>
+        <w:t xml:space="preserve">Nur bei: Tür B · Kapelle — Jemand sagt den Namen nur leise oder fragend: „Anneke?“  →  </w:t>
+      </w:r>
+      <w:r>
+        <w:rPr>
+          <w:rFonts w:ascii="Georgia" w:cs="Georgia" w:eastAsia="Georgia" w:hAnsi="Georgia"/>
+          <w:color w:val="333333"/>
+          <w:sz w:val="17"/>
+          <w:szCs w:val="17"/>
+        </w:rPr>
+        <w:t xml:space="preserve">Zählt. Gesagt ist gesagt — es muss nicht gerufen werden</w:t>
+      </w:r>
+    </w:p>
+    <w:p>
+      <w:pPr>
+        <w:pBdr>
+          <w:left w:val="single" w:color="BFBFBF" w:sz="18" w:space="8"/>
+        </w:pBdr>
+        <w:shd w:fill="F2F2F2" w:color="auto" w:val="clear"/>
+        <w:spacing w:after="40"/>
+        <w:ind w:left="120"/>
+      </w:pPr>
+      <w:r>
+        <w:rPr>
+          <w:rFonts w:ascii="Georgia" w:cs="Georgia" w:eastAsia="Georgia" w:hAnsi="Georgia"/>
+          <w:b/>
+          <w:bCs/>
+          <w:color w:val="333333"/>
+          <w:sz w:val="17"/>
+          <w:szCs w:val="17"/>
+        </w:rPr>
+        <w:t xml:space="preserve">Nur bei: Tür B · Kapelle, „Nein — niemand kennt sie“ — Mitten im Kampf fällt ihnen der Name doch noch ein  →  </w:t>
+      </w:r>
+      <w:r>
+        <w:rPr>
+          <w:rFonts w:ascii="Georgia" w:cs="Georgia" w:eastAsia="Georgia" w:hAnsi="Georgia"/>
+          <w:color w:val="333333"/>
+          <w:sz w:val="17"/>
+          <w:szCs w:val="17"/>
+        </w:rPr>
+        <w:t xml:space="preserve">Sie hält sofort an und fragt: „Is Greta still alive?“ Kampf beenden und oben auf „Ja — jemand ruft Anneke!“ umklicken — das ist der schönere Ausgang</w:t>
+      </w:r>
+    </w:p>
+    <w:p>
+      <w:pPr>
+        <w:pBdr>
+          <w:left w:val="single" w:color="BFBFBF" w:sz="18" w:space="8"/>
+        </w:pBdr>
+        <w:shd w:fill="F2F2F2" w:color="auto" w:val="clear"/>
+        <w:spacing w:after="40"/>
+        <w:ind w:left="120"/>
+      </w:pPr>
+      <w:r>
+        <w:rPr>
+          <w:rFonts w:ascii="Georgia" w:cs="Georgia" w:eastAsia="Georgia" w:hAnsi="Georgia"/>
+          <w:b/>
+          <w:bCs/>
+          <w:color w:val="333333"/>
+          <w:sz w:val="17"/>
+          <w:szCs w:val="17"/>
+        </w:rPr>
+        <w:t xml:space="preserve">Nur bei: Tür C · Küche — „We promise that we take you with.“  →  </w:t>
+      </w:r>
+      <w:r>
+        <w:rPr>
+          <w:rFonts w:ascii="Georgia" w:cs="Georgia" w:eastAsia="Georgia" w:hAnsi="Georgia"/>
+          <w:color w:val="333333"/>
+          <w:sz w:val="17"/>
+          <w:szCs w:val="17"/>
+        </w:rPr>
+        <w:t xml:space="preserve">„We’ll take you with us.“ — Versprechen mit will, und with braucht ein us. Tam wiederholt es leise, um sicher zu sein</w:t>
       </w:r>
     </w:p>
     <w:p>
@@ -9602,16 +9390,16 @@
           <w:sz w:val="17"/>
           <w:szCs w:val="17"/>
         </w:rPr>
-        <w:t xml:space="preserve">Jemand sieht in den Spiegel  →  </w:t>
-      </w:r>
-      <w:r>
-        <w:rPr>
-          <w:rFonts w:ascii="Georgia" w:cs="Georgia" w:eastAsia="Georgia" w:hAnsi="Georgia"/>
-          <w:color w:val="333333"/>
-          <w:sz w:val="17"/>
-          <w:szCs w:val="17"/>
-        </w:rPr>
-        <w:t xml:space="preserve">„Nobody who looked has ever told anyone.“ — kein Schaden</w:t>
+        <w:t xml:space="preserve">Nur bei: Tür C · Küche — Jemand verspricht halbherzig, nur um weiterzukommen  →  </w:t>
+      </w:r>
+      <w:r>
+        <w:rPr>
+          <w:rFonts w:ascii="Georgia" w:cs="Georgia" w:eastAsia="Georgia" w:hAnsi="Georgia"/>
+          <w:color w:val="333333"/>
+          <w:sz w:val="17"/>
+          <w:szCs w:val="17"/>
+        </w:rPr>
+        <w:t xml:space="preserve">Gilt als Versprechen. Nicht nachhaken — die Rechnung kommt im Epilog</w:t>
       </w:r>
     </w:p>
     <w:p>
@@ -10594,67 +10382,97 @@
           <w:sz w:val="16"/>
           <w:szCs w:val="16"/>
         </w:rPr>
-        <w:t xml:space="preserve">WENN … DANN (NUR DM)  </w:t>
-      </w:r>
-    </w:p>
-    <w:p>
-      <w:pPr>
-        <w:pBdr>
-          <w:left w:val="single" w:color="BFBFBF" w:sz="18" w:space="8"/>
-        </w:pBdr>
-        <w:shd w:fill="F2F2F2" w:color="auto" w:val="clear"/>
-        <w:spacing w:after="40"/>
-        <w:ind w:left="120"/>
-      </w:pPr>
-      <w:r>
-        <w:rPr>
-          <w:rFonts w:ascii="Georgia" w:cs="Georgia" w:eastAsia="Georgia" w:hAnsi="Georgia"/>
-          <w:b/>
-          <w:bCs/>
-          <w:color w:val="333333"/>
-          <w:sz w:val="17"/>
-          <w:szCs w:val="17"/>
-        </w:rPr>
-        <w:t xml:space="preserve">Nur „wir retten dich“  →  </w:t>
-      </w:r>
-      <w:r>
-        <w:rPr>
-          <w:rFonts w:ascii="Georgia" w:cs="Georgia" w:eastAsia="Georgia" w:hAnsi="Georgia"/>
-          <w:color w:val="333333"/>
-          <w:sz w:val="17"/>
-          <w:szCs w:val="17"/>
-        </w:rPr>
-        <w:t xml:space="preserve">Mirela bleibt sitzen und widerspricht</w:t>
-      </w:r>
-    </w:p>
-    <w:p>
-      <w:pPr>
-        <w:pBdr>
-          <w:left w:val="single" w:color="BFBFBF" w:sz="18" w:space="8"/>
-        </w:pBdr>
-        <w:shd w:fill="F2F2F2" w:color="auto" w:val="clear"/>
-        <w:spacing w:after="40"/>
-        <w:ind w:left="120"/>
-      </w:pPr>
-      <w:r>
-        <w:rPr>
-          <w:rFonts w:ascii="Georgia" w:cs="Georgia" w:eastAsia="Georgia" w:hAnsi="Georgia"/>
-          <w:b/>
-          <w:bCs/>
-          <w:color w:val="333333"/>
-          <w:sz w:val="17"/>
-          <w:szCs w:val="17"/>
-        </w:rPr>
-        <w:t xml:space="preserve">Ein echter Grund je Figur  →  </w:t>
-      </w:r>
-      <w:r>
-        <w:rPr>
-          <w:rFonts w:ascii="Georgia" w:cs="Georgia" w:eastAsia="Georgia" w:hAnsi="Georgia"/>
-          <w:color w:val="333333"/>
-          <w:sz w:val="17"/>
-          <w:szCs w:val="17"/>
-        </w:rPr>
-        <w:t xml:space="preserve">sie hört zu — weiter zur letzten Entscheidung</w:t>
+        <w:t xml:space="preserve">TIPPS (NUR DM)  </w:t>
+      </w:r>
+    </w:p>
+    <w:p>
+      <w:pPr>
+        <w:pBdr>
+          <w:left w:val="single" w:color="BFBFBF" w:sz="18" w:space="8"/>
+        </w:pBdr>
+        <w:shd w:fill="F2F2F2" w:color="auto" w:val="clear"/>
+        <w:spacing w:after="40"/>
+        <w:ind w:left="120"/>
+      </w:pPr>
+      <w:r>
+        <w:rPr>
+          <w:rFonts w:ascii="Georgia" w:cs="Georgia" w:eastAsia="Georgia" w:hAnsi="Georgia"/>
+          <w:b/>
+          <w:bCs/>
+          <w:color w:val="333333"/>
+          <w:sz w:val="17"/>
+          <w:szCs w:val="17"/>
+        </w:rPr>
+        <w:t xml:space="preserve">„Why did you came here?“  →  </w:t>
+      </w:r>
+      <w:r>
+        <w:rPr>
+          <w:rFonts w:ascii="Georgia" w:cs="Georgia" w:eastAsia="Georgia" w:hAnsi="Georgia"/>
+          <w:color w:val="333333"/>
+          <w:sz w:val="17"/>
+          <w:szCs w:val="17"/>
+        </w:rPr>
+        <w:t xml:space="preserve">„Why did you come?“ — nach did die Grundform. Mirela wiederholt die Frage richtig, bevor sie antwortet: „Why did I come? …“</w:t>
+      </w:r>
+    </w:p>
+    <w:p>
+      <w:pPr>
+        <w:pBdr>
+          <w:left w:val="single" w:color="BFBFBF" w:sz="18" w:space="8"/>
+        </w:pBdr>
+        <w:shd w:fill="F2F2F2" w:color="auto" w:val="clear"/>
+        <w:spacing w:after="40"/>
+        <w:ind w:left="120"/>
+      </w:pPr>
+      <w:r>
+        <w:rPr>
+          <w:rFonts w:ascii="Georgia" w:cs="Georgia" w:eastAsia="Georgia" w:hAnsi="Georgia"/>
+          <w:b/>
+          <w:bCs/>
+          <w:color w:val="333333"/>
+          <w:sz w:val="17"/>
+          <w:szCs w:val="17"/>
+        </w:rPr>
+        <w:t xml:space="preserve">Nur „That is not fair!“  →  </w:t>
+      </w:r>
+      <w:r>
+        <w:rPr>
+          <w:rFonts w:ascii="Georgia" w:cs="Georgia" w:eastAsia="Georgia" w:hAnsi="Georgia"/>
+          <w:color w:val="333333"/>
+          <w:sz w:val="17"/>
+          <w:szCs w:val="17"/>
+        </w:rPr>
+        <w:t xml:space="preserve">Nachfragen: „Not fair to whom — to you, to Lene, or to the village?“ Aus dem Ausruf wird ein Gespräch</w:t>
+      </w:r>
+    </w:p>
+    <w:p>
+      <w:pPr>
+        <w:pBdr>
+          <w:left w:val="single" w:color="BFBFBF" w:sz="18" w:space="8"/>
+        </w:pBdr>
+        <w:shd w:fill="F2F2F2" w:color="auto" w:val="clear"/>
+        <w:spacing w:after="40"/>
+        <w:ind w:left="120"/>
+      </w:pPr>
+      <w:r>
+        <w:rPr>
+          <w:rFonts w:ascii="Georgia" w:cs="Georgia" w:eastAsia="Georgia" w:hAnsi="Georgia"/>
+          <w:b/>
+          <w:bCs/>
+          <w:color w:val="333333"/>
+          <w:sz w:val="17"/>
+          <w:szCs w:val="17"/>
+        </w:rPr>
+        <w:t xml:space="preserve">„I think it is not fair.“  →  </w:t>
+      </w:r>
+      <w:r>
+        <w:rPr>
+          <w:rFonts w:ascii="Georgia" w:cs="Georgia" w:eastAsia="Georgia" w:hAnsi="Georgia"/>
+          <w:color w:val="333333"/>
+          <w:sz w:val="17"/>
+          <w:szCs w:val="17"/>
+        </w:rPr>
+        <w:t xml:space="preserve">Natürlicher: „I don’t think it’s fair.“ — im Englischen wandert das not nach vorn</w:t>
       </w:r>
     </w:p>
     <w:p>
@@ -10675,16 +10493,16 @@
           <w:sz w:val="17"/>
           <w:szCs w:val="17"/>
         </w:rPr>
-        <w:t xml:space="preserve">Nur bei: Weg C · Kutsche — Sie sagen ihr, dass sie die Kutsche genommen haben  →  </w:t>
-      </w:r>
-      <w:r>
-        <w:rPr>
-          <w:rFonts w:ascii="Georgia" w:cs="Georgia" w:eastAsia="Georgia" w:hAnsi="Georgia"/>
-          <w:color w:val="333333"/>
-          <w:sz w:val="17"/>
-          <w:szCs w:val="17"/>
-        </w:rPr>
-        <w:t xml:space="preserve">„Then Corvin has become slow.“</w:t>
+        <w:t xml:space="preserve">Niemandem fällt eine andere Idee ein  →  </w:t>
+      </w:r>
+      <w:r>
+        <w:rPr>
+          <w:rFonts w:ascii="Georgia" w:cs="Georgia" w:eastAsia="Georgia" w:hAnsi="Georgia"/>
+          <w:color w:val="333333"/>
+          <w:sz w:val="17"/>
+          <w:szCs w:val="17"/>
+        </w:rPr>
+        <w:t xml:space="preserve">Frag nach dem Dorf, nicht nach dem Grafen: „What could the village do instead?“ — dann kommen sie von selbst auf Angebote</w:t>
       </w:r>
     </w:p>
     <w:p>
@@ -11132,37 +10950,97 @@
           <w:sz w:val="16"/>
           <w:szCs w:val="16"/>
         </w:rPr>
-        <w:t xml:space="preserve">WENN … DANN (NUR DM)  </w:t>
-      </w:r>
-    </w:p>
-    <w:p>
-      <w:pPr>
-        <w:pBdr>
-          <w:left w:val="single" w:color="BFBFBF" w:sz="18" w:space="8"/>
-        </w:pBdr>
-        <w:shd w:fill="F2F2F2" w:color="auto" w:val="clear"/>
-        <w:spacing w:after="40"/>
-        <w:ind w:left="120"/>
-      </w:pPr>
-      <w:r>
-        <w:rPr>
-          <w:rFonts w:ascii="Georgia" w:cs="Georgia" w:eastAsia="Georgia" w:hAnsi="Georgia"/>
-          <w:b/>
-          <w:bCs/>
-          <w:color w:val="333333"/>
-          <w:sz w:val="17"/>
-          <w:szCs w:val="17"/>
-        </w:rPr>
-        <w:t xml:space="preserve">Sie entscheiden vor Mirela  →  </w:t>
-      </w:r>
-      <w:r>
-        <w:rPr>
-          <w:rFonts w:ascii="Georgia" w:cs="Georgia" w:eastAsia="Georgia" w:hAnsi="Georgia"/>
-          <w:color w:val="333333"/>
-          <w:sz w:val="17"/>
-          <w:szCs w:val="17"/>
-        </w:rPr>
-        <w:t xml:space="preserve">sie widerspricht — der beste Dialog des Abends</w:t>
+        <w:t xml:space="preserve">TIPPS (NUR DM)  </w:t>
+      </w:r>
+    </w:p>
+    <w:p>
+      <w:pPr>
+        <w:pBdr>
+          <w:left w:val="single" w:color="BFBFBF" w:sz="18" w:space="8"/>
+        </w:pBdr>
+        <w:shd w:fill="F2F2F2" w:color="auto" w:val="clear"/>
+        <w:spacing w:after="40"/>
+        <w:ind w:left="120"/>
+      </w:pPr>
+      <w:r>
+        <w:rPr>
+          <w:rFonts w:ascii="Georgia" w:cs="Georgia" w:eastAsia="Georgia" w:hAnsi="Georgia"/>
+          <w:b/>
+          <w:bCs/>
+          <w:color w:val="333333"/>
+          <w:sz w:val="17"/>
+          <w:szCs w:val="17"/>
+        </w:rPr>
+        <w:t xml:space="preserve">Sie wollen sie hinaustragen  →  </w:t>
+      </w:r>
+      <w:r>
+        <w:rPr>
+          <w:rFonts w:ascii="Georgia" w:cs="Georgia" w:eastAsia="Georgia" w:hAnsi="Georgia"/>
+          <w:color w:val="333333"/>
+          <w:sz w:val="17"/>
+          <w:szCs w:val="17"/>
+        </w:rPr>
+        <w:t xml:space="preserve">Mirela: „You’re not asking me. You’re carrying me. There is a difference.“</w:t>
+      </w:r>
+    </w:p>
+    <w:p>
+      <w:pPr>
+        <w:pBdr>
+          <w:left w:val="single" w:color="BFBFBF" w:sz="18" w:space="8"/>
+        </w:pBdr>
+        <w:shd w:fill="F2F2F2" w:color="auto" w:val="clear"/>
+        <w:spacing w:after="40"/>
+        <w:ind w:left="120"/>
+      </w:pPr>
+      <w:r>
+        <w:rPr>
+          <w:rFonts w:ascii="Georgia" w:cs="Georgia" w:eastAsia="Georgia" w:hAnsi="Georgia"/>
+          <w:b/>
+          <w:bCs/>
+          <w:color w:val="333333"/>
+          <w:sz w:val="17"/>
+          <w:szCs w:val="17"/>
+        </w:rPr>
+        <w:t xml:space="preserve">Sie wollen das Buch verbrennen  →  </w:t>
+      </w:r>
+      <w:r>
+        <w:rPr>
+          <w:rFonts w:ascii="Georgia" w:cs="Georgia" w:eastAsia="Georgia" w:hAnsi="Georgia"/>
+          <w:color w:val="333333"/>
+          <w:sz w:val="17"/>
+          <w:szCs w:val="17"/>
+        </w:rPr>
+        <w:t xml:space="preserve">Mirela: „And in February, when the wolves come — who protects the village then?“</w:t>
+      </w:r>
+    </w:p>
+    <w:p>
+      <w:pPr>
+        <w:pBdr>
+          <w:left w:val="single" w:color="BFBFBF" w:sz="18" w:space="8"/>
+        </w:pBdr>
+        <w:shd w:fill="F2F2F2" w:color="auto" w:val="clear"/>
+        <w:spacing w:after="40"/>
+        <w:ind w:left="120"/>
+      </w:pPr>
+      <w:r>
+        <w:rPr>
+          <w:rFonts w:ascii="Georgia" w:cs="Georgia" w:eastAsia="Georgia" w:hAnsi="Georgia"/>
+          <w:b/>
+          <w:bCs/>
+          <w:color w:val="333333"/>
+          <w:sz w:val="17"/>
+          <w:szCs w:val="17"/>
+        </w:rPr>
+        <w:t xml:space="preserve">Sie wollen verhandeln  →  </w:t>
+      </w:r>
+      <w:r>
+        <w:rPr>
+          <w:rFonts w:ascii="Georgia" w:cs="Georgia" w:eastAsia="Georgia" w:hAnsi="Georgia"/>
+          <w:color w:val="333333"/>
+          <w:sz w:val="17"/>
+          <w:szCs w:val="17"/>
+        </w:rPr>
+        <w:t xml:space="preserve">Mirela: „He will say yes. He always says yes. That is what worries me.“</w:t>
       </w:r>
     </w:p>
     <w:p>
@@ -11183,16 +11061,16 @@
           <w:sz w:val="17"/>
           <w:szCs w:val="17"/>
         </w:rPr>
-        <w:t xml:space="preserve">Die Karte ist geklickt  →  </w:t>
-      </w:r>
-      <w:r>
-        <w:rPr>
-          <w:rFonts w:ascii="Georgia" w:cs="Georgia" w:eastAsia="Georgia" w:hAnsi="Georgia"/>
-          <w:color w:val="333333"/>
-          <w:sz w:val="17"/>
-          <w:szCs w:val="17"/>
-        </w:rPr>
-        <w:t xml:space="preserve">im Finale steht nur noch dieser Fall</w:t>
+        <w:t xml:space="preserve">„If we will burn the book …“  →  </w:t>
+      </w:r>
+      <w:r>
+        <w:rPr>
+          <w:rFonts w:ascii="Georgia" w:cs="Georgia" w:eastAsia="Georgia" w:hAnsi="Georgia"/>
+          <w:color w:val="333333"/>
+          <w:sz w:val="17"/>
+          <w:szCs w:val="17"/>
+        </w:rPr>
+        <w:t xml:space="preserve">„If we burn the book, he will …“ — im if-Teil kein will. Die Stelle ist wie gemacht für if-Sätze: „And if you do that — what happens then?“</w:t>
       </w:r>
     </w:p>
     <w:p>
@@ -11267,8 +11145,8 @@
           <w:sz w:val="18"/>
           <w:szCs w:val="18"/>
         </w:rPr>
-        <w:t xml:space="preserve">Der Graf sieht aus wie ein müder Mann von fünfzig. Wie er auftritt, hängt an eurer Wahl und am Barometer — es steht nur der Fall da, der bei euch gilt. Zuerst wird geredet: Er antwortet auf jeden Satz (Antworten unten). Dann klickst du an, wie das Gespräch gelaufen ist, und darunter erscheint nur der passende Teil.
- Kommt es zum Kampf: Unter 15 Lebenspunkten hört er auf und redet — töten, Vertrag oder gehen lassen. Fällt eine Figur auf 0, ist sie bewusstlos, nicht tot. „Wie ist es ausgegangen?“ bietet nur an, was nach eurem Verlauf möglich ist: „Vaskir ist tot“ erst, wenn er im Kampf unter 15 gefallen ist; „Er ist entkommen“ nur nach einem Kampf.</w:t>
+        <w:t xml:space="preserve">Der Graf sieht aus wie ein müder Mann von fünfzig. Wie er auftritt, hängt an eurer Wahl und am Barometer — es steht nur der Fall da, der bei euch gilt.
+ Fällt im Kampf eine Figur auf 0, ist sie bewusstlos, nicht tot. „Wie ist es ausgegangen?“ bietet nur an, was nach eurem Verlauf möglich ist: „Vaskir ist tot“ erst, wenn er im Kampf unter 15 gefallen ist; „Er ist entkommen“ nur nach einem Kampf.</w:t>
       </w:r>
     </w:p>
     <w:p>
@@ -12009,7 +11887,7 @@
           <w:sz w:val="17"/>
           <w:szCs w:val="17"/>
         </w:rPr>
-        <w:t xml:space="preserve">Seine Antworten stehen darunter. Er ist leise und höflich und droht nie. Danach anklicken, wie das Gespräch gelaufen ist.</w:t>
+        <w:t xml:space="preserve">Seine Antworten stehen darunter. Danach anklicken, wie das Gespräch gelaufen ist.</w:t>
       </w:r>
     </w:p>
     <w:p>
@@ -13403,7 +13281,7 @@
           <w:sz w:val="18"/>
           <w:szCs w:val="18"/>
         </w:rPr>
-        <w:t xml:space="preserve">Kommt es zum Kampf: laden. Die Seite nimmt Vaskir und, je nach Gefahr und Wahl, seine Leute. Unter 15 Lebenspunkten hört er auf zu kämpfen.  →  Kampf laden</w:t>
+        <w:t xml:space="preserve">Kommt es zum Kampf: laden. Die Seite nimmt Vaskir und, je nach Gefahr und Wahl, seine Leute.  →  Kampf laden</w:t>
       </w:r>
     </w:p>
     <w:p>
@@ -13577,127 +13455,97 @@
           <w:sz w:val="16"/>
           <w:szCs w:val="16"/>
         </w:rPr>
-        <w:t xml:space="preserve">WENN … DANN (NUR DM)  </w:t>
-      </w:r>
-    </w:p>
-    <w:p>
-      <w:pPr>
-        <w:pBdr>
-          <w:left w:val="single" w:color="BFBFBF" w:sz="18" w:space="8"/>
-        </w:pBdr>
-        <w:shd w:fill="F2F2F2" w:color="auto" w:val="clear"/>
-        <w:spacing w:after="40"/>
-        <w:ind w:left="120"/>
-      </w:pPr>
-      <w:r>
-        <w:rPr>
-          <w:rFonts w:ascii="Georgia" w:cs="Georgia" w:eastAsia="Georgia" w:hAnsi="Georgia"/>
-          <w:b/>
-          <w:bCs/>
-          <w:color w:val="333333"/>
-          <w:sz w:val="17"/>
-          <w:szCs w:val="17"/>
-        </w:rPr>
-        <w:t xml:space="preserve">Das Angebot kostet die Gruppe etwas Echtes  →  </w:t>
-      </w:r>
-      <w:r>
-        <w:rPr>
-          <w:rFonts w:ascii="Georgia" w:cs="Georgia" w:eastAsia="Georgia" w:hAnsi="Georgia"/>
-          <w:color w:val="333333"/>
-          <w:sz w:val="17"/>
-          <w:szCs w:val="17"/>
-        </w:rPr>
-        <w:t xml:space="preserve">er nimmt an — „Ein echtes Angebot“ anklicken, kein Kampf</w:t>
-      </w:r>
-    </w:p>
-    <w:p>
-      <w:pPr>
-        <w:pBdr>
-          <w:left w:val="single" w:color="BFBFBF" w:sz="18" w:space="8"/>
-        </w:pBdr>
-        <w:shd w:fill="F2F2F2" w:color="auto" w:val="clear"/>
-        <w:spacing w:after="40"/>
-        <w:ind w:left="120"/>
-      </w:pPr>
-      <w:r>
-        <w:rPr>
-          <w:rFonts w:ascii="Georgia" w:cs="Georgia" w:eastAsia="Georgia" w:hAnsi="Georgia"/>
-          <w:b/>
-          <w:bCs/>
-          <w:color w:val="333333"/>
-          <w:sz w:val="17"/>
-          <w:szCs w:val="17"/>
-        </w:rPr>
-        <w:t xml:space="preserve">Sie wollen wissen, wie alles anfing  →  </w:t>
-      </w:r>
-      <w:r>
-        <w:rPr>
-          <w:rFonts w:ascii="Georgia" w:cs="Georgia" w:eastAsia="Georgia" w:hAnsi="Georgia"/>
-          <w:color w:val="333333"/>
-          <w:sz w:val="17"/>
-          <w:szCs w:val="17"/>
-        </w:rPr>
-        <w:t xml:space="preserve">„Sie fragen und hören zu“ — er erzählt und macht selbst ein Angebot</w:t>
-      </w:r>
-    </w:p>
-    <w:p>
-      <w:pPr>
-        <w:pBdr>
-          <w:left w:val="single" w:color="BFBFBF" w:sz="18" w:space="8"/>
-        </w:pBdr>
-        <w:shd w:fill="F2F2F2" w:color="auto" w:val="clear"/>
-        <w:spacing w:after="40"/>
-        <w:ind w:left="120"/>
-      </w:pPr>
-      <w:r>
-        <w:rPr>
-          <w:rFonts w:ascii="Georgia" w:cs="Georgia" w:eastAsia="Georgia" w:hAnsi="Georgia"/>
-          <w:b/>
-          <w:bCs/>
-          <w:color w:val="333333"/>
-          <w:sz w:val="17"/>
-          <w:szCs w:val="17"/>
-        </w:rPr>
-        <w:t xml:space="preserve">Drohung, Beleidigung, „we’ll kill you anyway“  →  </w:t>
-      </w:r>
-      <w:r>
-        <w:rPr>
-          <w:rFonts w:ascii="Georgia" w:cs="Georgia" w:eastAsia="Georgia" w:hAnsi="Georgia"/>
-          <w:color w:val="333333"/>
-          <w:sz w:val="17"/>
-          <w:szCs w:val="17"/>
-        </w:rPr>
-        <w:t xml:space="preserve">„Drohung“ anklicken — Kampf, und er schlägt zuerst zu</w:t>
-      </w:r>
-    </w:p>
-    <w:p>
-      <w:pPr>
-        <w:pBdr>
-          <w:left w:val="single" w:color="BFBFBF" w:sz="18" w:space="8"/>
-        </w:pBdr>
-        <w:shd w:fill="F2F2F2" w:color="auto" w:val="clear"/>
-        <w:spacing w:after="40"/>
-        <w:ind w:left="120"/>
-      </w:pPr>
-      <w:r>
-        <w:rPr>
-          <w:rFonts w:ascii="Georgia" w:cs="Georgia" w:eastAsia="Georgia" w:hAnsi="Georgia"/>
-          <w:b/>
-          <w:bCs/>
-          <w:color w:val="333333"/>
-          <w:sz w:val="17"/>
-          <w:szCs w:val="17"/>
-        </w:rPr>
-        <w:t xml:space="preserve">Nur bei: eins von „Sie fragen und hören zu“ / „Nur Forderungen“ / „Drohung oder Beleidigung“ / „Sie greifen an“ — Vaskir fällt unter 15 Lebenspunkte  →  </w:t>
-      </w:r>
-      <w:r>
-        <w:rPr>
-          <w:rFonts w:ascii="Georgia" w:cs="Georgia" w:eastAsia="Georgia" w:hAnsi="Georgia"/>
-          <w:color w:val="333333"/>
-          <w:sz w:val="17"/>
-          <w:szCs w:val="17"/>
-        </w:rPr>
-        <w:t xml:space="preserve">er hört auf und redet: töten, Vertrag oder gehen lassen — erst jetzt steht „Vaskir ist tot“ unten</w:t>
+        <w:t xml:space="preserve">TIPPS (NUR DM)  </w:t>
+      </w:r>
+    </w:p>
+    <w:p>
+      <w:pPr>
+        <w:pBdr>
+          <w:left w:val="single" w:color="BFBFBF" w:sz="18" w:space="8"/>
+        </w:pBdr>
+        <w:shd w:fill="F2F2F2" w:color="auto" w:val="clear"/>
+        <w:spacing w:after="40"/>
+        <w:ind w:left="120"/>
+      </w:pPr>
+      <w:r>
+        <w:rPr>
+          <w:rFonts w:ascii="Georgia" w:cs="Georgia" w:eastAsia="Georgia" w:hAnsi="Georgia"/>
+          <w:b/>
+          <w:bCs/>
+          <w:color w:val="333333"/>
+          <w:sz w:val="17"/>
+          <w:szCs w:val="17"/>
+        </w:rPr>
+        <w:t xml:space="preserve">„We offer you our friendship.“  →  </w:t>
+      </w:r>
+      <w:r>
+        <w:rPr>
+          <w:rFonts w:ascii="Georgia" w:cs="Georgia" w:eastAsia="Georgia" w:hAnsi="Georgia"/>
+          <w:color w:val="333333"/>
+          <w:sz w:val="17"/>
+          <w:szCs w:val="17"/>
+        </w:rPr>
+        <w:t xml:space="preserve">Zu billig. Vaskir lächelt: „Friendship is free. What does it cost you?“ Erst was die Gruppe etwas kostet, gilt als echtes Angebot</w:t>
+      </w:r>
+    </w:p>
+    <w:p>
+      <w:pPr>
+        <w:pBdr>
+          <w:left w:val="single" w:color="BFBFBF" w:sz="18" w:space="8"/>
+        </w:pBdr>
+        <w:shd w:fill="F2F2F2" w:color="auto" w:val="clear"/>
+        <w:spacing w:after="40"/>
+        <w:ind w:left="120"/>
+      </w:pPr>
+      <w:r>
+        <w:rPr>
+          <w:rFonts w:ascii="Georgia" w:cs="Georgia" w:eastAsia="Georgia" w:hAnsi="Georgia"/>
+          <w:b/>
+          <w:bCs/>
+          <w:color w:val="333333"/>
+          <w:sz w:val="17"/>
+          <w:szCs w:val="17"/>
+        </w:rPr>
+        <w:t xml:space="preserve">„Let her free!“  →  </w:t>
+      </w:r>
+      <w:r>
+        <w:rPr>
+          <w:rFonts w:ascii="Georgia" w:cs="Georgia" w:eastAsia="Georgia" w:hAnsi="Georgia"/>
+          <w:color w:val="333333"/>
+          <w:sz w:val="17"/>
+          <w:szCs w:val="17"/>
+        </w:rPr>
+        <w:t xml:space="preserve">„Let her go!“ oder „Set her free!“ — free ist kein Verb. Vaskir darf es höflich richtig sagen: „Let her go? She was never held.“</w:t>
+      </w:r>
+    </w:p>
+    <w:p>
+      <w:pPr>
+        <w:pBdr>
+          <w:left w:val="single" w:color="BFBFBF" w:sz="18" w:space="8"/>
+        </w:pBdr>
+        <w:shd w:fill="F2F2F2" w:color="auto" w:val="clear"/>
+        <w:spacing w:after="40"/>
+        <w:ind w:left="120"/>
+      </w:pPr>
+      <w:r>
+        <w:rPr>
+          <w:rFonts w:ascii="Georgia" w:cs="Georgia" w:eastAsia="Georgia" w:hAnsi="Georgia"/>
+          <w:b/>
+          <w:bCs/>
+          <w:color w:val="333333"/>
+          <w:sz w:val="17"/>
+          <w:szCs w:val="17"/>
+        </w:rPr>
+        <w:t xml:space="preserve">Sie wissen nicht, was sie bieten könnten  →  </w:t>
+      </w:r>
+      <w:r>
+        <w:rPr>
+          <w:rFonts w:ascii="Georgia" w:cs="Georgia" w:eastAsia="Georgia" w:hAnsi="Georgia"/>
+          <w:color w:val="333333"/>
+          <w:sz w:val="17"/>
+          <w:szCs w:val="17"/>
+        </w:rPr>
+        <w:t xml:space="preserve">Laut mitdenken, ohne zu lösen: „What do you have that he doesn’t? Time? A promise?“ Mirela hat gesagt, was er will</w:t>
       </w:r>
     </w:p>
     <w:p>
@@ -13718,16 +13566,16 @@
           <w:sz w:val="17"/>
           <w:szCs w:val="17"/>
         </w:rPr>
-        <w:t xml:space="preserve">Nur bei: eins von „Sie fragen und hören zu“ / „Nur Forderungen“ / „Drohung oder Beleidigung“ / „Sie greifen an“ — Eine Figur fällt auf 0  →  </w:t>
-      </w:r>
-      <w:r>
-        <w:rPr>
-          <w:rFonts w:ascii="Georgia" w:cs="Georgia" w:eastAsia="Georgia" w:hAnsi="Georgia"/>
-          <w:color w:val="333333"/>
-          <w:sz w:val="17"/>
-          <w:szCs w:val="17"/>
-        </w:rPr>
-        <w:t xml:space="preserve">Trank — oder liegen bis nach dem Kampf</w:t>
+        <w:t xml:space="preserve">Nur bei: eins von „Sie fragen und hören zu“ / „Nur Forderungen“ / „Drohung oder Beleidigung“ / „Sie greifen an“ — Er fällt unter 15 und fragt „Well?“  →  </w:t>
+      </w:r>
+      <w:r>
+        <w:rPr>
+          <w:rFonts w:ascii="Georgia" w:cs="Georgia" w:eastAsia="Georgia" w:hAnsi="Georgia"/>
+          <w:color w:val="333333"/>
+          <w:sz w:val="17"/>
+          <w:szCs w:val="17"/>
+        </w:rPr>
+        <w:t xml:space="preserve">Nicht gleich klicken. Jede Figur sagt einen Satz: „Kill him, because …“ / „Let him go, because …“ — die Entscheidung gehört allen drei</w:t>
       </w:r>
     </w:p>
     <w:p>
@@ -15845,127 +15693,37 @@
           <w:sz w:val="16"/>
           <w:szCs w:val="16"/>
         </w:rPr>
-        <w:t xml:space="preserve">WENN … DANN (NUR DM)  </w:t>
-      </w:r>
-    </w:p>
-    <w:p>
-      <w:pPr>
-        <w:pBdr>
-          <w:left w:val="single" w:color="BFBFBF" w:sz="18" w:space="8"/>
-        </w:pBdr>
-        <w:shd w:fill="F2F2F2" w:color="auto" w:val="clear"/>
-        <w:spacing w:after="40"/>
-        <w:ind w:left="120"/>
-      </w:pPr>
-      <w:r>
-        <w:rPr>
-          <w:rFonts w:ascii="Georgia" w:cs="Georgia" w:eastAsia="Georgia" w:hAnsi="Georgia"/>
-          <w:b/>
-          <w:bCs/>
-          <w:color w:val="333333"/>
-          <w:sz w:val="17"/>
-          <w:szCs w:val="17"/>
-        </w:rPr>
-        <w:t xml:space="preserve">Nur bei: Tür C · Küche, „Mitnahme zugesagt“ — Versprechen gehalten  →  </w:t>
-      </w:r>
-      <w:r>
-        <w:rPr>
-          <w:rFonts w:ascii="Georgia" w:cs="Georgia" w:eastAsia="Georgia" w:hAnsi="Georgia"/>
-          <w:color w:val="333333"/>
-          <w:sz w:val="17"/>
-          <w:szCs w:val="17"/>
-        </w:rPr>
-        <w:t xml:space="preserve">Tam kocht ab heute im Wirtshaus</w:t>
-      </w:r>
-    </w:p>
-    <w:p>
-      <w:pPr>
-        <w:pBdr>
-          <w:left w:val="single" w:color="BFBFBF" w:sz="18" w:space="8"/>
-        </w:pBdr>
-        <w:shd w:fill="F2F2F2" w:color="auto" w:val="clear"/>
-        <w:spacing w:after="40"/>
-        <w:ind w:left="120"/>
-      </w:pPr>
-      <w:r>
-        <w:rPr>
-          <w:rFonts w:ascii="Georgia" w:cs="Georgia" w:eastAsia="Georgia" w:hAnsi="Georgia"/>
-          <w:b/>
-          <w:bCs/>
-          <w:color w:val="333333"/>
-          <w:sz w:val="17"/>
-          <w:szCs w:val="17"/>
-        </w:rPr>
-        <w:t xml:space="preserve">Nur bei: Tür C · Küche, „Mitnahme zugesagt“ — Versprechen gebrochen  →  </w:t>
-      </w:r>
-      <w:r>
-        <w:rPr>
-          <w:rFonts w:ascii="Georgia" w:cs="Georgia" w:eastAsia="Georgia" w:hAnsi="Georgia"/>
-          <w:color w:val="333333"/>
-          <w:sz w:val="17"/>
-          <w:szCs w:val="17"/>
-        </w:rPr>
-        <w:t xml:space="preserve">beiläufig sagen, ohne Vorwurf</w:t>
-      </w:r>
-    </w:p>
-    <w:p>
-      <w:pPr>
-        <w:pBdr>
-          <w:left w:val="single" w:color="BFBFBF" w:sz="18" w:space="8"/>
-        </w:pBdr>
-        <w:shd w:fill="F2F2F2" w:color="auto" w:val="clear"/>
-        <w:spacing w:after="40"/>
-        <w:ind w:left="120"/>
-      </w:pPr>
-      <w:r>
-        <w:rPr>
-          <w:rFonts w:ascii="Georgia" w:cs="Georgia" w:eastAsia="Georgia" w:hAnsi="Georgia"/>
-          <w:b/>
-          <w:bCs/>
-          <w:color w:val="333333"/>
-          <w:sz w:val="17"/>
-          <w:szCs w:val="17"/>
-        </w:rPr>
-        <w:t xml:space="preserve">Nur bei: Tür A · Bibliothek, „Ja — er führt euch“ — Brief eingeworfen  →  </w:t>
-      </w:r>
-      <w:r>
-        <w:rPr>
-          <w:rFonts w:ascii="Georgia" w:cs="Georgia" w:eastAsia="Georgia" w:hAnsi="Georgia"/>
-          <w:color w:val="333333"/>
-          <w:sz w:val="17"/>
-          <w:szCs w:val="17"/>
-        </w:rPr>
-        <w:t xml:space="preserve">nach zwei Wochen eine Antwort im Gepäck</w:t>
-      </w:r>
-    </w:p>
-    <w:p>
-      <w:pPr>
-        <w:pBdr>
-          <w:left w:val="single" w:color="BFBFBF" w:sz="18" w:space="8"/>
-        </w:pBdr>
-        <w:shd w:fill="F2F2F2" w:color="auto" w:val="clear"/>
-        <w:spacing w:after="40"/>
-        <w:ind w:left="120"/>
-      </w:pPr>
-      <w:r>
-        <w:rPr>
-          <w:rFonts w:ascii="Georgia" w:cs="Georgia" w:eastAsia="Georgia" w:hAnsi="Georgia"/>
-          <w:b/>
-          <w:bCs/>
-          <w:color w:val="333333"/>
-          <w:sz w:val="17"/>
-          <w:szCs w:val="17"/>
-        </w:rPr>
-        <w:t xml:space="preserve">Alle wollen dasselbe  →  </w:t>
-      </w:r>
-      <w:r>
-        <w:rPr>
-          <w:rFonts w:ascii="Georgia" w:cs="Georgia" w:eastAsia="Georgia" w:hAnsi="Georgia"/>
-          <w:color w:val="333333"/>
-          <w:sz w:val="17"/>
-          <w:szCs w:val="17"/>
-        </w:rPr>
-        <w:t xml:space="preserve">Karte klicken, Schlusstext vorlesen, fertig</w:t>
+        <w:t xml:space="preserve">TIPPS (NUR DM)  </w:t>
+      </w:r>
+    </w:p>
+    <w:p>
+      <w:pPr>
+        <w:pBdr>
+          <w:left w:val="single" w:color="BFBFBF" w:sz="18" w:space="8"/>
+        </w:pBdr>
+        <w:shd w:fill="F2F2F2" w:color="auto" w:val="clear"/>
+        <w:spacing w:after="40"/>
+        <w:ind w:left="120"/>
+      </w:pPr>
+      <w:r>
+        <w:rPr>
+          <w:rFonts w:ascii="Georgia" w:cs="Georgia" w:eastAsia="Georgia" w:hAnsi="Georgia"/>
+          <w:b/>
+          <w:bCs/>
+          <w:color w:val="333333"/>
+          <w:sz w:val="17"/>
+          <w:szCs w:val="17"/>
+        </w:rPr>
+        <w:t xml:space="preserve">„I want that we stay.“  →  </w:t>
+      </w:r>
+      <w:r>
+        <w:rPr>
+          <w:rFonts w:ascii="Georgia" w:cs="Georgia" w:eastAsia="Georgia" w:hAnsi="Georgia"/>
+          <w:color w:val="333333"/>
+          <w:sz w:val="17"/>
+          <w:szCs w:val="17"/>
+        </w:rPr>
+        <w:t xml:space="preserve">„I want to stay.“ oder „I want us to stay.“ — want that gibt es nicht</w:t>
       </w:r>
     </w:p>
     <w:p>
@@ -15995,7 +15753,7 @@
           <w:sz w:val="17"/>
           <w:szCs w:val="17"/>
         </w:rPr>
-        <w:t xml:space="preserve">auch gut — klick, was die Mehrheit will, und lass die anderen ihren Satz trotzdem sagen</w:t>
+        <w:t xml:space="preserve">Auch gut — klick, was die Mehrheit will, und lass die anderen ihren Satz trotzdem sagen</w:t>
       </w:r>
     </w:p>
     <w:p>
@@ -16016,16 +15774,16 @@
           <w:sz w:val="17"/>
           <w:szCs w:val="17"/>
         </w:rPr>
-        <w:t xml:space="preserve">Jemand sagt nur ein Wort  →  </w:t>
-      </w:r>
-      <w:r>
-        <w:rPr>
-          <w:rFonts w:ascii="Georgia" w:cs="Georgia" w:eastAsia="Georgia" w:hAnsi="Georgia"/>
-          <w:color w:val="333333"/>
-          <w:sz w:val="17"/>
-          <w:szCs w:val="17"/>
-        </w:rPr>
-        <w:t xml:space="preserve">„That’s not an answer. Why?“ — die letzte Sprechübung des Abends</w:t>
+        <w:t xml:space="preserve">Jemand fragt, was aus einer Figur wurde  →  </w:t>
+      </w:r>
+      <w:r>
+        <w:rPr>
+          <w:rFonts w:ascii="Georgia" w:cs="Georgia" w:eastAsia="Georgia" w:hAnsi="Georgia"/>
+          <w:color w:val="333333"/>
+          <w:sz w:val="17"/>
+          <w:szCs w:val="17"/>
+        </w:rPr>
+        <w:t xml:space="preserve">Zurückfragen: „What do you think happened to her?“ — und die Antwort als wahr nehmen</w:t>
       </w:r>
     </w:p>
     <w:p>
@@ -16330,67 +16088,37 @@
           <w:sz w:val="16"/>
           <w:szCs w:val="16"/>
         </w:rPr>
-        <w:t xml:space="preserve">WENN … DANN (NUR DM)  </w:t>
-      </w:r>
-    </w:p>
-    <w:p>
-      <w:pPr>
-        <w:pBdr>
-          <w:left w:val="single" w:color="BFBFBF" w:sz="18" w:space="8"/>
-        </w:pBdr>
-        <w:shd w:fill="F2F2F2" w:color="auto" w:val="clear"/>
-        <w:spacing w:after="40"/>
-        <w:ind w:left="120"/>
-      </w:pPr>
-      <w:r>
-        <w:rPr>
-          <w:rFonts w:ascii="Georgia" w:cs="Georgia" w:eastAsia="Georgia" w:hAnsi="Georgia"/>
-          <w:b/>
-          <w:bCs/>
-          <w:color w:val="333333"/>
-          <w:sz w:val="17"/>
-          <w:szCs w:val="17"/>
-        </w:rPr>
-        <w:t xml:space="preserve">Der Hund ist gefallen und die Wachen stehen bei der Hälfte  →  </w:t>
-      </w:r>
-      <w:r>
-        <w:rPr>
-          <w:rFonts w:ascii="Georgia" w:cs="Georgia" w:eastAsia="Georgia" w:hAnsi="Georgia"/>
-          <w:color w:val="333333"/>
-          <w:sz w:val="17"/>
-          <w:szCs w:val="17"/>
-        </w:rPr>
-        <w:t xml:space="preserve">sie ziehen sich zurück: „They don’t want to die for him.“</w:t>
-      </w:r>
-    </w:p>
-    <w:p>
-      <w:pPr>
-        <w:pBdr>
-          <w:left w:val="single" w:color="BFBFBF" w:sz="18" w:space="8"/>
-        </w:pBdr>
-        <w:shd w:fill="F2F2F2" w:color="auto" w:val="clear"/>
-        <w:spacing w:after="40"/>
-        <w:ind w:left="120"/>
-      </w:pPr>
-      <w:r>
-        <w:rPr>
-          <w:rFonts w:ascii="Georgia" w:cs="Georgia" w:eastAsia="Georgia" w:hAnsi="Georgia"/>
-          <w:b/>
-          <w:bCs/>
-          <w:color w:val="333333"/>
-          <w:sz w:val="17"/>
-          <w:szCs w:val="17"/>
-        </w:rPr>
-        <w:t xml:space="preserve">Jemand redet mit den Wachen  →  </w:t>
-      </w:r>
-      <w:r>
-        <w:rPr>
-          <w:rFonts w:ascii="Georgia" w:cs="Georgia" w:eastAsia="Georgia" w:hAnsi="Georgia"/>
-          <w:color w:val="333333"/>
-          <w:sz w:val="17"/>
-          <w:szCs w:val="17"/>
-        </w:rPr>
-        <w:t xml:space="preserve">keine Antwort — sie haben Befehle</w:t>
+        <w:t xml:space="preserve">TIPPS (NUR DM)  </w:t>
+      </w:r>
+    </w:p>
+    <w:p>
+      <w:pPr>
+        <w:pBdr>
+          <w:left w:val="single" w:color="BFBFBF" w:sz="18" w:space="8"/>
+        </w:pBdr>
+        <w:shd w:fill="F2F2F2" w:color="auto" w:val="clear"/>
+        <w:spacing w:after="40"/>
+        <w:ind w:left="120"/>
+      </w:pPr>
+      <w:r>
+        <w:rPr>
+          <w:rFonts w:ascii="Georgia" w:cs="Georgia" w:eastAsia="Georgia" w:hAnsi="Georgia"/>
+          <w:b/>
+          <w:bCs/>
+          <w:color w:val="333333"/>
+          <w:sz w:val="17"/>
+          <w:szCs w:val="17"/>
+        </w:rPr>
+        <w:t xml:space="preserve">Jemand ruft „Attention!“  →  </w:t>
+      </w:r>
+      <w:r>
+        <w:rPr>
+          <w:rFonts w:ascii="Georgia" w:cs="Georgia" w:eastAsia="Georgia" w:hAnsi="Georgia"/>
+          <w:color w:val="333333"/>
+          <w:sz w:val="17"/>
+          <w:szCs w:val="17"/>
+        </w:rPr>
+        <w:t xml:space="preserve">„Watch out!“ oder „Look out!“ — attention heisst Aufmerksamkeit</w:t>
       </w:r>
     </w:p>
     <w:p>
@@ -16411,16 +16139,16 @@
           <w:sz w:val="17"/>
           <w:szCs w:val="17"/>
         </w:rPr>
-        <w:t xml:space="preserve">Die Patrouille ist vorbei  →  </w:t>
-      </w:r>
-      <w:r>
-        <w:rPr>
-          <w:rFonts w:ascii="Georgia" w:cs="Georgia" w:eastAsia="Georgia" w:hAnsi="Georgia"/>
-          <w:color w:val="333333"/>
-          <w:sz w:val="17"/>
-          <w:szCs w:val="17"/>
-        </w:rPr>
-        <w:t xml:space="preserve">„Zurück zur Geschichte“ — die Lightbearer heilt alle</w:t>
+        <w:t xml:space="preserve">Sie verteilen die Aufgaben auf Deutsch  →  </w:t>
+      </w:r>
+      <w:r>
+        <w:rPr>
+          <w:rFonts w:ascii="Georgia" w:cs="Georgia" w:eastAsia="Georgia" w:hAnsi="Georgia"/>
+          <w:color w:val="333333"/>
+          <w:sz w:val="17"/>
+          <w:szCs w:val="17"/>
+        </w:rPr>
+        <w:t xml:space="preserve">Gib drei Sätze vor: „I’ll take the hound.“ — „Stay behind me.“ — „Cover the healer!“</w:t>
       </w:r>
     </w:p>
     <w:p>

</xml_diff>

<commit_message>
Tipps: Spielleitung statt Sprachkorrektur
Die rechte Spalte gibt jetzt Hinweise zum Spielverlauf — was nicht
verraten wird, wo Tempo nötig ist, wann geschwiegen wird — statt
Grammatik- und Wortschatzkorrekturen.

Co-Authored-By: Claude Opus 5.5 <noreply@anthropic.com>
Claude-Session: https://claude.ai/code/session_01ADUPP2jvP6dgTYk1DsQkUN
</commit_message>
<xml_diff>
--- a/helferblatt/Nachtfels_Lesetext_DM.docx
+++ b/helferblatt/Nachtfels_Lesetext_DM.docx
@@ -186,7 +186,7 @@
           <w:szCs w:val="18"/>
         </w:rPr>
         <w:t xml:space="preserve">1 · Gold lesen. Englische Erzählung und Figurenrede — wörtlich. 2 · Grün fragen. Jede Figur äussert eine eigene Absicht oder Frage und danach einen Grund oder eine Reaktion. 3 · Ergebnis klicken. Nur markieren, was am Tisch passiert ist — Antworten abhaken, Entscheidungen anklicken.
- Rechts neben dem Text stehen die Tipps auf der Höhe der Stelle, zu der sie gehören: typische Stolpersteine genau dort und was du dann sagst. Unten steht immer, wann es weitergeht. Die Gefahr stellst du an der Säule rechts ein — die Lasche ‹ GEFAHR klappt die Knöpfe heraus: 0–3 ruhig, 4–7 du darfst in einem Kampf einen Gegner dazunehmen, 8–10 eine Patrouille vor dem nächsten Akt.</w:t>
+ Rechts neben dem Text stehen die Tipps auf der Höhe der Stelle, zu der sie gehören: was du dort besser nicht verrätst, wo du Tempo machst, wann du schweigst. Unten steht immer, wann es weitergeht. Die Gefahr stellst du an der Säule rechts ein — die Lasche ‹ GEFAHR klappt die Knöpfe heraus: 0–3 ruhig, 4–7 du darfst in einem Kampf einen Gegner dazunehmen, 8–10 eine Patrouille vor dem nächsten Akt.</w:t>
       </w:r>
     </w:p>
     <w:p>
@@ -648,16 +648,16 @@
           <w:sz w:val="17"/>
           <w:szCs w:val="17"/>
         </w:rPr>
-        <w:t xml:space="preserve">Ein Fehler, der das Verständnis nicht stört  →  </w:t>
-      </w:r>
-      <w:r>
-        <w:rPr>
-          <w:rFonts w:ascii="Georgia" w:cs="Georgia" w:eastAsia="Georgia" w:hAnsi="Georgia"/>
-          <w:color w:val="333333"/>
-          <w:sz w:val="17"/>
-          <w:szCs w:val="17"/>
-        </w:rPr>
-        <w:t xml:space="preserve">Nicht korrigieren. Als Figur richtig zurückgeben: „You went up there alone? Brave.“ — nie „No: went!“</w:t>
+        <w:t xml:space="preserve">Die Gruppe fragt nach der richtigen Lösung  →  </w:t>
+      </w:r>
+      <w:r>
+        <w:rPr>
+          <w:rFonts w:ascii="Georgia" w:cs="Georgia" w:eastAsia="Georgia" w:hAnsi="Georgia"/>
+          <w:color w:val="333333"/>
+          <w:sz w:val="17"/>
+          <w:szCs w:val="17"/>
+        </w:rPr>
+        <w:t xml:space="preserve">Es gibt keine — jeder Weg führt ans Ende, jeder kostet etwas anderes. Sag das ruhig so</w:t>
       </w:r>
     </w:p>
     <w:p>
@@ -678,16 +678,16 @@
           <w:sz w:val="17"/>
           <w:szCs w:val="17"/>
         </w:rPr>
-        <w:t xml:space="preserve">Du willst trotzdem etwas festhalten  →  </w:t>
-      </w:r>
-      <w:r>
-        <w:rPr>
-          <w:rFonts w:ascii="Georgia" w:cs="Georgia" w:eastAsia="Georgia" w:hAnsi="Georgia"/>
-          <w:color w:val="333333"/>
-          <w:sz w:val="17"/>
-          <w:szCs w:val="17"/>
-        </w:rPr>
-        <w:t xml:space="preserve">Nach der Szene, ein Satz, als Geschenk: „New phrase for you: …“ — höchstens einer pro Seite</w:t>
+        <w:t xml:space="preserve">Eine Idee steht nirgends  →  </w:t>
+      </w:r>
+      <w:r>
+        <w:rPr>
+          <w:rFonts w:ascii="Georgia" w:cs="Georgia" w:eastAsia="Georgia" w:hAnsi="Georgia"/>
+          <w:color w:val="333333"/>
+          <w:sz w:val="17"/>
+          <w:szCs w:val="17"/>
+        </w:rPr>
+        <w:t xml:space="preserve">Im Zweifel ja — und dafür kostet es etwas (Zeit, Gefahr +1). Ein Nein hält das Spiel an</w:t>
       </w:r>
     </w:p>
     <w:p>
@@ -1718,76 +1718,76 @@
           <w:sz w:val="17"/>
           <w:szCs w:val="17"/>
         </w:rPr>
-        <w:t xml:space="preserve">„I mean, they are afraid.“  →  </w:t>
-      </w:r>
-      <w:r>
-        <w:rPr>
-          <w:rFonts w:ascii="Georgia" w:cs="Georgia" w:eastAsia="Georgia" w:hAnsi="Georgia"/>
-          <w:color w:val="333333"/>
-          <w:sz w:val="17"/>
-          <w:szCs w:val="17"/>
-        </w:rPr>
-        <w:t xml:space="preserve">„I mean“ heisst „ich will sagen“. Für eine Meinung: „I think …“ oder „Maybe …“ — kurz vorsprechen, weiter</w:t>
-      </w:r>
-    </w:p>
-    <w:p>
-      <w:pPr>
-        <w:pBdr>
-          <w:left w:val="single" w:color="BFBFBF" w:sz="18" w:space="8"/>
-        </w:pBdr>
-        <w:shd w:fill="F2F2F2" w:color="auto" w:val="clear"/>
-        <w:spacing w:after="40"/>
-        <w:ind w:left="120"/>
-      </w:pPr>
-      <w:r>
-        <w:rPr>
-          <w:rFonts w:ascii="Georgia" w:cs="Georgia" w:eastAsia="Georgia" w:hAnsi="Georgia"/>
-          <w:b/>
-          <w:bCs/>
-          <w:color w:val="333333"/>
-          <w:sz w:val="17"/>
-          <w:szCs w:val="17"/>
-        </w:rPr>
-        <w:t xml:space="preserve">„I have fifteen years.“  →  </w:t>
-      </w:r>
-      <w:r>
-        <w:rPr>
-          <w:rFonts w:ascii="Georgia" w:cs="Georgia" w:eastAsia="Georgia" w:hAnsi="Georgia"/>
-          <w:color w:val="333333"/>
-          <w:sz w:val="17"/>
-          <w:szCs w:val="17"/>
-        </w:rPr>
-        <w:t xml:space="preserve">„I’m fifteen.“ — Alter immer mit be. Marek gibt es richtig zurück: „Fifteen? And already hunting vampires.“</w:t>
-      </w:r>
-    </w:p>
-    <w:p>
-      <w:pPr>
-        <w:pBdr>
-          <w:left w:val="single" w:color="BFBFBF" w:sz="18" w:space="8"/>
-        </w:pBdr>
-        <w:shd w:fill="F2F2F2" w:color="auto" w:val="clear"/>
-        <w:spacing w:after="40"/>
-        <w:ind w:left="120"/>
-      </w:pPr>
-      <w:r>
-        <w:rPr>
-          <w:rFonts w:ascii="Georgia" w:cs="Georgia" w:eastAsia="Georgia" w:hAnsi="Georgia"/>
-          <w:b/>
-          <w:bCs/>
-          <w:color w:val="333333"/>
-          <w:sz w:val="17"/>
-          <w:szCs w:val="17"/>
-        </w:rPr>
-        <w:t xml:space="preserve">„We are hunters since two years.“  →  </w:t>
-      </w:r>
-      <w:r>
-        <w:rPr>
-          <w:rFonts w:ascii="Georgia" w:cs="Georgia" w:eastAsia="Georgia" w:hAnsi="Georgia"/>
-          <w:color w:val="333333"/>
-          <w:sz w:val="17"/>
-          <w:szCs w:val="17"/>
-        </w:rPr>
-        <w:t xml:space="preserve">„We’ve been hunters for two years.“ — since nur mit Zeitpunkt (since June), for mit Dauer. Marek fragt einfach nach: „For two years? Hm.“</w:t>
+        <w:t xml:space="preserve">Eine Vermutung trifft ins Schwarze  →  </w:t>
+      </w:r>
+      <w:r>
+        <w:rPr>
+          <w:rFonts w:ascii="Georgia" w:cs="Georgia" w:eastAsia="Georgia" w:hAnsi="Georgia"/>
+          <w:color w:val="333333"/>
+          <w:sz w:val="17"/>
+          <w:szCs w:val="17"/>
+        </w:rPr>
+        <w:t xml:space="preserve">Kein Zeichen geben, auch kein Lächeln. Aber merk sie dir — im Wirtshaus: „Someone guessed this in the carriage.“</w:t>
+      </w:r>
+    </w:p>
+    <w:p>
+      <w:pPr>
+        <w:pBdr>
+          <w:left w:val="single" w:color="BFBFBF" w:sz="18" w:space="8"/>
+        </w:pBdr>
+        <w:shd w:fill="F2F2F2" w:color="auto" w:val="clear"/>
+        <w:spacing w:after="40"/>
+        <w:ind w:left="120"/>
+      </w:pPr>
+      <w:r>
+        <w:rPr>
+          <w:rFonts w:ascii="Georgia" w:cs="Georgia" w:eastAsia="Georgia" w:hAnsi="Georgia"/>
+          <w:b/>
+          <w:bCs/>
+          <w:color w:val="333333"/>
+          <w:sz w:val="17"/>
+          <w:szCs w:val="17"/>
+        </w:rPr>
+        <w:t xml:space="preserve">Vor Mareks Frage  →  </w:t>
+      </w:r>
+      <w:r>
+        <w:rPr>
+          <w:rFonts w:ascii="Georgia" w:cs="Georgia" w:eastAsia="Georgia" w:hAnsi="Georgia"/>
+          <w:color w:val="333333"/>
+          <w:sz w:val="17"/>
+          <w:szCs w:val="17"/>
+        </w:rPr>
+        <w:t xml:space="preserve">Nach „The driver does not slow down“ zwei Sekunden Stille. Die Pause macht den Wald unheimlich, nicht der Text</w:t>
+      </w:r>
+    </w:p>
+    <w:p>
+      <w:pPr>
+        <w:pBdr>
+          <w:left w:val="single" w:color="BFBFBF" w:sz="18" w:space="8"/>
+        </w:pBdr>
+        <w:shd w:fill="F2F2F2" w:color="auto" w:val="clear"/>
+        <w:spacing w:after="40"/>
+        <w:ind w:left="120"/>
+      </w:pPr>
+      <w:r>
+        <w:rPr>
+          <w:rFonts w:ascii="Georgia" w:cs="Georgia" w:eastAsia="Georgia" w:hAnsi="Georgia"/>
+          <w:b/>
+          <w:bCs/>
+          <w:color w:val="333333"/>
+          <w:sz w:val="17"/>
+          <w:szCs w:val="17"/>
+        </w:rPr>
+        <w:t xml:space="preserve">Wen Marek zuerst ansieht  →  </w:t>
+      </w:r>
+      <w:r>
+        <w:rPr>
+          <w:rFonts w:ascii="Georgia" w:cs="Georgia" w:eastAsia="Georgia" w:hAnsi="Georgia"/>
+          <w:color w:val="333333"/>
+          <w:sz w:val="17"/>
+          <w:szCs w:val="17"/>
+        </w:rPr>
+        <w:t xml:space="preserve">Nicht den Lautesten. Er nennt die Figur, die am weitesten hinten sitzt — so kommen alle drei dran</w:t>
       </w:r>
     </w:p>
     <w:p>
@@ -1808,16 +1808,16 @@
           <w:sz w:val="17"/>
           <w:szCs w:val="17"/>
         </w:rPr>
-        <w:t xml:space="preserve">Jemand erfindet etwas Wildes über sich  →  </w:t>
-      </w:r>
-      <w:r>
-        <w:rPr>
-          <w:rFonts w:ascii="Georgia" w:cs="Georgia" w:eastAsia="Georgia" w:hAnsi="Georgia"/>
-          <w:color w:val="333333"/>
-          <w:sz w:val="17"/>
-          <w:szCs w:val="17"/>
-        </w:rPr>
-        <w:t xml:space="preserve">Gelten lassen — Marek glaubt kein Wort und fragt genau deshalb weiter. Erfinden ist Sprechen</w:t>
+        <w:t xml:space="preserve">Die Ankunft  →  </w:t>
+      </w:r>
+      <w:r>
+        <w:rPr>
+          <w:rFonts w:ascii="Georgia" w:cs="Georgia" w:eastAsia="Georgia" w:hAnsi="Georgia"/>
+          <w:color w:val="333333"/>
+          <w:sz w:val="17"/>
+          <w:szCs w:val="17"/>
+        </w:rPr>
+        <w:t xml:space="preserve">Zügig durchlesen, ohne Rückfragen bis zum Schloss. Das eine Licht im Fenster ist das Bild, das sie mitnehmen sollen</w:t>
       </w:r>
     </w:p>
     <w:p>
@@ -2912,46 +2912,46 @@
           <w:sz w:val="17"/>
           <w:szCs w:val="17"/>
         </w:rPr>
-        <w:t xml:space="preserve">„Why nobody looks for her?“  →  </w:t>
-      </w:r>
-      <w:r>
-        <w:rPr>
-          <w:rFonts w:ascii="Georgia" w:cs="Georgia" w:eastAsia="Georgia" w:hAnsi="Georgia"/>
-          <w:color w:val="333333"/>
-          <w:sz w:val="17"/>
-          <w:szCs w:val="17"/>
-        </w:rPr>
-        <w:t xml:space="preserve">Nicht verbessern — Greta sieht fragend: „Sorry?“ Meist kommt die Frage dann richtig. Sonst vorsprechen: „Why is nobody looking for her?“</w:t>
-      </w:r>
-    </w:p>
-    <w:p>
-      <w:pPr>
-        <w:pBdr>
-          <w:left w:val="single" w:color="BFBFBF" w:sz="18" w:space="8"/>
-        </w:pBdr>
-        <w:shd w:fill="F2F2F2" w:color="auto" w:val="clear"/>
-        <w:spacing w:after="40"/>
-        <w:ind w:left="120"/>
-      </w:pPr>
-      <w:r>
-        <w:rPr>
-          <w:rFonts w:ascii="Georgia" w:cs="Georgia" w:eastAsia="Georgia" w:hAnsi="Georgia"/>
-          <w:b/>
-          <w:bCs/>
-          <w:color w:val="333333"/>
-          <w:sz w:val="17"/>
-          <w:szCs w:val="17"/>
-        </w:rPr>
-        <w:t xml:space="preserve">„Can you say me the way?“  →  </w:t>
-      </w:r>
-      <w:r>
-        <w:rPr>
-          <w:rFonts w:ascii="Georgia" w:cs="Georgia" w:eastAsia="Georgia" w:hAnsi="Georgia"/>
-          <w:color w:val="333333"/>
-          <w:sz w:val="17"/>
-          <w:szCs w:val="17"/>
-        </w:rPr>
-        <w:t xml:space="preserve">„Can you tell me …?“ — say me gibt es nicht. Greta darf es beiläufig richtig nehmen: „Tell you? All right.“</w:t>
+        <w:t xml:space="preserve">Pieters Anneke-Satz  →  </w:t>
+      </w:r>
+      <w:r>
+        <w:rPr>
+          <w:rFonts w:ascii="Georgia" w:cs="Georgia" w:eastAsia="Georgia" w:hAnsi="Georgia"/>
+          <w:color w:val="333333"/>
+          <w:sz w:val="17"/>
+          <w:szCs w:val="17"/>
+        </w:rPr>
+        <w:t xml:space="preserve">Laut und schlecht getimt — mitten in eine andere Antwort hinein. Danach schweigt der ganze Raum einen Moment</w:t>
+      </w:r>
+    </w:p>
+    <w:p>
+      <w:pPr>
+        <w:pBdr>
+          <w:left w:val="single" w:color="BFBFBF" w:sz="18" w:space="8"/>
+        </w:pBdr>
+        <w:shd w:fill="F2F2F2" w:color="auto" w:val="clear"/>
+        <w:spacing w:after="40"/>
+        <w:ind w:left="120"/>
+      </w:pPr>
+      <w:r>
+        <w:rPr>
+          <w:rFonts w:ascii="Georgia" w:cs="Georgia" w:eastAsia="Georgia" w:hAnsi="Georgia"/>
+          <w:b/>
+          <w:bCs/>
+          <w:color w:val="333333"/>
+          <w:sz w:val="17"/>
+          <w:szCs w:val="17"/>
+        </w:rPr>
+        <w:t xml:space="preserve">Sie fragen Greta nach Anneke  →  </w:t>
+      </w:r>
+      <w:r>
+        <w:rPr>
+          <w:rFonts w:ascii="Georgia" w:cs="Georgia" w:eastAsia="Georgia" w:hAnsi="Georgia"/>
+          <w:color w:val="333333"/>
+          <w:sz w:val="17"/>
+          <w:szCs w:val="17"/>
+        </w:rPr>
+        <w:t xml:space="preserve">Greta antwortet nicht, sie wischt die Theke. Das Schweigen ist die Antwort — nicht auflösen</w:t>
       </w:r>
     </w:p>
     <w:p>
@@ -2972,16 +2972,16 @@
           <w:sz w:val="17"/>
           <w:szCs w:val="17"/>
         </w:rPr>
-        <w:t xml:space="preserve">Alle reden nur mit Greta  →  </w:t>
-      </w:r>
-      <w:r>
-        <w:rPr>
-          <w:rFonts w:ascii="Georgia" w:cs="Georgia" w:eastAsia="Georgia" w:hAnsi="Georgia"/>
-          <w:color w:val="333333"/>
-          <w:sz w:val="17"/>
-          <w:szCs w:val="17"/>
-        </w:rPr>
-        <w:t xml:space="preserve">Pieter lacht laut in ihre Frage hinein, Tobias räuspert sich an der Tür — ein Blick zu den beiden genügt, die anderen Figuren gehen hin</w:t>
+        <w:t xml:space="preserve">Die Karte liegt da  →  </w:t>
+      </w:r>
+      <w:r>
+        <w:rPr>
+          <w:rFonts w:ascii="Georgia" w:cs="Georgia" w:eastAsia="Georgia" w:hAnsi="Georgia"/>
+          <w:color w:val="333333"/>
+          <w:sz w:val="17"/>
+          <w:szCs w:val="17"/>
+        </w:rPr>
+        <w:t xml:space="preserve">Nur hinlegen, nicht erklären. Die drei Wege kommen auf der nächsten Seite — hier genügt, dass sie sie ansehen</w:t>
       </w:r>
     </w:p>
     <w:p>
@@ -3490,46 +3490,46 @@
           <w:sz w:val="17"/>
           <w:szCs w:val="17"/>
         </w:rPr>
-        <w:t xml:space="preserve">„Because dangerous.“  →  </w:t>
-      </w:r>
-      <w:r>
-        <w:rPr>
-          <w:rFonts w:ascii="Georgia" w:cs="Georgia" w:eastAsia="Georgia" w:hAnsi="Georgia"/>
-          <w:color w:val="333333"/>
-          <w:sz w:val="17"/>
-          <w:szCs w:val="17"/>
-        </w:rPr>
-        <w:t xml:space="preserve">„Because it’s dangerous.“ — nach because kommt ein ganzer Satz mit Verb. Einmal nachsprechen lassen, dann weiter</w:t>
-      </w:r>
-    </w:p>
-    <w:p>
-      <w:pPr>
-        <w:pBdr>
-          <w:left w:val="single" w:color="BFBFBF" w:sz="18" w:space="8"/>
-        </w:pBdr>
-        <w:shd w:fill="F2F2F2" w:color="auto" w:val="clear"/>
-        <w:spacing w:after="40"/>
-        <w:ind w:left="120"/>
-      </w:pPr>
-      <w:r>
-        <w:rPr>
-          <w:rFonts w:ascii="Georgia" w:cs="Georgia" w:eastAsia="Georgia" w:hAnsi="Georgia"/>
-          <w:b/>
-          <w:bCs/>
-          <w:color w:val="333333"/>
-          <w:sz w:val="17"/>
-          <w:szCs w:val="17"/>
-        </w:rPr>
-        <w:t xml:space="preserve">„The mine is more safe.“  →  </w:t>
-      </w:r>
-      <w:r>
-        <w:rPr>
-          <w:rFonts w:ascii="Georgia" w:cs="Georgia" w:eastAsia="Georgia" w:hAnsi="Georgia"/>
-          <w:color w:val="333333"/>
-          <w:sz w:val="17"/>
-          <w:szCs w:val="17"/>
-        </w:rPr>
-        <w:t xml:space="preserve">„safer“ — kurze Adjektive mit -er: safer, faster, darker. Beiläufig zurück: „Safer, yes. But darker.“</w:t>
+        <w:t xml:space="preserve">Zwei sind dafür, einer dagegen  →  </w:t>
+      </w:r>
+      <w:r>
+        <w:rPr>
+          <w:rFonts w:ascii="Georgia" w:cs="Georgia" w:eastAsia="Georgia" w:hAnsi="Georgia"/>
+          <w:color w:val="333333"/>
+          <w:sz w:val="17"/>
+          <w:szCs w:val="17"/>
+        </w:rPr>
+        <w:t xml:space="preserve">Die Minderheit zuerst reden lassen, dann abstimmen. Wer überstimmt wird, soll wenigstens gehört worden sein</w:t>
+      </w:r>
+    </w:p>
+    <w:p>
+      <w:pPr>
+        <w:pBdr>
+          <w:left w:val="single" w:color="BFBFBF" w:sz="18" w:space="8"/>
+        </w:pBdr>
+        <w:shd w:fill="F2F2F2" w:color="auto" w:val="clear"/>
+        <w:spacing w:after="40"/>
+        <w:ind w:left="120"/>
+      </w:pPr>
+      <w:r>
+        <w:rPr>
+          <w:rFonts w:ascii="Georgia" w:cs="Georgia" w:eastAsia="Georgia" w:hAnsi="Georgia"/>
+          <w:b/>
+          <w:bCs/>
+          <w:color w:val="333333"/>
+          <w:sz w:val="17"/>
+          <w:szCs w:val="17"/>
+        </w:rPr>
+        <w:t xml:space="preserve">Sie fragen dich, welcher Weg der beste ist  →  </w:t>
+      </w:r>
+      <w:r>
+        <w:rPr>
+          <w:rFonts w:ascii="Georgia" w:cs="Georgia" w:eastAsia="Georgia" w:hAnsi="Georgia"/>
+          <w:color w:val="333333"/>
+          <w:sz w:val="17"/>
+          <w:szCs w:val="17"/>
+        </w:rPr>
+        <w:t xml:space="preserve">„I’m only the narrator.“ Nichts empfehlen — auch nicht mit dem Gesicht</w:t>
       </w:r>
     </w:p>
     <w:p>
@@ -3550,16 +3550,16 @@
           <w:sz w:val="17"/>
           <w:szCs w:val="17"/>
         </w:rPr>
-        <w:t xml:space="preserve">Sie fragen dich, welcher Weg der beste ist  →  </w:t>
-      </w:r>
-      <w:r>
-        <w:rPr>
-          <w:rFonts w:ascii="Georgia" w:cs="Georgia" w:eastAsia="Georgia" w:hAnsi="Georgia"/>
-          <w:color w:val="333333"/>
-          <w:sz w:val="17"/>
-          <w:szCs w:val="17"/>
-        </w:rPr>
-        <w:t xml:space="preserve">Nicht verraten: „I’m only the narrator. What would your character do?“ Keiner ist der richtige — alle drei führen in den Hof</w:t>
+        <w:t xml:space="preserve">Sie wählen die Kutsche  →  </w:t>
+      </w:r>
+      <w:r>
+        <w:rPr>
+          <w:rFonts w:ascii="Georgia" w:cs="Georgia" w:eastAsia="Georgia" w:hAnsi="Georgia"/>
+          <w:color w:val="333333"/>
+          <w:sz w:val="17"/>
+          <w:szCs w:val="17"/>
+        </w:rPr>
+        <w:t xml:space="preserve">Nicht warnen. Dass Corvin sie verrät, erfahren sie oben — genau das macht die Wahl zu einer Wahl</w:t>
       </w:r>
     </w:p>
     <w:p>
@@ -6020,136 +6020,136 @@
           <w:sz w:val="17"/>
           <w:szCs w:val="17"/>
         </w:rPr>
-        <w:t xml:space="preserve">Nur bei: Weg A · Strasse — „I help the wolf.“ — und nicht mehr  →  </w:t>
-      </w:r>
-      <w:r>
-        <w:rPr>
-          <w:rFonts w:ascii="Georgia" w:cs="Georgia" w:eastAsia="Georgia" w:hAnsi="Georgia"/>
-          <w:color w:val="333333"/>
-          <w:sz w:val="17"/>
-          <w:szCs w:val="17"/>
-        </w:rPr>
-        <w:t xml:space="preserve">„How? What do you do with your hands?“ Geholfen ist erst, was jemand beschreibt: „I open the trap, slowly.“</w:t>
-      </w:r>
-    </w:p>
-    <w:p>
-      <w:pPr>
-        <w:pBdr>
-          <w:left w:val="single" w:color="BFBFBF" w:sz="18" w:space="8"/>
-        </w:pBdr>
-        <w:shd w:fill="F2F2F2" w:color="auto" w:val="clear"/>
-        <w:spacing w:after="40"/>
-        <w:ind w:left="120"/>
-      </w:pPr>
-      <w:r>
-        <w:rPr>
-          <w:rFonts w:ascii="Georgia" w:cs="Georgia" w:eastAsia="Georgia" w:hAnsi="Georgia"/>
-          <w:b/>
-          <w:bCs/>
-          <w:color w:val="333333"/>
-          <w:sz w:val="17"/>
-          <w:szCs w:val="17"/>
-        </w:rPr>
-        <w:t xml:space="preserve">Nur bei: Weg A · Strasse — Im Kampf nur „I attack.“  →  </w:t>
-      </w:r>
-      <w:r>
-        <w:rPr>
-          <w:rFonts w:ascii="Georgia" w:cs="Georgia" w:eastAsia="Georgia" w:hAnsi="Georgia"/>
-          <w:color w:val="333333"/>
-          <w:sz w:val="17"/>
-          <w:szCs w:val="17"/>
-        </w:rPr>
-        <w:t xml:space="preserve">„With what? Where do you hit it?“ — erst der Satz, dann der Knopf. Der gelbe Satz auf dem Spielerblatt ist die Belohnung</w:t>
-      </w:r>
-    </w:p>
-    <w:p>
-      <w:pPr>
-        <w:pBdr>
-          <w:left w:val="single" w:color="BFBFBF" w:sz="18" w:space="8"/>
-        </w:pBdr>
-        <w:shd w:fill="F2F2F2" w:color="auto" w:val="clear"/>
-        <w:spacing w:after="40"/>
-        <w:ind w:left="120"/>
-      </w:pPr>
-      <w:r>
-        <w:rPr>
-          <w:rFonts w:ascii="Georgia" w:cs="Georgia" w:eastAsia="Georgia" w:hAnsi="Georgia"/>
-          <w:b/>
-          <w:bCs/>
-          <w:color w:val="333333"/>
-          <w:sz w:val="17"/>
-          <w:szCs w:val="17"/>
-        </w:rPr>
-        <w:t xml:space="preserve">Nur bei: Weg A · Strasse — „Help! I am stucked!“  →  </w:t>
-      </w:r>
-      <w:r>
-        <w:rPr>
-          <w:rFonts w:ascii="Georgia" w:cs="Georgia" w:eastAsia="Georgia" w:hAnsi="Georgia"/>
-          <w:color w:val="333333"/>
-          <w:sz w:val="17"/>
-          <w:szCs w:val="17"/>
-        </w:rPr>
-        <w:t xml:space="preserve">„I’m stuck!“ — ohne -ed. Als Hilfe reicht ein kurzer Satz: „Take my hand!“ — „Hold on to me!“</w:t>
-      </w:r>
-    </w:p>
-    <w:p>
-      <w:pPr>
-        <w:pBdr>
-          <w:left w:val="single" w:color="BFBFBF" w:sz="18" w:space="8"/>
-        </w:pBdr>
-        <w:shd w:fill="F2F2F2" w:color="auto" w:val="clear"/>
-        <w:spacing w:after="40"/>
-        <w:ind w:left="120"/>
-      </w:pPr>
-      <w:r>
-        <w:rPr>
-          <w:rFonts w:ascii="Georgia" w:cs="Georgia" w:eastAsia="Georgia" w:hAnsi="Georgia"/>
-          <w:b/>
-          <w:bCs/>
-          <w:color w:val="333333"/>
-          <w:sz w:val="17"/>
-          <w:szCs w:val="17"/>
-        </w:rPr>
-        <w:t xml:space="preserve">Nur bei: Weg A · Strasse — Sie planen auf Deutsch, „weil es leise sein muss“  →  </w:t>
-      </w:r>
-      <w:r>
-        <w:rPr>
-          <w:rFonts w:ascii="Georgia" w:cs="Georgia" w:eastAsia="Georgia" w:hAnsi="Georgia"/>
-          <w:color w:val="333333"/>
-          <w:sz w:val="17"/>
-          <w:szCs w:val="17"/>
-        </w:rPr>
-        <w:t xml:space="preserve">Flüstern geht auch auf Englisch. Gib vier Wörter vor: „Quiet!“ — „Wait.“ — „Now!“ — „Follow me.“</w:t>
-      </w:r>
-    </w:p>
-    <w:p>
-      <w:pPr>
-        <w:pBdr>
-          <w:left w:val="single" w:color="BFBFBF" w:sz="18" w:space="8"/>
-        </w:pBdr>
-        <w:shd w:fill="F2F2F2" w:color="auto" w:val="clear"/>
-        <w:spacing w:after="40"/>
-        <w:ind w:left="120"/>
-      </w:pPr>
-      <w:r>
-        <w:rPr>
-          <w:rFonts w:ascii="Georgia" w:cs="Georgia" w:eastAsia="Georgia" w:hAnsi="Georgia"/>
-          <w:b/>
-          <w:bCs/>
-          <w:color w:val="333333"/>
-          <w:sz w:val="17"/>
-          <w:szCs w:val="17"/>
-        </w:rPr>
-        <w:t xml:space="preserve">Nur bei: Weg B · Stollen — „We are invited from the Count.“  →  </w:t>
-      </w:r>
-      <w:r>
-        <w:rPr>
-          <w:rFonts w:ascii="Georgia" w:cs="Georgia" w:eastAsia="Georgia" w:hAnsi="Georgia"/>
-          <w:color w:val="333333"/>
-          <w:sz w:val="17"/>
-          <w:szCs w:val="17"/>
-        </w:rPr>
-        <w:t xml:space="preserve">„The Count invited us.“ — oder „invited by“. Die Wache darf es langsam wiederholen: „Invited. By the Count. I see.“</w:t>
+        <w:t xml:space="preserve">Nur bei: Weg A · Strasse — Niemand denkt an den verletzten Wolf  →  </w:t>
+      </w:r>
+      <w:r>
+        <w:rPr>
+          <w:rFonts w:ascii="Georgia" w:cs="Georgia" w:eastAsia="Georgia" w:hAnsi="Georgia"/>
+          <w:color w:val="333333"/>
+          <w:sz w:val="17"/>
+          <w:szCs w:val="17"/>
+        </w:rPr>
+        <w:t xml:space="preserve">Einmal erwähnen: „The small one is limping.“ Mehr nicht — die Idee muss von ihnen kommen</w:t>
+      </w:r>
+    </w:p>
+    <w:p>
+      <w:pPr>
+        <w:pBdr>
+          <w:left w:val="single" w:color="BFBFBF" w:sz="18" w:space="8"/>
+        </w:pBdr>
+        <w:shd w:fill="F2F2F2" w:color="auto" w:val="clear"/>
+        <w:spacing w:after="40"/>
+        <w:ind w:left="120"/>
+      </w:pPr>
+      <w:r>
+        <w:rPr>
+          <w:rFonts w:ascii="Georgia" w:cs="Georgia" w:eastAsia="Georgia" w:hAnsi="Georgia"/>
+          <w:b/>
+          <w:bCs/>
+          <w:color w:val="333333"/>
+          <w:sz w:val="17"/>
+          <w:szCs w:val="17"/>
+        </w:rPr>
+        <w:t xml:space="preserve">Nur bei: Weg A · Strasse — Der erste Kampf zieht sich  →  </w:t>
+      </w:r>
+      <w:r>
+        <w:rPr>
+          <w:rFonts w:ascii="Georgia" w:cs="Georgia" w:eastAsia="Georgia" w:hAnsi="Georgia"/>
+          <w:color w:val="333333"/>
+          <w:sz w:val="17"/>
+          <w:szCs w:val="17"/>
+        </w:rPr>
+        <w:t xml:space="preserve">Ein geflohener Wolf ist ein gewonnener Kampf. Nicht bis zum letzten Punkt ausspielen — die Zeit brauchst du oben</w:t>
+      </w:r>
+    </w:p>
+    <w:p>
+      <w:pPr>
+        <w:pBdr>
+          <w:left w:val="single" w:color="BFBFBF" w:sz="18" w:space="8"/>
+        </w:pBdr>
+        <w:shd w:fill="F2F2F2" w:color="auto" w:val="clear"/>
+        <w:spacing w:after="40"/>
+        <w:ind w:left="120"/>
+      </w:pPr>
+      <w:r>
+        <w:rPr>
+          <w:rFonts w:ascii="Georgia" w:cs="Georgia" w:eastAsia="Georgia" w:hAnsi="Georgia"/>
+          <w:b/>
+          <w:bCs/>
+          <w:color w:val="333333"/>
+          <w:sz w:val="17"/>
+          <w:szCs w:val="17"/>
+        </w:rPr>
+        <w:t xml:space="preserve">Nur bei: Weg A · Strasse — Alle kommen glatt durch  →  </w:t>
+      </w:r>
+      <w:r>
+        <w:rPr>
+          <w:rFonts w:ascii="Georgia" w:cs="Georgia" w:eastAsia="Georgia" w:hAnsi="Georgia"/>
+          <w:color w:val="333333"/>
+          <w:sz w:val="17"/>
+          <w:szCs w:val="17"/>
+        </w:rPr>
+        <w:t xml:space="preserve">Trotzdem einen Satz erzählen: ein Stiefel bleibt im Schlamm stecken. Sonst fühlt sich der Sumpf wie ein Formular an</w:t>
+      </w:r>
+    </w:p>
+    <w:p>
+      <w:pPr>
+        <w:pBdr>
+          <w:left w:val="single" w:color="BFBFBF" w:sz="18" w:space="8"/>
+        </w:pBdr>
+        <w:shd w:fill="F2F2F2" w:color="auto" w:val="clear"/>
+        <w:spacing w:after="40"/>
+        <w:ind w:left="120"/>
+      </w:pPr>
+      <w:r>
+        <w:rPr>
+          <w:rFonts w:ascii="Georgia" w:cs="Georgia" w:eastAsia="Georgia" w:hAnsi="Georgia"/>
+          <w:b/>
+          <w:bCs/>
+          <w:color w:val="333333"/>
+          <w:sz w:val="17"/>
+          <w:szCs w:val="17"/>
+        </w:rPr>
+        <w:t xml:space="preserve">Nur bei: Weg A · Strasse — Jemand hat einen Plan (Stein werfen, ablenken)  →  </w:t>
+      </w:r>
+      <w:r>
+        <w:rPr>
+          <w:rFonts w:ascii="Georgia" w:cs="Georgia" w:eastAsia="Georgia" w:hAnsi="Georgia"/>
+          <w:color w:val="333333"/>
+          <w:sz w:val="17"/>
+          <w:szCs w:val="17"/>
+        </w:rPr>
+        <w:t xml:space="preserve">Ein guter Plan ersetzt den Wurf: Wer ihn beschreibt, muss nicht würfeln. Pläne belohnen, nicht Glück</w:t>
+      </w:r>
+    </w:p>
+    <w:p>
+      <w:pPr>
+        <w:pBdr>
+          <w:left w:val="single" w:color="BFBFBF" w:sz="18" w:space="8"/>
+        </w:pBdr>
+        <w:shd w:fill="F2F2F2" w:color="auto" w:val="clear"/>
+        <w:spacing w:after="40"/>
+        <w:ind w:left="120"/>
+      </w:pPr>
+      <w:r>
+        <w:rPr>
+          <w:rFonts w:ascii="Georgia" w:cs="Georgia" w:eastAsia="Georgia" w:hAnsi="Georgia"/>
+          <w:b/>
+          <w:bCs/>
+          <w:color w:val="333333"/>
+          <w:sz w:val="17"/>
+          <w:szCs w:val="17"/>
+        </w:rPr>
+        <w:t xml:space="preserve">Nur bei: Weg B · Stollen — Die Wache spielen  →  </w:t>
+      </w:r>
+      <w:r>
+        <w:rPr>
+          <w:rFonts w:ascii="Georgia" w:cs="Georgia" w:eastAsia="Georgia" w:hAnsi="Georgia"/>
+          <w:color w:val="333333"/>
+          <w:sz w:val="17"/>
+          <w:szCs w:val="17"/>
+        </w:rPr>
+        <w:t xml:space="preserve">Er ist müde, nicht misstrauisch: husten, gähnen, zur Treppe schauen. Er will, dass es vorbei ist — lass ihn glauben wollen</w:t>
       </w:r>
     </w:p>
     <w:p>
@@ -6179,7 +6179,7 @@
           <w:sz w:val="17"/>
           <w:szCs w:val="17"/>
         </w:rPr>
-        <w:t xml:space="preserve">Sag nur „Yes. You noticed.“ — nicht erklären. Das Unheimliche wirkt, solange es niemand ausspricht</w:t>
+        <w:t xml:space="preserve">Nur „Yes. You noticed.“ — nicht erklären. Das Unheimliche wirkt, solange es niemand ausspricht</w:t>
       </w:r>
     </w:p>
     <w:p>
@@ -6200,16 +6200,16 @@
           <w:sz w:val="17"/>
           <w:szCs w:val="17"/>
         </w:rPr>
-        <w:t xml:space="preserve">Nur bei: Weg C · Kutsche — Jemand lügt Corvin an  →  </w:t>
-      </w:r>
-      <w:r>
-        <w:rPr>
-          <w:rFonts w:ascii="Georgia" w:cs="Georgia" w:eastAsia="Georgia" w:hAnsi="Georgia"/>
-          <w:color w:val="333333"/>
-          <w:sz w:val="17"/>
-          <w:szCs w:val="17"/>
-        </w:rPr>
-        <w:t xml:space="preserve">Mitspielen — Corvin glaubt alles und lächelt. Eine gute Lüge ist gutes Englisch</w:t>
+        <w:t xml:space="preserve">Nur bei: Weg C · Kutsche — Die Fahrt zieht sich  →  </w:t>
+      </w:r>
+      <w:r>
+        <w:rPr>
+          <w:rFonts w:ascii="Georgia" w:cs="Georgia" w:eastAsia="Georgia" w:hAnsi="Georgia"/>
+          <w:color w:val="333333"/>
+          <w:sz w:val="17"/>
+          <w:szCs w:val="17"/>
+        </w:rPr>
+        <w:t xml:space="preserve">Zwei Stunden Kutsche sind am Tisch zwei Minuten: drei Fragen von Corvin, dann ist das Tor da</w:t>
       </w:r>
     </w:p>
     <w:p>
@@ -7297,46 +7297,46 @@
           <w:sz w:val="17"/>
           <w:szCs w:val="17"/>
         </w:rPr>
-        <w:t xml:space="preserve">„I am agree with Lara.“  →  </w:t>
-      </w:r>
-      <w:r>
-        <w:rPr>
-          <w:rFonts w:ascii="Georgia" w:cs="Georgia" w:eastAsia="Georgia" w:hAnsi="Georgia"/>
-          <w:color w:val="333333"/>
-          <w:sz w:val="17"/>
-          <w:szCs w:val="17"/>
-        </w:rPr>
-        <w:t xml:space="preserve">„I agree with Lara.“ — agree ist ein Verb, ohne am. Gib den Satzanfang für die Antwort auf die anderen: „I agree, because …“ / „I see it differently: …“</w:t>
-      </w:r>
-    </w:p>
-    <w:p>
-      <w:pPr>
-        <w:pBdr>
-          <w:left w:val="single" w:color="BFBFBF" w:sz="18" w:space="8"/>
-        </w:pBdr>
-        <w:shd w:fill="F2F2F2" w:color="auto" w:val="clear"/>
-        <w:spacing w:after="40"/>
-        <w:ind w:left="120"/>
-      </w:pPr>
-      <w:r>
-        <w:rPr>
-          <w:rFonts w:ascii="Georgia" w:cs="Georgia" w:eastAsia="Georgia" w:hAnsi="Georgia"/>
-          <w:b/>
-          <w:bCs/>
-          <w:color w:val="333333"/>
-          <w:sz w:val="17"/>
-          <w:szCs w:val="17"/>
-        </w:rPr>
-        <w:t xml:space="preserve">„I would go in the library.“  →  </w:t>
-      </w:r>
-      <w:r>
-        <w:rPr>
-          <w:rFonts w:ascii="Georgia" w:cs="Georgia" w:eastAsia="Georgia" w:hAnsi="Georgia"/>
-          <w:color w:val="333333"/>
-          <w:sz w:val="17"/>
-          <w:szCs w:val="17"/>
-        </w:rPr>
-        <w:t xml:space="preserve">„into the library“. Nicht unterbrechen — beim Nachfragen richtig verwenden: „Into the library — why?“</w:t>
+        <w:t xml:space="preserve">Jemand will allein losgehen  →  </w:t>
+      </w:r>
+      <w:r>
+        <w:rPr>
+          <w:rFonts w:ascii="Georgia" w:cs="Georgia" w:eastAsia="Georgia" w:hAnsi="Georgia"/>
+          <w:color w:val="333333"/>
+          <w:sz w:val="17"/>
+          <w:szCs w:val="17"/>
+        </w:rPr>
+        <w:t xml:space="preserve">Nicht verbieten, bremsen: „The others are still at the fountain.“ Die Gruppe bleibt zusammen, sonst zerfällt die Szene</w:t>
+      </w:r>
+    </w:p>
+    <w:p>
+      <w:pPr>
+        <w:pBdr>
+          <w:left w:val="single" w:color="BFBFBF" w:sz="18" w:space="8"/>
+        </w:pBdr>
+        <w:shd w:fill="F2F2F2" w:color="auto" w:val="clear"/>
+        <w:spacing w:after="40"/>
+        <w:ind w:left="120"/>
+      </w:pPr>
+      <w:r>
+        <w:rPr>
+          <w:rFonts w:ascii="Georgia" w:cs="Georgia" w:eastAsia="Georgia" w:hAnsi="Georgia"/>
+          <w:b/>
+          <w:bCs/>
+          <w:color w:val="333333"/>
+          <w:sz w:val="17"/>
+          <w:szCs w:val="17"/>
+        </w:rPr>
+        <w:t xml:space="preserve">Sie hängen zu lange an der Wahl  →  </w:t>
+      </w:r>
+      <w:r>
+        <w:rPr>
+          <w:rFonts w:ascii="Georgia" w:cs="Georgia" w:eastAsia="Georgia" w:hAnsi="Georgia"/>
+          <w:color w:val="333333"/>
+          <w:sz w:val="17"/>
+          <w:szCs w:val="17"/>
+        </w:rPr>
+        <w:t xml:space="preserve">Oben geht ein Fenster an: „A light. Second floor.“ Danach entscheiden sie schnell</w:t>
       </w:r>
     </w:p>
     <w:p>
@@ -7357,16 +7357,16 @@
           <w:sz w:val="17"/>
           <w:szCs w:val="17"/>
         </w:rPr>
-        <w:t xml:space="preserve">„Can we look through the window first?“  →  </w:t>
-      </w:r>
-      <w:r>
-        <w:rPr>
-          <w:rFonts w:ascii="Georgia" w:cs="Georgia" w:eastAsia="Georgia" w:hAnsi="Georgia"/>
-          <w:color w:val="333333"/>
-          <w:sz w:val="17"/>
-          <w:szCs w:val="17"/>
-        </w:rPr>
-        <w:t xml:space="preserve">Ja — genau dafür ist die Liste unten da. Jede Antwort nur einmal, und dann wird entschieden</w:t>
+        <w:t xml:space="preserve">Sie kennen den Namen Anneke nicht und wollen in die Kapelle  →  </w:t>
+      </w:r>
+      <w:r>
+        <w:rPr>
+          <w:rFonts w:ascii="Georgia" w:cs="Georgia" w:eastAsia="Georgia" w:hAnsi="Georgia"/>
+          <w:color w:val="333333"/>
+          <w:sz w:val="17"/>
+          <w:szCs w:val="17"/>
+        </w:rPr>
+        <w:t xml:space="preserve">Nicht warnen. Ob sie im Wirtshaus zugehört haben, zeigt sich jetzt</w:t>
       </w:r>
     </w:p>
     <w:p>
@@ -9240,46 +9240,46 @@
           <w:sz w:val="17"/>
           <w:szCs w:val="17"/>
         </w:rPr>
-        <w:t xml:space="preserve">Nur bei: Tür A · Bibliothek — „I am fifteen. I live in Zurich. I like pizza.“  →  </w:t>
-      </w:r>
-      <w:r>
-        <w:rPr>
-          <w:rFonts w:ascii="Georgia" w:cs="Georgia" w:eastAsia="Georgia" w:hAnsi="Georgia"/>
-          <w:color w:val="333333"/>
-          <w:sz w:val="17"/>
-          <w:szCs w:val="17"/>
-        </w:rPr>
-        <w:t xml:space="preserve">Gilt — aber Bellamy seufzt: „True. And terribly dull. Tell me something that costs you a little.“ Der zweite Versuch darf persönlicher werden</w:t>
-      </w:r>
-    </w:p>
-    <w:p>
-      <w:pPr>
-        <w:pBdr>
-          <w:left w:val="single" w:color="BFBFBF" w:sz="18" w:space="8"/>
-        </w:pBdr>
-        <w:shd w:fill="F2F2F2" w:color="auto" w:val="clear"/>
-        <w:spacing w:after="40"/>
-        <w:ind w:left="120"/>
-      </w:pPr>
-      <w:r>
-        <w:rPr>
-          <w:rFonts w:ascii="Georgia" w:cs="Georgia" w:eastAsia="Georgia" w:hAnsi="Georgia"/>
-          <w:b/>
-          <w:bCs/>
-          <w:color w:val="333333"/>
-          <w:sz w:val="17"/>
-          <w:szCs w:val="17"/>
-        </w:rPr>
-        <w:t xml:space="preserve">Nur bei: Tür A · Bibliothek — „I lie never.“  →  </w:t>
-      </w:r>
-      <w:r>
-        <w:rPr>
-          <w:rFonts w:ascii="Georgia" w:cs="Georgia" w:eastAsia="Georgia" w:hAnsi="Georgia"/>
-          <w:color w:val="333333"/>
-          <w:sz w:val="17"/>
-          <w:szCs w:val="17"/>
-        </w:rPr>
-        <w:t xml:space="preserve">„I never lie.“ — never, always, often stehen vor dem Verb. Bellamy lächelt: „Never? Now that is a lie.“</w:t>
+        <w:t xml:space="preserve">Nur bei: Tür A · Bibliothek — Bellamy merkt eine Lüge  →  </w:t>
+      </w:r>
+      <w:r>
+        <w:rPr>
+          <w:rFonts w:ascii="Georgia" w:cs="Georgia" w:eastAsia="Georgia" w:hAnsi="Georgia"/>
+          <w:color w:val="333333"/>
+          <w:sz w:val="17"/>
+          <w:szCs w:val="17"/>
+        </w:rPr>
+        <w:t xml:space="preserve">Nicht sofort. Er lässt den Satz stehen, sieht lange hin und sagt erst am Ende: „Two true things. And one that wasn’t.“</w:t>
+      </w:r>
+    </w:p>
+    <w:p>
+      <w:pPr>
+        <w:pBdr>
+          <w:left w:val="single" w:color="BFBFBF" w:sz="18" w:space="8"/>
+        </w:pBdr>
+        <w:shd w:fill="F2F2F2" w:color="auto" w:val="clear"/>
+        <w:spacing w:after="40"/>
+        <w:ind w:left="120"/>
+      </w:pPr>
+      <w:r>
+        <w:rPr>
+          <w:rFonts w:ascii="Georgia" w:cs="Georgia" w:eastAsia="Georgia" w:hAnsi="Georgia"/>
+          <w:b/>
+          <w:bCs/>
+          <w:color w:val="333333"/>
+          <w:sz w:val="17"/>
+          <w:szCs w:val="17"/>
+        </w:rPr>
+        <w:t xml:space="preserve">Nur bei: Tür A · Bibliothek — Jemand erzählt etwas wirklich Persönliches  →  </w:t>
+      </w:r>
+      <w:r>
+        <w:rPr>
+          <w:rFonts w:ascii="Georgia" w:cs="Georgia" w:eastAsia="Georgia" w:hAnsi="Georgia"/>
+          <w:color w:val="333333"/>
+          <w:sz w:val="17"/>
+          <w:szCs w:val="17"/>
+        </w:rPr>
+        <w:t xml:space="preserve">Nicht nachfragen, nicht kommentieren. Bellamy nickt nur: „Thank you.“ Das bleibt am Tisch</w:t>
       </w:r>
     </w:p>
     <w:p>
@@ -9360,16 +9360,46 @@
           <w:sz w:val="17"/>
           <w:szCs w:val="17"/>
         </w:rPr>
-        <w:t xml:space="preserve">Nur bei: Tür C · Küche — „We promise that we take you with.“  →  </w:t>
-      </w:r>
-      <w:r>
-        <w:rPr>
-          <w:rFonts w:ascii="Georgia" w:cs="Georgia" w:eastAsia="Georgia" w:hAnsi="Georgia"/>
-          <w:color w:val="333333"/>
-          <w:sz w:val="17"/>
-          <w:szCs w:val="17"/>
-        </w:rPr>
-        <w:t xml:space="preserve">„We’ll take you with us.“ — Versprechen mit will, und with braucht ein us. Tam wiederholt es leise, um sicher zu sein</w:t>
+        <w:t xml:space="preserve">Nur bei: Tür C · Küche — Nach Tams Frage  →  </w:t>
+      </w:r>
+      <w:r>
+        <w:rPr>
+          <w:rFonts w:ascii="Georgia" w:cs="Georgia" w:eastAsia="Georgia" w:hAnsi="Georgia"/>
+          <w:color w:val="333333"/>
+          <w:sz w:val="17"/>
+          <w:szCs w:val="17"/>
+        </w:rPr>
+        <w:t xml:space="preserve">Still sein und warten, auch zehn Sekunden. Nicht helfen, nicht umformulieren — die Pause gehört Tam</w:t>
+      </w:r>
+    </w:p>
+    <w:p>
+      <w:pPr>
+        <w:pBdr>
+          <w:left w:val="single" w:color="BFBFBF" w:sz="18" w:space="8"/>
+        </w:pBdr>
+        <w:shd w:fill="F2F2F2" w:color="auto" w:val="clear"/>
+        <w:spacing w:after="40"/>
+        <w:ind w:left="120"/>
+      </w:pPr>
+      <w:r>
+        <w:rPr>
+          <w:rFonts w:ascii="Georgia" w:cs="Georgia" w:eastAsia="Georgia" w:hAnsi="Georgia"/>
+          <w:b/>
+          <w:bCs/>
+          <w:color w:val="333333"/>
+          <w:sz w:val="17"/>
+          <w:szCs w:val="17"/>
+        </w:rPr>
+        <w:t xml:space="preserve">Nur bei: Tür C · Küche — Jemand verspricht halbherzig, nur um weiterzukommen  →  </w:t>
+      </w:r>
+      <w:r>
+        <w:rPr>
+          <w:rFonts w:ascii="Georgia" w:cs="Georgia" w:eastAsia="Georgia" w:hAnsi="Georgia"/>
+          <w:color w:val="333333"/>
+          <w:sz w:val="17"/>
+          <w:szCs w:val="17"/>
+        </w:rPr>
+        <w:t xml:space="preserve">Gilt als Versprechen. Nicht nachhaken — die Rechnung kommt im Epilog</w:t>
       </w:r>
     </w:p>
     <w:p>
@@ -9390,16 +9420,16 @@
           <w:sz w:val="17"/>
           <w:szCs w:val="17"/>
         </w:rPr>
-        <w:t xml:space="preserve">Nur bei: Tür C · Küche — Jemand verspricht halbherzig, nur um weiterzukommen  →  </w:t>
-      </w:r>
-      <w:r>
-        <w:rPr>
-          <w:rFonts w:ascii="Georgia" w:cs="Georgia" w:eastAsia="Georgia" w:hAnsi="Georgia"/>
-          <w:color w:val="333333"/>
-          <w:sz w:val="17"/>
-          <w:szCs w:val="17"/>
-        </w:rPr>
-        <w:t xml:space="preserve">Gilt als Versprechen. Nicht nachhaken — die Rechnung kommt im Epilog</w:t>
+        <w:t xml:space="preserve">Nur bei: Tür A · Bibliothek, Tür C · Küche, „Nein — ihr sucht selbst“ — Sie suchen den Weg allein  →  </w:t>
+      </w:r>
+      <w:r>
+        <w:rPr>
+          <w:rFonts w:ascii="Georgia" w:cs="Georgia" w:eastAsia="Georgia" w:hAnsi="Georgia"/>
+          <w:color w:val="333333"/>
+          <w:sz w:val="17"/>
+          <w:szCs w:val="17"/>
+        </w:rPr>
+        <w:t xml:space="preserve">Kurz halten: zwei falsche Türen, ein Moment Angst, dann der Spiegel. Die Strafe ist die Gefahr, nicht verlorene Zeit</w:t>
       </w:r>
     </w:p>
     <w:p>
@@ -10403,76 +10433,46 @@
           <w:sz w:val="17"/>
           <w:szCs w:val="17"/>
         </w:rPr>
-        <w:t xml:space="preserve">„Why did you came here?“  →  </w:t>
-      </w:r>
-      <w:r>
-        <w:rPr>
-          <w:rFonts w:ascii="Georgia" w:cs="Georgia" w:eastAsia="Georgia" w:hAnsi="Georgia"/>
-          <w:color w:val="333333"/>
-          <w:sz w:val="17"/>
-          <w:szCs w:val="17"/>
-        </w:rPr>
-        <w:t xml:space="preserve">„Why did you come?“ — nach did die Grundform. Mirela wiederholt die Frage richtig, bevor sie antwortet: „Why did I come? …“</w:t>
-      </w:r>
-    </w:p>
-    <w:p>
-      <w:pPr>
-        <w:pBdr>
-          <w:left w:val="single" w:color="BFBFBF" w:sz="18" w:space="8"/>
-        </w:pBdr>
-        <w:shd w:fill="F2F2F2" w:color="auto" w:val="clear"/>
-        <w:spacing w:after="40"/>
-        <w:ind w:left="120"/>
-      </w:pPr>
-      <w:r>
-        <w:rPr>
-          <w:rFonts w:ascii="Georgia" w:cs="Georgia" w:eastAsia="Georgia" w:hAnsi="Georgia"/>
-          <w:b/>
-          <w:bCs/>
-          <w:color w:val="333333"/>
-          <w:sz w:val="17"/>
-          <w:szCs w:val="17"/>
-        </w:rPr>
-        <w:t xml:space="preserve">Nur „That is not fair!“  →  </w:t>
-      </w:r>
-      <w:r>
-        <w:rPr>
-          <w:rFonts w:ascii="Georgia" w:cs="Georgia" w:eastAsia="Georgia" w:hAnsi="Georgia"/>
-          <w:color w:val="333333"/>
-          <w:sz w:val="17"/>
-          <w:szCs w:val="17"/>
-        </w:rPr>
-        <w:t xml:space="preserve">Nachfragen: „Not fair to whom — to you, to Lene, or to the village?“ Aus dem Ausruf wird ein Gespräch</w:t>
-      </w:r>
-    </w:p>
-    <w:p>
-      <w:pPr>
-        <w:pBdr>
-          <w:left w:val="single" w:color="BFBFBF" w:sz="18" w:space="8"/>
-        </w:pBdr>
-        <w:shd w:fill="F2F2F2" w:color="auto" w:val="clear"/>
-        <w:spacing w:after="40"/>
-        <w:ind w:left="120"/>
-      </w:pPr>
-      <w:r>
-        <w:rPr>
-          <w:rFonts w:ascii="Georgia" w:cs="Georgia" w:eastAsia="Georgia" w:hAnsi="Georgia"/>
-          <w:b/>
-          <w:bCs/>
-          <w:color w:val="333333"/>
-          <w:sz w:val="17"/>
-          <w:szCs w:val="17"/>
-        </w:rPr>
-        <w:t xml:space="preserve">„I think it is not fair.“  →  </w:t>
-      </w:r>
-      <w:r>
-        <w:rPr>
-          <w:rFonts w:ascii="Georgia" w:cs="Georgia" w:eastAsia="Georgia" w:hAnsi="Georgia"/>
-          <w:color w:val="333333"/>
-          <w:sz w:val="17"/>
-          <w:szCs w:val="17"/>
-        </w:rPr>
-        <w:t xml:space="preserve">Natürlicher: „I don’t think it’s fair.“ — im Englischen wandert das not nach vorn</w:t>
+        <w:t xml:space="preserve">Sie stellen nur Ja-Nein-Fragen  →  </w:t>
+      </w:r>
+      <w:r>
+        <w:rPr>
+          <w:rFonts w:ascii="Georgia" w:cs="Georgia" w:eastAsia="Georgia" w:hAnsi="Georgia"/>
+          <w:color w:val="333333"/>
+          <w:sz w:val="17"/>
+          <w:szCs w:val="17"/>
+        </w:rPr>
+        <w:t xml:space="preserve">Dann antwortet Mirela auch nur mit „Yes.“ oder „No.“ Die langen Antworten gibt es auf Why- und What-Fragen</w:t>
+      </w:r>
+    </w:p>
+    <w:p>
+      <w:pPr>
+        <w:pBdr>
+          <w:left w:val="single" w:color="BFBFBF" w:sz="18" w:space="8"/>
+        </w:pBdr>
+        <w:shd w:fill="F2F2F2" w:color="auto" w:val="clear"/>
+        <w:spacing w:after="40"/>
+        <w:ind w:left="120"/>
+      </w:pPr>
+      <w:r>
+        <w:rPr>
+          <w:rFonts w:ascii="Georgia" w:cs="Georgia" w:eastAsia="Georgia" w:hAnsi="Georgia"/>
+          <w:b/>
+          <w:bCs/>
+          <w:color w:val="333333"/>
+          <w:sz w:val="17"/>
+          <w:szCs w:val="17"/>
+        </w:rPr>
+        <w:t xml:space="preserve">Der Name Lene fällt  →  </w:t>
+      </w:r>
+      <w:r>
+        <w:rPr>
+          <w:rFonts w:ascii="Georgia" w:cs="Georgia" w:eastAsia="Georgia" w:hAnsi="Georgia"/>
+          <w:color w:val="333333"/>
+          <w:sz w:val="17"/>
+          <w:szCs w:val="17"/>
+        </w:rPr>
+        <w:t xml:space="preserve">Langsam sagen lassen. Das ist der Moment, in dem die Gruppe begreift: kein Entführungsfall</w:t>
       </w:r>
     </w:p>
     <w:p>
@@ -11061,16 +11061,16 @@
           <w:sz w:val="17"/>
           <w:szCs w:val="17"/>
         </w:rPr>
-        <w:t xml:space="preserve">„If we will burn the book …“  →  </w:t>
-      </w:r>
-      <w:r>
-        <w:rPr>
-          <w:rFonts w:ascii="Georgia" w:cs="Georgia" w:eastAsia="Georgia" w:hAnsi="Georgia"/>
-          <w:color w:val="333333"/>
-          <w:sz w:val="17"/>
-          <w:szCs w:val="17"/>
-        </w:rPr>
-        <w:t xml:space="preserve">„If we burn the book, he will …“ — im if-Teil kein will. Die Stelle ist wie gemacht für if-Sätze: „And if you do that — what happens then?“</w:t>
+        <w:t xml:space="preserve">Sie können sich nicht einigen  →  </w:t>
+      </w:r>
+      <w:r>
+        <w:rPr>
+          <w:rFonts w:ascii="Georgia" w:cs="Georgia" w:eastAsia="Georgia" w:hAnsi="Georgia"/>
+          <w:color w:val="333333"/>
+          <w:sz w:val="17"/>
+          <w:szCs w:val="17"/>
+        </w:rPr>
+        <w:t xml:space="preserve">Mirela entscheidet nicht für sie, sagt aber: „Whatever you do — do it together. He can smell doubt.“</w:t>
       </w:r>
     </w:p>
     <w:p>
@@ -13506,16 +13506,16 @@
           <w:sz w:val="17"/>
           <w:szCs w:val="17"/>
         </w:rPr>
-        <w:t xml:space="preserve">„Let her free!“  →  </w:t>
-      </w:r>
-      <w:r>
-        <w:rPr>
-          <w:rFonts w:ascii="Georgia" w:cs="Georgia" w:eastAsia="Georgia" w:hAnsi="Georgia"/>
-          <w:color w:val="333333"/>
-          <w:sz w:val="17"/>
-          <w:szCs w:val="17"/>
-        </w:rPr>
-        <w:t xml:space="preserve">„Let her go!“ oder „Set her free!“ — free ist kein Verb. Vaskir darf es höflich richtig sagen: „Let her go? She was never held.“</w:t>
+        <w:t xml:space="preserve">Jemand beleidigt ihn nebenbei, ohne es zu meinen  →  </w:t>
+      </w:r>
+      <w:r>
+        <w:rPr>
+          <w:rFonts w:ascii="Georgia" w:cs="Georgia" w:eastAsia="Georgia" w:hAnsi="Georgia"/>
+          <w:color w:val="333333"/>
+          <w:sz w:val="17"/>
+          <w:szCs w:val="17"/>
+        </w:rPr>
+        <w:t xml:space="preserve">Noch keine Drohung. Vaskir hebt eine Augenbraue: „Careful.“ Erst beim zweiten Mal „Drohung“ anklicken</w:t>
       </w:r>
     </w:p>
     <w:p>
@@ -15714,16 +15714,16 @@
           <w:sz w:val="17"/>
           <w:szCs w:val="17"/>
         </w:rPr>
-        <w:t xml:space="preserve">„I want that we stay.“  →  </w:t>
-      </w:r>
-      <w:r>
-        <w:rPr>
-          <w:rFonts w:ascii="Georgia" w:cs="Georgia" w:eastAsia="Georgia" w:hAnsi="Georgia"/>
-          <w:color w:val="333333"/>
-          <w:sz w:val="17"/>
-          <w:szCs w:val="17"/>
-        </w:rPr>
-        <w:t xml:space="preserve">„I want to stay.“ oder „I want us to stay.“ — want that gibt es nicht</w:t>
+        <w:t xml:space="preserve">Die Zeit ist knapp  →  </w:t>
+      </w:r>
+      <w:r>
+        <w:rPr>
+          <w:rFonts w:ascii="Georgia" w:cs="Georgia" w:eastAsia="Georgia" w:hAnsi="Georgia"/>
+          <w:color w:val="333333"/>
+          <w:sz w:val="17"/>
+          <w:szCs w:val="17"/>
+        </w:rPr>
+        <w:t xml:space="preserve">Die Absätze oben kürzen, nie die Schlussrunde. Das letzte Wort gehört den Schülern</w:t>
       </w:r>
     </w:p>
     <w:p>
@@ -16109,16 +16109,16 @@
           <w:sz w:val="17"/>
           <w:szCs w:val="17"/>
         </w:rPr>
-        <w:t xml:space="preserve">Jemand ruft „Attention!“  →  </w:t>
-      </w:r>
-      <w:r>
-        <w:rPr>
-          <w:rFonts w:ascii="Georgia" w:cs="Georgia" w:eastAsia="Georgia" w:hAnsi="Georgia"/>
-          <w:color w:val="333333"/>
-          <w:sz w:val="17"/>
-          <w:szCs w:val="17"/>
-        </w:rPr>
-        <w:t xml:space="preserve">„Watch out!“ oder „Look out!“ — attention heisst Aufmerksamkeit</w:t>
+        <w:t xml:space="preserve">Die Gruppe vergisst die Tränke  →  </w:t>
+      </w:r>
+      <w:r>
+        <w:rPr>
+          <w:rFonts w:ascii="Georgia" w:cs="Georgia" w:eastAsia="Georgia" w:hAnsi="Georgia"/>
+          <w:color w:val="333333"/>
+          <w:sz w:val="17"/>
+          <w:szCs w:val="17"/>
+        </w:rPr>
+        <w:t xml:space="preserve">Einmal erinnern: „You still have a potion.“ Dieser Kampf ist der, für den sie gedacht sind</w:t>
       </w:r>
     </w:p>
     <w:p>
@@ -16139,16 +16139,16 @@
           <w:sz w:val="17"/>
           <w:szCs w:val="17"/>
         </w:rPr>
-        <w:t xml:space="preserve">Sie verteilen die Aufgaben auf Deutsch  →  </w:t>
-      </w:r>
-      <w:r>
-        <w:rPr>
-          <w:rFonts w:ascii="Georgia" w:cs="Georgia" w:eastAsia="Georgia" w:hAnsi="Georgia"/>
-          <w:color w:val="333333"/>
-          <w:sz w:val="17"/>
-          <w:szCs w:val="17"/>
-        </w:rPr>
-        <w:t xml:space="preserve">Gib drei Sätze vor: „I’ll take the hound.“ — „Stay behind me.“ — „Cover the healer!“</w:t>
+        <w:t xml:space="preserve">Der Hund fällt  →  </w:t>
+      </w:r>
+      <w:r>
+        <w:rPr>
+          <w:rFonts w:ascii="Georgia" w:cs="Georgia" w:eastAsia="Georgia" w:hAnsi="Georgia"/>
+          <w:color w:val="333333"/>
+          <w:sz w:val="17"/>
+          <w:szCs w:val="17"/>
+        </w:rPr>
+        <w:t xml:space="preserve">Kurz innehalten, die Wachen sehen einander an. Dann spüren die Spieler selbst, dass die gleich aufgeben</w:t>
       </w:r>
     </w:p>
     <w:p>

</xml_diff>